<commit_message>
Further implementation of document.
</commit_message>
<xml_diff>
--- a/Submission/s479832 - AutomatingSafetyCriticalEngineering.docx
+++ b/Submission/s479832 - AutomatingSafetyCriticalEngineering.docx
@@ -178,8 +178,6 @@
     <w:p/>
     <w:p/>
     <w:p/>
-    <w:p/>
-    <w:p/>
     <w:p>
       <w:pPr>
         <w:pStyle w:val="Heading4"/>
@@ -236,7 +234,6 @@
         <w:pStyle w:val="Heading4"/>
       </w:pPr>
       <w:r>
-        <w:lastRenderedPageBreak/>
         <w:t xml:space="preserve">Date: </w:t>
       </w:r>
       <w:sdt>
@@ -379,7 +376,11 @@
           <w:tcPr>
             <w:tcW w:w="3568" w:type="dxa"/>
           </w:tcPr>
-          <w:p/>
+          <w:p>
+            <w:r>
+              <w:t>Background</w:t>
+            </w:r>
+          </w:p>
         </w:tc>
         <w:tc>
           <w:tcPr>
@@ -394,146 +395,148 @@
           <w:p/>
         </w:tc>
       </w:tr>
-    </w:tbl>
-    <w:p/>
-    <w:p>
-      <w:r>
-        <w:t xml:space="preserve">Total word count: </w:t>
-      </w:r>
-      <w:r>
-        <w:br w:type="page"/>
-      </w:r>
-    </w:p>
-    <w:tbl>
-      <w:tblPr>
-        <w:tblStyle w:val="TableGrid"/>
-        <w:tblW w:w="10751" w:type="dxa"/>
-        <w:tblBorders>
-          <w:top w:val="none" w:sz="0" w:space="0" w:color="auto"/>
-          <w:left w:val="none" w:sz="0" w:space="0" w:color="auto"/>
-          <w:bottom w:val="none" w:sz="0" w:space="0" w:color="auto"/>
-          <w:right w:val="none" w:sz="0" w:space="0" w:color="auto"/>
-          <w:insideH w:val="none" w:sz="0" w:space="0" w:color="auto"/>
-          <w:insideV w:val="none" w:sz="0" w:space="0" w:color="auto"/>
-        </w:tblBorders>
-        <w:tblLook w:val="04A0" w:firstRow="1" w:lastRow="0" w:firstColumn="1" w:lastColumn="0" w:noHBand="0" w:noVBand="1"/>
-      </w:tblPr>
-      <w:tblGrid>
-        <w:gridCol w:w="3071"/>
-        <w:gridCol w:w="236"/>
-        <w:gridCol w:w="7444"/>
-      </w:tblGrid>
       <w:tr>
         <w:tc>
           <w:tcPr>
-            <w:tcW w:w="3071" w:type="dxa"/>
+            <w:tcW w:w="3568" w:type="dxa"/>
           </w:tcPr>
           <w:p>
-            <w:pPr>
-              <w:pStyle w:val="Heading3"/>
-              <w:rPr>
-                <w:rStyle w:val="IntenseReference"/>
-                <w:b/>
-                <w:bCs w:val="0"/>
-                <w:smallCaps w:val="0"/>
-                <w:color w:val="384A50"/>
-                <w:spacing w:val="0"/>
-              </w:rPr>
-            </w:pPr>
             <w:r>
-              <w:rPr>
-                <w:noProof/>
-                <w:lang w:eastAsia="en-GB"/>
-              </w:rPr>
-              <w:lastRenderedPageBreak/>
-              <w:drawing>
-                <wp:inline distT="0" distB="0" distL="0" distR="0" wp14:anchorId="7B85B7E6" wp14:editId="2F4CF6E3">
-                  <wp:extent cx="1584960" cy="1584960"/>
-                  <wp:effectExtent l="0" t="0" r="0" b="0"/>
-                  <wp:docPr id="16" name="Picture 16"/>
-                  <wp:cNvGraphicFramePr>
-                    <a:graphicFrameLocks xmlns:a="http://schemas.openxmlformats.org/drawingml/2006/main" noChangeAspect="1"/>
-                  </wp:cNvGraphicFramePr>
-                  <a:graphic xmlns:a="http://schemas.openxmlformats.org/drawingml/2006/main">
-                    <a:graphicData uri="http://schemas.openxmlformats.org/drawingml/2006/picture">
-                      <pic:pic xmlns:pic="http://schemas.openxmlformats.org/drawingml/2006/picture">
-                        <pic:nvPicPr>
-                          <pic:cNvPr id="21" name="Marques-CU.png"/>
-                          <pic:cNvPicPr/>
-                        </pic:nvPicPr>
-                        <pic:blipFill>
-                          <a:blip r:embed="rId12" cstate="print">
-                            <a:extLst>
-                              <a:ext uri="{28A0092B-C50C-407E-A947-70E740481C1C}">
-                                <a14:useLocalDpi xmlns:a14="http://schemas.microsoft.com/office/drawing/2010/main" val="0"/>
-                              </a:ext>
-                            </a:extLst>
-                          </a:blip>
-                          <a:stretch>
-                            <a:fillRect/>
-                          </a:stretch>
-                        </pic:blipFill>
-                        <pic:spPr>
-                          <a:xfrm>
-                            <a:off x="0" y="0"/>
-                            <a:ext cx="1584960" cy="1584960"/>
-                          </a:xfrm>
-                          <a:prstGeom prst="rect">
-                            <a:avLst/>
-                          </a:prstGeom>
-                        </pic:spPr>
-                      </pic:pic>
-                    </a:graphicData>
-                  </a:graphic>
-                </wp:inline>
-              </w:drawing>
+              <w:t>State of the Art</w:t>
             </w:r>
           </w:p>
         </w:tc>
         <w:tc>
           <w:tcPr>
-            <w:tcW w:w="236" w:type="dxa"/>
-            <w:vAlign w:val="center"/>
+            <w:tcW w:w="3310" w:type="dxa"/>
+          </w:tcPr>
+          <w:p/>
+        </w:tc>
+        <w:tc>
+          <w:tcPr>
+            <w:tcW w:w="3310" w:type="dxa"/>
+          </w:tcPr>
+          <w:p/>
+        </w:tc>
+      </w:tr>
+      <w:tr>
+        <w:tc>
+          <w:tcPr>
+            <w:tcW w:w="3568" w:type="dxa"/>
           </w:tcPr>
           <w:p>
-            <w:pPr>
-              <w:pStyle w:val="Heading3"/>
-              <w:rPr>
-                <w:rStyle w:val="IntenseReference"/>
-                <w:b/>
-                <w:bCs w:val="0"/>
-                <w:smallCaps w:val="0"/>
-                <w:color w:val="384A50"/>
-                <w:spacing w:val="0"/>
-              </w:rPr>
-            </w:pPr>
+            <w:r>
+              <w:t>Methodology Review 1</w:t>
+            </w:r>
           </w:p>
         </w:tc>
         <w:tc>
           <w:tcPr>
-            <w:tcW w:w="7444" w:type="dxa"/>
-            <w:vAlign w:val="center"/>
+            <w:tcW w:w="3310" w:type="dxa"/>
+          </w:tcPr>
+          <w:p/>
+        </w:tc>
+        <w:tc>
+          <w:tcPr>
+            <w:tcW w:w="3310" w:type="dxa"/>
+          </w:tcPr>
+          <w:p/>
+        </w:tc>
+      </w:tr>
+      <w:tr>
+        <w:tc>
+          <w:tcPr>
+            <w:tcW w:w="3568" w:type="dxa"/>
+          </w:tcPr>
+          <w:p>
+            <w:r>
+              <w:t>Methodology Review 2</w:t>
+            </w:r>
+          </w:p>
+        </w:tc>
+        <w:tc>
+          <w:tcPr>
+            <w:tcW w:w="3310" w:type="dxa"/>
+          </w:tcPr>
+          <w:p/>
+        </w:tc>
+        <w:tc>
+          <w:tcPr>
+            <w:tcW w:w="3310" w:type="dxa"/>
+          </w:tcPr>
+          <w:p/>
+        </w:tc>
+      </w:tr>
+      <w:tr>
+        <w:tc>
+          <w:tcPr>
+            <w:tcW w:w="3568" w:type="dxa"/>
+          </w:tcPr>
+          <w:p>
+            <w:r>
+              <w:t>Methodology Application and Future Development</w:t>
+            </w:r>
+          </w:p>
+        </w:tc>
+        <w:tc>
+          <w:tcPr>
+            <w:tcW w:w="3310" w:type="dxa"/>
+          </w:tcPr>
+          <w:p/>
+        </w:tc>
+        <w:tc>
+          <w:tcPr>
+            <w:tcW w:w="3310" w:type="dxa"/>
+          </w:tcPr>
+          <w:p/>
+        </w:tc>
+      </w:tr>
+      <w:tr>
+        <w:tc>
+          <w:tcPr>
+            <w:tcW w:w="3568" w:type="dxa"/>
+          </w:tcPr>
+          <w:p>
+            <w:r>
+              <w:t>References</w:t>
+            </w:r>
+          </w:p>
+        </w:tc>
+        <w:tc>
+          <w:tcPr>
+            <w:tcW w:w="3310" w:type="dxa"/>
+          </w:tcPr>
+          <w:p/>
+        </w:tc>
+        <w:tc>
+          <w:tcPr>
+            <w:tcW w:w="3310" w:type="dxa"/>
+          </w:tcPr>
+          <w:p/>
+        </w:tc>
+      </w:tr>
+      <w:tr>
+        <w:tc>
+          <w:tcPr>
+            <w:tcW w:w="10188" w:type="dxa"/>
+            <w:gridSpan w:val="3"/>
+            <w:shd w:val="clear" w:color="auto" w:fill="44546A" w:themeFill="text2"/>
           </w:tcPr>
           <w:p>
             <w:pPr>
-              <w:pStyle w:val="Title"/>
-            </w:pPr>
-            <w:r>
-              <w:t>Automating Safety Critical Software Engineering</w:t>
-            </w:r>
-          </w:p>
-          <w:p>
-            <w:pPr>
-              <w:pStyle w:val="Subtitle"/>
-              <w:rPr>
-                <w:color w:val="0099C4"/>
-              </w:rPr>
+              <w:jc w:val="right"/>
             </w:pPr>
             <w:r>
               <w:rPr>
-                <w:color w:val="0099C4"/>
+                <w:color w:val="FFFFFF" w:themeColor="background1"/>
               </w:rPr>
-              <w:t>Agentic Optimisation and Transformation</w:t>
+              <w:t>Total Word Count</w:t>
+            </w:r>
+            <w:r>
+              <w:rPr>
+                <w:color w:val="FFFFFF" w:themeColor="background1"/>
+              </w:rPr>
+              <w:t>: 6000</w:t>
             </w:r>
           </w:p>
         </w:tc>
@@ -541,14 +544,32 @@
     </w:tbl>
     <w:p/>
     <w:p>
+      <w:r>
+        <w:br w:type="page"/>
+      </w:r>
+    </w:p>
+    <w:p/>
+    <w:p>
       <w:pPr>
         <w:pStyle w:val="Heading3"/>
       </w:pPr>
       <w:r>
-        <w:t>Introduction</w:t>
+        <w:t>Background</w:t>
       </w:r>
     </w:p>
     <w:bookmarkEnd w:id="0"/>
+    <w:p/>
+    <w:p>
+      <w:r>
+        <w:rPr>
+          <w:highlight w:val="yellow"/>
+        </w:rPr>
+        <w:t>Introduce why the topic is important to AI and your applied setting. What are the technical and commercial challenges?</w:t>
+      </w:r>
+      <w:r>
+        <w:t xml:space="preserve"> 15</w:t>
+      </w:r>
+    </w:p>
     <w:p/>
     <w:p>
       <w:r>
@@ -557,19 +578,74 @@
     </w:p>
     <w:p/>
     <w:p/>
-    <w:p/>
-    <w:p/>
+    <w:p>
+      <w:pPr>
+        <w:pStyle w:val="Heading3"/>
+      </w:pPr>
+      <w:r>
+        <w:t>State of the Art</w:t>
+      </w:r>
+    </w:p>
     <w:p/>
     <w:p>
-      <w:pPr>
+      <w:r>
         <w:rPr>
-          <w:rFonts w:eastAsiaTheme="majorEastAsia" w:cstheme="majorBidi"/>
-          <w:b/>
-          <w:color w:val="442B58"/>
-          <w:sz w:val="28"/>
-          <w:szCs w:val="28"/>
+          <w:highlight w:val="yellow"/>
         </w:rPr>
-      </w:pPr>
+        <w:t>Introduce previous and current technology in this area. What are their benefits and draw backs, how do they interrelate? Reference your findings</w:t>
+      </w:r>
+      <w:r>
+        <w:t xml:space="preserve"> 25</w:t>
+      </w:r>
+    </w:p>
+    <w:p/>
+    <w:p>
+      <w:pPr>
+        <w:pStyle w:val="Heading3"/>
+      </w:pPr>
+      <w:r>
+        <w:t>Methodology Reviews</w:t>
+      </w:r>
+    </w:p>
+    <w:p/>
+    <w:p>
+      <w:r>
+        <w:rPr>
+          <w:highlight w:val="yellow"/>
+        </w:rPr>
+        <w:t>Select 1-2 methods in depth, offer analysis and discussion. Use referenced results or diagrams.</w:t>
+      </w:r>
+    </w:p>
+    <w:p/>
+    <w:p>
+      <w:r>
+        <w:t>Two methodologies are selected and reviewed here, against the traditional and state of the art approaches, to the exaction of the full engineering lifecycle (FEL) of a product.</w:t>
+      </w:r>
+    </w:p>
+    <w:p/>
+    <w:p>
+      <w:pPr>
+        <w:pStyle w:val="Heading3"/>
+      </w:pPr>
+      <w:r>
+        <w:t>Methodology Review 1: LLM Supported Traditional FEL</w:t>
+      </w:r>
+    </w:p>
+    <w:p>
+      <w:pPr>
+        <w:pStyle w:val="Heading3"/>
+      </w:pPr>
+    </w:p>
+    <w:p/>
+    <w:p>
+      <w:pPr>
+        <w:pStyle w:val="Heading3"/>
+      </w:pPr>
+      <w:r>
+        <w:t>Methodology Review 2: Agentic Team Based FEL</w:t>
+      </w:r>
+    </w:p>
+    <w:p>
       <w:r>
         <w:br w:type="page"/>
       </w:r>
@@ -580,6 +656,17 @@
       </w:pPr>
       <w:r>
         <w:lastRenderedPageBreak/>
+        <w:t>Methodology Application and Future Development</w:t>
+      </w:r>
+    </w:p>
+    <w:p/>
+    <w:p/>
+    <w:p/>
+    <w:p>
+      <w:pPr>
+        <w:pStyle w:val="Heading3"/>
+      </w:pPr>
+      <w:r>
         <w:t>References</w:t>
       </w:r>
     </w:p>
@@ -2373,7 +2460,6 @@
   <w:style w:type="character" w:default="1" w:styleId="DefaultParagraphFont">
     <w:name w:val="Default Paragraph Font"/>
     <w:uiPriority w:val="1"/>
-    <w:semiHidden/>
     <w:unhideWhenUsed/>
   </w:style>
   <w:style w:type="table" w:default="1" w:styleId="TableNormal">
@@ -3345,85 +3431,6 @@
 </file>
 
 <file path=customXml/item1.xml><?xml version="1.0" encoding="utf-8"?>
-<b:Sources xmlns:b="http://schemas.openxmlformats.org/officeDocument/2006/bibliography" xmlns="http://schemas.openxmlformats.org/officeDocument/2006/bibliography" SelectedStyle="/APASixthEditionOfficeOnline.xsl" StyleName="APA"/>
-</file>
-
-<file path=customXml/item2.xml><?xml version="1.0" encoding="utf-8"?>
-<?mso-contentType ?>
-<FormTemplates xmlns="http://schemas.microsoft.com/sharepoint/v3/contenttype/forms">
-  <Display>DocumentLibraryForm</Display>
-  <Edit>DocumentLibraryForm</Edit>
-  <New>DocumentLibraryForm</New>
-</FormTemplates>
-</file>
-
-<file path=customXml/item3.xml><?xml version="1.0" encoding="utf-8"?>
-<?mso-contentType ?>
-<spe:Receivers xmlns:spe="http://schemas.microsoft.com/sharepoint/events">
-  <Receiver>
-    <Name>Document ID Generator</Name>
-    <Synchronization>Synchronous</Synchronization>
-    <Type>10001</Type>
-    <SequenceNumber>1000</SequenceNumber>
-    <Url/>
-    <Assembly>Microsoft.Office.DocumentManagement, Version=16.0.0.0, Culture=neutral, PublicKeyToken=71e9bce111e9429c</Assembly>
-    <Class>Microsoft.Office.DocumentManagement.Internal.DocIdHandler</Class>
-    <Data/>
-    <Filter/>
-  </Receiver>
-  <Receiver>
-    <Name>Document ID Generator</Name>
-    <Synchronization>Synchronous</Synchronization>
-    <Type>10002</Type>
-    <SequenceNumber>1001</SequenceNumber>
-    <Url/>
-    <Assembly>Microsoft.Office.DocumentManagement, Version=16.0.0.0, Culture=neutral, PublicKeyToken=71e9bce111e9429c</Assembly>
-    <Class>Microsoft.Office.DocumentManagement.Internal.DocIdHandler</Class>
-    <Data/>
-    <Filter/>
-  </Receiver>
-  <Receiver>
-    <Name>Document ID Generator</Name>
-    <Synchronization>Synchronous</Synchronization>
-    <Type>10004</Type>
-    <SequenceNumber>1002</SequenceNumber>
-    <Url/>
-    <Assembly>Microsoft.Office.DocumentManagement, Version=16.0.0.0, Culture=neutral, PublicKeyToken=71e9bce111e9429c</Assembly>
-    <Class>Microsoft.Office.DocumentManagement.Internal.DocIdHandler</Class>
-    <Data/>
-    <Filter/>
-  </Receiver>
-  <Receiver>
-    <Name>Document ID Generator</Name>
-    <Synchronization>Synchronous</Synchronization>
-    <Type>10006</Type>
-    <SequenceNumber>1003</SequenceNumber>
-    <Url/>
-    <Assembly>Microsoft.Office.DocumentManagement, Version=16.0.0.0, Culture=neutral, PublicKeyToken=71e9bce111e9429c</Assembly>
-    <Class>Microsoft.Office.DocumentManagement.Internal.DocIdHandler</Class>
-    <Data/>
-    <Filter/>
-  </Receiver>
-</spe:Receivers>
-</file>
-
-<file path=customXml/item4.xml><?xml version="1.0" encoding="utf-8"?>
-<p:properties xmlns:p="http://schemas.microsoft.com/office/2006/metadata/properties" xmlns:xsi="http://www.w3.org/2001/XMLSchema-instance" xmlns:pc="http://schemas.microsoft.com/office/infopath/2007/PartnerControls">
-  <documentManagement>
-    <TaxCatchAll xmlns="d5759068-2af1-405f-8952-bba64d53795f" xsi:nil="true"/>
-    <lcf76f155ced4ddcb4097134ff3c332f xmlns="fc6929cc-5503-4d88-ab04-1ba5755a3b48">
-      <Terms xmlns="http://schemas.microsoft.com/office/infopath/2007/PartnerControls"/>
-    </lcf76f155ced4ddcb4097134ff3c332f>
-    <_dlc_DocId xmlns="d5759068-2af1-405f-8952-bba64d53795f">TQRXN6XH56H4-652439573-2884814</_dlc_DocId>
-    <_dlc_DocIdUrl xmlns="d5759068-2af1-405f-8952-bba64d53795f">
-      <Url>https://cranfield.sharepoint.com/sites/PGVibData/_layouts/15/DocIdRedir.aspx?ID=TQRXN6XH56H4-652439573-2884814</Url>
-      <Description>TQRXN6XH56H4-652439573-2884814</Description>
-    </_dlc_DocIdUrl>
-  </documentManagement>
-</p:properties>
-</file>
-
-<file path=customXml/item5.xml><?xml version="1.0" encoding="utf-8"?>
 <ct:contentTypeSchema xmlns:ct="http://schemas.microsoft.com/office/2006/metadata/contentType" xmlns:ma="http://schemas.microsoft.com/office/2006/metadata/properties/metaAttributes" ct:_="" ma:_="" ma:contentTypeName="Document" ma:contentTypeID="0x010100EC8CC33C3763BF4EA730E2D192C2DDB9" ma:contentTypeVersion="18" ma:contentTypeDescription="Create a new document." ma:contentTypeScope="" ma:versionID="1d13a82d8fbf311ad2d5c7ffcaf8a280">
   <xsd:schema xmlns:xsd="http://www.w3.org/2001/XMLSchema" xmlns:xs="http://www.w3.org/2001/XMLSchema" xmlns:p="http://schemas.microsoft.com/office/2006/metadata/properties" xmlns:ns2="d5759068-2af1-405f-8952-bba64d53795f" xmlns:ns3="fc6929cc-5503-4d88-ab04-1ba5755a3b48" targetNamespace="http://schemas.microsoft.com/office/2006/metadata/properties" ma:root="true" ma:fieldsID="9beb809c4fb16bb24a029ea3bd9fcc9e" ns2:_="" ns3:_="">
     <xsd:import namespace="d5759068-2af1-405f-8952-bba64d53795f"/>
@@ -3703,42 +3710,86 @@
 </ct:contentTypeSchema>
 </file>
 
-<file path=customXml/itemProps1.xml><?xml version="1.0" encoding="utf-8"?>
-<ds:datastoreItem xmlns:ds="http://schemas.openxmlformats.org/officeDocument/2006/customXml" ds:itemID="{B37BF8BA-60FB-44B9-BFEB-4B8F946969EA}">
-  <ds:schemaRefs>
-    <ds:schemaRef ds:uri="http://schemas.openxmlformats.org/officeDocument/2006/bibliography"/>
-  </ds:schemaRefs>
-</ds:datastoreItem>
+<file path=customXml/item2.xml><?xml version="1.0" encoding="utf-8"?>
+<p:properties xmlns:p="http://schemas.microsoft.com/office/2006/metadata/properties" xmlns:xsi="http://www.w3.org/2001/XMLSchema-instance" xmlns:pc="http://schemas.microsoft.com/office/infopath/2007/PartnerControls">
+  <documentManagement>
+    <TaxCatchAll xmlns="d5759068-2af1-405f-8952-bba64d53795f" xsi:nil="true"/>
+    <lcf76f155ced4ddcb4097134ff3c332f xmlns="fc6929cc-5503-4d88-ab04-1ba5755a3b48">
+      <Terms xmlns="http://schemas.microsoft.com/office/infopath/2007/PartnerControls"/>
+    </lcf76f155ced4ddcb4097134ff3c332f>
+    <_dlc_DocId xmlns="d5759068-2af1-405f-8952-bba64d53795f">TQRXN6XH56H4-652439573-2884814</_dlc_DocId>
+    <_dlc_DocIdUrl xmlns="d5759068-2af1-405f-8952-bba64d53795f">
+      <Url>https://cranfield.sharepoint.com/sites/PGVibData/_layouts/15/DocIdRedir.aspx?ID=TQRXN6XH56H4-652439573-2884814</Url>
+      <Description>TQRXN6XH56H4-652439573-2884814</Description>
+    </_dlc_DocIdUrl>
+  </documentManagement>
+</p:properties>
 </file>
 
-<file path=customXml/itemProps2.xml><?xml version="1.0" encoding="utf-8"?>
-<ds:datastoreItem xmlns:ds="http://schemas.openxmlformats.org/officeDocument/2006/customXml" ds:itemID="{1CA9BEE3-0228-47D5-9957-749897919E7C}">
-  <ds:schemaRefs>
-    <ds:schemaRef ds:uri="http://schemas.microsoft.com/sharepoint/v3/contenttype/forms"/>
-  </ds:schemaRefs>
-</ds:datastoreItem>
+<file path=customXml/item3.xml><?xml version="1.0" encoding="utf-8"?>
+<?mso-contentType ?>
+<spe:Receivers xmlns:spe="http://schemas.microsoft.com/sharepoint/events">
+  <Receiver>
+    <Name>Document ID Generator</Name>
+    <Synchronization>Synchronous</Synchronization>
+    <Type>10001</Type>
+    <SequenceNumber>1000</SequenceNumber>
+    <Url/>
+    <Assembly>Microsoft.Office.DocumentManagement, Version=16.0.0.0, Culture=neutral, PublicKeyToken=71e9bce111e9429c</Assembly>
+    <Class>Microsoft.Office.DocumentManagement.Internal.DocIdHandler</Class>
+    <Data/>
+    <Filter/>
+  </Receiver>
+  <Receiver>
+    <Name>Document ID Generator</Name>
+    <Synchronization>Synchronous</Synchronization>
+    <Type>10002</Type>
+    <SequenceNumber>1001</SequenceNumber>
+    <Url/>
+    <Assembly>Microsoft.Office.DocumentManagement, Version=16.0.0.0, Culture=neutral, PublicKeyToken=71e9bce111e9429c</Assembly>
+    <Class>Microsoft.Office.DocumentManagement.Internal.DocIdHandler</Class>
+    <Data/>
+    <Filter/>
+  </Receiver>
+  <Receiver>
+    <Name>Document ID Generator</Name>
+    <Synchronization>Synchronous</Synchronization>
+    <Type>10004</Type>
+    <SequenceNumber>1002</SequenceNumber>
+    <Url/>
+    <Assembly>Microsoft.Office.DocumentManagement, Version=16.0.0.0, Culture=neutral, PublicKeyToken=71e9bce111e9429c</Assembly>
+    <Class>Microsoft.Office.DocumentManagement.Internal.DocIdHandler</Class>
+    <Data/>
+    <Filter/>
+  </Receiver>
+  <Receiver>
+    <Name>Document ID Generator</Name>
+    <Synchronization>Synchronous</Synchronization>
+    <Type>10006</Type>
+    <SequenceNumber>1003</SequenceNumber>
+    <Url/>
+    <Assembly>Microsoft.Office.DocumentManagement, Version=16.0.0.0, Culture=neutral, PublicKeyToken=71e9bce111e9429c</Assembly>
+    <Class>Microsoft.Office.DocumentManagement.Internal.DocIdHandler</Class>
+    <Data/>
+    <Filter/>
+  </Receiver>
+</spe:Receivers>
 </file>
 
-<file path=customXml/itemProps3.xml><?xml version="1.0" encoding="utf-8"?>
-<ds:datastoreItem xmlns:ds="http://schemas.openxmlformats.org/officeDocument/2006/customXml" ds:itemID="{9BF3BFED-8332-44D7-87FA-AF83EF4A9234}">
-  <ds:schemaRefs>
-    <ds:schemaRef ds:uri="http://schemas.microsoft.com/sharepoint/events"/>
-  </ds:schemaRefs>
-</ds:datastoreItem>
+<file path=customXml/item4.xml><?xml version="1.0" encoding="utf-8"?>
+<?mso-contentType ?>
+<FormTemplates xmlns="http://schemas.microsoft.com/sharepoint/v3/contenttype/forms">
+  <Display>DocumentLibraryForm</Display>
+  <Edit>DocumentLibraryForm</Edit>
+  <New>DocumentLibraryForm</New>
+</FormTemplates>
 </file>
 
-<file path=customXml/itemProps4.xml><?xml version="1.0" encoding="utf-8"?>
-<ds:datastoreItem xmlns:ds="http://schemas.openxmlformats.org/officeDocument/2006/customXml" ds:itemID="{FE6286F3-FFA3-49D9-B011-02550189FDEB}">
-  <ds:schemaRefs>
-    <ds:schemaRef ds:uri="http://schemas.microsoft.com/office/2006/metadata/properties"/>
-    <ds:schemaRef ds:uri="http://schemas.microsoft.com/office/infopath/2007/PartnerControls"/>
-    <ds:schemaRef ds:uri="d5759068-2af1-405f-8952-bba64d53795f"/>
-    <ds:schemaRef ds:uri="fc6929cc-5503-4d88-ab04-1ba5755a3b48"/>
-  </ds:schemaRefs>
-</ds:datastoreItem>
+<file path=customXml/item5.xml><?xml version="1.0" encoding="utf-8"?>
+<b:Sources xmlns:b="http://schemas.openxmlformats.org/officeDocument/2006/bibliography" xmlns="http://schemas.openxmlformats.org/officeDocument/2006/bibliography" SelectedStyle="/APASixthEditionOfficeOnline.xsl" StyleName="APA"/>
 </file>
 
-<file path=customXml/itemProps5.xml><?xml version="1.0" encoding="utf-8"?>
+<file path=customXml/itemProps1.xml><?xml version="1.0" encoding="utf-8"?>
 <ds:datastoreItem xmlns:ds="http://schemas.openxmlformats.org/officeDocument/2006/customXml" ds:itemID="{D5F812A0-A3A2-4EE0-A6ED-E9877F3154D7}">
   <ds:schemaRefs>
     <ds:schemaRef ds:uri="http://schemas.microsoft.com/office/2006/metadata/contentType"/>
@@ -3755,4 +3806,39 @@
     <ds:schemaRef ds:uri="http://schemas.microsoft.com/internal/obd"/>
   </ds:schemaRefs>
 </ds:datastoreItem>
+</file>
+
+<file path=customXml/itemProps2.xml><?xml version="1.0" encoding="utf-8"?>
+<ds:datastoreItem xmlns:ds="http://schemas.openxmlformats.org/officeDocument/2006/customXml" ds:itemID="{FE6286F3-FFA3-49D9-B011-02550189FDEB}">
+  <ds:schemaRefs>
+    <ds:schemaRef ds:uri="http://schemas.microsoft.com/office/2006/metadata/properties"/>
+    <ds:schemaRef ds:uri="http://schemas.microsoft.com/office/infopath/2007/PartnerControls"/>
+    <ds:schemaRef ds:uri="d5759068-2af1-405f-8952-bba64d53795f"/>
+    <ds:schemaRef ds:uri="fc6929cc-5503-4d88-ab04-1ba5755a3b48"/>
+  </ds:schemaRefs>
+</ds:datastoreItem>
+</file>
+
+<file path=customXml/itemProps3.xml><?xml version="1.0" encoding="utf-8"?>
+<ds:datastoreItem xmlns:ds="http://schemas.openxmlformats.org/officeDocument/2006/customXml" ds:itemID="{9BF3BFED-8332-44D7-87FA-AF83EF4A9234}">
+  <ds:schemaRefs>
+    <ds:schemaRef ds:uri="http://schemas.microsoft.com/sharepoint/events"/>
+  </ds:schemaRefs>
+</ds:datastoreItem>
+</file>
+
+<file path=customXml/itemProps4.xml><?xml version="1.0" encoding="utf-8"?>
+<ds:datastoreItem xmlns:ds="http://schemas.openxmlformats.org/officeDocument/2006/customXml" ds:itemID="{1CA9BEE3-0228-47D5-9957-749897919E7C}">
+  <ds:schemaRefs>
+    <ds:schemaRef ds:uri="http://schemas.microsoft.com/sharepoint/v3/contenttype/forms"/>
+  </ds:schemaRefs>
+</ds:datastoreItem>
+</file>
+
+<file path=customXml/itemProps5.xml><?xml version="1.0" encoding="utf-8"?>
+<ds:datastoreItem xmlns:ds="http://schemas.openxmlformats.org/officeDocument/2006/customXml" ds:itemID="{B37BF8BA-60FB-44B9-BFEB-4B8F946969EA}">
+  <ds:schemaRefs>
+    <ds:schemaRef ds:uri="http://schemas.openxmlformats.org/officeDocument/2006/bibliography"/>
+  </ds:schemaRefs>
+</ds:datastoreItem>
 </file>
</xml_diff>

<commit_message>
Delivery of diss update and rapid prototype of LLM Reviewer + RAG + Skills file capability
</commit_message>
<xml_diff>
--- a/Submission/s479832 - AutomatingSafetyCriticalEngineering.docx
+++ b/Submission/s479832 - AutomatingSafetyCriticalEngineering.docx
@@ -1,6 +1,6 @@
 
 <file path=word/document.xml><?xml version="1.0" encoding="utf-8"?>
-<w:document xmlns:wpc="http://schemas.microsoft.com/office/word/2010/wordprocessingCanvas" xmlns:cx="http://schemas.microsoft.com/office/drawing/2014/chartex" xmlns:cx1="http://schemas.microsoft.com/office/drawing/2015/9/8/chartex" xmlns:cx2="http://schemas.microsoft.com/office/drawing/2015/10/21/chartex" xmlns:cx3="http://schemas.microsoft.com/office/drawing/2016/5/9/chartex" xmlns:cx4="http://schemas.microsoft.com/office/drawing/2016/5/10/chartex" xmlns:cx5="http://schemas.microsoft.com/office/drawing/2016/5/11/chartex" xmlns:cx6="http://schemas.microsoft.com/office/drawing/2016/5/12/chartex" xmlns:cx7="http://schemas.microsoft.com/office/drawing/2016/5/13/chartex" xmlns:cx8="http://schemas.microsoft.com/office/drawing/2016/5/14/chartex" xmlns:mc="http://schemas.openxmlformats.org/markup-compatibility/2006" xmlns:aink="http://schemas.microsoft.com/office/drawing/2016/ink" xmlns:am3d="http://schemas.microsoft.com/office/drawing/2017/model3d" xmlns:o="urn:schemas-microsoft-com:office:office" xmlns:oel="http://schemas.microsoft.com/office/2019/extlst" xmlns:r="http://schemas.openxmlformats.org/officeDocument/2006/relationships" xmlns:m="http://schemas.openxmlformats.org/officeDocument/2006/math" xmlns:v="urn:schemas-microsoft-com:vml" xmlns:wp14="http://schemas.microsoft.com/office/word/2010/wordprocessingDrawing" xmlns:wp="http://schemas.openxmlformats.org/drawingml/2006/wordprocessingDrawing" xmlns:w10="urn:schemas-microsoft-com:office:word" xmlns:w="http://schemas.openxmlformats.org/wordprocessingml/2006/main" xmlns:w14="http://schemas.microsoft.com/office/word/2010/wordml" xmlns:w15="http://schemas.microsoft.com/office/word/2012/wordml" xmlns:w16cex="http://schemas.microsoft.com/office/word/2018/wordml/cex" xmlns:w16cid="http://schemas.microsoft.com/office/word/2016/wordml/cid" xmlns:w16="http://schemas.microsoft.com/office/word/2018/wordml" xmlns:w16du="http://schemas.microsoft.com/office/word/2023/wordml/word16du" xmlns:w16sdtdh="http://schemas.microsoft.com/office/word/2020/wordml/sdtdatahash" xmlns:w16sdtfl="http://schemas.microsoft.com/office/word/2024/wordml/sdtformatlock" xmlns:w16se="http://schemas.microsoft.com/office/word/2015/wordml/symex" xmlns:wpg="http://schemas.microsoft.com/office/word/2010/wordprocessingGroup" xmlns:wpi="http://schemas.microsoft.com/office/word/2010/wordprocessingInk" xmlns:wne="http://schemas.microsoft.com/office/word/2006/wordml" xmlns:wps="http://schemas.microsoft.com/office/word/2010/wordprocessingShape" mc:Ignorable="w14 w15 w16se w16cid w16 w16cex w16sdtdh w16sdtfl w16du wp14">
+<w:document xmlns:wpc="http://schemas.microsoft.com/office/word/2010/wordprocessingCanvas" xmlns:cx="http://schemas.microsoft.com/office/drawing/2014/chartex" xmlns:cx1="http://schemas.microsoft.com/office/drawing/2015/9/8/chartex" xmlns:cx2="http://schemas.microsoft.com/office/drawing/2015/10/21/chartex" xmlns:cx3="http://schemas.microsoft.com/office/drawing/2016/5/9/chartex" xmlns:cx4="http://schemas.microsoft.com/office/drawing/2016/5/10/chartex" xmlns:cx5="http://schemas.microsoft.com/office/drawing/2016/5/11/chartex" xmlns:cx6="http://schemas.microsoft.com/office/drawing/2016/5/12/chartex" xmlns:cx7="http://schemas.microsoft.com/office/drawing/2016/5/13/chartex" xmlns:cx8="http://schemas.microsoft.com/office/drawing/2016/5/14/chartex" xmlns:mc="http://schemas.openxmlformats.org/markup-compatibility/2006" xmlns:aink="http://schemas.microsoft.com/office/drawing/2016/ink" xmlns:am3d="http://schemas.microsoft.com/office/drawing/2017/model3d" xmlns:o="urn:schemas-microsoft-com:office:office" xmlns:oel="http://schemas.microsoft.com/office/2019/extlst" xmlns:r="http://schemas.openxmlformats.org/officeDocument/2006/relationships" xmlns:m="http://schemas.openxmlformats.org/officeDocument/2006/math" xmlns:v="urn:schemas-microsoft-com:vml" xmlns:wp14="http://schemas.microsoft.com/office/word/2010/wordprocessingDrawing" xmlns:wp="http://schemas.openxmlformats.org/drawingml/2006/wordprocessingDrawing" xmlns:w10="urn:schemas-microsoft-com:office:word" xmlns:w="http://schemas.openxmlformats.org/wordprocessingml/2006/main" xmlns:w14="http://schemas.microsoft.com/office/word/2010/wordml" xmlns:w15="http://schemas.microsoft.com/office/word/2012/wordml" xmlns:w16cei="http://schemas.microsoft.com/office/word/2026/wordml/cei" xmlns:w16cex="http://schemas.microsoft.com/office/word/2018/wordml/cex" xmlns:w16cid="http://schemas.microsoft.com/office/word/2016/wordml/cid" xmlns:w16="http://schemas.microsoft.com/office/word/2018/wordml" xmlns:w16du="http://schemas.microsoft.com/office/word/2023/wordml/word16du" xmlns:w16sdtdh="http://schemas.microsoft.com/office/word/2020/wordml/sdtdatahash" xmlns:w16sdtfl="http://schemas.microsoft.com/office/word/2024/wordml/sdtformatlock" xmlns:w16se="http://schemas.microsoft.com/office/word/2015/wordml/symex" xmlns:wpg="http://schemas.microsoft.com/office/word/2010/wordprocessingGroup" xmlns:wpi="http://schemas.microsoft.com/office/word/2010/wordprocessingInk" xmlns:wne="http://schemas.microsoft.com/office/word/2006/wordml" xmlns:wps="http://schemas.microsoft.com/office/word/2010/wordprocessingShape" mc:Ignorable="w14 w15 w16se w16cid w16 w16cex w16sdtdh w16sdtfl w16du wp14">
   <w:body>
     <w:tbl>
       <w:tblPr>
@@ -588,15 +588,7 @@
         <w:t>adherence to D0-178C</w:t>
       </w:r>
       <w:r>
-        <w:t xml:space="preserve"> is substantiated at the project level, through the application of standards derived processes. The production of planning documents, defining such processes, outline how the recommendations made in D0-178C against lifecycle artefacts, and supplementary standards (330, 331, </w:t>
-      </w:r>
-      <w:proofErr w:type="gramStart"/>
-      <w:r>
-        <w:t>332..</w:t>
-      </w:r>
-      <w:proofErr w:type="gramEnd"/>
-      <w:r>
-        <w:t xml:space="preserve">) are met. </w:t>
+        <w:t xml:space="preserve"> is substantiated at the project level, through the application of standards derived processes. The production of planning documents, defining such processes, outline how the recommendations made in D0-178C against lifecycle artefacts, and supplementary standards (330, 331, 332..) are met. </w:t>
       </w:r>
     </w:p>
     <w:p>
@@ -705,23 +697,7 @@
         <w:jc w:val="both"/>
       </w:pPr>
       <w:r>
-        <w:t xml:space="preserve">Considering the proprietary nature of MBSE tools, and </w:t>
-      </w:r>
-      <w:proofErr w:type="gramStart"/>
-      <w:r>
-        <w:t>so as to</w:t>
-      </w:r>
-      <w:proofErr w:type="gramEnd"/>
-      <w:r>
-        <w:t xml:space="preserve"> smoothly and easily integrate such tools into an agentic workflow, they shall be used, as far as possible, to produce associated artefacts, and must remain used according to license and fair use stipulations. A process which considers impacts to established safety case driven evidence substantiation, must be prioritised, </w:t>
-      </w:r>
-      <w:proofErr w:type="gramStart"/>
-      <w:r>
-        <w:t>so as to</w:t>
-      </w:r>
-      <w:proofErr w:type="gramEnd"/>
-      <w:r>
-        <w:t xml:space="preserve"> not increase certification challenge. The associated airworthiness authority must validate the defined Acceptable Means of Compliance, and as such this must be substantiated by defined and considered processes. These shall be defined within this document, to produce a preliminary response.</w:t>
+        <w:t>Considering the proprietary nature of MBSE tools, and so as to smoothly and easily integrate such tools into an agentic workflow, they shall be used, as far as possible, to produce associated artefacts, and must remain used according to license and fair use stipulations. A process which considers impacts to established safety case driven evidence substantiation, must be prioritised, so as to not increase certification challenge. The associated airworthiness authority must validate the defined Acceptable Means of Compliance, and as such this must be substantiated by defined and considered processes. These shall be defined within this document, to produce a preliminary response.</w:t>
       </w:r>
     </w:p>
     <w:p/>
@@ -781,45 +757,16 @@
     <w:p/>
     <w:p>
       <w:r>
-        <w:t xml:space="preserve">The traditional software lifecycle, when exacted in an Agile manner, is driven by the delivery of artefacts, which provide the necessary evidence, to claim compliance, against pertinent plans and standards documentation, implementing the means of compliance for high level standards such as D0-178C. At each stage of delivery, these artefacts are reviewed to confirm compliance against these </w:t>
-      </w:r>
-      <w:proofErr w:type="gramStart"/>
-      <w:r>
-        <w:t>aforementioned plans</w:t>
-      </w:r>
-      <w:proofErr w:type="gramEnd"/>
-      <w:r>
-        <w:t xml:space="preserve"> and standards, and later, to confirm their functional correctness as per the stated requirements. This is a sequential process, where system level requirements (and associated de-risking activities) are produced, as pre-requisit</w:t>
-      </w:r>
-      <w:r>
-        <w:t xml:space="preserve">e deliverables, to the commencement of </w:t>
-      </w:r>
-      <w:proofErr w:type="gramStart"/>
-      <w:r>
-        <w:t>high level</w:t>
-      </w:r>
-      <w:proofErr w:type="gramEnd"/>
-      <w:r>
-        <w:t xml:space="preserve"> requirement (HLR) implementation, just as HLRs, precede the commencement of </w:t>
-      </w:r>
-      <w:proofErr w:type="gramStart"/>
-      <w:r>
-        <w:t>low level</w:t>
-      </w:r>
-      <w:proofErr w:type="gramEnd"/>
-      <w:r>
-        <w:t xml:space="preserve"> requirement (LLR) implementation.</w:t>
-      </w:r>
-    </w:p>
-    <w:p/>
-    <w:p>
-      <w:proofErr w:type="gramStart"/>
-      <w:r>
-        <w:t>This sequential manner of delivery,</w:t>
-      </w:r>
-      <w:proofErr w:type="gramEnd"/>
-      <w:r>
-        <w:t xml:space="preserve"> serves to facilitate the parallel completion of tasks which relate to each other, at each level in the hierarchy of deliverables. This benefits traditional software teams, who gain suitable time to conduct reviews, whilst other work items can be progressed, or reviewed at the same time.</w:t>
+        <w:t>The traditional software lifecycle, when exacted in an Agile manner, is driven by the delivery of artefacts, which provide the necessary evidence, to claim compliance, against pertinent plans and standards documentation, implementing the means of compliance for high level standards such as D0-178C. At each stage of delivery, these artefacts are reviewed to confirm compliance against these aforementioned plans and standards, and later, to confirm their functional correctness as per the stated requirements. This is a sequential process, where system level requirements (and associated de-risking activities) are produced, as pre-requisit</w:t>
+      </w:r>
+      <w:r>
+        <w:t>e deliverables, to the commencement of high level requirement (HLR) implementation, just as HLRs, precede the commencement of low level requirement (LLR) implementation.</w:t>
+      </w:r>
+    </w:p>
+    <w:p/>
+    <w:p>
+      <w:r>
+        <w:t>This sequential manner of delivery, serves to facilitate the parallel completion of tasks which relate to each other, at each level in the hierarchy of deliverables. This benefits traditional software teams, who gain suitable time to conduct reviews, whilst other work items can be progressed, or reviewed at the same time.</w:t>
       </w:r>
     </w:p>
     <w:p/>
@@ -831,15 +778,7 @@
     <w:p/>
     <w:p>
       <w:r>
-        <w:t xml:space="preserve">As a result, high integrity software, would see the greatest cost savings, from complete automation, yet incurs the highest potential penalty, </w:t>
-      </w:r>
-      <w:proofErr w:type="gramStart"/>
-      <w:r>
-        <w:t>as a consequence of</w:t>
-      </w:r>
-      <w:proofErr w:type="gramEnd"/>
-      <w:r>
-        <w:t xml:space="preserve"> failure in the loss of human life.</w:t>
+        <w:t>As a result, high integrity software, would see the greatest cost savings, from complete automation, yet incurs the highest potential penalty, as a consequence of failure in the loss of human life.</w:t>
       </w:r>
       <w:r>
         <w:t xml:space="preserve"> For this reason, the integration of AI/ML into the domain of safety critical software engineering, is rife with concern and scepticism. As it currently stands, no established means of compliance, for deployed AI/ML has been agreed by the military certification authorities. Ongoing work maintains a position of caution, advising against Level 3 (fully autonomous/human out of the loop) operation.</w:t>
@@ -873,16 +812,141 @@
     <w:p/>
     <w:p>
       <w:pPr>
+        <w:jc w:val="both"/>
+      </w:pPr>
+      <w:r>
+        <w:t>Large Language models, when hosted on premises and load balanced to permit parallel user access, are limited in their capacity, according to hardware limitations such as memory capacity and throughput.</w:t>
+      </w:r>
+      <w:r>
+        <w:t xml:space="preserve"> According to this limitation, businesses may limit both the size of the model, or the floating point accuracy provided to the model weights and bias node values to improve the cost/value model, therefore frontier model utilisation will be considered as a secondary control. The methodology reviews compare traditional approaches (acting as a control), with the stated methodologies, and with the output from a comparable request submitted to a frontier LLM.</w:t>
+      </w:r>
+    </w:p>
+    <w:p>
+      <w:pPr>
+        <w:jc w:val="both"/>
+      </w:pPr>
+    </w:p>
+    <w:p>
+      <w:pPr>
+        <w:jc w:val="both"/>
+      </w:pPr>
+      <w:r>
+        <w:t>To ensure adherence to D0-178C remains viable through the transformation of any traditional process, no stage of the traditional software lifecycle, as defined below, will be omitted from consideration. All artefacts required as per the allocated DAL rating, must be preserved.</w:t>
+      </w:r>
+    </w:p>
+    <w:p>
+      <w:pPr>
         <w:pStyle w:val="Heading3"/>
       </w:pPr>
       <w:r>
+        <w:lastRenderedPageBreak/>
         <w:t>Methodology Review 1: LLM Supported Traditional FEL</w:t>
       </w:r>
     </w:p>
     <w:p>
+      <w:r>
+        <w:t xml:space="preserve">The FEL of a software product already achieves the delivery of both the software artefact and of all associated assurance material. Therefore, LLM enablement of these existing processes can be implemented with a lesser modification to any material substantiating compliance. </w:t>
+      </w:r>
+      <w:r>
+        <w:t xml:space="preserve">A high-level definition of </w:t>
+      </w:r>
+      <w:r>
+        <w:t>such a</w:t>
+      </w:r>
+      <w:r>
+        <w:t xml:space="preserve"> lifecycle is proposed below.</w:t>
+      </w:r>
+    </w:p>
+    <w:p/>
+    <w:p>
+      <w:r>
+        <w:t>&lt;INSERT AGENTIC LIFECYCLE&gt;</w:t>
+      </w:r>
+    </w:p>
+    <w:p/>
+    <w:p>
+      <w:r>
+        <w:t>WHAT IT ACHIEVES</w:t>
+      </w:r>
+    </w:p>
+    <w:p/>
+    <w:p>
+      <w:r>
+        <w:t>WHY</w:t>
+      </w:r>
+    </w:p>
+    <w:p/>
+    <w:p>
+      <w:r>
+        <w:t>COMPARE TO TRADITIONAL</w:t>
+      </w:r>
+    </w:p>
+    <w:p/>
+    <w:p>
+      <w:r>
+        <w:t>COMPARE TO FRONTIER</w:t>
+      </w:r>
+    </w:p>
+    <w:p/>
+    <w:p>
+      <w:r>
+        <w:t>SUIMMARISE</w:t>
+      </w:r>
+    </w:p>
+    <w:p/>
+    <w:p>
       <w:pPr>
         <w:pStyle w:val="Heading3"/>
       </w:pPr>
+      <w:r>
+        <w:t>Methodology Review 2: Agentic Team Based FEL</w:t>
+      </w:r>
+    </w:p>
+    <w:p>
+      <w:r>
+        <w:t>According to the benefits, able to be realised from agentic automation of the development pipeline, the need for human in the loop validation and any requirements to steer/reprompt agentic processes, the existing FEL must be modified. A high-level definition of this lifecycle is proposed below.</w:t>
+      </w:r>
+    </w:p>
+    <w:p/>
+    <w:p>
+      <w:r>
+        <w:t>&lt;INSERT AGENTIC LIFECYCLE&gt;</w:t>
+      </w:r>
+    </w:p>
+    <w:p/>
+    <w:p>
+      <w:r>
+        <w:t>WHAT IT ACHIEVES</w:t>
+      </w:r>
+    </w:p>
+    <w:p/>
+    <w:p>
+      <w:r>
+        <w:t>WHY</w:t>
+      </w:r>
+    </w:p>
+    <w:p/>
+    <w:p>
+      <w:r>
+        <w:t>COMPARE TO TRADITIONAL</w:t>
+      </w:r>
+    </w:p>
+    <w:p/>
+    <w:p>
+      <w:r>
+        <w:t>COMPARE TO FRONTIER</w:t>
+      </w:r>
+    </w:p>
+    <w:p/>
+    <w:p>
+      <w:r>
+        <w:t>SUIMMARISE</w:t>
+      </w:r>
+    </w:p>
+    <w:p>
+      <w:r>
+        <w:br w:type="page"/>
+      </w:r>
     </w:p>
     <w:p/>
     <w:p>
@@ -890,20 +954,6 @@
         <w:pStyle w:val="Heading3"/>
       </w:pPr>
       <w:r>
-        <w:t>Methodology Review 2: Agentic Team Based FEL</w:t>
-      </w:r>
-    </w:p>
-    <w:p>
-      <w:r>
-        <w:br w:type="page"/>
-      </w:r>
-    </w:p>
-    <w:p>
-      <w:pPr>
-        <w:pStyle w:val="Heading3"/>
-      </w:pPr>
-      <w:r>
-        <w:lastRenderedPageBreak/>
         <w:t>Methodology Application and Future Development</w:t>
       </w:r>
     </w:p>
@@ -982,7 +1032,7 @@
 </file>
 
 <file path=word/endnotes.xml><?xml version="1.0" encoding="utf-8"?>
-<w:endnotes xmlns:wpc="http://schemas.microsoft.com/office/word/2010/wordprocessingCanvas" xmlns:cx="http://schemas.microsoft.com/office/drawing/2014/chartex" xmlns:cx1="http://schemas.microsoft.com/office/drawing/2015/9/8/chartex" xmlns:cx2="http://schemas.microsoft.com/office/drawing/2015/10/21/chartex" xmlns:cx3="http://schemas.microsoft.com/office/drawing/2016/5/9/chartex" xmlns:cx4="http://schemas.microsoft.com/office/drawing/2016/5/10/chartex" xmlns:cx5="http://schemas.microsoft.com/office/drawing/2016/5/11/chartex" xmlns:cx6="http://schemas.microsoft.com/office/drawing/2016/5/12/chartex" xmlns:cx7="http://schemas.microsoft.com/office/drawing/2016/5/13/chartex" xmlns:cx8="http://schemas.microsoft.com/office/drawing/2016/5/14/chartex" xmlns:mc="http://schemas.openxmlformats.org/markup-compatibility/2006" xmlns:aink="http://schemas.microsoft.com/office/drawing/2016/ink" xmlns:am3d="http://schemas.microsoft.com/office/drawing/2017/model3d" xmlns:o="urn:schemas-microsoft-com:office:office" xmlns:oel="http://schemas.microsoft.com/office/2019/extlst" xmlns:r="http://schemas.openxmlformats.org/officeDocument/2006/relationships" xmlns:m="http://schemas.openxmlformats.org/officeDocument/2006/math" xmlns:v="urn:schemas-microsoft-com:vml" xmlns:wp14="http://schemas.microsoft.com/office/word/2010/wordprocessingDrawing" xmlns:wp="http://schemas.openxmlformats.org/drawingml/2006/wordprocessingDrawing" xmlns:w10="urn:schemas-microsoft-com:office:word" xmlns:w="http://schemas.openxmlformats.org/wordprocessingml/2006/main" xmlns:w14="http://schemas.microsoft.com/office/word/2010/wordml" xmlns:w15="http://schemas.microsoft.com/office/word/2012/wordml" xmlns:w16cex="http://schemas.microsoft.com/office/word/2018/wordml/cex" xmlns:w16cid="http://schemas.microsoft.com/office/word/2016/wordml/cid" xmlns:w16="http://schemas.microsoft.com/office/word/2018/wordml" xmlns:w16du="http://schemas.microsoft.com/office/word/2023/wordml/word16du" xmlns:w16sdtdh="http://schemas.microsoft.com/office/word/2020/wordml/sdtdatahash" xmlns:w16sdtfl="http://schemas.microsoft.com/office/word/2024/wordml/sdtformatlock" xmlns:w16se="http://schemas.microsoft.com/office/word/2015/wordml/symex" xmlns:wpg="http://schemas.microsoft.com/office/word/2010/wordprocessingGroup" xmlns:wpi="http://schemas.microsoft.com/office/word/2010/wordprocessingInk" xmlns:wne="http://schemas.microsoft.com/office/word/2006/wordml" xmlns:wps="http://schemas.microsoft.com/office/word/2010/wordprocessingShape" mc:Ignorable="w14 w15 w16se w16cid w16 w16cex w16sdtdh w16sdtfl w16du wp14">
+<w:endnotes xmlns:wpc="http://schemas.microsoft.com/office/word/2010/wordprocessingCanvas" xmlns:cx="http://schemas.microsoft.com/office/drawing/2014/chartex" xmlns:cx1="http://schemas.microsoft.com/office/drawing/2015/9/8/chartex" xmlns:cx2="http://schemas.microsoft.com/office/drawing/2015/10/21/chartex" xmlns:cx3="http://schemas.microsoft.com/office/drawing/2016/5/9/chartex" xmlns:cx4="http://schemas.microsoft.com/office/drawing/2016/5/10/chartex" xmlns:cx5="http://schemas.microsoft.com/office/drawing/2016/5/11/chartex" xmlns:cx6="http://schemas.microsoft.com/office/drawing/2016/5/12/chartex" xmlns:cx7="http://schemas.microsoft.com/office/drawing/2016/5/13/chartex" xmlns:cx8="http://schemas.microsoft.com/office/drawing/2016/5/14/chartex" xmlns:mc="http://schemas.openxmlformats.org/markup-compatibility/2006" xmlns:aink="http://schemas.microsoft.com/office/drawing/2016/ink" xmlns:am3d="http://schemas.microsoft.com/office/drawing/2017/model3d" xmlns:o="urn:schemas-microsoft-com:office:office" xmlns:oel="http://schemas.microsoft.com/office/2019/extlst" xmlns:r="http://schemas.openxmlformats.org/officeDocument/2006/relationships" xmlns:m="http://schemas.openxmlformats.org/officeDocument/2006/math" xmlns:v="urn:schemas-microsoft-com:vml" xmlns:wp14="http://schemas.microsoft.com/office/word/2010/wordprocessingDrawing" xmlns:wp="http://schemas.openxmlformats.org/drawingml/2006/wordprocessingDrawing" xmlns:w10="urn:schemas-microsoft-com:office:word" xmlns:w="http://schemas.openxmlformats.org/wordprocessingml/2006/main" xmlns:w14="http://schemas.microsoft.com/office/word/2010/wordml" xmlns:w15="http://schemas.microsoft.com/office/word/2012/wordml" xmlns:w16cei="http://schemas.microsoft.com/office/word/2026/wordml/cei" xmlns:w16cex="http://schemas.microsoft.com/office/word/2018/wordml/cex" xmlns:w16cid="http://schemas.microsoft.com/office/word/2016/wordml/cid" xmlns:w16="http://schemas.microsoft.com/office/word/2018/wordml" xmlns:w16du="http://schemas.microsoft.com/office/word/2023/wordml/word16du" xmlns:w16sdtdh="http://schemas.microsoft.com/office/word/2020/wordml/sdtdatahash" xmlns:w16sdtfl="http://schemas.microsoft.com/office/word/2024/wordml/sdtformatlock" xmlns:w16se="http://schemas.microsoft.com/office/word/2015/wordml/symex" xmlns:wpg="http://schemas.microsoft.com/office/word/2010/wordprocessingGroup" xmlns:wpi="http://schemas.microsoft.com/office/word/2010/wordprocessingInk" xmlns:wne="http://schemas.microsoft.com/office/word/2006/wordml" xmlns:wps="http://schemas.microsoft.com/office/word/2010/wordprocessingShape" mc:Ignorable="w14 w15 w16se w16cid w16 w16cex w16sdtdh w16sdtfl w16du wp14">
   <w:endnote w:type="separator" w:id="-1">
     <w:p>
       <w:r>
@@ -1001,7 +1051,7 @@
 </file>
 
 <file path=word/footer1.xml><?xml version="1.0" encoding="utf-8"?>
-<w:ftr xmlns:wpc="http://schemas.microsoft.com/office/word/2010/wordprocessingCanvas" xmlns:cx="http://schemas.microsoft.com/office/drawing/2014/chartex" xmlns:cx1="http://schemas.microsoft.com/office/drawing/2015/9/8/chartex" xmlns:cx2="http://schemas.microsoft.com/office/drawing/2015/10/21/chartex" xmlns:cx3="http://schemas.microsoft.com/office/drawing/2016/5/9/chartex" xmlns:cx4="http://schemas.microsoft.com/office/drawing/2016/5/10/chartex" xmlns:cx5="http://schemas.microsoft.com/office/drawing/2016/5/11/chartex" xmlns:cx6="http://schemas.microsoft.com/office/drawing/2016/5/12/chartex" xmlns:cx7="http://schemas.microsoft.com/office/drawing/2016/5/13/chartex" xmlns:cx8="http://schemas.microsoft.com/office/drawing/2016/5/14/chartex" xmlns:mc="http://schemas.openxmlformats.org/markup-compatibility/2006" xmlns:aink="http://schemas.microsoft.com/office/drawing/2016/ink" xmlns:am3d="http://schemas.microsoft.com/office/drawing/2017/model3d" xmlns:o="urn:schemas-microsoft-com:office:office" xmlns:oel="http://schemas.microsoft.com/office/2019/extlst" xmlns:r="http://schemas.openxmlformats.org/officeDocument/2006/relationships" xmlns:m="http://schemas.openxmlformats.org/officeDocument/2006/math" xmlns:v="urn:schemas-microsoft-com:vml" xmlns:wp14="http://schemas.microsoft.com/office/word/2010/wordprocessingDrawing" xmlns:wp="http://schemas.openxmlformats.org/drawingml/2006/wordprocessingDrawing" xmlns:w10="urn:schemas-microsoft-com:office:word" xmlns:w="http://schemas.openxmlformats.org/wordprocessingml/2006/main" xmlns:w14="http://schemas.microsoft.com/office/word/2010/wordml" xmlns:w15="http://schemas.microsoft.com/office/word/2012/wordml" xmlns:w16cex="http://schemas.microsoft.com/office/word/2018/wordml/cex" xmlns:w16cid="http://schemas.microsoft.com/office/word/2016/wordml/cid" xmlns:w16="http://schemas.microsoft.com/office/word/2018/wordml" xmlns:w16du="http://schemas.microsoft.com/office/word/2023/wordml/word16du" xmlns:w16sdtdh="http://schemas.microsoft.com/office/word/2020/wordml/sdtdatahash" xmlns:w16sdtfl="http://schemas.microsoft.com/office/word/2024/wordml/sdtformatlock" xmlns:w16se="http://schemas.microsoft.com/office/word/2015/wordml/symex" xmlns:wpg="http://schemas.microsoft.com/office/word/2010/wordprocessingGroup" xmlns:wpi="http://schemas.microsoft.com/office/word/2010/wordprocessingInk" xmlns:wne="http://schemas.microsoft.com/office/word/2006/wordml" xmlns:wps="http://schemas.microsoft.com/office/word/2010/wordprocessingShape" mc:Ignorable="w14 w15 w16se w16cid w16 w16cex w16sdtdh w16sdtfl w16du wp14">
+<w:ftr xmlns:wpc="http://schemas.microsoft.com/office/word/2010/wordprocessingCanvas" xmlns:cx="http://schemas.microsoft.com/office/drawing/2014/chartex" xmlns:cx1="http://schemas.microsoft.com/office/drawing/2015/9/8/chartex" xmlns:cx2="http://schemas.microsoft.com/office/drawing/2015/10/21/chartex" xmlns:cx3="http://schemas.microsoft.com/office/drawing/2016/5/9/chartex" xmlns:cx4="http://schemas.microsoft.com/office/drawing/2016/5/10/chartex" xmlns:cx5="http://schemas.microsoft.com/office/drawing/2016/5/11/chartex" xmlns:cx6="http://schemas.microsoft.com/office/drawing/2016/5/12/chartex" xmlns:cx7="http://schemas.microsoft.com/office/drawing/2016/5/13/chartex" xmlns:cx8="http://schemas.microsoft.com/office/drawing/2016/5/14/chartex" xmlns:mc="http://schemas.openxmlformats.org/markup-compatibility/2006" xmlns:aink="http://schemas.microsoft.com/office/drawing/2016/ink" xmlns:am3d="http://schemas.microsoft.com/office/drawing/2017/model3d" xmlns:o="urn:schemas-microsoft-com:office:office" xmlns:oel="http://schemas.microsoft.com/office/2019/extlst" xmlns:r="http://schemas.openxmlformats.org/officeDocument/2006/relationships" xmlns:m="http://schemas.openxmlformats.org/officeDocument/2006/math" xmlns:v="urn:schemas-microsoft-com:vml" xmlns:wp14="http://schemas.microsoft.com/office/word/2010/wordprocessingDrawing" xmlns:wp="http://schemas.openxmlformats.org/drawingml/2006/wordprocessingDrawing" xmlns:w10="urn:schemas-microsoft-com:office:word" xmlns:w="http://schemas.openxmlformats.org/wordprocessingml/2006/main" xmlns:w14="http://schemas.microsoft.com/office/word/2010/wordml" xmlns:w15="http://schemas.microsoft.com/office/word/2012/wordml" xmlns:w16cei="http://schemas.microsoft.com/office/word/2026/wordml/cei" xmlns:w16cex="http://schemas.microsoft.com/office/word/2018/wordml/cex" xmlns:w16cid="http://schemas.microsoft.com/office/word/2016/wordml/cid" xmlns:w16="http://schemas.microsoft.com/office/word/2018/wordml" xmlns:w16du="http://schemas.microsoft.com/office/word/2023/wordml/word16du" xmlns:w16sdtdh="http://schemas.microsoft.com/office/word/2020/wordml/sdtdatahash" xmlns:w16sdtfl="http://schemas.microsoft.com/office/word/2024/wordml/sdtformatlock" xmlns:w16se="http://schemas.microsoft.com/office/word/2015/wordml/symex" xmlns:wpg="http://schemas.microsoft.com/office/word/2010/wordprocessingGroup" xmlns:wpi="http://schemas.microsoft.com/office/word/2010/wordprocessingInk" xmlns:wne="http://schemas.microsoft.com/office/word/2006/wordml" xmlns:wps="http://schemas.microsoft.com/office/word/2010/wordprocessingShape" mc:Ignorable="w14 w15 w16se w16cid w16 w16cex w16sdtdh w16sdtfl w16du wp14">
   <w:p>
     <w:pPr>
       <w:pStyle w:val="Footer"/>
@@ -1039,7 +1089,7 @@
 </file>
 
 <file path=word/footer2.xml><?xml version="1.0" encoding="utf-8"?>
-<w:ftr xmlns:wpc="http://schemas.microsoft.com/office/word/2010/wordprocessingCanvas" xmlns:cx="http://schemas.microsoft.com/office/drawing/2014/chartex" xmlns:cx1="http://schemas.microsoft.com/office/drawing/2015/9/8/chartex" xmlns:cx2="http://schemas.microsoft.com/office/drawing/2015/10/21/chartex" xmlns:cx3="http://schemas.microsoft.com/office/drawing/2016/5/9/chartex" xmlns:cx4="http://schemas.microsoft.com/office/drawing/2016/5/10/chartex" xmlns:cx5="http://schemas.microsoft.com/office/drawing/2016/5/11/chartex" xmlns:cx6="http://schemas.microsoft.com/office/drawing/2016/5/12/chartex" xmlns:cx7="http://schemas.microsoft.com/office/drawing/2016/5/13/chartex" xmlns:cx8="http://schemas.microsoft.com/office/drawing/2016/5/14/chartex" xmlns:mc="http://schemas.openxmlformats.org/markup-compatibility/2006" xmlns:aink="http://schemas.microsoft.com/office/drawing/2016/ink" xmlns:am3d="http://schemas.microsoft.com/office/drawing/2017/model3d" xmlns:o="urn:schemas-microsoft-com:office:office" xmlns:oel="http://schemas.microsoft.com/office/2019/extlst" xmlns:r="http://schemas.openxmlformats.org/officeDocument/2006/relationships" xmlns:m="http://schemas.openxmlformats.org/officeDocument/2006/math" xmlns:v="urn:schemas-microsoft-com:vml" xmlns:wp14="http://schemas.microsoft.com/office/word/2010/wordprocessingDrawing" xmlns:wp="http://schemas.openxmlformats.org/drawingml/2006/wordprocessingDrawing" xmlns:w10="urn:schemas-microsoft-com:office:word" xmlns:w="http://schemas.openxmlformats.org/wordprocessingml/2006/main" xmlns:w14="http://schemas.microsoft.com/office/word/2010/wordml" xmlns:w15="http://schemas.microsoft.com/office/word/2012/wordml" xmlns:w16cex="http://schemas.microsoft.com/office/word/2018/wordml/cex" xmlns:w16cid="http://schemas.microsoft.com/office/word/2016/wordml/cid" xmlns:w16="http://schemas.microsoft.com/office/word/2018/wordml" xmlns:w16du="http://schemas.microsoft.com/office/word/2023/wordml/word16du" xmlns:w16sdtdh="http://schemas.microsoft.com/office/word/2020/wordml/sdtdatahash" xmlns:w16sdtfl="http://schemas.microsoft.com/office/word/2024/wordml/sdtformatlock" xmlns:w16se="http://schemas.microsoft.com/office/word/2015/wordml/symex" xmlns:wpg="http://schemas.microsoft.com/office/word/2010/wordprocessingGroup" xmlns:wpi="http://schemas.microsoft.com/office/word/2010/wordprocessingInk" xmlns:wne="http://schemas.microsoft.com/office/word/2006/wordml" xmlns:wps="http://schemas.microsoft.com/office/word/2010/wordprocessingShape" mc:Ignorable="w14 w15 w16se w16cid w16 w16cex w16sdtdh w16sdtfl w16du wp14">
+<w:ftr xmlns:wpc="http://schemas.microsoft.com/office/word/2010/wordprocessingCanvas" xmlns:cx="http://schemas.microsoft.com/office/drawing/2014/chartex" xmlns:cx1="http://schemas.microsoft.com/office/drawing/2015/9/8/chartex" xmlns:cx2="http://schemas.microsoft.com/office/drawing/2015/10/21/chartex" xmlns:cx3="http://schemas.microsoft.com/office/drawing/2016/5/9/chartex" xmlns:cx4="http://schemas.microsoft.com/office/drawing/2016/5/10/chartex" xmlns:cx5="http://schemas.microsoft.com/office/drawing/2016/5/11/chartex" xmlns:cx6="http://schemas.microsoft.com/office/drawing/2016/5/12/chartex" xmlns:cx7="http://schemas.microsoft.com/office/drawing/2016/5/13/chartex" xmlns:cx8="http://schemas.microsoft.com/office/drawing/2016/5/14/chartex" xmlns:mc="http://schemas.openxmlformats.org/markup-compatibility/2006" xmlns:aink="http://schemas.microsoft.com/office/drawing/2016/ink" xmlns:am3d="http://schemas.microsoft.com/office/drawing/2017/model3d" xmlns:o="urn:schemas-microsoft-com:office:office" xmlns:oel="http://schemas.microsoft.com/office/2019/extlst" xmlns:r="http://schemas.openxmlformats.org/officeDocument/2006/relationships" xmlns:m="http://schemas.openxmlformats.org/officeDocument/2006/math" xmlns:v="urn:schemas-microsoft-com:vml" xmlns:wp14="http://schemas.microsoft.com/office/word/2010/wordprocessingDrawing" xmlns:wp="http://schemas.openxmlformats.org/drawingml/2006/wordprocessingDrawing" xmlns:w10="urn:schemas-microsoft-com:office:word" xmlns:w="http://schemas.openxmlformats.org/wordprocessingml/2006/main" xmlns:w14="http://schemas.microsoft.com/office/word/2010/wordml" xmlns:w15="http://schemas.microsoft.com/office/word/2012/wordml" xmlns:w16cei="http://schemas.microsoft.com/office/word/2026/wordml/cei" xmlns:w16cex="http://schemas.microsoft.com/office/word/2018/wordml/cex" xmlns:w16cid="http://schemas.microsoft.com/office/word/2016/wordml/cid" xmlns:w16="http://schemas.microsoft.com/office/word/2018/wordml" xmlns:w16du="http://schemas.microsoft.com/office/word/2023/wordml/word16du" xmlns:w16sdtdh="http://schemas.microsoft.com/office/word/2020/wordml/sdtdatahash" xmlns:w16sdtfl="http://schemas.microsoft.com/office/word/2024/wordml/sdtformatlock" xmlns:w16se="http://schemas.microsoft.com/office/word/2015/wordml/symex" xmlns:wpg="http://schemas.microsoft.com/office/word/2010/wordprocessingGroup" xmlns:wpi="http://schemas.microsoft.com/office/word/2010/wordprocessingInk" xmlns:wne="http://schemas.microsoft.com/office/word/2006/wordml" xmlns:wps="http://schemas.microsoft.com/office/word/2010/wordprocessingShape" mc:Ignorable="w14 w15 w16se w16cid w16 w16cex w16sdtdh w16sdtfl w16du wp14">
   <w:p>
     <w:pPr>
       <w:pStyle w:val="Footer"/>
@@ -1113,7 +1163,7 @@
 </file>
 
 <file path=word/footer3.xml><?xml version="1.0" encoding="utf-8"?>
-<w:ftr xmlns:wpc="http://schemas.microsoft.com/office/word/2010/wordprocessingCanvas" xmlns:cx="http://schemas.microsoft.com/office/drawing/2014/chartex" xmlns:cx1="http://schemas.microsoft.com/office/drawing/2015/9/8/chartex" xmlns:cx2="http://schemas.microsoft.com/office/drawing/2015/10/21/chartex" xmlns:cx3="http://schemas.microsoft.com/office/drawing/2016/5/9/chartex" xmlns:cx4="http://schemas.microsoft.com/office/drawing/2016/5/10/chartex" xmlns:cx5="http://schemas.microsoft.com/office/drawing/2016/5/11/chartex" xmlns:cx6="http://schemas.microsoft.com/office/drawing/2016/5/12/chartex" xmlns:cx7="http://schemas.microsoft.com/office/drawing/2016/5/13/chartex" xmlns:cx8="http://schemas.microsoft.com/office/drawing/2016/5/14/chartex" xmlns:mc="http://schemas.openxmlformats.org/markup-compatibility/2006" xmlns:aink="http://schemas.microsoft.com/office/drawing/2016/ink" xmlns:am3d="http://schemas.microsoft.com/office/drawing/2017/model3d" xmlns:o="urn:schemas-microsoft-com:office:office" xmlns:oel="http://schemas.microsoft.com/office/2019/extlst" xmlns:r="http://schemas.openxmlformats.org/officeDocument/2006/relationships" xmlns:m="http://schemas.openxmlformats.org/officeDocument/2006/math" xmlns:v="urn:schemas-microsoft-com:vml" xmlns:wp14="http://schemas.microsoft.com/office/word/2010/wordprocessingDrawing" xmlns:wp="http://schemas.openxmlformats.org/drawingml/2006/wordprocessingDrawing" xmlns:w10="urn:schemas-microsoft-com:office:word" xmlns:w="http://schemas.openxmlformats.org/wordprocessingml/2006/main" xmlns:w14="http://schemas.microsoft.com/office/word/2010/wordml" xmlns:w15="http://schemas.microsoft.com/office/word/2012/wordml" xmlns:w16cex="http://schemas.microsoft.com/office/word/2018/wordml/cex" xmlns:w16cid="http://schemas.microsoft.com/office/word/2016/wordml/cid" xmlns:w16="http://schemas.microsoft.com/office/word/2018/wordml" xmlns:w16du="http://schemas.microsoft.com/office/word/2023/wordml/word16du" xmlns:w16sdtdh="http://schemas.microsoft.com/office/word/2020/wordml/sdtdatahash" xmlns:w16sdtfl="http://schemas.microsoft.com/office/word/2024/wordml/sdtformatlock" xmlns:w16se="http://schemas.microsoft.com/office/word/2015/wordml/symex" xmlns:wpg="http://schemas.microsoft.com/office/word/2010/wordprocessingGroup" xmlns:wpi="http://schemas.microsoft.com/office/word/2010/wordprocessingInk" xmlns:wne="http://schemas.microsoft.com/office/word/2006/wordml" xmlns:wps="http://schemas.microsoft.com/office/word/2010/wordprocessingShape" mc:Ignorable="w14 w15 w16se w16cid w16 w16cex w16sdtdh w16sdtfl w16du wp14">
+<w:ftr xmlns:wpc="http://schemas.microsoft.com/office/word/2010/wordprocessingCanvas" xmlns:cx="http://schemas.microsoft.com/office/drawing/2014/chartex" xmlns:cx1="http://schemas.microsoft.com/office/drawing/2015/9/8/chartex" xmlns:cx2="http://schemas.microsoft.com/office/drawing/2015/10/21/chartex" xmlns:cx3="http://schemas.microsoft.com/office/drawing/2016/5/9/chartex" xmlns:cx4="http://schemas.microsoft.com/office/drawing/2016/5/10/chartex" xmlns:cx5="http://schemas.microsoft.com/office/drawing/2016/5/11/chartex" xmlns:cx6="http://schemas.microsoft.com/office/drawing/2016/5/12/chartex" xmlns:cx7="http://schemas.microsoft.com/office/drawing/2016/5/13/chartex" xmlns:cx8="http://schemas.microsoft.com/office/drawing/2016/5/14/chartex" xmlns:mc="http://schemas.openxmlformats.org/markup-compatibility/2006" xmlns:aink="http://schemas.microsoft.com/office/drawing/2016/ink" xmlns:am3d="http://schemas.microsoft.com/office/drawing/2017/model3d" xmlns:o="urn:schemas-microsoft-com:office:office" xmlns:oel="http://schemas.microsoft.com/office/2019/extlst" xmlns:r="http://schemas.openxmlformats.org/officeDocument/2006/relationships" xmlns:m="http://schemas.openxmlformats.org/officeDocument/2006/math" xmlns:v="urn:schemas-microsoft-com:vml" xmlns:wp14="http://schemas.microsoft.com/office/word/2010/wordprocessingDrawing" xmlns:wp="http://schemas.openxmlformats.org/drawingml/2006/wordprocessingDrawing" xmlns:w10="urn:schemas-microsoft-com:office:word" xmlns:w="http://schemas.openxmlformats.org/wordprocessingml/2006/main" xmlns:w14="http://schemas.microsoft.com/office/word/2010/wordml" xmlns:w15="http://schemas.microsoft.com/office/word/2012/wordml" xmlns:w16cei="http://schemas.microsoft.com/office/word/2026/wordml/cei" xmlns:w16cex="http://schemas.microsoft.com/office/word/2018/wordml/cex" xmlns:w16cid="http://schemas.microsoft.com/office/word/2016/wordml/cid" xmlns:w16="http://schemas.microsoft.com/office/word/2018/wordml" xmlns:w16du="http://schemas.microsoft.com/office/word/2023/wordml/word16du" xmlns:w16sdtdh="http://schemas.microsoft.com/office/word/2020/wordml/sdtdatahash" xmlns:w16sdtfl="http://schemas.microsoft.com/office/word/2024/wordml/sdtformatlock" xmlns:w16se="http://schemas.microsoft.com/office/word/2015/wordml/symex" xmlns:wpg="http://schemas.microsoft.com/office/word/2010/wordprocessingGroup" xmlns:wpi="http://schemas.microsoft.com/office/word/2010/wordprocessingInk" xmlns:wne="http://schemas.microsoft.com/office/word/2006/wordml" xmlns:wps="http://schemas.microsoft.com/office/word/2010/wordprocessingShape" mc:Ignorable="w14 w15 w16se w16cid w16 w16cex w16sdtdh w16sdtfl w16du wp14">
   <w:p>
     <w:pPr>
       <w:pStyle w:val="Header4"/>
@@ -1146,7 +1196,7 @@
 </file>
 
 <file path=word/footnotes.xml><?xml version="1.0" encoding="utf-8"?>
-<w:footnotes xmlns:wpc="http://schemas.microsoft.com/office/word/2010/wordprocessingCanvas" xmlns:cx="http://schemas.microsoft.com/office/drawing/2014/chartex" xmlns:cx1="http://schemas.microsoft.com/office/drawing/2015/9/8/chartex" xmlns:cx2="http://schemas.microsoft.com/office/drawing/2015/10/21/chartex" xmlns:cx3="http://schemas.microsoft.com/office/drawing/2016/5/9/chartex" xmlns:cx4="http://schemas.microsoft.com/office/drawing/2016/5/10/chartex" xmlns:cx5="http://schemas.microsoft.com/office/drawing/2016/5/11/chartex" xmlns:cx6="http://schemas.microsoft.com/office/drawing/2016/5/12/chartex" xmlns:cx7="http://schemas.microsoft.com/office/drawing/2016/5/13/chartex" xmlns:cx8="http://schemas.microsoft.com/office/drawing/2016/5/14/chartex" xmlns:mc="http://schemas.openxmlformats.org/markup-compatibility/2006" xmlns:aink="http://schemas.microsoft.com/office/drawing/2016/ink" xmlns:am3d="http://schemas.microsoft.com/office/drawing/2017/model3d" xmlns:o="urn:schemas-microsoft-com:office:office" xmlns:oel="http://schemas.microsoft.com/office/2019/extlst" xmlns:r="http://schemas.openxmlformats.org/officeDocument/2006/relationships" xmlns:m="http://schemas.openxmlformats.org/officeDocument/2006/math" xmlns:v="urn:schemas-microsoft-com:vml" xmlns:wp14="http://schemas.microsoft.com/office/word/2010/wordprocessingDrawing" xmlns:wp="http://schemas.openxmlformats.org/drawingml/2006/wordprocessingDrawing" xmlns:w10="urn:schemas-microsoft-com:office:word" xmlns:w="http://schemas.openxmlformats.org/wordprocessingml/2006/main" xmlns:w14="http://schemas.microsoft.com/office/word/2010/wordml" xmlns:w15="http://schemas.microsoft.com/office/word/2012/wordml" xmlns:w16cex="http://schemas.microsoft.com/office/word/2018/wordml/cex" xmlns:w16cid="http://schemas.microsoft.com/office/word/2016/wordml/cid" xmlns:w16="http://schemas.microsoft.com/office/word/2018/wordml" xmlns:w16du="http://schemas.microsoft.com/office/word/2023/wordml/word16du" xmlns:w16sdtdh="http://schemas.microsoft.com/office/word/2020/wordml/sdtdatahash" xmlns:w16sdtfl="http://schemas.microsoft.com/office/word/2024/wordml/sdtformatlock" xmlns:w16se="http://schemas.microsoft.com/office/word/2015/wordml/symex" xmlns:wpg="http://schemas.microsoft.com/office/word/2010/wordprocessingGroup" xmlns:wpi="http://schemas.microsoft.com/office/word/2010/wordprocessingInk" xmlns:wne="http://schemas.microsoft.com/office/word/2006/wordml" xmlns:wps="http://schemas.microsoft.com/office/word/2010/wordprocessingShape" mc:Ignorable="w14 w15 w16se w16cid w16 w16cex w16sdtdh w16sdtfl w16du wp14">
+<w:footnotes xmlns:wpc="http://schemas.microsoft.com/office/word/2010/wordprocessingCanvas" xmlns:cx="http://schemas.microsoft.com/office/drawing/2014/chartex" xmlns:cx1="http://schemas.microsoft.com/office/drawing/2015/9/8/chartex" xmlns:cx2="http://schemas.microsoft.com/office/drawing/2015/10/21/chartex" xmlns:cx3="http://schemas.microsoft.com/office/drawing/2016/5/9/chartex" xmlns:cx4="http://schemas.microsoft.com/office/drawing/2016/5/10/chartex" xmlns:cx5="http://schemas.microsoft.com/office/drawing/2016/5/11/chartex" xmlns:cx6="http://schemas.microsoft.com/office/drawing/2016/5/12/chartex" xmlns:cx7="http://schemas.microsoft.com/office/drawing/2016/5/13/chartex" xmlns:cx8="http://schemas.microsoft.com/office/drawing/2016/5/14/chartex" xmlns:mc="http://schemas.openxmlformats.org/markup-compatibility/2006" xmlns:aink="http://schemas.microsoft.com/office/drawing/2016/ink" xmlns:am3d="http://schemas.microsoft.com/office/drawing/2017/model3d" xmlns:o="urn:schemas-microsoft-com:office:office" xmlns:oel="http://schemas.microsoft.com/office/2019/extlst" xmlns:r="http://schemas.openxmlformats.org/officeDocument/2006/relationships" xmlns:m="http://schemas.openxmlformats.org/officeDocument/2006/math" xmlns:v="urn:schemas-microsoft-com:vml" xmlns:wp14="http://schemas.microsoft.com/office/word/2010/wordprocessingDrawing" xmlns:wp="http://schemas.openxmlformats.org/drawingml/2006/wordprocessingDrawing" xmlns:w10="urn:schemas-microsoft-com:office:word" xmlns:w="http://schemas.openxmlformats.org/wordprocessingml/2006/main" xmlns:w14="http://schemas.microsoft.com/office/word/2010/wordml" xmlns:w15="http://schemas.microsoft.com/office/word/2012/wordml" xmlns:w16cei="http://schemas.microsoft.com/office/word/2026/wordml/cei" xmlns:w16cex="http://schemas.microsoft.com/office/word/2018/wordml/cex" xmlns:w16cid="http://schemas.microsoft.com/office/word/2016/wordml/cid" xmlns:w16="http://schemas.microsoft.com/office/word/2018/wordml" xmlns:w16du="http://schemas.microsoft.com/office/word/2023/wordml/word16du" xmlns:w16sdtdh="http://schemas.microsoft.com/office/word/2020/wordml/sdtdatahash" xmlns:w16sdtfl="http://schemas.microsoft.com/office/word/2024/wordml/sdtformatlock" xmlns:w16se="http://schemas.microsoft.com/office/word/2015/wordml/symex" xmlns:wpg="http://schemas.microsoft.com/office/word/2010/wordprocessingGroup" xmlns:wpi="http://schemas.microsoft.com/office/word/2010/wordprocessingInk" xmlns:wne="http://schemas.microsoft.com/office/word/2006/wordml" xmlns:wps="http://schemas.microsoft.com/office/word/2010/wordprocessingShape" mc:Ignorable="w14 w15 w16se w16cid w16 w16cex w16sdtdh w16sdtfl w16du wp14">
   <w:footnote w:type="separator" w:id="-1">
     <w:p>
       <w:r>
@@ -1165,7 +1215,7 @@
 </file>
 
 <file path=word/numbering.xml><?xml version="1.0" encoding="utf-8"?>
-<w:numbering xmlns:wpc="http://schemas.microsoft.com/office/word/2010/wordprocessingCanvas" xmlns:cx="http://schemas.microsoft.com/office/drawing/2014/chartex" xmlns:cx1="http://schemas.microsoft.com/office/drawing/2015/9/8/chartex" xmlns:cx2="http://schemas.microsoft.com/office/drawing/2015/10/21/chartex" xmlns:cx3="http://schemas.microsoft.com/office/drawing/2016/5/9/chartex" xmlns:cx4="http://schemas.microsoft.com/office/drawing/2016/5/10/chartex" xmlns:cx5="http://schemas.microsoft.com/office/drawing/2016/5/11/chartex" xmlns:cx6="http://schemas.microsoft.com/office/drawing/2016/5/12/chartex" xmlns:cx7="http://schemas.microsoft.com/office/drawing/2016/5/13/chartex" xmlns:cx8="http://schemas.microsoft.com/office/drawing/2016/5/14/chartex" xmlns:mc="http://schemas.openxmlformats.org/markup-compatibility/2006" xmlns:aink="http://schemas.microsoft.com/office/drawing/2016/ink" xmlns:am3d="http://schemas.microsoft.com/office/drawing/2017/model3d" xmlns:o="urn:schemas-microsoft-com:office:office" xmlns:oel="http://schemas.microsoft.com/office/2019/extlst" xmlns:r="http://schemas.openxmlformats.org/officeDocument/2006/relationships" xmlns:m="http://schemas.openxmlformats.org/officeDocument/2006/math" xmlns:v="urn:schemas-microsoft-com:vml" xmlns:wp14="http://schemas.microsoft.com/office/word/2010/wordprocessingDrawing" xmlns:wp="http://schemas.openxmlformats.org/drawingml/2006/wordprocessingDrawing" xmlns:w10="urn:schemas-microsoft-com:office:word" xmlns:w="http://schemas.openxmlformats.org/wordprocessingml/2006/main" xmlns:w14="http://schemas.microsoft.com/office/word/2010/wordml" xmlns:w15="http://schemas.microsoft.com/office/word/2012/wordml" xmlns:w16cex="http://schemas.microsoft.com/office/word/2018/wordml/cex" xmlns:w16cid="http://schemas.microsoft.com/office/word/2016/wordml/cid" xmlns:w16="http://schemas.microsoft.com/office/word/2018/wordml" xmlns:w16du="http://schemas.microsoft.com/office/word/2023/wordml/word16du" xmlns:w16sdtdh="http://schemas.microsoft.com/office/word/2020/wordml/sdtdatahash" xmlns:w16sdtfl="http://schemas.microsoft.com/office/word/2024/wordml/sdtformatlock" xmlns:w16se="http://schemas.microsoft.com/office/word/2015/wordml/symex" xmlns:wpg="http://schemas.microsoft.com/office/word/2010/wordprocessingGroup" xmlns:wpi="http://schemas.microsoft.com/office/word/2010/wordprocessingInk" xmlns:wne="http://schemas.microsoft.com/office/word/2006/wordml" xmlns:wps="http://schemas.microsoft.com/office/word/2010/wordprocessingShape" mc:Ignorable="w14 w15 w16se w16cid w16 w16cex w16sdtdh w16sdtfl w16du wp14">
+<w:numbering xmlns:wpc="http://schemas.microsoft.com/office/word/2010/wordprocessingCanvas" xmlns:cx="http://schemas.microsoft.com/office/drawing/2014/chartex" xmlns:cx1="http://schemas.microsoft.com/office/drawing/2015/9/8/chartex" xmlns:cx2="http://schemas.microsoft.com/office/drawing/2015/10/21/chartex" xmlns:cx3="http://schemas.microsoft.com/office/drawing/2016/5/9/chartex" xmlns:cx4="http://schemas.microsoft.com/office/drawing/2016/5/10/chartex" xmlns:cx5="http://schemas.microsoft.com/office/drawing/2016/5/11/chartex" xmlns:cx6="http://schemas.microsoft.com/office/drawing/2016/5/12/chartex" xmlns:cx7="http://schemas.microsoft.com/office/drawing/2016/5/13/chartex" xmlns:cx8="http://schemas.microsoft.com/office/drawing/2016/5/14/chartex" xmlns:mc="http://schemas.openxmlformats.org/markup-compatibility/2006" xmlns:aink="http://schemas.microsoft.com/office/drawing/2016/ink" xmlns:am3d="http://schemas.microsoft.com/office/drawing/2017/model3d" xmlns:o="urn:schemas-microsoft-com:office:office" xmlns:oel="http://schemas.microsoft.com/office/2019/extlst" xmlns:r="http://schemas.openxmlformats.org/officeDocument/2006/relationships" xmlns:m="http://schemas.openxmlformats.org/officeDocument/2006/math" xmlns:v="urn:schemas-microsoft-com:vml" xmlns:wp14="http://schemas.microsoft.com/office/word/2010/wordprocessingDrawing" xmlns:wp="http://schemas.openxmlformats.org/drawingml/2006/wordprocessingDrawing" xmlns:w10="urn:schemas-microsoft-com:office:word" xmlns:w="http://schemas.openxmlformats.org/wordprocessingml/2006/main" xmlns:w14="http://schemas.microsoft.com/office/word/2010/wordml" xmlns:w15="http://schemas.microsoft.com/office/word/2012/wordml" xmlns:w16cei="http://schemas.microsoft.com/office/word/2026/wordml/cei" xmlns:w16cex="http://schemas.microsoft.com/office/word/2018/wordml/cex" xmlns:w16cid="http://schemas.microsoft.com/office/word/2016/wordml/cid" xmlns:w16="http://schemas.microsoft.com/office/word/2018/wordml" xmlns:w16du="http://schemas.microsoft.com/office/word/2023/wordml/word16du" xmlns:w16sdtdh="http://schemas.microsoft.com/office/word/2020/wordml/sdtdatahash" xmlns:w16sdtfl="http://schemas.microsoft.com/office/word/2024/wordml/sdtformatlock" xmlns:w16se="http://schemas.microsoft.com/office/word/2015/wordml/symex" xmlns:wpg="http://schemas.microsoft.com/office/word/2010/wordprocessingGroup" xmlns:wpi="http://schemas.microsoft.com/office/word/2010/wordprocessingInk" xmlns:wne="http://schemas.microsoft.com/office/word/2006/wordml" xmlns:wps="http://schemas.microsoft.com/office/word/2010/wordprocessingShape" mc:Ignorable="w14 w15 w16se w16cid w16 w16cex w16sdtdh w16sdtfl w16du wp14">
   <w:abstractNum w:abstractNumId="0" w15:restartNumberingAfterBreak="0">
     <w:nsid w:val="FFFFFF1D"/>
     <w:multiLevelType w:val="multilevel"/>
@@ -3708,81 +3758,6 @@
 </file>
 
 <file path=customXml/item1.xml><?xml version="1.0" encoding="utf-8"?>
-<?mso-contentType ?>
-<FormTemplates xmlns="http://schemas.microsoft.com/sharepoint/v3/contenttype/forms">
-  <Display>DocumentLibraryForm</Display>
-  <Edit>DocumentLibraryForm</Edit>
-  <New>DocumentLibraryForm</New>
-</FormTemplates>
-</file>
-
-<file path=customXml/item2.xml><?xml version="1.0" encoding="utf-8"?>
-<?mso-contentType ?>
-<spe:Receivers xmlns:spe="http://schemas.microsoft.com/sharepoint/events">
-  <Receiver>
-    <Name>Document ID Generator</Name>
-    <Synchronization>Synchronous</Synchronization>
-    <Type>10001</Type>
-    <SequenceNumber>1000</SequenceNumber>
-    <Url/>
-    <Assembly>Microsoft.Office.DocumentManagement, Version=16.0.0.0, Culture=neutral, PublicKeyToken=71e9bce111e9429c</Assembly>
-    <Class>Microsoft.Office.DocumentManagement.Internal.DocIdHandler</Class>
-    <Data/>
-    <Filter/>
-  </Receiver>
-  <Receiver>
-    <Name>Document ID Generator</Name>
-    <Synchronization>Synchronous</Synchronization>
-    <Type>10002</Type>
-    <SequenceNumber>1001</SequenceNumber>
-    <Url/>
-    <Assembly>Microsoft.Office.DocumentManagement, Version=16.0.0.0, Culture=neutral, PublicKeyToken=71e9bce111e9429c</Assembly>
-    <Class>Microsoft.Office.DocumentManagement.Internal.DocIdHandler</Class>
-    <Data/>
-    <Filter/>
-  </Receiver>
-  <Receiver>
-    <Name>Document ID Generator</Name>
-    <Synchronization>Synchronous</Synchronization>
-    <Type>10004</Type>
-    <SequenceNumber>1002</SequenceNumber>
-    <Url/>
-    <Assembly>Microsoft.Office.DocumentManagement, Version=16.0.0.0, Culture=neutral, PublicKeyToken=71e9bce111e9429c</Assembly>
-    <Class>Microsoft.Office.DocumentManagement.Internal.DocIdHandler</Class>
-    <Data/>
-    <Filter/>
-  </Receiver>
-  <Receiver>
-    <Name>Document ID Generator</Name>
-    <Synchronization>Synchronous</Synchronization>
-    <Type>10006</Type>
-    <SequenceNumber>1003</SequenceNumber>
-    <Url/>
-    <Assembly>Microsoft.Office.DocumentManagement, Version=16.0.0.0, Culture=neutral, PublicKeyToken=71e9bce111e9429c</Assembly>
-    <Class>Microsoft.Office.DocumentManagement.Internal.DocIdHandler</Class>
-    <Data/>
-    <Filter/>
-  </Receiver>
-</spe:Receivers>
-</file>
-
-<file path=customXml/item3.xml><?xml version="1.0" encoding="utf-8"?>
-<p:properties xmlns:p="http://schemas.microsoft.com/office/2006/metadata/properties" xmlns:xsi="http://www.w3.org/2001/XMLSchema-instance" xmlns:pc="http://schemas.microsoft.com/office/infopath/2007/PartnerControls">
-  <documentManagement>
-    <TaxCatchAll xmlns="d5759068-2af1-405f-8952-bba64d53795f" xsi:nil="true"/>
-    <lcf76f155ced4ddcb4097134ff3c332f xmlns="fc6929cc-5503-4d88-ab04-1ba5755a3b48">
-      <Terms xmlns="http://schemas.microsoft.com/office/infopath/2007/PartnerControls"/>
-    </lcf76f155ced4ddcb4097134ff3c332f>
-    <_dlc_DocId xmlns="d5759068-2af1-405f-8952-bba64d53795f">TQRXN6XH56H4-652439573-2884814</_dlc_DocId>
-    <_dlc_DocIdUrl xmlns="d5759068-2af1-405f-8952-bba64d53795f">
-      <Url>https://cranfield.sharepoint.com/sites/PGVibData/_layouts/15/DocIdRedir.aspx?ID=TQRXN6XH56H4-652439573-2884814</Url>
-      <Description>TQRXN6XH56H4-652439573-2884814</Description>
-    </_dlc_DocIdUrl>
-  </documentManagement>
-</p:properties>
-</file>
-
-<file path=customXml/item4.xml><?xml version="1.0" encoding="utf-8"?>
 <ct:contentTypeSchema xmlns:ct="http://schemas.microsoft.com/office/2006/metadata/contentType" xmlns:ma="http://schemas.microsoft.com/office/2006/metadata/properties/metaAttributes" ct:_="" ma:_="" ma:contentTypeName="Document" ma:contentTypeID="0x010100EC8CC33C3763BF4EA730E2D192C2DDB9" ma:contentTypeVersion="18" ma:contentTypeDescription="Create a new document." ma:contentTypeScope="" ma:versionID="1d13a82d8fbf311ad2d5c7ffcaf8a280">
   <xsd:schema xmlns:xsd="http://www.w3.org/2001/XMLSchema" xmlns:xs="http://www.w3.org/2001/XMLSchema" xmlns:p="http://schemas.microsoft.com/office/2006/metadata/properties" xmlns:ns2="d5759068-2af1-405f-8952-bba64d53795f" xmlns:ns3="fc6929cc-5503-4d88-ab04-1ba5755a3b48" targetNamespace="http://schemas.microsoft.com/office/2006/metadata/properties" ma:root="true" ma:fieldsID="9beb809c4fb16bb24a029ea3bd9fcc9e" ns2:_="" ns3:_="">
     <xsd:import namespace="d5759068-2af1-405f-8952-bba64d53795f"/>
@@ -4062,38 +4037,86 @@
 </ct:contentTypeSchema>
 </file>
 
+<file path=customXml/item2.xml><?xml version="1.0" encoding="utf-8"?>
+<p:properties xmlns:p="http://schemas.microsoft.com/office/2006/metadata/properties" xmlns:xsi="http://www.w3.org/2001/XMLSchema-instance" xmlns:pc="http://schemas.microsoft.com/office/infopath/2007/PartnerControls">
+  <documentManagement>
+    <TaxCatchAll xmlns="d5759068-2af1-405f-8952-bba64d53795f" xsi:nil="true"/>
+    <lcf76f155ced4ddcb4097134ff3c332f xmlns="fc6929cc-5503-4d88-ab04-1ba5755a3b48">
+      <Terms xmlns="http://schemas.microsoft.com/office/infopath/2007/PartnerControls"/>
+    </lcf76f155ced4ddcb4097134ff3c332f>
+    <_dlc_DocId xmlns="d5759068-2af1-405f-8952-bba64d53795f">TQRXN6XH56H4-652439573-2884814</_dlc_DocId>
+    <_dlc_DocIdUrl xmlns="d5759068-2af1-405f-8952-bba64d53795f">
+      <Url>https://cranfield.sharepoint.com/sites/PGVibData/_layouts/15/DocIdRedir.aspx?ID=TQRXN6XH56H4-652439573-2884814</Url>
+      <Description>TQRXN6XH56H4-652439573-2884814</Description>
+    </_dlc_DocIdUrl>
+  </documentManagement>
+</p:properties>
+</file>
+
+<file path=customXml/item3.xml><?xml version="1.0" encoding="utf-8"?>
+<?mso-contentType ?>
+<spe:Receivers xmlns:spe="http://schemas.microsoft.com/sharepoint/events">
+  <Receiver>
+    <Name>Document ID Generator</Name>
+    <Synchronization>Synchronous</Synchronization>
+    <Type>10001</Type>
+    <SequenceNumber>1000</SequenceNumber>
+    <Url/>
+    <Assembly>Microsoft.Office.DocumentManagement, Version=16.0.0.0, Culture=neutral, PublicKeyToken=71e9bce111e9429c</Assembly>
+    <Class>Microsoft.Office.DocumentManagement.Internal.DocIdHandler</Class>
+    <Data/>
+    <Filter/>
+  </Receiver>
+  <Receiver>
+    <Name>Document ID Generator</Name>
+    <Synchronization>Synchronous</Synchronization>
+    <Type>10002</Type>
+    <SequenceNumber>1001</SequenceNumber>
+    <Url/>
+    <Assembly>Microsoft.Office.DocumentManagement, Version=16.0.0.0, Culture=neutral, PublicKeyToken=71e9bce111e9429c</Assembly>
+    <Class>Microsoft.Office.DocumentManagement.Internal.DocIdHandler</Class>
+    <Data/>
+    <Filter/>
+  </Receiver>
+  <Receiver>
+    <Name>Document ID Generator</Name>
+    <Synchronization>Synchronous</Synchronization>
+    <Type>10004</Type>
+    <SequenceNumber>1002</SequenceNumber>
+    <Url/>
+    <Assembly>Microsoft.Office.DocumentManagement, Version=16.0.0.0, Culture=neutral, PublicKeyToken=71e9bce111e9429c</Assembly>
+    <Class>Microsoft.Office.DocumentManagement.Internal.DocIdHandler</Class>
+    <Data/>
+    <Filter/>
+  </Receiver>
+  <Receiver>
+    <Name>Document ID Generator</Name>
+    <Synchronization>Synchronous</Synchronization>
+    <Type>10006</Type>
+    <SequenceNumber>1003</SequenceNumber>
+    <Url/>
+    <Assembly>Microsoft.Office.DocumentManagement, Version=16.0.0.0, Culture=neutral, PublicKeyToken=71e9bce111e9429c</Assembly>
+    <Class>Microsoft.Office.DocumentManagement.Internal.DocIdHandler</Class>
+    <Data/>
+    <Filter/>
+  </Receiver>
+</spe:Receivers>
+</file>
+
+<file path=customXml/item4.xml><?xml version="1.0" encoding="utf-8"?>
+<?mso-contentType ?>
+<FormTemplates xmlns="http://schemas.microsoft.com/sharepoint/v3/contenttype/forms">
+  <Display>DocumentLibraryForm</Display>
+  <Edit>DocumentLibraryForm</Edit>
+  <New>DocumentLibraryForm</New>
+</FormTemplates>
+</file>
+
 <file path=customXml/item5.xml><?xml version="1.0" encoding="utf-8"?>
 <b:Sources xmlns:b="http://schemas.openxmlformats.org/officeDocument/2006/bibliography" xmlns="http://schemas.openxmlformats.org/officeDocument/2006/bibliography" SelectedStyle="/APASixthEditionOfficeOnline.xsl" StyleName="APA"/>
 </file>
 
 <file path=customXml/itemProps1.xml><?xml version="1.0" encoding="utf-8"?>
-<ds:datastoreItem xmlns:ds="http://schemas.openxmlformats.org/officeDocument/2006/customXml" ds:itemID="{1CA9BEE3-0228-47D5-9957-749897919E7C}">
-  <ds:schemaRefs>
-    <ds:schemaRef ds:uri="http://schemas.microsoft.com/sharepoint/v3/contenttype/forms"/>
-  </ds:schemaRefs>
-</ds:datastoreItem>
-</file>
-
-<file path=customXml/itemProps2.xml><?xml version="1.0" encoding="utf-8"?>
-<ds:datastoreItem xmlns:ds="http://schemas.openxmlformats.org/officeDocument/2006/customXml" ds:itemID="{9BF3BFED-8332-44D7-87FA-AF83EF4A9234}">
-  <ds:schemaRefs>
-    <ds:schemaRef ds:uri="http://schemas.microsoft.com/sharepoint/events"/>
-  </ds:schemaRefs>
-</ds:datastoreItem>
-</file>
-
-<file path=customXml/itemProps3.xml><?xml version="1.0" encoding="utf-8"?>
-<ds:datastoreItem xmlns:ds="http://schemas.openxmlformats.org/officeDocument/2006/customXml" ds:itemID="{FE6286F3-FFA3-49D9-B011-02550189FDEB}">
-  <ds:schemaRefs>
-    <ds:schemaRef ds:uri="http://schemas.microsoft.com/office/2006/metadata/properties"/>
-    <ds:schemaRef ds:uri="http://schemas.microsoft.com/office/infopath/2007/PartnerControls"/>
-    <ds:schemaRef ds:uri="d5759068-2af1-405f-8952-bba64d53795f"/>
-    <ds:schemaRef ds:uri="fc6929cc-5503-4d88-ab04-1ba5755a3b48"/>
-  </ds:schemaRefs>
-</ds:datastoreItem>
-</file>
-
-<file path=customXml/itemProps4.xml><?xml version="1.0" encoding="utf-8"?>
 <ds:datastoreItem xmlns:ds="http://schemas.openxmlformats.org/officeDocument/2006/customXml" ds:itemID="{D5F812A0-A3A2-4EE0-A6ED-E9877F3154D7}">
   <ds:schemaRefs>
     <ds:schemaRef ds:uri="http://schemas.microsoft.com/office/2006/metadata/contentType"/>
@@ -4112,6 +4135,33 @@
 </ds:datastoreItem>
 </file>
 
+<file path=customXml/itemProps2.xml><?xml version="1.0" encoding="utf-8"?>
+<ds:datastoreItem xmlns:ds="http://schemas.openxmlformats.org/officeDocument/2006/customXml" ds:itemID="{FE6286F3-FFA3-49D9-B011-02550189FDEB}">
+  <ds:schemaRefs>
+    <ds:schemaRef ds:uri="http://schemas.microsoft.com/office/2006/metadata/properties"/>
+    <ds:schemaRef ds:uri="http://schemas.microsoft.com/office/infopath/2007/PartnerControls"/>
+    <ds:schemaRef ds:uri="d5759068-2af1-405f-8952-bba64d53795f"/>
+    <ds:schemaRef ds:uri="fc6929cc-5503-4d88-ab04-1ba5755a3b48"/>
+  </ds:schemaRefs>
+</ds:datastoreItem>
+</file>
+
+<file path=customXml/itemProps3.xml><?xml version="1.0" encoding="utf-8"?>
+<ds:datastoreItem xmlns:ds="http://schemas.openxmlformats.org/officeDocument/2006/customXml" ds:itemID="{9BF3BFED-8332-44D7-87FA-AF83EF4A9234}">
+  <ds:schemaRefs>
+    <ds:schemaRef ds:uri="http://schemas.microsoft.com/sharepoint/events"/>
+  </ds:schemaRefs>
+</ds:datastoreItem>
+</file>
+
+<file path=customXml/itemProps4.xml><?xml version="1.0" encoding="utf-8"?>
+<ds:datastoreItem xmlns:ds="http://schemas.openxmlformats.org/officeDocument/2006/customXml" ds:itemID="{1CA9BEE3-0228-47D5-9957-749897919E7C}">
+  <ds:schemaRefs>
+    <ds:schemaRef ds:uri="http://schemas.microsoft.com/sharepoint/v3/contenttype/forms"/>
+  </ds:schemaRefs>
+</ds:datastoreItem>
+</file>
+
 <file path=customXml/itemProps5.xml><?xml version="1.0" encoding="utf-8"?>
 <ds:datastoreItem xmlns:ds="http://schemas.openxmlformats.org/officeDocument/2006/customXml" ds:itemID="{B37BF8BA-60FB-44B9-BFEB-4B8F946969EA}">
   <ds:schemaRefs>

</xml_diff>

<commit_message>
Additions to report content.
</commit_message>
<xml_diff>
--- a/Submission/s479832 - AutomatingSafetyCriticalEngineering.docx
+++ b/Submission/s479832 - AutomatingSafetyCriticalEngineering.docx
@@ -1,6 +1,6 @@
 
 <file path=word/document.xml><?xml version="1.0" encoding="utf-8"?>
-<w:document xmlns:wpc="http://schemas.microsoft.com/office/word/2010/wordprocessingCanvas" xmlns:cx="http://schemas.microsoft.com/office/drawing/2014/chartex" xmlns:cx1="http://schemas.microsoft.com/office/drawing/2015/9/8/chartex" xmlns:cx2="http://schemas.microsoft.com/office/drawing/2015/10/21/chartex" xmlns:cx3="http://schemas.microsoft.com/office/drawing/2016/5/9/chartex" xmlns:cx4="http://schemas.microsoft.com/office/drawing/2016/5/10/chartex" xmlns:cx5="http://schemas.microsoft.com/office/drawing/2016/5/11/chartex" xmlns:cx6="http://schemas.microsoft.com/office/drawing/2016/5/12/chartex" xmlns:cx7="http://schemas.microsoft.com/office/drawing/2016/5/13/chartex" xmlns:cx8="http://schemas.microsoft.com/office/drawing/2016/5/14/chartex" xmlns:mc="http://schemas.openxmlformats.org/markup-compatibility/2006" xmlns:aink="http://schemas.microsoft.com/office/drawing/2016/ink" xmlns:am3d="http://schemas.microsoft.com/office/drawing/2017/model3d" xmlns:o="urn:schemas-microsoft-com:office:office" xmlns:oel="http://schemas.microsoft.com/office/2019/extlst" xmlns:r="http://schemas.openxmlformats.org/officeDocument/2006/relationships" xmlns:m="http://schemas.openxmlformats.org/officeDocument/2006/math" xmlns:v="urn:schemas-microsoft-com:vml" xmlns:wp14="http://schemas.microsoft.com/office/word/2010/wordprocessingDrawing" xmlns:wp="http://schemas.openxmlformats.org/drawingml/2006/wordprocessingDrawing" xmlns:w10="urn:schemas-microsoft-com:office:word" xmlns:w="http://schemas.openxmlformats.org/wordprocessingml/2006/main" xmlns:w14="http://schemas.microsoft.com/office/word/2010/wordml" xmlns:w15="http://schemas.microsoft.com/office/word/2012/wordml" xmlns:w16cei="http://schemas.microsoft.com/office/word/2026/wordml/cei" xmlns:w16cex="http://schemas.microsoft.com/office/word/2018/wordml/cex" xmlns:w16cid="http://schemas.microsoft.com/office/word/2016/wordml/cid" xmlns:w16="http://schemas.microsoft.com/office/word/2018/wordml" xmlns:w16du="http://schemas.microsoft.com/office/word/2023/wordml/word16du" xmlns:w16sdtdh="http://schemas.microsoft.com/office/word/2020/wordml/sdtdatahash" xmlns:w16sdtfl="http://schemas.microsoft.com/office/word/2024/wordml/sdtformatlock" xmlns:w16se="http://schemas.microsoft.com/office/word/2015/wordml/symex" xmlns:wpg="http://schemas.microsoft.com/office/word/2010/wordprocessingGroup" xmlns:wpi="http://schemas.microsoft.com/office/word/2010/wordprocessingInk" xmlns:wne="http://schemas.microsoft.com/office/word/2006/wordml" xmlns:wps="http://schemas.microsoft.com/office/word/2010/wordprocessingShape" mc:Ignorable="w14 w15 w16se w16cid w16 w16cex w16sdtdh w16sdtfl w16du wp14">
+<w:document xmlns:wpc="http://schemas.microsoft.com/office/word/2010/wordprocessingCanvas" xmlns:cx="http://schemas.microsoft.com/office/drawing/2014/chartex" xmlns:cx1="http://schemas.microsoft.com/office/drawing/2015/9/8/chartex" xmlns:cx2="http://schemas.microsoft.com/office/drawing/2015/10/21/chartex" xmlns:cx3="http://schemas.microsoft.com/office/drawing/2016/5/9/chartex" xmlns:cx4="http://schemas.microsoft.com/office/drawing/2016/5/10/chartex" xmlns:cx5="http://schemas.microsoft.com/office/drawing/2016/5/11/chartex" xmlns:cx6="http://schemas.microsoft.com/office/drawing/2016/5/12/chartex" xmlns:cx7="http://schemas.microsoft.com/office/drawing/2016/5/13/chartex" xmlns:cx8="http://schemas.microsoft.com/office/drawing/2016/5/14/chartex" xmlns:mc="http://schemas.openxmlformats.org/markup-compatibility/2006" xmlns:aink="http://schemas.microsoft.com/office/drawing/2016/ink" xmlns:am3d="http://schemas.microsoft.com/office/drawing/2017/model3d" xmlns:o="urn:schemas-microsoft-com:office:office" xmlns:oel="http://schemas.microsoft.com/office/2019/extlst" xmlns:r="http://schemas.openxmlformats.org/officeDocument/2006/relationships" xmlns:m="http://schemas.openxmlformats.org/officeDocument/2006/math" xmlns:v="urn:schemas-microsoft-com:vml" xmlns:wp14="http://schemas.microsoft.com/office/word/2010/wordprocessingDrawing" xmlns:wp="http://schemas.openxmlformats.org/drawingml/2006/wordprocessingDrawing" xmlns:w10="urn:schemas-microsoft-com:office:word" xmlns:w="http://schemas.openxmlformats.org/wordprocessingml/2006/main" xmlns:w14="http://schemas.microsoft.com/office/word/2010/wordml" xmlns:w15="http://schemas.microsoft.com/office/word/2012/wordml" xmlns:w16cex="http://schemas.microsoft.com/office/word/2018/wordml/cex" xmlns:w16cid="http://schemas.microsoft.com/office/word/2016/wordml/cid" xmlns:w16="http://schemas.microsoft.com/office/word/2018/wordml" xmlns:w16du="http://schemas.microsoft.com/office/word/2023/wordml/word16du" xmlns:w16sdtdh="http://schemas.microsoft.com/office/word/2020/wordml/sdtdatahash" xmlns:w16sdtfl="http://schemas.microsoft.com/office/word/2024/wordml/sdtformatlock" xmlns:w16se="http://schemas.microsoft.com/office/word/2015/wordml/symex" xmlns:wpg="http://schemas.microsoft.com/office/word/2010/wordprocessingGroup" xmlns:wpi="http://schemas.microsoft.com/office/word/2010/wordprocessingInk" xmlns:wne="http://schemas.microsoft.com/office/word/2006/wordml" xmlns:wps="http://schemas.microsoft.com/office/word/2010/wordprocessingShape" mc:Ignorable="w14 w15 w16se w16cid w16 w16cex w16sdtdh w16sdtfl w16du wp14">
   <w:body>
     <w:tbl>
       <w:tblPr>
@@ -756,41 +756,104 @@
     </w:p>
     <w:p/>
     <w:p>
-      <w:r>
-        <w:t>The traditional software lifecycle, when exacted in an Agile manner, is driven by the delivery of artefacts, which provide the necessary evidence, to claim compliance, against pertinent plans and standards documentation, implementing the means of compliance for high level standards such as D0-178C. At each stage of delivery, these artefacts are reviewed to confirm compliance against these aforementioned plans and standards, and later, to confirm their functional correctness as per the stated requirements. This is a sequential process, where system level requirements (and associated de-risking activities) are produced, as pre-requisit</w:t>
+      <w:pPr>
+        <w:jc w:val="both"/>
+      </w:pPr>
+      <w:r>
+        <w:t xml:space="preserve">The context of operation, monetary value and implications of a systems failure, inform the methodologies used to assess the suitability and correctness, of software’s design, implementation and verification. Historically, software written in assembly was subjected to additional review around memory usage, efficient instruction and flight testing as means of substantiating means of compliance. With </w:t>
+      </w:r>
+      <w:r>
+        <w:t>the observed</w:t>
+      </w:r>
+      <w:r>
+        <w:t xml:space="preserve"> increase in software complexity, </w:t>
+      </w:r>
+      <w:r>
+        <w:t>provably permutative approaches to verification, and formal methods of software implementation become infeasible. D0178A defined processes, requiring the correct documentation, review and testing of software, across a structured lifecycle. The standards next releas</w:t>
+      </w:r>
+      <w:r>
+        <w:t>es D0178B and D0178C, shifted to promote compliance to objectives (themselves split according to Design Assurance Levels (DAL), through the collection and demonstration of evidence, defined in plans and standards, which are defined to meet D0178Cs objectives.</w:t>
+      </w:r>
+    </w:p>
+    <w:p/>
+    <w:p>
+      <w:pPr>
+        <w:jc w:val="both"/>
+      </w:pPr>
+      <w:r>
+        <w:t xml:space="preserve">The traditional software lifecycle, when exacted in an Agile manner, is driven by the delivery of artefacts, which provide the necessary evidence, to claim compliance, against pertinent plans and standards documentation, implementing the means of compliance for high level standards such as D0-178C. </w:t>
+      </w:r>
+    </w:p>
+    <w:p>
+      <w:pPr>
+        <w:jc w:val="both"/>
+      </w:pPr>
+    </w:p>
+    <w:p>
+      <w:pPr>
+        <w:jc w:val="both"/>
+      </w:pPr>
+      <w:r>
+        <w:t>At each stage of delivery, these artefacts are reviewed to confirm compliance against these aforementioned plans and standards, and later, to confirm their functional correctness as per the stated requirements. This is a sequential process, where system level requirements (and associated de-risking activities) are produced, as pre-requisit</w:t>
       </w:r>
       <w:r>
         <w:t>e deliverables, to the commencement of high level requirement (HLR) implementation, just as HLRs, precede the commencement of low level requirement (LLR) implementation.</w:t>
       </w:r>
     </w:p>
+    <w:p>
+      <w:pPr>
+        <w:jc w:val="both"/>
+      </w:pPr>
+    </w:p>
+    <w:p>
+      <w:pPr>
+        <w:jc w:val="both"/>
+      </w:pPr>
+      <w:r>
+        <w:t>This sequential manner of delivery, serves to facilitate the parallel completion of tasks which relate to each other, at each level in the hierarchy of deliverables. This benefits traditional software teams, who gain suitable time to conduct reviews, whilst other work items can be progressed, or reviewed at the same time.</w:t>
+      </w:r>
+    </w:p>
+    <w:p>
+      <w:pPr>
+        <w:jc w:val="both"/>
+      </w:pPr>
+    </w:p>
+    <w:p>
+      <w:pPr>
+        <w:jc w:val="both"/>
+      </w:pPr>
+      <w:r>
+        <w:t>This additional time, serving to increase the quality in the delivered artefact, ultimately costs the project money, scaling in an almost exponential manner, according to an increase in the Design Assurance Level (DAL) associated with the project / domain.</w:t>
+      </w:r>
+    </w:p>
+    <w:p>
+      <w:pPr>
+        <w:jc w:val="both"/>
+      </w:pPr>
+    </w:p>
+    <w:p>
+      <w:pPr>
+        <w:jc w:val="both"/>
+      </w:pPr>
+      <w:r>
+        <w:t>As a result, high integrity software, would see the greatest cost savings, from complete automation, yet incurs the highest potential penalty, as a consequence of failure in the loss of human life.</w:t>
+      </w:r>
+      <w:r>
+        <w:t xml:space="preserve"> For this reason, the integration of AI/ML into the domain of safety critical software engineering, is rife with concern and scepticism. As it currently stands, no established means of compliance, for deployed AI/ML has been agreed by the military certification authorities. Ongoing work maintains a position of caution, advising against Level 3 (fully autonomous/human out of the loop) operation.</w:t>
+      </w:r>
+    </w:p>
     <w:p/>
     <w:p>
       <w:r>
-        <w:t>This sequential manner of delivery, serves to facilitate the parallel completion of tasks which relate to each other, at each level in the hierarchy of deliverables. This benefits traditional software teams, who gain suitable time to conduct reviews, whilst other work items can be progressed, or reviewed at the same time.</w:t>
-      </w:r>
-    </w:p>
-    <w:p/>
-    <w:p>
-      <w:r>
-        <w:t>This additional time, serving to increase the quality in the delivered artefact, ultimately costs the project money, scaling in an almost exponential manner, according to an increase in the Design Assurance Level (DAL) associated with the project / domain.</w:t>
-      </w:r>
-    </w:p>
-    <w:p/>
-    <w:p>
-      <w:r>
-        <w:t>As a result, high integrity software, would see the greatest cost savings, from complete automation, yet incurs the highest potential penalty, as a consequence of failure in the loss of human life.</w:t>
-      </w:r>
-      <w:r>
-        <w:t xml:space="preserve"> For this reason, the integration of AI/ML into the domain of safety critical software engineering, is rife with concern and scepticism. As it currently stands, no established means of compliance, for deployed AI/ML has been agreed by the military certification authorities. Ongoing work maintains a position of caution, advising against Level 3 (fully autonomous/human out of the loop) operation.</w:t>
-      </w:r>
-    </w:p>
-    <w:p/>
-    <w:p/>
+        <w:br w:type="page"/>
+      </w:r>
+    </w:p>
     <w:p>
       <w:pPr>
         <w:pStyle w:val="Heading3"/>
       </w:pPr>
       <w:r>
+        <w:lastRenderedPageBreak/>
         <w:t>Methodology Reviews</w:t>
       </w:r>
     </w:p>
@@ -815,10 +878,7 @@
         <w:jc w:val="both"/>
       </w:pPr>
       <w:r>
-        <w:t>Large Language models, when hosted on premises and load balanced to permit parallel user access, are limited in their capacity, according to hardware limitations such as memory capacity and throughput.</w:t>
-      </w:r>
-      <w:r>
-        <w:t xml:space="preserve"> According to this limitation, businesses may limit both the size of the model, or the floating point accuracy provided to the model weights and bias node values to improve the cost/value model, therefore frontier model utilisation will be considered as a secondary control. The methodology reviews compare traditional approaches (acting as a control), with the stated methodologies, and with the output from a comparable request submitted to a frontier LLM.</w:t>
+        <w:t>Large Language models, when hosted on premises and load balanced to permit parallel user access, are limited in their capacity, according to hardware limitations such as memory capacity and throughput. According to this limitation, businesses may limit both the size of the model, or the floating point accuracy provided to the model weights and bias node values to improve the cost/value model, therefore frontier model utilisation will be considered as a secondary control. The methodology reviews compare traditional approaches (acting as a control), with the stated methodologies, and with the output from a comparable request submitted to a frontier LLM.</w:t>
       </w:r>
     </w:p>
     <w:p>
@@ -832,6 +892,20 @@
       </w:pPr>
       <w:r>
         <w:t>To ensure adherence to D0-178C remains viable through the transformation of any traditional process, no stage of the traditional software lifecycle, as defined below, will be omitted from consideration. All artefacts required as per the allocated DAL rating, must be preserved.</w:t>
+      </w:r>
+    </w:p>
+    <w:p>
+      <w:pPr>
+        <w:rPr>
+          <w:rFonts w:eastAsiaTheme="majorEastAsia" w:cstheme="majorBidi"/>
+          <w:b/>
+          <w:color w:val="442B58"/>
+          <w:sz w:val="28"/>
+          <w:szCs w:val="28"/>
+        </w:rPr>
+      </w:pPr>
+      <w:r>
+        <w:br w:type="page"/>
       </w:r>
     </w:p>
     <w:p>
@@ -844,28 +918,2202 @@
       </w:r>
     </w:p>
     <w:p>
-      <w:r>
-        <w:t xml:space="preserve">The FEL of a software product already achieves the delivery of both the software artefact and of all associated assurance material. Therefore, LLM enablement of these existing processes can be implemented with a lesser modification to any material substantiating compliance. </w:t>
-      </w:r>
-      <w:r>
-        <w:t xml:space="preserve">A high-level definition of </w:t>
-      </w:r>
-      <w:r>
-        <w:t>such a</w:t>
-      </w:r>
-      <w:r>
-        <w:t xml:space="preserve"> lifecycle is proposed below.</w:t>
+      <w:pPr>
+        <w:jc w:val="both"/>
+      </w:pPr>
+      <w:r>
+        <w:t>The FEL of a software product already achieves the delivery of both the software artefact and of all associated assurance material. Therefore, LLM enablement of these existing processes can be implemented with a lesser modification to any material substantiating compliance. A high</w:t>
+      </w:r>
+      <w:r>
+        <w:t xml:space="preserve"> </w:t>
+      </w:r>
+      <w:r>
+        <w:t>level definition of such a lifecycle is proposed below.</w:t>
       </w:r>
     </w:p>
     <w:p/>
     <w:p>
       <w:r>
-        <w:t>&lt;INSERT AGENTIC LIFECYCLE&gt;</w:t>
+        <w:rPr>
+          <w:noProof/>
+        </w:rPr>
+        <mc:AlternateContent>
+          <mc:Choice Requires="wps">
+            <w:drawing>
+              <wp:anchor distT="0" distB="0" distL="114300" distR="114300" simplePos="0" relativeHeight="251670528" behindDoc="0" locked="0" layoutInCell="1" allowOverlap="1" wp14:anchorId="56949F41" wp14:editId="5AB2EB5B">
+                <wp:simplePos x="0" y="0"/>
+                <wp:positionH relativeFrom="column">
+                  <wp:posOffset>2764790</wp:posOffset>
+                </wp:positionH>
+                <wp:positionV relativeFrom="paragraph">
+                  <wp:posOffset>64770</wp:posOffset>
+                </wp:positionV>
+                <wp:extent cx="1352550" cy="5919788"/>
+                <wp:effectExtent l="19050" t="0" r="19050" b="43180"/>
+                <wp:wrapNone/>
+                <wp:docPr id="1456902598" name="Arrow: Down 2"/>
+                <wp:cNvGraphicFramePr/>
+                <a:graphic xmlns:a="http://schemas.openxmlformats.org/drawingml/2006/main">
+                  <a:graphicData uri="http://schemas.microsoft.com/office/word/2010/wordprocessingShape">
+                    <wps:wsp>
+                      <wps:cNvSpPr/>
+                      <wps:spPr>
+                        <a:xfrm>
+                          <a:off x="0" y="0"/>
+                          <a:ext cx="1352550" cy="5919788"/>
+                        </a:xfrm>
+                        <a:prstGeom prst="downArrow">
+                          <a:avLst/>
+                        </a:prstGeom>
+                      </wps:spPr>
+                      <wps:style>
+                        <a:lnRef idx="2">
+                          <a:schemeClr val="accent1">
+                            <a:shade val="15000"/>
+                          </a:schemeClr>
+                        </a:lnRef>
+                        <a:fillRef idx="1">
+                          <a:schemeClr val="accent1"/>
+                        </a:fillRef>
+                        <a:effectRef idx="0">
+                          <a:schemeClr val="accent1"/>
+                        </a:effectRef>
+                        <a:fontRef idx="minor">
+                          <a:schemeClr val="lt1"/>
+                        </a:fontRef>
+                      </wps:style>
+                      <wps:bodyPr rot="0" spcFirstLastPara="0" vertOverflow="overflow" horzOverflow="overflow" vert="horz" wrap="square" lIns="91440" tIns="45720" rIns="91440" bIns="45720" numCol="1" spcCol="0" rtlCol="0" fromWordArt="0" anchor="ctr" anchorCtr="0" forceAA="0" compatLnSpc="1">
+                        <a:prstTxWarp prst="textNoShape">
+                          <a:avLst/>
+                        </a:prstTxWarp>
+                        <a:noAutofit/>
+                      </wps:bodyPr>
+                    </wps:wsp>
+                  </a:graphicData>
+                </a:graphic>
+                <wp14:sizeRelV relativeFrom="margin">
+                  <wp14:pctHeight>0</wp14:pctHeight>
+                </wp14:sizeRelV>
+              </wp:anchor>
+            </w:drawing>
+          </mc:Choice>
+          <mc:Fallback>
+            <w:pict>
+              <v:shapetype w14:anchorId="78782567" id="_x0000_t67" coordsize="21600,21600" o:spt="67" adj="16200,5400" path="m0@0l@1@0@1,0@2,0@2@0,21600@0,10800,21600xe">
+                <v:stroke joinstyle="miter"/>
+                <v:formulas>
+                  <v:f eqn="val #0"/>
+                  <v:f eqn="val #1"/>
+                  <v:f eqn="sum height 0 #1"/>
+                  <v:f eqn="sum 10800 0 #1"/>
+                  <v:f eqn="sum width 0 #0"/>
+                  <v:f eqn="prod @4 @3 10800"/>
+                  <v:f eqn="sum width 0 @5"/>
+                </v:formulas>
+                <v:path o:connecttype="custom" o:connectlocs="10800,0;0,@0;10800,21600;21600,@0" o:connectangles="270,180,90,0" textboxrect="@1,0,@2,@6"/>
+                <v:handles>
+                  <v:h position="#1,#0" xrange="0,10800" yrange="0,21600"/>
+                </v:handles>
+              </v:shapetype>
+              <v:shape id="Arrow: Down 2" o:spid="_x0000_s1026" type="#_x0000_t67" style="position:absolute;margin-left:217.7pt;margin-top:5.1pt;width:106.5pt;height:466.15pt;z-index:251670528;visibility:visible;mso-wrap-style:square;mso-height-percent:0;mso-wrap-distance-left:9pt;mso-wrap-distance-top:0;mso-wrap-distance-right:9pt;mso-wrap-distance-bottom:0;mso-position-horizontal:absolute;mso-position-horizontal-relative:text;mso-position-vertical:absolute;mso-position-vertical-relative:text;mso-height-percent:0;mso-height-relative:margin;v-text-anchor:middle" o:gfxdata="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" adj="19132" fillcolor="#5b9bd5 [3204]" strokecolor="#091723 [484]" strokeweight="1pt"/>
+            </w:pict>
+          </mc:Fallback>
+        </mc:AlternateContent>
+      </w:r>
+      <w:r>
+        <w:rPr>
+          <w:noProof/>
+        </w:rPr>
+        <mc:AlternateContent>
+          <mc:Choice Requires="wps">
+            <w:drawing>
+              <wp:anchor distT="0" distB="0" distL="114300" distR="114300" simplePos="0" relativeHeight="251659264" behindDoc="0" locked="0" layoutInCell="1" allowOverlap="1" wp14:anchorId="28959A2B" wp14:editId="2F7A9DF4">
+                <wp:simplePos x="0" y="0"/>
+                <wp:positionH relativeFrom="column">
+                  <wp:posOffset>97790</wp:posOffset>
+                </wp:positionH>
+                <wp:positionV relativeFrom="paragraph">
+                  <wp:posOffset>131446</wp:posOffset>
+                </wp:positionV>
+                <wp:extent cx="1466850" cy="719138"/>
+                <wp:effectExtent l="0" t="0" r="19050" b="24130"/>
+                <wp:wrapNone/>
+                <wp:docPr id="2076959747" name="Rectangle: Rounded Corners 1"/>
+                <wp:cNvGraphicFramePr/>
+                <a:graphic xmlns:a="http://schemas.openxmlformats.org/drawingml/2006/main">
+                  <a:graphicData uri="http://schemas.microsoft.com/office/word/2010/wordprocessingShape">
+                    <wps:wsp>
+                      <wps:cNvSpPr/>
+                      <wps:spPr>
+                        <a:xfrm>
+                          <a:off x="0" y="0"/>
+                          <a:ext cx="1466850" cy="719138"/>
+                        </a:xfrm>
+                        <a:prstGeom prst="roundRect">
+                          <a:avLst/>
+                        </a:prstGeom>
+                      </wps:spPr>
+                      <wps:style>
+                        <a:lnRef idx="2">
+                          <a:schemeClr val="accent1">
+                            <a:shade val="15000"/>
+                          </a:schemeClr>
+                        </a:lnRef>
+                        <a:fillRef idx="1">
+                          <a:schemeClr val="accent1"/>
+                        </a:fillRef>
+                        <a:effectRef idx="0">
+                          <a:schemeClr val="accent1"/>
+                        </a:effectRef>
+                        <a:fontRef idx="minor">
+                          <a:schemeClr val="lt1"/>
+                        </a:fontRef>
+                      </wps:style>
+                      <wps:txbx>
+                        <w:txbxContent>
+                          <w:p>
+                            <w:pPr>
+                              <w:jc w:val="center"/>
+                            </w:pPr>
+                            <w:r>
+                              <w:t>Plans and standards definition</w:t>
+                            </w:r>
+                          </w:p>
+                        </w:txbxContent>
+                      </wps:txbx>
+                      <wps:bodyPr rot="0" spcFirstLastPara="0" vertOverflow="overflow" horzOverflow="overflow" vert="horz" wrap="square" lIns="91440" tIns="45720" rIns="91440" bIns="45720" numCol="1" spcCol="0" rtlCol="0" fromWordArt="0" anchor="ctr" anchorCtr="0" forceAA="0" compatLnSpc="1">
+                        <a:prstTxWarp prst="textNoShape">
+                          <a:avLst/>
+                        </a:prstTxWarp>
+                        <a:noAutofit/>
+                      </wps:bodyPr>
+                    </wps:wsp>
+                  </a:graphicData>
+                </a:graphic>
+                <wp14:sizeRelH relativeFrom="margin">
+                  <wp14:pctWidth>0</wp14:pctWidth>
+                </wp14:sizeRelH>
+                <wp14:sizeRelV relativeFrom="margin">
+                  <wp14:pctHeight>0</wp14:pctHeight>
+                </wp14:sizeRelV>
+              </wp:anchor>
+            </w:drawing>
+          </mc:Choice>
+          <mc:Fallback>
+            <w:pict>
+              <v:roundrect w14:anchorId="28959A2B" id="Rectangle: Rounded Corners 1" o:spid="_x0000_s1026" style="position:absolute;margin-left:7.7pt;margin-top:10.35pt;width:115.5pt;height:56.65pt;z-index:251659264;visibility:visible;mso-wrap-style:square;mso-width-percent:0;mso-height-percent:0;mso-wrap-distance-left:9pt;mso-wrap-distance-top:0;mso-wrap-distance-right:9pt;mso-wrap-distance-bottom:0;mso-position-horizontal:absolute;mso-position-horizontal-relative:text;mso-position-vertical:absolute;mso-position-vertical-relative:text;mso-width-percent:0;mso-height-percent:0;mso-width-relative:margin;mso-height-relative:margin;v-text-anchor:middle" arcsize="10923f" o:gfxdata="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" fillcolor="#5b9bd5 [3204]" strokecolor="#091723 [484]" strokeweight="1pt">
+                <v:stroke joinstyle="miter"/>
+                <v:textbox>
+                  <w:txbxContent>
+                    <w:p>
+                      <w:pPr>
+                        <w:jc w:val="center"/>
+                      </w:pPr>
+                      <w:r>
+                        <w:t>Plans and standards definition</w:t>
+                      </w:r>
+                    </w:p>
+                  </w:txbxContent>
+                </v:textbox>
+              </v:roundrect>
+            </w:pict>
+          </mc:Fallback>
+        </mc:AlternateContent>
       </w:r>
     </w:p>
     <w:p/>
     <w:p>
       <w:r>
+        <w:rPr>
+          <w:noProof/>
+        </w:rPr>
+        <mc:AlternateContent>
+          <mc:Choice Requires="wps">
+            <w:drawing>
+              <wp:anchor distT="0" distB="0" distL="114300" distR="114300" simplePos="0" relativeHeight="251682816" behindDoc="0" locked="0" layoutInCell="1" allowOverlap="1" wp14:anchorId="2D04C6EF" wp14:editId="5DF6770C">
+                <wp:simplePos x="0" y="0"/>
+                <wp:positionH relativeFrom="column">
+                  <wp:posOffset>1569403</wp:posOffset>
+                </wp:positionH>
+                <wp:positionV relativeFrom="paragraph">
+                  <wp:posOffset>42863</wp:posOffset>
+                </wp:positionV>
+                <wp:extent cx="1537970" cy="0"/>
+                <wp:effectExtent l="38100" t="76200" r="0" b="95250"/>
+                <wp:wrapNone/>
+                <wp:docPr id="780317117" name="Straight Arrow Connector 5"/>
+                <wp:cNvGraphicFramePr/>
+                <a:graphic xmlns:a="http://schemas.openxmlformats.org/drawingml/2006/main">
+                  <a:graphicData uri="http://schemas.microsoft.com/office/word/2010/wordprocessingShape">
+                    <wps:wsp>
+                      <wps:cNvCnPr/>
+                      <wps:spPr>
+                        <a:xfrm flipH="1">
+                          <a:off x="0" y="0"/>
+                          <a:ext cx="1537970" cy="0"/>
+                        </a:xfrm>
+                        <a:prstGeom prst="straightConnector1">
+                          <a:avLst/>
+                        </a:prstGeom>
+                        <a:ln>
+                          <a:tailEnd type="triangle"/>
+                        </a:ln>
+                      </wps:spPr>
+                      <wps:style>
+                        <a:lnRef idx="1">
+                          <a:schemeClr val="accent1"/>
+                        </a:lnRef>
+                        <a:fillRef idx="0">
+                          <a:schemeClr val="accent1"/>
+                        </a:fillRef>
+                        <a:effectRef idx="0">
+                          <a:schemeClr val="accent1"/>
+                        </a:effectRef>
+                        <a:fontRef idx="minor">
+                          <a:schemeClr val="tx1"/>
+                        </a:fontRef>
+                      </wps:style>
+                      <wps:bodyPr/>
+                    </wps:wsp>
+                  </a:graphicData>
+                </a:graphic>
+              </wp:anchor>
+            </w:drawing>
+          </mc:Choice>
+          <mc:Fallback>
+            <w:pict>
+              <v:shapetype w14:anchorId="6783A1BA" id="_x0000_t32" coordsize="21600,21600" o:spt="32" o:oned="t" path="m,l21600,21600e" filled="f">
+                <v:path arrowok="t" fillok="f" o:connecttype="none"/>
+                <o:lock v:ext="edit" shapetype="t"/>
+              </v:shapetype>
+              <v:shape id="Straight Arrow Connector 5" o:spid="_x0000_s1026" type="#_x0000_t32" style="position:absolute;margin-left:123.6pt;margin-top:3.4pt;width:121.1pt;height:0;flip:x;z-index:251682816;visibility:visible;mso-wrap-style:square;mso-wrap-distance-left:9pt;mso-wrap-distance-top:0;mso-wrap-distance-right:9pt;mso-wrap-distance-bottom:0;mso-position-horizontal:absolute;mso-position-horizontal-relative:text;mso-position-vertical:absolute;mso-position-vertical-relative:text" o:gfxdata="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" strokecolor="#5b9bd5 [3204]" strokeweight=".5pt">
+                <v:stroke endarrow="block" joinstyle="miter"/>
+              </v:shape>
+            </w:pict>
+          </mc:Fallback>
+        </mc:AlternateContent>
+      </w:r>
+    </w:p>
+    <w:p>
+      <w:r>
+        <w:rPr>
+          <w:noProof/>
+        </w:rPr>
+        <mc:AlternateContent>
+          <mc:Choice Requires="wps">
+            <w:drawing>
+              <wp:anchor distT="0" distB="0" distL="114300" distR="114300" simplePos="0" relativeHeight="251693056" behindDoc="0" locked="0" layoutInCell="1" allowOverlap="1" wp14:anchorId="581EB35F" wp14:editId="0F94DF95">
+                <wp:simplePos x="0" y="0"/>
+                <wp:positionH relativeFrom="column">
+                  <wp:posOffset>2064703</wp:posOffset>
+                </wp:positionH>
+                <wp:positionV relativeFrom="paragraph">
+                  <wp:posOffset>53340</wp:posOffset>
+                </wp:positionV>
+                <wp:extent cx="376238" cy="290513"/>
+                <wp:effectExtent l="19050" t="19050" r="43180" b="14605"/>
+                <wp:wrapNone/>
+                <wp:docPr id="2147234533" name="Isosceles Triangle 7"/>
+                <wp:cNvGraphicFramePr/>
+                <a:graphic xmlns:a="http://schemas.openxmlformats.org/drawingml/2006/main">
+                  <a:graphicData uri="http://schemas.microsoft.com/office/word/2010/wordprocessingShape">
+                    <wps:wsp>
+                      <wps:cNvSpPr/>
+                      <wps:spPr>
+                        <a:xfrm>
+                          <a:off x="0" y="0"/>
+                          <a:ext cx="376238" cy="290513"/>
+                        </a:xfrm>
+                        <a:prstGeom prst="triangle">
+                          <a:avLst/>
+                        </a:prstGeom>
+                      </wps:spPr>
+                      <wps:style>
+                        <a:lnRef idx="2">
+                          <a:schemeClr val="accent1">
+                            <a:shade val="15000"/>
+                          </a:schemeClr>
+                        </a:lnRef>
+                        <a:fillRef idx="1">
+                          <a:schemeClr val="accent1"/>
+                        </a:fillRef>
+                        <a:effectRef idx="0">
+                          <a:schemeClr val="accent1"/>
+                        </a:effectRef>
+                        <a:fontRef idx="minor">
+                          <a:schemeClr val="lt1"/>
+                        </a:fontRef>
+                      </wps:style>
+                      <wps:bodyPr rot="0" spcFirstLastPara="0" vertOverflow="overflow" horzOverflow="overflow" vert="horz" wrap="square" lIns="91440" tIns="45720" rIns="91440" bIns="45720" numCol="1" spcCol="0" rtlCol="0" fromWordArt="0" anchor="ctr" anchorCtr="0" forceAA="0" compatLnSpc="1">
+                        <a:prstTxWarp prst="textNoShape">
+                          <a:avLst/>
+                        </a:prstTxWarp>
+                        <a:noAutofit/>
+                      </wps:bodyPr>
+                    </wps:wsp>
+                  </a:graphicData>
+                </a:graphic>
+              </wp:anchor>
+            </w:drawing>
+          </mc:Choice>
+          <mc:Fallback>
+            <w:pict>
+              <v:shapetype w14:anchorId="206D7309" id="_x0000_t5" coordsize="21600,21600" o:spt="5" adj="10800" path="m@0,l,21600r21600,xe">
+                <v:stroke joinstyle="miter"/>
+                <v:formulas>
+                  <v:f eqn="val #0"/>
+                  <v:f eqn="prod #0 1 2"/>
+                  <v:f eqn="sum @1 10800 0"/>
+                </v:formulas>
+                <v:path gradientshapeok="t" o:connecttype="custom" o:connectlocs="@0,0;@1,10800;0,21600;10800,21600;21600,21600;@2,10800" textboxrect="0,10800,10800,18000;5400,10800,16200,18000;10800,10800,21600,18000;0,7200,7200,21600;7200,7200,14400,21600;14400,7200,21600,21600"/>
+                <v:handles>
+                  <v:h position="#0,topLeft" xrange="0,21600"/>
+                </v:handles>
+              </v:shapetype>
+              <v:shape id="Isosceles Triangle 7" o:spid="_x0000_s1026" type="#_x0000_t5" style="position:absolute;margin-left:162.6pt;margin-top:4.2pt;width:29.65pt;height:22.9pt;z-index:251693056;visibility:visible;mso-wrap-style:square;mso-wrap-distance-left:9pt;mso-wrap-distance-top:0;mso-wrap-distance-right:9pt;mso-wrap-distance-bottom:0;mso-position-horizontal:absolute;mso-position-horizontal-relative:text;mso-position-vertical:absolute;mso-position-vertical-relative:text;v-text-anchor:middle" o:gfxdata="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" fillcolor="#5b9bd5 [3204]" strokecolor="#091723 [484]" strokeweight="1pt"/>
+            </w:pict>
+          </mc:Fallback>
+        </mc:AlternateContent>
+      </w:r>
+    </w:p>
+    <w:p>
+      <w:r>
+        <w:rPr>
+          <w:noProof/>
+        </w:rPr>
+        <mc:AlternateContent>
+          <mc:Choice Requires="wps">
+            <w:drawing>
+              <wp:anchor distT="0" distB="0" distL="114300" distR="114300" simplePos="0" relativeHeight="251671552" behindDoc="0" locked="0" layoutInCell="1" allowOverlap="1" wp14:anchorId="2CB9EAAE" wp14:editId="01754830">
+                <wp:simplePos x="0" y="0"/>
+                <wp:positionH relativeFrom="column">
+                  <wp:posOffset>1564640</wp:posOffset>
+                </wp:positionH>
+                <wp:positionV relativeFrom="paragraph">
+                  <wp:posOffset>32703</wp:posOffset>
+                </wp:positionV>
+                <wp:extent cx="1537970" cy="0"/>
+                <wp:effectExtent l="0" t="76200" r="24130" b="95250"/>
+                <wp:wrapNone/>
+                <wp:docPr id="1580243832" name="Straight Arrow Connector 4"/>
+                <wp:cNvGraphicFramePr/>
+                <a:graphic xmlns:a="http://schemas.openxmlformats.org/drawingml/2006/main">
+                  <a:graphicData uri="http://schemas.microsoft.com/office/word/2010/wordprocessingShape">
+                    <wps:wsp>
+                      <wps:cNvCnPr/>
+                      <wps:spPr>
+                        <a:xfrm>
+                          <a:off x="0" y="0"/>
+                          <a:ext cx="1537970" cy="0"/>
+                        </a:xfrm>
+                        <a:prstGeom prst="straightConnector1">
+                          <a:avLst/>
+                        </a:prstGeom>
+                        <a:ln>
+                          <a:tailEnd type="triangle"/>
+                        </a:ln>
+                      </wps:spPr>
+                      <wps:style>
+                        <a:lnRef idx="1">
+                          <a:schemeClr val="accent1"/>
+                        </a:lnRef>
+                        <a:fillRef idx="0">
+                          <a:schemeClr val="accent1"/>
+                        </a:fillRef>
+                        <a:effectRef idx="0">
+                          <a:schemeClr val="accent1"/>
+                        </a:effectRef>
+                        <a:fontRef idx="minor">
+                          <a:schemeClr val="tx1"/>
+                        </a:fontRef>
+                      </wps:style>
+                      <wps:bodyPr/>
+                    </wps:wsp>
+                  </a:graphicData>
+                </a:graphic>
+              </wp:anchor>
+            </w:drawing>
+          </mc:Choice>
+          <mc:Fallback>
+            <w:pict>
+              <v:shape w14:anchorId="0DA08458" id="Straight Arrow Connector 4" o:spid="_x0000_s1026" type="#_x0000_t32" style="position:absolute;margin-left:123.2pt;margin-top:2.6pt;width:121.1pt;height:0;z-index:251671552;visibility:visible;mso-wrap-style:square;mso-wrap-distance-left:9pt;mso-wrap-distance-top:0;mso-wrap-distance-right:9pt;mso-wrap-distance-bottom:0;mso-position-horizontal:absolute;mso-position-horizontal-relative:text;mso-position-vertical:absolute;mso-position-vertical-relative:text" o:gfxdata="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" strokecolor="#5b9bd5 [3204]" strokeweight=".5pt">
+                <v:stroke endarrow="block" joinstyle="miter"/>
+              </v:shape>
+            </w:pict>
+          </mc:Fallback>
+        </mc:AlternateContent>
+      </w:r>
+    </w:p>
+    <w:p>
+      <w:r>
+        <w:rPr>
+          <w:noProof/>
+        </w:rPr>
+        <mc:AlternateContent>
+          <mc:Choice Requires="wps">
+            <w:drawing>
+              <wp:anchor distT="0" distB="0" distL="114300" distR="114300" simplePos="0" relativeHeight="251661312" behindDoc="0" locked="0" layoutInCell="1" allowOverlap="1" wp14:anchorId="69D2B295" wp14:editId="2C2FE813">
+                <wp:simplePos x="0" y="0"/>
+                <wp:positionH relativeFrom="column">
+                  <wp:posOffset>107315</wp:posOffset>
+                </wp:positionH>
+                <wp:positionV relativeFrom="paragraph">
+                  <wp:posOffset>75882</wp:posOffset>
+                </wp:positionV>
+                <wp:extent cx="1800225" cy="742950"/>
+                <wp:effectExtent l="0" t="0" r="28575" b="19050"/>
+                <wp:wrapNone/>
+                <wp:docPr id="1640616899" name="Rectangle: Rounded Corners 1"/>
+                <wp:cNvGraphicFramePr/>
+                <a:graphic xmlns:a="http://schemas.openxmlformats.org/drawingml/2006/main">
+                  <a:graphicData uri="http://schemas.microsoft.com/office/word/2010/wordprocessingShape">
+                    <wps:wsp>
+                      <wps:cNvSpPr/>
+                      <wps:spPr>
+                        <a:xfrm>
+                          <a:off x="0" y="0"/>
+                          <a:ext cx="1800225" cy="742950"/>
+                        </a:xfrm>
+                        <a:prstGeom prst="roundRect">
+                          <a:avLst/>
+                        </a:prstGeom>
+                      </wps:spPr>
+                      <wps:style>
+                        <a:lnRef idx="2">
+                          <a:schemeClr val="accent1">
+                            <a:shade val="15000"/>
+                          </a:schemeClr>
+                        </a:lnRef>
+                        <a:fillRef idx="1">
+                          <a:schemeClr val="accent1"/>
+                        </a:fillRef>
+                        <a:effectRef idx="0">
+                          <a:schemeClr val="accent1"/>
+                        </a:effectRef>
+                        <a:fontRef idx="minor">
+                          <a:schemeClr val="lt1"/>
+                        </a:fontRef>
+                      </wps:style>
+                      <wps:txbx>
+                        <w:txbxContent>
+                          <w:p>
+                            <w:pPr>
+                              <w:jc w:val="center"/>
+                            </w:pPr>
+                            <w:r>
+                              <w:t>System Requirements as Allocated To Software</w:t>
+                            </w:r>
+                          </w:p>
+                        </w:txbxContent>
+                      </wps:txbx>
+                      <wps:bodyPr rot="0" spcFirstLastPara="0" vertOverflow="overflow" horzOverflow="overflow" vert="horz" wrap="square" lIns="91440" tIns="45720" rIns="91440" bIns="45720" numCol="1" spcCol="0" rtlCol="0" fromWordArt="0" anchor="ctr" anchorCtr="0" forceAA="0" compatLnSpc="1">
+                        <a:prstTxWarp prst="textNoShape">
+                          <a:avLst/>
+                        </a:prstTxWarp>
+                        <a:noAutofit/>
+                      </wps:bodyPr>
+                    </wps:wsp>
+                  </a:graphicData>
+                </a:graphic>
+                <wp14:sizeRelH relativeFrom="margin">
+                  <wp14:pctWidth>0</wp14:pctWidth>
+                </wp14:sizeRelH>
+                <wp14:sizeRelV relativeFrom="margin">
+                  <wp14:pctHeight>0</wp14:pctHeight>
+                </wp14:sizeRelV>
+              </wp:anchor>
+            </w:drawing>
+          </mc:Choice>
+          <mc:Fallback>
+            <w:pict>
+              <v:roundrect w14:anchorId="69D2B295" id="_x0000_s1027" style="position:absolute;margin-left:8.45pt;margin-top:5.95pt;width:141.75pt;height:58.5pt;z-index:251661312;visibility:visible;mso-wrap-style:square;mso-width-percent:0;mso-height-percent:0;mso-wrap-distance-left:9pt;mso-wrap-distance-top:0;mso-wrap-distance-right:9pt;mso-wrap-distance-bottom:0;mso-position-horizontal:absolute;mso-position-horizontal-relative:text;mso-position-vertical:absolute;mso-position-vertical-relative:text;mso-width-percent:0;mso-height-percent:0;mso-width-relative:margin;mso-height-relative:margin;v-text-anchor:middle" arcsize="10923f" o:gfxdata="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" fillcolor="#5b9bd5 [3204]" strokecolor="#091723 [484]" strokeweight="1pt">
+                <v:stroke joinstyle="miter"/>
+                <v:textbox>
+                  <w:txbxContent>
+                    <w:p>
+                      <w:pPr>
+                        <w:jc w:val="center"/>
+                      </w:pPr>
+                      <w:r>
+                        <w:t>System Requirements as Allocated To Software</w:t>
+                      </w:r>
+                    </w:p>
+                  </w:txbxContent>
+                </v:textbox>
+              </v:roundrect>
+            </w:pict>
+          </mc:Fallback>
+        </mc:AlternateContent>
+      </w:r>
+    </w:p>
+    <w:p>
+      <w:r>
+        <w:rPr>
+          <w:noProof/>
+        </w:rPr>
+        <mc:AlternateContent>
+          <mc:Choice Requires="wps">
+            <w:drawing>
+              <wp:anchor distT="0" distB="0" distL="114300" distR="114300" simplePos="0" relativeHeight="251692032" behindDoc="0" locked="0" layoutInCell="1" allowOverlap="1" wp14:anchorId="16F9153F" wp14:editId="781FB1E9">
+                <wp:simplePos x="0" y="0"/>
+                <wp:positionH relativeFrom="column">
+                  <wp:posOffset>1917065</wp:posOffset>
+                </wp:positionH>
+                <wp:positionV relativeFrom="paragraph">
+                  <wp:posOffset>108585</wp:posOffset>
+                </wp:positionV>
+                <wp:extent cx="1185545" cy="0"/>
+                <wp:effectExtent l="38100" t="76200" r="0" b="95250"/>
+                <wp:wrapNone/>
+                <wp:docPr id="550992420" name="Straight Arrow Connector 6"/>
+                <wp:cNvGraphicFramePr/>
+                <a:graphic xmlns:a="http://schemas.openxmlformats.org/drawingml/2006/main">
+                  <a:graphicData uri="http://schemas.microsoft.com/office/word/2010/wordprocessingShape">
+                    <wps:wsp>
+                      <wps:cNvCnPr/>
+                      <wps:spPr>
+                        <a:xfrm flipH="1">
+                          <a:off x="0" y="0"/>
+                          <a:ext cx="1185545" cy="0"/>
+                        </a:xfrm>
+                        <a:prstGeom prst="straightConnector1">
+                          <a:avLst/>
+                        </a:prstGeom>
+                        <a:ln>
+                          <a:tailEnd type="triangle"/>
+                        </a:ln>
+                      </wps:spPr>
+                      <wps:style>
+                        <a:lnRef idx="1">
+                          <a:schemeClr val="accent1"/>
+                        </a:lnRef>
+                        <a:fillRef idx="0">
+                          <a:schemeClr val="accent1"/>
+                        </a:fillRef>
+                        <a:effectRef idx="0">
+                          <a:schemeClr val="accent1"/>
+                        </a:effectRef>
+                        <a:fontRef idx="minor">
+                          <a:schemeClr val="tx1"/>
+                        </a:fontRef>
+                      </wps:style>
+                      <wps:bodyPr/>
+                    </wps:wsp>
+                  </a:graphicData>
+                </a:graphic>
+              </wp:anchor>
+            </w:drawing>
+          </mc:Choice>
+          <mc:Fallback>
+            <w:pict>
+              <v:shape w14:anchorId="61E3C357" id="Straight Arrow Connector 6" o:spid="_x0000_s1026" type="#_x0000_t32" style="position:absolute;margin-left:150.95pt;margin-top:8.55pt;width:93.35pt;height:0;flip:x;z-index:251692032;visibility:visible;mso-wrap-style:square;mso-wrap-distance-left:9pt;mso-wrap-distance-top:0;mso-wrap-distance-right:9pt;mso-wrap-distance-bottom:0;mso-position-horizontal:absolute;mso-position-horizontal-relative:text;mso-position-vertical:absolute;mso-position-vertical-relative:text" o:gfxdata="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" strokecolor="#5b9bd5 [3204]" strokeweight=".5pt">
+                <v:stroke endarrow="block" joinstyle="miter"/>
+              </v:shape>
+            </w:pict>
+          </mc:Fallback>
+        </mc:AlternateContent>
+      </w:r>
+    </w:p>
+    <w:p>
+      <w:r>
+        <w:rPr>
+          <w:noProof/>
+        </w:rPr>
+        <mc:AlternateContent>
+          <mc:Choice Requires="wps">
+            <w:drawing>
+              <wp:anchor distT="0" distB="0" distL="114300" distR="114300" simplePos="0" relativeHeight="251695104" behindDoc="0" locked="0" layoutInCell="1" allowOverlap="1" wp14:anchorId="74F1C718" wp14:editId="2D3CD06C">
+                <wp:simplePos x="0" y="0"/>
+                <wp:positionH relativeFrom="column">
+                  <wp:posOffset>2090420</wp:posOffset>
+                </wp:positionH>
+                <wp:positionV relativeFrom="paragraph">
+                  <wp:posOffset>114300</wp:posOffset>
+                </wp:positionV>
+                <wp:extent cx="375920" cy="290195"/>
+                <wp:effectExtent l="19050" t="19050" r="43180" b="14605"/>
+                <wp:wrapNone/>
+                <wp:docPr id="84325601" name="Isosceles Triangle 7"/>
+                <wp:cNvGraphicFramePr/>
+                <a:graphic xmlns:a="http://schemas.openxmlformats.org/drawingml/2006/main">
+                  <a:graphicData uri="http://schemas.microsoft.com/office/word/2010/wordprocessingShape">
+                    <wps:wsp>
+                      <wps:cNvSpPr/>
+                      <wps:spPr>
+                        <a:xfrm>
+                          <a:off x="0" y="0"/>
+                          <a:ext cx="375920" cy="290195"/>
+                        </a:xfrm>
+                        <a:prstGeom prst="triangle">
+                          <a:avLst/>
+                        </a:prstGeom>
+                      </wps:spPr>
+                      <wps:style>
+                        <a:lnRef idx="2">
+                          <a:schemeClr val="accent1">
+                            <a:shade val="15000"/>
+                          </a:schemeClr>
+                        </a:lnRef>
+                        <a:fillRef idx="1">
+                          <a:schemeClr val="accent1"/>
+                        </a:fillRef>
+                        <a:effectRef idx="0">
+                          <a:schemeClr val="accent1"/>
+                        </a:effectRef>
+                        <a:fontRef idx="minor">
+                          <a:schemeClr val="lt1"/>
+                        </a:fontRef>
+                      </wps:style>
+                      <wps:bodyPr rot="0" spcFirstLastPara="0" vertOverflow="overflow" horzOverflow="overflow" vert="horz" wrap="square" lIns="91440" tIns="45720" rIns="91440" bIns="45720" numCol="1" spcCol="0" rtlCol="0" fromWordArt="0" anchor="ctr" anchorCtr="0" forceAA="0" compatLnSpc="1">
+                        <a:prstTxWarp prst="textNoShape">
+                          <a:avLst/>
+                        </a:prstTxWarp>
+                        <a:noAutofit/>
+                      </wps:bodyPr>
+                    </wps:wsp>
+                  </a:graphicData>
+                </a:graphic>
+              </wp:anchor>
+            </w:drawing>
+          </mc:Choice>
+          <mc:Fallback>
+            <w:pict>
+              <v:shape w14:anchorId="3CA08984" id="Isosceles Triangle 7" o:spid="_x0000_s1026" type="#_x0000_t5" style="position:absolute;margin-left:164.6pt;margin-top:9pt;width:29.6pt;height:22.85pt;z-index:251695104;visibility:visible;mso-wrap-style:square;mso-wrap-distance-left:9pt;mso-wrap-distance-top:0;mso-wrap-distance-right:9pt;mso-wrap-distance-bottom:0;mso-position-horizontal:absolute;mso-position-horizontal-relative:text;mso-position-vertical:absolute;mso-position-vertical-relative:text;v-text-anchor:middle" o:gfxdata="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" fillcolor="#5b9bd5 [3204]" strokecolor="#091723 [484]" strokeweight="1pt"/>
+            </w:pict>
+          </mc:Fallback>
+        </mc:AlternateContent>
+      </w:r>
+      <w:r>
+        <w:rPr>
+          <w:noProof/>
+        </w:rPr>
+        <mc:AlternateContent>
+          <mc:Choice Requires="wps">
+            <w:drawing>
+              <wp:anchor distT="0" distB="0" distL="114300" distR="114300" simplePos="0" relativeHeight="251704320" behindDoc="0" locked="0" layoutInCell="1" allowOverlap="1" wp14:anchorId="7652D858" wp14:editId="45C9F947">
+                <wp:simplePos x="0" y="0"/>
+                <wp:positionH relativeFrom="column">
+                  <wp:posOffset>2467292</wp:posOffset>
+                </wp:positionH>
+                <wp:positionV relativeFrom="paragraph">
+                  <wp:posOffset>118745</wp:posOffset>
+                </wp:positionV>
+                <wp:extent cx="337820" cy="337820"/>
+                <wp:effectExtent l="19050" t="19050" r="24130" b="43180"/>
+                <wp:wrapNone/>
+                <wp:docPr id="230120439" name="Diamond 8"/>
+                <wp:cNvGraphicFramePr/>
+                <a:graphic xmlns:a="http://schemas.openxmlformats.org/drawingml/2006/main">
+                  <a:graphicData uri="http://schemas.microsoft.com/office/word/2010/wordprocessingShape">
+                    <wps:wsp>
+                      <wps:cNvSpPr/>
+                      <wps:spPr>
+                        <a:xfrm>
+                          <a:off x="0" y="0"/>
+                          <a:ext cx="337820" cy="337820"/>
+                        </a:xfrm>
+                        <a:prstGeom prst="diamond">
+                          <a:avLst/>
+                        </a:prstGeom>
+                      </wps:spPr>
+                      <wps:style>
+                        <a:lnRef idx="2">
+                          <a:schemeClr val="accent1">
+                            <a:shade val="15000"/>
+                          </a:schemeClr>
+                        </a:lnRef>
+                        <a:fillRef idx="1">
+                          <a:schemeClr val="accent1"/>
+                        </a:fillRef>
+                        <a:effectRef idx="0">
+                          <a:schemeClr val="accent1"/>
+                        </a:effectRef>
+                        <a:fontRef idx="minor">
+                          <a:schemeClr val="lt1"/>
+                        </a:fontRef>
+                      </wps:style>
+                      <wps:bodyPr rot="0" spcFirstLastPara="0" vertOverflow="overflow" horzOverflow="overflow" vert="horz" wrap="square" lIns="91440" tIns="45720" rIns="91440" bIns="45720" numCol="1" spcCol="0" rtlCol="0" fromWordArt="0" anchor="ctr" anchorCtr="0" forceAA="0" compatLnSpc="1">
+                        <a:prstTxWarp prst="textNoShape">
+                          <a:avLst/>
+                        </a:prstTxWarp>
+                        <a:noAutofit/>
+                      </wps:bodyPr>
+                    </wps:wsp>
+                  </a:graphicData>
+                </a:graphic>
+              </wp:anchor>
+            </w:drawing>
+          </mc:Choice>
+          <mc:Fallback>
+            <w:pict>
+              <v:shapetype w14:anchorId="3753AB1F" id="_x0000_t4" coordsize="21600,21600" o:spt="4" path="m10800,l,10800,10800,21600,21600,10800xe">
+                <v:stroke joinstyle="miter"/>
+                <v:path gradientshapeok="t" o:connecttype="rect" textboxrect="5400,5400,16200,16200"/>
+              </v:shapetype>
+              <v:shape id="Diamond 8" o:spid="_x0000_s1026" type="#_x0000_t4" style="position:absolute;margin-left:194.25pt;margin-top:9.35pt;width:26.6pt;height:26.6pt;z-index:251704320;visibility:visible;mso-wrap-style:square;mso-wrap-distance-left:9pt;mso-wrap-distance-top:0;mso-wrap-distance-right:9pt;mso-wrap-distance-bottom:0;mso-position-horizontal:absolute;mso-position-horizontal-relative:text;mso-position-vertical:absolute;mso-position-vertical-relative:text;v-text-anchor:middle" o:gfxdata="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" fillcolor="#5b9bd5 [3204]" strokecolor="#091723 [484]" strokeweight="1pt"/>
+            </w:pict>
+          </mc:Fallback>
+        </mc:AlternateContent>
+      </w:r>
+    </w:p>
+    <w:p>
+      <w:r>
+        <w:rPr>
+          <w:noProof/>
+        </w:rPr>
+        <mc:AlternateContent>
+          <mc:Choice Requires="wps">
+            <w:drawing>
+              <wp:anchor distT="0" distB="0" distL="114300" distR="114300" simplePos="0" relativeHeight="251681792" behindDoc="0" locked="0" layoutInCell="1" allowOverlap="1" wp14:anchorId="1B65AB17" wp14:editId="0B5F04C0">
+                <wp:simplePos x="0" y="0"/>
+                <wp:positionH relativeFrom="column">
+                  <wp:posOffset>1571625</wp:posOffset>
+                </wp:positionH>
+                <wp:positionV relativeFrom="paragraph">
+                  <wp:posOffset>126683</wp:posOffset>
+                </wp:positionV>
+                <wp:extent cx="1537970" cy="0"/>
+                <wp:effectExtent l="0" t="76200" r="24130" b="95250"/>
+                <wp:wrapNone/>
+                <wp:docPr id="1100569042" name="Straight Arrow Connector 4"/>
+                <wp:cNvGraphicFramePr/>
+                <a:graphic xmlns:a="http://schemas.openxmlformats.org/drawingml/2006/main">
+                  <a:graphicData uri="http://schemas.microsoft.com/office/word/2010/wordprocessingShape">
+                    <wps:wsp>
+                      <wps:cNvCnPr/>
+                      <wps:spPr>
+                        <a:xfrm>
+                          <a:off x="0" y="0"/>
+                          <a:ext cx="1537970" cy="0"/>
+                        </a:xfrm>
+                        <a:prstGeom prst="straightConnector1">
+                          <a:avLst/>
+                        </a:prstGeom>
+                        <a:ln>
+                          <a:tailEnd type="triangle"/>
+                        </a:ln>
+                      </wps:spPr>
+                      <wps:style>
+                        <a:lnRef idx="1">
+                          <a:schemeClr val="accent1"/>
+                        </a:lnRef>
+                        <a:fillRef idx="0">
+                          <a:schemeClr val="accent1"/>
+                        </a:fillRef>
+                        <a:effectRef idx="0">
+                          <a:schemeClr val="accent1"/>
+                        </a:effectRef>
+                        <a:fontRef idx="minor">
+                          <a:schemeClr val="tx1"/>
+                        </a:fontRef>
+                      </wps:style>
+                      <wps:bodyPr/>
+                    </wps:wsp>
+                  </a:graphicData>
+                </a:graphic>
+              </wp:anchor>
+            </w:drawing>
+          </mc:Choice>
+          <mc:Fallback>
+            <w:pict>
+              <v:shape w14:anchorId="50EE5831" id="Straight Arrow Connector 4" o:spid="_x0000_s1026" type="#_x0000_t32" style="position:absolute;margin-left:123.75pt;margin-top:10pt;width:121.1pt;height:0;z-index:251681792;visibility:visible;mso-wrap-style:square;mso-wrap-distance-left:9pt;mso-wrap-distance-top:0;mso-wrap-distance-right:9pt;mso-wrap-distance-bottom:0;mso-position-horizontal:absolute;mso-position-horizontal-relative:text;mso-position-vertical:absolute;mso-position-vertical-relative:text" o:gfxdata="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" strokecolor="#5b9bd5 [3204]" strokeweight=".5pt">
+                <v:stroke endarrow="block" joinstyle="miter"/>
+              </v:shape>
+            </w:pict>
+          </mc:Fallback>
+        </mc:AlternateContent>
+      </w:r>
+    </w:p>
+    <w:p/>
+    <w:p>
+      <w:r>
+        <w:rPr>
+          <w:noProof/>
+        </w:rPr>
+        <mc:AlternateContent>
+          <mc:Choice Requires="wps">
+            <w:drawing>
+              <wp:anchor distT="0" distB="0" distL="114300" distR="114300" simplePos="0" relativeHeight="251663360" behindDoc="0" locked="0" layoutInCell="1" allowOverlap="1" wp14:anchorId="115E8328" wp14:editId="47AF7F6F">
+                <wp:simplePos x="0" y="0"/>
+                <wp:positionH relativeFrom="column">
+                  <wp:posOffset>135890</wp:posOffset>
+                </wp:positionH>
+                <wp:positionV relativeFrom="paragraph">
+                  <wp:posOffset>50482</wp:posOffset>
+                </wp:positionV>
+                <wp:extent cx="1466850" cy="785495"/>
+                <wp:effectExtent l="0" t="0" r="19050" b="14605"/>
+                <wp:wrapNone/>
+                <wp:docPr id="2030963667" name="Rectangle: Rounded Corners 1"/>
+                <wp:cNvGraphicFramePr/>
+                <a:graphic xmlns:a="http://schemas.openxmlformats.org/drawingml/2006/main">
+                  <a:graphicData uri="http://schemas.microsoft.com/office/word/2010/wordprocessingShape">
+                    <wps:wsp>
+                      <wps:cNvSpPr/>
+                      <wps:spPr>
+                        <a:xfrm>
+                          <a:off x="0" y="0"/>
+                          <a:ext cx="1466850" cy="785495"/>
+                        </a:xfrm>
+                        <a:prstGeom prst="roundRect">
+                          <a:avLst/>
+                        </a:prstGeom>
+                      </wps:spPr>
+                      <wps:style>
+                        <a:lnRef idx="2">
+                          <a:schemeClr val="accent1">
+                            <a:shade val="15000"/>
+                          </a:schemeClr>
+                        </a:lnRef>
+                        <a:fillRef idx="1">
+                          <a:schemeClr val="accent1"/>
+                        </a:fillRef>
+                        <a:effectRef idx="0">
+                          <a:schemeClr val="accent1"/>
+                        </a:effectRef>
+                        <a:fontRef idx="minor">
+                          <a:schemeClr val="lt1"/>
+                        </a:fontRef>
+                      </wps:style>
+                      <wps:txbx>
+                        <w:txbxContent>
+                          <w:p>
+                            <w:pPr>
+                              <w:jc w:val="center"/>
+                            </w:pPr>
+                            <w:r>
+                              <w:t>High Level Requirements</w:t>
+                            </w:r>
+                          </w:p>
+                        </w:txbxContent>
+                      </wps:txbx>
+                      <wps:bodyPr rot="0" spcFirstLastPara="0" vertOverflow="overflow" horzOverflow="overflow" vert="horz" wrap="square" lIns="91440" tIns="45720" rIns="91440" bIns="45720" numCol="1" spcCol="0" rtlCol="0" fromWordArt="0" anchor="ctr" anchorCtr="0" forceAA="0" compatLnSpc="1">
+                        <a:prstTxWarp prst="textNoShape">
+                          <a:avLst/>
+                        </a:prstTxWarp>
+                        <a:noAutofit/>
+                      </wps:bodyPr>
+                    </wps:wsp>
+                  </a:graphicData>
+                </a:graphic>
+                <wp14:sizeRelH relativeFrom="margin">
+                  <wp14:pctWidth>0</wp14:pctWidth>
+                </wp14:sizeRelH>
+                <wp14:sizeRelV relativeFrom="margin">
+                  <wp14:pctHeight>0</wp14:pctHeight>
+                </wp14:sizeRelV>
+              </wp:anchor>
+            </w:drawing>
+          </mc:Choice>
+          <mc:Fallback>
+            <w:pict>
+              <v:roundrect w14:anchorId="115E8328" id="_x0000_s1028" style="position:absolute;margin-left:10.7pt;margin-top:3.95pt;width:115.5pt;height:61.85pt;z-index:251663360;visibility:visible;mso-wrap-style:square;mso-width-percent:0;mso-height-percent:0;mso-wrap-distance-left:9pt;mso-wrap-distance-top:0;mso-wrap-distance-right:9pt;mso-wrap-distance-bottom:0;mso-position-horizontal:absolute;mso-position-horizontal-relative:text;mso-position-vertical:absolute;mso-position-vertical-relative:text;mso-width-percent:0;mso-height-percent:0;mso-width-relative:margin;mso-height-relative:margin;v-text-anchor:middle" arcsize="10923f" o:gfxdata="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" fillcolor="#5b9bd5 [3204]" strokecolor="#091723 [484]" strokeweight="1pt">
+                <v:stroke joinstyle="miter"/>
+                <v:textbox>
+                  <w:txbxContent>
+                    <w:p>
+                      <w:pPr>
+                        <w:jc w:val="center"/>
+                      </w:pPr>
+                      <w:r>
+                        <w:t>High Level Requirements</w:t>
+                      </w:r>
+                    </w:p>
+                  </w:txbxContent>
+                </v:textbox>
+              </v:roundrect>
+            </w:pict>
+          </mc:Fallback>
+        </mc:AlternateContent>
+      </w:r>
+    </w:p>
+    <w:p>
+      <w:r>
+        <w:rPr>
+          <w:noProof/>
+        </w:rPr>
+        <mc:AlternateContent>
+          <mc:Choice Requires="wps">
+            <w:drawing>
+              <wp:anchor distT="0" distB="0" distL="114300" distR="114300" simplePos="0" relativeHeight="251684864" behindDoc="0" locked="0" layoutInCell="1" allowOverlap="1" wp14:anchorId="43F88F7E" wp14:editId="02730198">
+                <wp:simplePos x="0" y="0"/>
+                <wp:positionH relativeFrom="column">
+                  <wp:posOffset>1610677</wp:posOffset>
+                </wp:positionH>
+                <wp:positionV relativeFrom="paragraph">
+                  <wp:posOffset>160655</wp:posOffset>
+                </wp:positionV>
+                <wp:extent cx="1537970" cy="0"/>
+                <wp:effectExtent l="38100" t="76200" r="0" b="95250"/>
+                <wp:wrapNone/>
+                <wp:docPr id="2141195288" name="Straight Arrow Connector 5"/>
+                <wp:cNvGraphicFramePr/>
+                <a:graphic xmlns:a="http://schemas.openxmlformats.org/drawingml/2006/main">
+                  <a:graphicData uri="http://schemas.microsoft.com/office/word/2010/wordprocessingShape">
+                    <wps:wsp>
+                      <wps:cNvCnPr/>
+                      <wps:spPr>
+                        <a:xfrm flipH="1">
+                          <a:off x="0" y="0"/>
+                          <a:ext cx="1537970" cy="0"/>
+                        </a:xfrm>
+                        <a:prstGeom prst="straightConnector1">
+                          <a:avLst/>
+                        </a:prstGeom>
+                        <a:ln>
+                          <a:tailEnd type="triangle"/>
+                        </a:ln>
+                      </wps:spPr>
+                      <wps:style>
+                        <a:lnRef idx="1">
+                          <a:schemeClr val="accent1"/>
+                        </a:lnRef>
+                        <a:fillRef idx="0">
+                          <a:schemeClr val="accent1"/>
+                        </a:fillRef>
+                        <a:effectRef idx="0">
+                          <a:schemeClr val="accent1"/>
+                        </a:effectRef>
+                        <a:fontRef idx="minor">
+                          <a:schemeClr val="tx1"/>
+                        </a:fontRef>
+                      </wps:style>
+                      <wps:bodyPr/>
+                    </wps:wsp>
+                  </a:graphicData>
+                </a:graphic>
+              </wp:anchor>
+            </w:drawing>
+          </mc:Choice>
+          <mc:Fallback>
+            <w:pict>
+              <v:shape w14:anchorId="36920503" id="Straight Arrow Connector 5" o:spid="_x0000_s1026" type="#_x0000_t32" style="position:absolute;margin-left:126.8pt;margin-top:12.65pt;width:121.1pt;height:0;flip:x;z-index:251684864;visibility:visible;mso-wrap-style:square;mso-wrap-distance-left:9pt;mso-wrap-distance-top:0;mso-wrap-distance-right:9pt;mso-wrap-distance-bottom:0;mso-position-horizontal:absolute;mso-position-horizontal-relative:text;mso-position-vertical:absolute;mso-position-vertical-relative:text" o:gfxdata="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" strokecolor="#5b9bd5 [3204]" strokeweight=".5pt">
+                <v:stroke endarrow="block" joinstyle="miter"/>
+              </v:shape>
+            </w:pict>
+          </mc:Fallback>
+        </mc:AlternateContent>
+      </w:r>
+    </w:p>
+    <w:p>
+      <w:r>
+        <w:rPr>
+          <w:noProof/>
+        </w:rPr>
+        <mc:AlternateContent>
+          <mc:Choice Requires="wps">
+            <w:drawing>
+              <wp:anchor distT="0" distB="0" distL="114300" distR="114300" simplePos="0" relativeHeight="251706368" behindDoc="0" locked="0" layoutInCell="1" allowOverlap="1" wp14:anchorId="42867F27" wp14:editId="0049DCBE">
+                <wp:simplePos x="0" y="0"/>
+                <wp:positionH relativeFrom="column">
+                  <wp:posOffset>2507297</wp:posOffset>
+                </wp:positionH>
+                <wp:positionV relativeFrom="paragraph">
+                  <wp:posOffset>118745</wp:posOffset>
+                </wp:positionV>
+                <wp:extent cx="337820" cy="337820"/>
+                <wp:effectExtent l="19050" t="19050" r="24130" b="43180"/>
+                <wp:wrapNone/>
+                <wp:docPr id="1380119786" name="Diamond 8"/>
+                <wp:cNvGraphicFramePr/>
+                <a:graphic xmlns:a="http://schemas.openxmlformats.org/drawingml/2006/main">
+                  <a:graphicData uri="http://schemas.microsoft.com/office/word/2010/wordprocessingShape">
+                    <wps:wsp>
+                      <wps:cNvSpPr/>
+                      <wps:spPr>
+                        <a:xfrm>
+                          <a:off x="0" y="0"/>
+                          <a:ext cx="337820" cy="337820"/>
+                        </a:xfrm>
+                        <a:prstGeom prst="diamond">
+                          <a:avLst/>
+                        </a:prstGeom>
+                      </wps:spPr>
+                      <wps:style>
+                        <a:lnRef idx="2">
+                          <a:schemeClr val="accent1">
+                            <a:shade val="15000"/>
+                          </a:schemeClr>
+                        </a:lnRef>
+                        <a:fillRef idx="1">
+                          <a:schemeClr val="accent1"/>
+                        </a:fillRef>
+                        <a:effectRef idx="0">
+                          <a:schemeClr val="accent1"/>
+                        </a:effectRef>
+                        <a:fontRef idx="minor">
+                          <a:schemeClr val="lt1"/>
+                        </a:fontRef>
+                      </wps:style>
+                      <wps:bodyPr rot="0" spcFirstLastPara="0" vertOverflow="overflow" horzOverflow="overflow" vert="horz" wrap="square" lIns="91440" tIns="45720" rIns="91440" bIns="45720" numCol="1" spcCol="0" rtlCol="0" fromWordArt="0" anchor="ctr" anchorCtr="0" forceAA="0" compatLnSpc="1">
+                        <a:prstTxWarp prst="textNoShape">
+                          <a:avLst/>
+                        </a:prstTxWarp>
+                        <a:noAutofit/>
+                      </wps:bodyPr>
+                    </wps:wsp>
+                  </a:graphicData>
+                </a:graphic>
+              </wp:anchor>
+            </w:drawing>
+          </mc:Choice>
+          <mc:Fallback>
+            <w:pict>
+              <v:shape w14:anchorId="1E80C828" id="Diamond 8" o:spid="_x0000_s1026" type="#_x0000_t4" style="position:absolute;margin-left:197.4pt;margin-top:9.35pt;width:26.6pt;height:26.6pt;z-index:251706368;visibility:visible;mso-wrap-style:square;mso-wrap-distance-left:9pt;mso-wrap-distance-top:0;mso-wrap-distance-right:9pt;mso-wrap-distance-bottom:0;mso-position-horizontal:absolute;mso-position-horizontal-relative:text;mso-position-vertical:absolute;mso-position-vertical-relative:text;v-text-anchor:middle" o:gfxdata="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" fillcolor="#5b9bd5 [3204]" strokecolor="#091723 [484]" strokeweight="1pt"/>
+            </w:pict>
+          </mc:Fallback>
+        </mc:AlternateContent>
+      </w:r>
+      <w:r>
+        <w:rPr>
+          <w:noProof/>
+        </w:rPr>
+        <mc:AlternateContent>
+          <mc:Choice Requires="wps">
+            <w:drawing>
+              <wp:anchor distT="0" distB="0" distL="114300" distR="114300" simplePos="0" relativeHeight="251697152" behindDoc="0" locked="0" layoutInCell="1" allowOverlap="1" wp14:anchorId="358675B3" wp14:editId="20264963">
+                <wp:simplePos x="0" y="0"/>
+                <wp:positionH relativeFrom="column">
+                  <wp:posOffset>2102803</wp:posOffset>
+                </wp:positionH>
+                <wp:positionV relativeFrom="paragraph">
+                  <wp:posOffset>147638</wp:posOffset>
+                </wp:positionV>
+                <wp:extent cx="376238" cy="290513"/>
+                <wp:effectExtent l="19050" t="19050" r="43180" b="14605"/>
+                <wp:wrapNone/>
+                <wp:docPr id="1919338436" name="Isosceles Triangle 7"/>
+                <wp:cNvGraphicFramePr/>
+                <a:graphic xmlns:a="http://schemas.openxmlformats.org/drawingml/2006/main">
+                  <a:graphicData uri="http://schemas.microsoft.com/office/word/2010/wordprocessingShape">
+                    <wps:wsp>
+                      <wps:cNvSpPr/>
+                      <wps:spPr>
+                        <a:xfrm>
+                          <a:off x="0" y="0"/>
+                          <a:ext cx="376238" cy="290513"/>
+                        </a:xfrm>
+                        <a:prstGeom prst="triangle">
+                          <a:avLst/>
+                        </a:prstGeom>
+                      </wps:spPr>
+                      <wps:style>
+                        <a:lnRef idx="2">
+                          <a:schemeClr val="accent1">
+                            <a:shade val="15000"/>
+                          </a:schemeClr>
+                        </a:lnRef>
+                        <a:fillRef idx="1">
+                          <a:schemeClr val="accent1"/>
+                        </a:fillRef>
+                        <a:effectRef idx="0">
+                          <a:schemeClr val="accent1"/>
+                        </a:effectRef>
+                        <a:fontRef idx="minor">
+                          <a:schemeClr val="lt1"/>
+                        </a:fontRef>
+                      </wps:style>
+                      <wps:bodyPr rot="0" spcFirstLastPara="0" vertOverflow="overflow" horzOverflow="overflow" vert="horz" wrap="square" lIns="91440" tIns="45720" rIns="91440" bIns="45720" numCol="1" spcCol="0" rtlCol="0" fromWordArt="0" anchor="ctr" anchorCtr="0" forceAA="0" compatLnSpc="1">
+                        <a:prstTxWarp prst="textNoShape">
+                          <a:avLst/>
+                        </a:prstTxWarp>
+                        <a:noAutofit/>
+                      </wps:bodyPr>
+                    </wps:wsp>
+                  </a:graphicData>
+                </a:graphic>
+              </wp:anchor>
+            </w:drawing>
+          </mc:Choice>
+          <mc:Fallback>
+            <w:pict>
+              <v:shape w14:anchorId="3E6B3196" id="Isosceles Triangle 7" o:spid="_x0000_s1026" type="#_x0000_t5" style="position:absolute;margin-left:165.6pt;margin-top:11.65pt;width:29.65pt;height:22.9pt;z-index:251697152;visibility:visible;mso-wrap-style:square;mso-wrap-distance-left:9pt;mso-wrap-distance-top:0;mso-wrap-distance-right:9pt;mso-wrap-distance-bottom:0;mso-position-horizontal:absolute;mso-position-horizontal-relative:text;mso-position-vertical:absolute;mso-position-vertical-relative:text;v-text-anchor:middle" o:gfxdata="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" fillcolor="#5b9bd5 [3204]" strokecolor="#091723 [484]" strokeweight="1pt"/>
+            </w:pict>
+          </mc:Fallback>
+        </mc:AlternateContent>
+      </w:r>
+    </w:p>
+    <w:p>
+      <w:r>
+        <w:rPr>
+          <w:noProof/>
+        </w:rPr>
+        <mc:AlternateContent>
+          <mc:Choice Requires="wps">
+            <w:drawing>
+              <wp:anchor distT="0" distB="0" distL="114300" distR="114300" simplePos="0" relativeHeight="251673600" behindDoc="0" locked="0" layoutInCell="1" allowOverlap="1" wp14:anchorId="517DCF69" wp14:editId="5745ECC7">
+                <wp:simplePos x="0" y="0"/>
+                <wp:positionH relativeFrom="column">
+                  <wp:posOffset>1564640</wp:posOffset>
+                </wp:positionH>
+                <wp:positionV relativeFrom="paragraph">
+                  <wp:posOffset>141288</wp:posOffset>
+                </wp:positionV>
+                <wp:extent cx="1537970" cy="0"/>
+                <wp:effectExtent l="0" t="76200" r="24130" b="95250"/>
+                <wp:wrapNone/>
+                <wp:docPr id="879205256" name="Straight Arrow Connector 4"/>
+                <wp:cNvGraphicFramePr/>
+                <a:graphic xmlns:a="http://schemas.openxmlformats.org/drawingml/2006/main">
+                  <a:graphicData uri="http://schemas.microsoft.com/office/word/2010/wordprocessingShape">
+                    <wps:wsp>
+                      <wps:cNvCnPr/>
+                      <wps:spPr>
+                        <a:xfrm>
+                          <a:off x="0" y="0"/>
+                          <a:ext cx="1537970" cy="0"/>
+                        </a:xfrm>
+                        <a:prstGeom prst="straightConnector1">
+                          <a:avLst/>
+                        </a:prstGeom>
+                        <a:ln>
+                          <a:tailEnd type="triangle"/>
+                        </a:ln>
+                      </wps:spPr>
+                      <wps:style>
+                        <a:lnRef idx="1">
+                          <a:schemeClr val="accent1"/>
+                        </a:lnRef>
+                        <a:fillRef idx="0">
+                          <a:schemeClr val="accent1"/>
+                        </a:fillRef>
+                        <a:effectRef idx="0">
+                          <a:schemeClr val="accent1"/>
+                        </a:effectRef>
+                        <a:fontRef idx="minor">
+                          <a:schemeClr val="tx1"/>
+                        </a:fontRef>
+                      </wps:style>
+                      <wps:bodyPr/>
+                    </wps:wsp>
+                  </a:graphicData>
+                </a:graphic>
+              </wp:anchor>
+            </w:drawing>
+          </mc:Choice>
+          <mc:Fallback>
+            <w:pict>
+              <v:shape w14:anchorId="4DD1A536" id="Straight Arrow Connector 4" o:spid="_x0000_s1026" type="#_x0000_t32" style="position:absolute;margin-left:123.2pt;margin-top:11.15pt;width:121.1pt;height:0;z-index:251673600;visibility:visible;mso-wrap-style:square;mso-wrap-distance-left:9pt;mso-wrap-distance-top:0;mso-wrap-distance-right:9pt;mso-wrap-distance-bottom:0;mso-position-horizontal:absolute;mso-position-horizontal-relative:text;mso-position-vertical:absolute;mso-position-vertical-relative:text" o:gfxdata="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" strokecolor="#5b9bd5 [3204]" strokeweight=".5pt">
+                <v:stroke endarrow="block" joinstyle="miter"/>
+              </v:shape>
+            </w:pict>
+          </mc:Fallback>
+        </mc:AlternateContent>
+      </w:r>
+    </w:p>
+    <w:p/>
+    <w:p>
+      <w:r>
+        <w:rPr>
+          <w:noProof/>
+        </w:rPr>
+        <mc:AlternateContent>
+          <mc:Choice Requires="wps">
+            <w:drawing>
+              <wp:anchor distT="0" distB="0" distL="114300" distR="114300" simplePos="0" relativeHeight="251665408" behindDoc="0" locked="0" layoutInCell="1" allowOverlap="1" wp14:anchorId="09EB52AC" wp14:editId="5BDB358D">
+                <wp:simplePos x="0" y="0"/>
+                <wp:positionH relativeFrom="column">
+                  <wp:posOffset>111760</wp:posOffset>
+                </wp:positionH>
+                <wp:positionV relativeFrom="paragraph">
+                  <wp:posOffset>70803</wp:posOffset>
+                </wp:positionV>
+                <wp:extent cx="1466850" cy="785495"/>
+                <wp:effectExtent l="0" t="0" r="19050" b="14605"/>
+                <wp:wrapNone/>
+                <wp:docPr id="737765919" name="Rectangle: Rounded Corners 1"/>
+                <wp:cNvGraphicFramePr/>
+                <a:graphic xmlns:a="http://schemas.openxmlformats.org/drawingml/2006/main">
+                  <a:graphicData uri="http://schemas.microsoft.com/office/word/2010/wordprocessingShape">
+                    <wps:wsp>
+                      <wps:cNvSpPr/>
+                      <wps:spPr>
+                        <a:xfrm>
+                          <a:off x="0" y="0"/>
+                          <a:ext cx="1466850" cy="785495"/>
+                        </a:xfrm>
+                        <a:prstGeom prst="roundRect">
+                          <a:avLst/>
+                        </a:prstGeom>
+                      </wps:spPr>
+                      <wps:style>
+                        <a:lnRef idx="2">
+                          <a:schemeClr val="accent1">
+                            <a:shade val="15000"/>
+                          </a:schemeClr>
+                        </a:lnRef>
+                        <a:fillRef idx="1">
+                          <a:schemeClr val="accent1"/>
+                        </a:fillRef>
+                        <a:effectRef idx="0">
+                          <a:schemeClr val="accent1"/>
+                        </a:effectRef>
+                        <a:fontRef idx="minor">
+                          <a:schemeClr val="lt1"/>
+                        </a:fontRef>
+                      </wps:style>
+                      <wps:txbx>
+                        <w:txbxContent>
+                          <w:p>
+                            <w:pPr>
+                              <w:jc w:val="center"/>
+                            </w:pPr>
+                            <w:r>
+                              <w:t>Low</w:t>
+                            </w:r>
+                            <w:r>
+                              <w:t xml:space="preserve"> Level Requirements</w:t>
+                            </w:r>
+                          </w:p>
+                        </w:txbxContent>
+                      </wps:txbx>
+                      <wps:bodyPr rot="0" spcFirstLastPara="0" vertOverflow="overflow" horzOverflow="overflow" vert="horz" wrap="square" lIns="91440" tIns="45720" rIns="91440" bIns="45720" numCol="1" spcCol="0" rtlCol="0" fromWordArt="0" anchor="ctr" anchorCtr="0" forceAA="0" compatLnSpc="1">
+                        <a:prstTxWarp prst="textNoShape">
+                          <a:avLst/>
+                        </a:prstTxWarp>
+                        <a:noAutofit/>
+                      </wps:bodyPr>
+                    </wps:wsp>
+                  </a:graphicData>
+                </a:graphic>
+                <wp14:sizeRelH relativeFrom="margin">
+                  <wp14:pctWidth>0</wp14:pctWidth>
+                </wp14:sizeRelH>
+                <wp14:sizeRelV relativeFrom="margin">
+                  <wp14:pctHeight>0</wp14:pctHeight>
+                </wp14:sizeRelV>
+              </wp:anchor>
+            </w:drawing>
+          </mc:Choice>
+          <mc:Fallback>
+            <w:pict>
+              <v:roundrect w14:anchorId="09EB52AC" id="_x0000_s1029" style="position:absolute;margin-left:8.8pt;margin-top:5.6pt;width:115.5pt;height:61.85pt;z-index:251665408;visibility:visible;mso-wrap-style:square;mso-width-percent:0;mso-height-percent:0;mso-wrap-distance-left:9pt;mso-wrap-distance-top:0;mso-wrap-distance-right:9pt;mso-wrap-distance-bottom:0;mso-position-horizontal:absolute;mso-position-horizontal-relative:text;mso-position-vertical:absolute;mso-position-vertical-relative:text;mso-width-percent:0;mso-height-percent:0;mso-width-relative:margin;mso-height-relative:margin;v-text-anchor:middle" arcsize="10923f" o:gfxdata="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" fillcolor="#5b9bd5 [3204]" strokecolor="#091723 [484]" strokeweight="1pt">
+                <v:stroke joinstyle="miter"/>
+                <v:textbox>
+                  <w:txbxContent>
+                    <w:p>
+                      <w:pPr>
+                        <w:jc w:val="center"/>
+                      </w:pPr>
+                      <w:r>
+                        <w:t>Low</w:t>
+                      </w:r>
+                      <w:r>
+                        <w:t xml:space="preserve"> Level Requirements</w:t>
+                      </w:r>
+                    </w:p>
+                  </w:txbxContent>
+                </v:textbox>
+              </v:roundrect>
+            </w:pict>
+          </mc:Fallback>
+        </mc:AlternateContent>
+      </w:r>
+    </w:p>
+    <w:p>
+      <w:r>
+        <w:rPr>
+          <w:noProof/>
+        </w:rPr>
+        <mc:AlternateContent>
+          <mc:Choice Requires="wps">
+            <w:drawing>
+              <wp:anchor distT="0" distB="0" distL="114300" distR="114300" simplePos="0" relativeHeight="251686912" behindDoc="0" locked="0" layoutInCell="1" allowOverlap="1" wp14:anchorId="3A377487" wp14:editId="6CEFF328">
+                <wp:simplePos x="0" y="0"/>
+                <wp:positionH relativeFrom="column">
+                  <wp:posOffset>1573847</wp:posOffset>
+                </wp:positionH>
+                <wp:positionV relativeFrom="paragraph">
+                  <wp:posOffset>142240</wp:posOffset>
+                </wp:positionV>
+                <wp:extent cx="1537970" cy="0"/>
+                <wp:effectExtent l="38100" t="76200" r="0" b="95250"/>
+                <wp:wrapNone/>
+                <wp:docPr id="146872204" name="Straight Arrow Connector 5"/>
+                <wp:cNvGraphicFramePr/>
+                <a:graphic xmlns:a="http://schemas.openxmlformats.org/drawingml/2006/main">
+                  <a:graphicData uri="http://schemas.microsoft.com/office/word/2010/wordprocessingShape">
+                    <wps:wsp>
+                      <wps:cNvCnPr/>
+                      <wps:spPr>
+                        <a:xfrm flipH="1">
+                          <a:off x="0" y="0"/>
+                          <a:ext cx="1537970" cy="0"/>
+                        </a:xfrm>
+                        <a:prstGeom prst="straightConnector1">
+                          <a:avLst/>
+                        </a:prstGeom>
+                        <a:ln>
+                          <a:tailEnd type="triangle"/>
+                        </a:ln>
+                      </wps:spPr>
+                      <wps:style>
+                        <a:lnRef idx="1">
+                          <a:schemeClr val="accent1"/>
+                        </a:lnRef>
+                        <a:fillRef idx="0">
+                          <a:schemeClr val="accent1"/>
+                        </a:fillRef>
+                        <a:effectRef idx="0">
+                          <a:schemeClr val="accent1"/>
+                        </a:effectRef>
+                        <a:fontRef idx="minor">
+                          <a:schemeClr val="tx1"/>
+                        </a:fontRef>
+                      </wps:style>
+                      <wps:bodyPr/>
+                    </wps:wsp>
+                  </a:graphicData>
+                </a:graphic>
+              </wp:anchor>
+            </w:drawing>
+          </mc:Choice>
+          <mc:Fallback>
+            <w:pict>
+              <v:shape w14:anchorId="046A3CD4" id="Straight Arrow Connector 5" o:spid="_x0000_s1026" type="#_x0000_t32" style="position:absolute;margin-left:123.9pt;margin-top:11.2pt;width:121.1pt;height:0;flip:x;z-index:251686912;visibility:visible;mso-wrap-style:square;mso-wrap-distance-left:9pt;mso-wrap-distance-top:0;mso-wrap-distance-right:9pt;mso-wrap-distance-bottom:0;mso-position-horizontal:absolute;mso-position-horizontal-relative:text;mso-position-vertical:absolute;mso-position-vertical-relative:text" o:gfxdata="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" strokecolor="#5b9bd5 [3204]" strokeweight=".5pt">
+                <v:stroke endarrow="block" joinstyle="miter"/>
+              </v:shape>
+            </w:pict>
+          </mc:Fallback>
+        </mc:AlternateContent>
+      </w:r>
+    </w:p>
+    <w:p>
+      <w:r>
+        <w:rPr>
+          <w:noProof/>
+        </w:rPr>
+        <mc:AlternateContent>
+          <mc:Choice Requires="wps">
+            <w:drawing>
+              <wp:anchor distT="0" distB="0" distL="114300" distR="114300" simplePos="0" relativeHeight="251708416" behindDoc="0" locked="0" layoutInCell="1" allowOverlap="1" wp14:anchorId="290921B8" wp14:editId="5E7BC4B2">
+                <wp:simplePos x="0" y="0"/>
+                <wp:positionH relativeFrom="column">
+                  <wp:posOffset>2488565</wp:posOffset>
+                </wp:positionH>
+                <wp:positionV relativeFrom="paragraph">
+                  <wp:posOffset>124142</wp:posOffset>
+                </wp:positionV>
+                <wp:extent cx="337820" cy="337820"/>
+                <wp:effectExtent l="19050" t="19050" r="24130" b="43180"/>
+                <wp:wrapNone/>
+                <wp:docPr id="902388867" name="Diamond 8"/>
+                <wp:cNvGraphicFramePr/>
+                <a:graphic xmlns:a="http://schemas.openxmlformats.org/drawingml/2006/main">
+                  <a:graphicData uri="http://schemas.microsoft.com/office/word/2010/wordprocessingShape">
+                    <wps:wsp>
+                      <wps:cNvSpPr/>
+                      <wps:spPr>
+                        <a:xfrm>
+                          <a:off x="0" y="0"/>
+                          <a:ext cx="337820" cy="337820"/>
+                        </a:xfrm>
+                        <a:prstGeom prst="diamond">
+                          <a:avLst/>
+                        </a:prstGeom>
+                      </wps:spPr>
+                      <wps:style>
+                        <a:lnRef idx="2">
+                          <a:schemeClr val="accent1">
+                            <a:shade val="15000"/>
+                          </a:schemeClr>
+                        </a:lnRef>
+                        <a:fillRef idx="1">
+                          <a:schemeClr val="accent1"/>
+                        </a:fillRef>
+                        <a:effectRef idx="0">
+                          <a:schemeClr val="accent1"/>
+                        </a:effectRef>
+                        <a:fontRef idx="minor">
+                          <a:schemeClr val="lt1"/>
+                        </a:fontRef>
+                      </wps:style>
+                      <wps:bodyPr rot="0" spcFirstLastPara="0" vertOverflow="overflow" horzOverflow="overflow" vert="horz" wrap="square" lIns="91440" tIns="45720" rIns="91440" bIns="45720" numCol="1" spcCol="0" rtlCol="0" fromWordArt="0" anchor="ctr" anchorCtr="0" forceAA="0" compatLnSpc="1">
+                        <a:prstTxWarp prst="textNoShape">
+                          <a:avLst/>
+                        </a:prstTxWarp>
+                        <a:noAutofit/>
+                      </wps:bodyPr>
+                    </wps:wsp>
+                  </a:graphicData>
+                </a:graphic>
+              </wp:anchor>
+            </w:drawing>
+          </mc:Choice>
+          <mc:Fallback>
+            <w:pict>
+              <v:shape w14:anchorId="4DB50CA6" id="Diamond 8" o:spid="_x0000_s1026" type="#_x0000_t4" style="position:absolute;margin-left:195.95pt;margin-top:9.75pt;width:26.6pt;height:26.6pt;z-index:251708416;visibility:visible;mso-wrap-style:square;mso-wrap-distance-left:9pt;mso-wrap-distance-top:0;mso-wrap-distance-right:9pt;mso-wrap-distance-bottom:0;mso-position-horizontal:absolute;mso-position-horizontal-relative:text;mso-position-vertical:absolute;mso-position-vertical-relative:text;v-text-anchor:middle" o:gfxdata="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" fillcolor="#5b9bd5 [3204]" strokecolor="#091723 [484]" strokeweight="1pt"/>
+            </w:pict>
+          </mc:Fallback>
+        </mc:AlternateContent>
+      </w:r>
+      <w:r>
+        <w:rPr>
+          <w:noProof/>
+        </w:rPr>
+        <mc:AlternateContent>
+          <mc:Choice Requires="wps">
+            <w:drawing>
+              <wp:anchor distT="0" distB="0" distL="114300" distR="114300" simplePos="0" relativeHeight="251699200" behindDoc="0" locked="0" layoutInCell="1" allowOverlap="1" wp14:anchorId="5697C19D" wp14:editId="4EABD010">
+                <wp:simplePos x="0" y="0"/>
+                <wp:positionH relativeFrom="column">
+                  <wp:posOffset>2097722</wp:posOffset>
+                </wp:positionH>
+                <wp:positionV relativeFrom="paragraph">
+                  <wp:posOffset>138430</wp:posOffset>
+                </wp:positionV>
+                <wp:extent cx="376238" cy="290513"/>
+                <wp:effectExtent l="19050" t="19050" r="43180" b="14605"/>
+                <wp:wrapNone/>
+                <wp:docPr id="1859219169" name="Isosceles Triangle 7"/>
+                <wp:cNvGraphicFramePr/>
+                <a:graphic xmlns:a="http://schemas.openxmlformats.org/drawingml/2006/main">
+                  <a:graphicData uri="http://schemas.microsoft.com/office/word/2010/wordprocessingShape">
+                    <wps:wsp>
+                      <wps:cNvSpPr/>
+                      <wps:spPr>
+                        <a:xfrm>
+                          <a:off x="0" y="0"/>
+                          <a:ext cx="376238" cy="290513"/>
+                        </a:xfrm>
+                        <a:prstGeom prst="triangle">
+                          <a:avLst/>
+                        </a:prstGeom>
+                      </wps:spPr>
+                      <wps:style>
+                        <a:lnRef idx="2">
+                          <a:schemeClr val="accent1">
+                            <a:shade val="15000"/>
+                          </a:schemeClr>
+                        </a:lnRef>
+                        <a:fillRef idx="1">
+                          <a:schemeClr val="accent1"/>
+                        </a:fillRef>
+                        <a:effectRef idx="0">
+                          <a:schemeClr val="accent1"/>
+                        </a:effectRef>
+                        <a:fontRef idx="minor">
+                          <a:schemeClr val="lt1"/>
+                        </a:fontRef>
+                      </wps:style>
+                      <wps:bodyPr rot="0" spcFirstLastPara="0" vertOverflow="overflow" horzOverflow="overflow" vert="horz" wrap="square" lIns="91440" tIns="45720" rIns="91440" bIns="45720" numCol="1" spcCol="0" rtlCol="0" fromWordArt="0" anchor="ctr" anchorCtr="0" forceAA="0" compatLnSpc="1">
+                        <a:prstTxWarp prst="textNoShape">
+                          <a:avLst/>
+                        </a:prstTxWarp>
+                        <a:noAutofit/>
+                      </wps:bodyPr>
+                    </wps:wsp>
+                  </a:graphicData>
+                </a:graphic>
+              </wp:anchor>
+            </w:drawing>
+          </mc:Choice>
+          <mc:Fallback>
+            <w:pict>
+              <v:shape w14:anchorId="2FEEF690" id="Isosceles Triangle 7" o:spid="_x0000_s1026" type="#_x0000_t5" style="position:absolute;margin-left:165.15pt;margin-top:10.9pt;width:29.65pt;height:22.9pt;z-index:251699200;visibility:visible;mso-wrap-style:square;mso-wrap-distance-left:9pt;mso-wrap-distance-top:0;mso-wrap-distance-right:9pt;mso-wrap-distance-bottom:0;mso-position-horizontal:absolute;mso-position-horizontal-relative:text;mso-position-vertical:absolute;mso-position-vertical-relative:text;v-text-anchor:middle" o:gfxdata="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" fillcolor="#5b9bd5 [3204]" strokecolor="#091723 [484]" strokeweight="1pt"/>
+            </w:pict>
+          </mc:Fallback>
+        </mc:AlternateContent>
+      </w:r>
+    </w:p>
+    <w:p>
+      <w:r>
+        <w:rPr>
+          <w:noProof/>
+        </w:rPr>
+        <mc:AlternateContent>
+          <mc:Choice Requires="wps">
+            <w:drawing>
+              <wp:anchor distT="0" distB="0" distL="114300" distR="114300" simplePos="0" relativeHeight="251675648" behindDoc="0" locked="0" layoutInCell="1" allowOverlap="1" wp14:anchorId="279088A7" wp14:editId="30996805">
+                <wp:simplePos x="0" y="0"/>
+                <wp:positionH relativeFrom="column">
+                  <wp:posOffset>1574165</wp:posOffset>
+                </wp:positionH>
+                <wp:positionV relativeFrom="paragraph">
+                  <wp:posOffset>141923</wp:posOffset>
+                </wp:positionV>
+                <wp:extent cx="1537970" cy="0"/>
+                <wp:effectExtent l="0" t="76200" r="24130" b="95250"/>
+                <wp:wrapNone/>
+                <wp:docPr id="1530442559" name="Straight Arrow Connector 4"/>
+                <wp:cNvGraphicFramePr/>
+                <a:graphic xmlns:a="http://schemas.openxmlformats.org/drawingml/2006/main">
+                  <a:graphicData uri="http://schemas.microsoft.com/office/word/2010/wordprocessingShape">
+                    <wps:wsp>
+                      <wps:cNvCnPr/>
+                      <wps:spPr>
+                        <a:xfrm>
+                          <a:off x="0" y="0"/>
+                          <a:ext cx="1537970" cy="0"/>
+                        </a:xfrm>
+                        <a:prstGeom prst="straightConnector1">
+                          <a:avLst/>
+                        </a:prstGeom>
+                        <a:ln>
+                          <a:tailEnd type="triangle"/>
+                        </a:ln>
+                      </wps:spPr>
+                      <wps:style>
+                        <a:lnRef idx="1">
+                          <a:schemeClr val="accent1"/>
+                        </a:lnRef>
+                        <a:fillRef idx="0">
+                          <a:schemeClr val="accent1"/>
+                        </a:fillRef>
+                        <a:effectRef idx="0">
+                          <a:schemeClr val="accent1"/>
+                        </a:effectRef>
+                        <a:fontRef idx="minor">
+                          <a:schemeClr val="tx1"/>
+                        </a:fontRef>
+                      </wps:style>
+                      <wps:bodyPr/>
+                    </wps:wsp>
+                  </a:graphicData>
+                </a:graphic>
+              </wp:anchor>
+            </w:drawing>
+          </mc:Choice>
+          <mc:Fallback>
+            <w:pict>
+              <v:shape w14:anchorId="575A0A83" id="Straight Arrow Connector 4" o:spid="_x0000_s1026" type="#_x0000_t32" style="position:absolute;margin-left:123.95pt;margin-top:11.2pt;width:121.1pt;height:0;z-index:251675648;visibility:visible;mso-wrap-style:square;mso-wrap-distance-left:9pt;mso-wrap-distance-top:0;mso-wrap-distance-right:9pt;mso-wrap-distance-bottom:0;mso-position-horizontal:absolute;mso-position-horizontal-relative:text;mso-position-vertical:absolute;mso-position-vertical-relative:text" o:gfxdata="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" strokecolor="#5b9bd5 [3204]" strokeweight=".5pt">
+                <v:stroke endarrow="block" joinstyle="miter"/>
+              </v:shape>
+            </w:pict>
+          </mc:Fallback>
+        </mc:AlternateContent>
+      </w:r>
+    </w:p>
+    <w:p/>
+    <w:p>
+      <w:r>
+        <w:rPr>
+          <w:noProof/>
+        </w:rPr>
+        <mc:AlternateContent>
+          <mc:Choice Requires="wps">
+            <w:drawing>
+              <wp:anchor distT="0" distB="0" distL="114300" distR="114300" simplePos="0" relativeHeight="251667456" behindDoc="0" locked="0" layoutInCell="1" allowOverlap="1" wp14:anchorId="5222A9A4" wp14:editId="7ECEA0BF">
+                <wp:simplePos x="0" y="0"/>
+                <wp:positionH relativeFrom="column">
+                  <wp:posOffset>102553</wp:posOffset>
+                </wp:positionH>
+                <wp:positionV relativeFrom="paragraph">
+                  <wp:posOffset>109855</wp:posOffset>
+                </wp:positionV>
+                <wp:extent cx="1466850" cy="785495"/>
+                <wp:effectExtent l="0" t="0" r="19050" b="14605"/>
+                <wp:wrapNone/>
+                <wp:docPr id="2005791745" name="Rectangle: Rounded Corners 1"/>
+                <wp:cNvGraphicFramePr/>
+                <a:graphic xmlns:a="http://schemas.openxmlformats.org/drawingml/2006/main">
+                  <a:graphicData uri="http://schemas.microsoft.com/office/word/2010/wordprocessingShape">
+                    <wps:wsp>
+                      <wps:cNvSpPr/>
+                      <wps:spPr>
+                        <a:xfrm>
+                          <a:off x="0" y="0"/>
+                          <a:ext cx="1466850" cy="785495"/>
+                        </a:xfrm>
+                        <a:prstGeom prst="roundRect">
+                          <a:avLst/>
+                        </a:prstGeom>
+                      </wps:spPr>
+                      <wps:style>
+                        <a:lnRef idx="2">
+                          <a:schemeClr val="accent1">
+                            <a:shade val="15000"/>
+                          </a:schemeClr>
+                        </a:lnRef>
+                        <a:fillRef idx="1">
+                          <a:schemeClr val="accent1"/>
+                        </a:fillRef>
+                        <a:effectRef idx="0">
+                          <a:schemeClr val="accent1"/>
+                        </a:effectRef>
+                        <a:fontRef idx="minor">
+                          <a:schemeClr val="lt1"/>
+                        </a:fontRef>
+                      </wps:style>
+                      <wps:txbx>
+                        <w:txbxContent>
+                          <w:p>
+                            <w:pPr>
+                              <w:jc w:val="center"/>
+                            </w:pPr>
+                            <w:r>
+                              <w:t>Low</w:t>
+                            </w:r>
+                            <w:r>
+                              <w:t xml:space="preserve"> Level Requirement</w:t>
+                            </w:r>
+                            <w:r>
+                              <w:t xml:space="preserve"> Verification</w:t>
+                            </w:r>
+                          </w:p>
+                        </w:txbxContent>
+                      </wps:txbx>
+                      <wps:bodyPr rot="0" spcFirstLastPara="0" vertOverflow="overflow" horzOverflow="overflow" vert="horz" wrap="square" lIns="91440" tIns="45720" rIns="91440" bIns="45720" numCol="1" spcCol="0" rtlCol="0" fromWordArt="0" anchor="ctr" anchorCtr="0" forceAA="0" compatLnSpc="1">
+                        <a:prstTxWarp prst="textNoShape">
+                          <a:avLst/>
+                        </a:prstTxWarp>
+                        <a:noAutofit/>
+                      </wps:bodyPr>
+                    </wps:wsp>
+                  </a:graphicData>
+                </a:graphic>
+                <wp14:sizeRelH relativeFrom="margin">
+                  <wp14:pctWidth>0</wp14:pctWidth>
+                </wp14:sizeRelH>
+                <wp14:sizeRelV relativeFrom="margin">
+                  <wp14:pctHeight>0</wp14:pctHeight>
+                </wp14:sizeRelV>
+              </wp:anchor>
+            </w:drawing>
+          </mc:Choice>
+          <mc:Fallback>
+            <w:pict>
+              <v:roundrect w14:anchorId="5222A9A4" id="_x0000_s1030" style="position:absolute;margin-left:8.1pt;margin-top:8.65pt;width:115.5pt;height:61.85pt;z-index:251667456;visibility:visible;mso-wrap-style:square;mso-width-percent:0;mso-height-percent:0;mso-wrap-distance-left:9pt;mso-wrap-distance-top:0;mso-wrap-distance-right:9pt;mso-wrap-distance-bottom:0;mso-position-horizontal:absolute;mso-position-horizontal-relative:text;mso-position-vertical:absolute;mso-position-vertical-relative:text;mso-width-percent:0;mso-height-percent:0;mso-width-relative:margin;mso-height-relative:margin;v-text-anchor:middle" arcsize="10923f" o:gfxdata="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" fillcolor="#5b9bd5 [3204]" strokecolor="#091723 [484]" strokeweight="1pt">
+                <v:stroke joinstyle="miter"/>
+                <v:textbox>
+                  <w:txbxContent>
+                    <w:p>
+                      <w:pPr>
+                        <w:jc w:val="center"/>
+                      </w:pPr>
+                      <w:r>
+                        <w:t>Low</w:t>
+                      </w:r>
+                      <w:r>
+                        <w:t xml:space="preserve"> Level Requirement</w:t>
+                      </w:r>
+                      <w:r>
+                        <w:t xml:space="preserve"> Verification</w:t>
+                      </w:r>
+                    </w:p>
+                  </w:txbxContent>
+                </v:textbox>
+              </v:roundrect>
+            </w:pict>
+          </mc:Fallback>
+        </mc:AlternateContent>
+      </w:r>
+    </w:p>
+    <w:p>
+      <w:r>
+        <w:rPr>
+          <w:noProof/>
+        </w:rPr>
+        <mc:AlternateContent>
+          <mc:Choice Requires="wps">
+            <w:drawing>
+              <wp:anchor distT="0" distB="0" distL="114300" distR="114300" simplePos="0" relativeHeight="251688960" behindDoc="0" locked="0" layoutInCell="1" allowOverlap="1" wp14:anchorId="562FA7F4" wp14:editId="232722E7">
+                <wp:simplePos x="0" y="0"/>
+                <wp:positionH relativeFrom="column">
+                  <wp:posOffset>1582737</wp:posOffset>
+                </wp:positionH>
+                <wp:positionV relativeFrom="paragraph">
+                  <wp:posOffset>137160</wp:posOffset>
+                </wp:positionV>
+                <wp:extent cx="1537970" cy="0"/>
+                <wp:effectExtent l="38100" t="76200" r="0" b="95250"/>
+                <wp:wrapNone/>
+                <wp:docPr id="692959621" name="Straight Arrow Connector 5"/>
+                <wp:cNvGraphicFramePr/>
+                <a:graphic xmlns:a="http://schemas.openxmlformats.org/drawingml/2006/main">
+                  <a:graphicData uri="http://schemas.microsoft.com/office/word/2010/wordprocessingShape">
+                    <wps:wsp>
+                      <wps:cNvCnPr/>
+                      <wps:spPr>
+                        <a:xfrm flipH="1">
+                          <a:off x="0" y="0"/>
+                          <a:ext cx="1537970" cy="0"/>
+                        </a:xfrm>
+                        <a:prstGeom prst="straightConnector1">
+                          <a:avLst/>
+                        </a:prstGeom>
+                        <a:ln>
+                          <a:tailEnd type="triangle"/>
+                        </a:ln>
+                      </wps:spPr>
+                      <wps:style>
+                        <a:lnRef idx="1">
+                          <a:schemeClr val="accent1"/>
+                        </a:lnRef>
+                        <a:fillRef idx="0">
+                          <a:schemeClr val="accent1"/>
+                        </a:fillRef>
+                        <a:effectRef idx="0">
+                          <a:schemeClr val="accent1"/>
+                        </a:effectRef>
+                        <a:fontRef idx="minor">
+                          <a:schemeClr val="tx1"/>
+                        </a:fontRef>
+                      </wps:style>
+                      <wps:bodyPr/>
+                    </wps:wsp>
+                  </a:graphicData>
+                </a:graphic>
+              </wp:anchor>
+            </w:drawing>
+          </mc:Choice>
+          <mc:Fallback>
+            <w:pict>
+              <v:shape w14:anchorId="5887A89F" id="Straight Arrow Connector 5" o:spid="_x0000_s1026" type="#_x0000_t32" style="position:absolute;margin-left:124.6pt;margin-top:10.8pt;width:121.1pt;height:0;flip:x;z-index:251688960;visibility:visible;mso-wrap-style:square;mso-wrap-distance-left:9pt;mso-wrap-distance-top:0;mso-wrap-distance-right:9pt;mso-wrap-distance-bottom:0;mso-position-horizontal:absolute;mso-position-horizontal-relative:text;mso-position-vertical:absolute;mso-position-vertical-relative:text" o:gfxdata="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" strokecolor="#5b9bd5 [3204]" strokeweight=".5pt">
+                <v:stroke endarrow="block" joinstyle="miter"/>
+              </v:shape>
+            </w:pict>
+          </mc:Fallback>
+        </mc:AlternateContent>
+      </w:r>
+    </w:p>
+    <w:p>
+      <w:r>
+        <w:rPr>
+          <w:noProof/>
+        </w:rPr>
+        <mc:AlternateContent>
+          <mc:Choice Requires="wps">
+            <w:drawing>
+              <wp:anchor distT="0" distB="0" distL="114300" distR="114300" simplePos="0" relativeHeight="251701248" behindDoc="0" locked="0" layoutInCell="1" allowOverlap="1" wp14:anchorId="5248B2B6" wp14:editId="4B06C59B">
+                <wp:simplePos x="0" y="0"/>
+                <wp:positionH relativeFrom="column">
+                  <wp:posOffset>2083753</wp:posOffset>
+                </wp:positionH>
+                <wp:positionV relativeFrom="paragraph">
+                  <wp:posOffset>152717</wp:posOffset>
+                </wp:positionV>
+                <wp:extent cx="376238" cy="290513"/>
+                <wp:effectExtent l="19050" t="19050" r="43180" b="14605"/>
+                <wp:wrapNone/>
+                <wp:docPr id="405844367" name="Isosceles Triangle 7"/>
+                <wp:cNvGraphicFramePr/>
+                <a:graphic xmlns:a="http://schemas.openxmlformats.org/drawingml/2006/main">
+                  <a:graphicData uri="http://schemas.microsoft.com/office/word/2010/wordprocessingShape">
+                    <wps:wsp>
+                      <wps:cNvSpPr/>
+                      <wps:spPr>
+                        <a:xfrm>
+                          <a:off x="0" y="0"/>
+                          <a:ext cx="376238" cy="290513"/>
+                        </a:xfrm>
+                        <a:prstGeom prst="triangle">
+                          <a:avLst/>
+                        </a:prstGeom>
+                      </wps:spPr>
+                      <wps:style>
+                        <a:lnRef idx="2">
+                          <a:schemeClr val="accent1">
+                            <a:shade val="15000"/>
+                          </a:schemeClr>
+                        </a:lnRef>
+                        <a:fillRef idx="1">
+                          <a:schemeClr val="accent1"/>
+                        </a:fillRef>
+                        <a:effectRef idx="0">
+                          <a:schemeClr val="accent1"/>
+                        </a:effectRef>
+                        <a:fontRef idx="minor">
+                          <a:schemeClr val="lt1"/>
+                        </a:fontRef>
+                      </wps:style>
+                      <wps:bodyPr rot="0" spcFirstLastPara="0" vertOverflow="overflow" horzOverflow="overflow" vert="horz" wrap="square" lIns="91440" tIns="45720" rIns="91440" bIns="45720" numCol="1" spcCol="0" rtlCol="0" fromWordArt="0" anchor="ctr" anchorCtr="0" forceAA="0" compatLnSpc="1">
+                        <a:prstTxWarp prst="textNoShape">
+                          <a:avLst/>
+                        </a:prstTxWarp>
+                        <a:noAutofit/>
+                      </wps:bodyPr>
+                    </wps:wsp>
+                  </a:graphicData>
+                </a:graphic>
+              </wp:anchor>
+            </w:drawing>
+          </mc:Choice>
+          <mc:Fallback>
+            <w:pict>
+              <v:shape w14:anchorId="294B8DBD" id="Isosceles Triangle 7" o:spid="_x0000_s1026" type="#_x0000_t5" style="position:absolute;margin-left:164.1pt;margin-top:12pt;width:29.65pt;height:22.9pt;z-index:251701248;visibility:visible;mso-wrap-style:square;mso-wrap-distance-left:9pt;mso-wrap-distance-top:0;mso-wrap-distance-right:9pt;mso-wrap-distance-bottom:0;mso-position-horizontal:absolute;mso-position-horizontal-relative:text;mso-position-vertical:absolute;mso-position-vertical-relative:text;v-text-anchor:middle" o:gfxdata="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" fillcolor="#5b9bd5 [3204]" strokecolor="#091723 [484]" strokeweight="1pt"/>
+            </w:pict>
+          </mc:Fallback>
+        </mc:AlternateContent>
+      </w:r>
+    </w:p>
+    <w:p>
+      <w:r>
+        <w:rPr>
+          <w:noProof/>
+        </w:rPr>
+        <mc:AlternateContent>
+          <mc:Choice Requires="wps">
+            <w:drawing>
+              <wp:anchor distT="0" distB="0" distL="114300" distR="114300" simplePos="0" relativeHeight="251677696" behindDoc="0" locked="0" layoutInCell="1" allowOverlap="1" wp14:anchorId="325CBBF1" wp14:editId="189404F8">
+                <wp:simplePos x="0" y="0"/>
+                <wp:positionH relativeFrom="column">
+                  <wp:posOffset>1555115</wp:posOffset>
+                </wp:positionH>
+                <wp:positionV relativeFrom="paragraph">
+                  <wp:posOffset>165418</wp:posOffset>
+                </wp:positionV>
+                <wp:extent cx="1537970" cy="0"/>
+                <wp:effectExtent l="0" t="76200" r="24130" b="95250"/>
+                <wp:wrapNone/>
+                <wp:docPr id="2105191353" name="Straight Arrow Connector 4"/>
+                <wp:cNvGraphicFramePr/>
+                <a:graphic xmlns:a="http://schemas.openxmlformats.org/drawingml/2006/main">
+                  <a:graphicData uri="http://schemas.microsoft.com/office/word/2010/wordprocessingShape">
+                    <wps:wsp>
+                      <wps:cNvCnPr/>
+                      <wps:spPr>
+                        <a:xfrm>
+                          <a:off x="0" y="0"/>
+                          <a:ext cx="1537970" cy="0"/>
+                        </a:xfrm>
+                        <a:prstGeom prst="straightConnector1">
+                          <a:avLst/>
+                        </a:prstGeom>
+                        <a:ln>
+                          <a:tailEnd type="triangle"/>
+                        </a:ln>
+                      </wps:spPr>
+                      <wps:style>
+                        <a:lnRef idx="1">
+                          <a:schemeClr val="accent1"/>
+                        </a:lnRef>
+                        <a:fillRef idx="0">
+                          <a:schemeClr val="accent1"/>
+                        </a:fillRef>
+                        <a:effectRef idx="0">
+                          <a:schemeClr val="accent1"/>
+                        </a:effectRef>
+                        <a:fontRef idx="minor">
+                          <a:schemeClr val="tx1"/>
+                        </a:fontRef>
+                      </wps:style>
+                      <wps:bodyPr/>
+                    </wps:wsp>
+                  </a:graphicData>
+                </a:graphic>
+              </wp:anchor>
+            </w:drawing>
+          </mc:Choice>
+          <mc:Fallback>
+            <w:pict>
+              <v:shape w14:anchorId="744B6BAC" id="Straight Arrow Connector 4" o:spid="_x0000_s1026" type="#_x0000_t32" style="position:absolute;margin-left:122.45pt;margin-top:13.05pt;width:121.1pt;height:0;z-index:251677696;visibility:visible;mso-wrap-style:square;mso-wrap-distance-left:9pt;mso-wrap-distance-top:0;mso-wrap-distance-right:9pt;mso-wrap-distance-bottom:0;mso-position-horizontal:absolute;mso-position-horizontal-relative:text;mso-position-vertical:absolute;mso-position-vertical-relative:text" o:gfxdata="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" strokecolor="#5b9bd5 [3204]" strokeweight=".5pt">
+                <v:stroke endarrow="block" joinstyle="miter"/>
+              </v:shape>
+            </w:pict>
+          </mc:Fallback>
+        </mc:AlternateContent>
+      </w:r>
+    </w:p>
+    <w:p/>
+    <w:p>
+      <w:r>
+        <w:rPr>
+          <w:noProof/>
+        </w:rPr>
+        <mc:AlternateContent>
+          <mc:Choice Requires="wps">
+            <w:drawing>
+              <wp:anchor distT="0" distB="0" distL="114300" distR="114300" simplePos="0" relativeHeight="251669504" behindDoc="0" locked="0" layoutInCell="1" allowOverlap="1" wp14:anchorId="701BC2DF" wp14:editId="43B54EC1">
+                <wp:simplePos x="0" y="0"/>
+                <wp:positionH relativeFrom="column">
+                  <wp:posOffset>106045</wp:posOffset>
+                </wp:positionH>
+                <wp:positionV relativeFrom="paragraph">
+                  <wp:posOffset>139383</wp:posOffset>
+                </wp:positionV>
+                <wp:extent cx="1466850" cy="785495"/>
+                <wp:effectExtent l="0" t="0" r="19050" b="14605"/>
+                <wp:wrapNone/>
+                <wp:docPr id="868677863" name="Rectangle: Rounded Corners 1"/>
+                <wp:cNvGraphicFramePr/>
+                <a:graphic xmlns:a="http://schemas.openxmlformats.org/drawingml/2006/main">
+                  <a:graphicData uri="http://schemas.microsoft.com/office/word/2010/wordprocessingShape">
+                    <wps:wsp>
+                      <wps:cNvSpPr/>
+                      <wps:spPr>
+                        <a:xfrm>
+                          <a:off x="0" y="0"/>
+                          <a:ext cx="1466850" cy="785495"/>
+                        </a:xfrm>
+                        <a:prstGeom prst="roundRect">
+                          <a:avLst/>
+                        </a:prstGeom>
+                      </wps:spPr>
+                      <wps:style>
+                        <a:lnRef idx="2">
+                          <a:schemeClr val="accent1">
+                            <a:shade val="15000"/>
+                          </a:schemeClr>
+                        </a:lnRef>
+                        <a:fillRef idx="1">
+                          <a:schemeClr val="accent1"/>
+                        </a:fillRef>
+                        <a:effectRef idx="0">
+                          <a:schemeClr val="accent1"/>
+                        </a:effectRef>
+                        <a:fontRef idx="minor">
+                          <a:schemeClr val="lt1"/>
+                        </a:fontRef>
+                      </wps:style>
+                      <wps:txbx>
+                        <w:txbxContent>
+                          <w:p>
+                            <w:r>
+                              <w:t>SW/SW / HW/SW / ACP Testing</w:t>
+                            </w:r>
+                          </w:p>
+                        </w:txbxContent>
+                      </wps:txbx>
+                      <wps:bodyPr rot="0" spcFirstLastPara="0" vertOverflow="overflow" horzOverflow="overflow" vert="horz" wrap="square" lIns="91440" tIns="45720" rIns="91440" bIns="45720" numCol="1" spcCol="0" rtlCol="0" fromWordArt="0" anchor="ctr" anchorCtr="0" forceAA="0" compatLnSpc="1">
+                        <a:prstTxWarp prst="textNoShape">
+                          <a:avLst/>
+                        </a:prstTxWarp>
+                        <a:noAutofit/>
+                      </wps:bodyPr>
+                    </wps:wsp>
+                  </a:graphicData>
+                </a:graphic>
+                <wp14:sizeRelH relativeFrom="margin">
+                  <wp14:pctWidth>0</wp14:pctWidth>
+                </wp14:sizeRelH>
+                <wp14:sizeRelV relativeFrom="margin">
+                  <wp14:pctHeight>0</wp14:pctHeight>
+                </wp14:sizeRelV>
+              </wp:anchor>
+            </w:drawing>
+          </mc:Choice>
+          <mc:Fallback>
+            <w:pict>
+              <v:roundrect w14:anchorId="701BC2DF" id="_x0000_s1031" style="position:absolute;margin-left:8.35pt;margin-top:11pt;width:115.5pt;height:61.85pt;z-index:251669504;visibility:visible;mso-wrap-style:square;mso-width-percent:0;mso-height-percent:0;mso-wrap-distance-left:9pt;mso-wrap-distance-top:0;mso-wrap-distance-right:9pt;mso-wrap-distance-bottom:0;mso-position-horizontal:absolute;mso-position-horizontal-relative:text;mso-position-vertical:absolute;mso-position-vertical-relative:text;mso-width-percent:0;mso-height-percent:0;mso-width-relative:margin;mso-height-relative:margin;v-text-anchor:middle" arcsize="10923f" o:gfxdata="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" fillcolor="#5b9bd5 [3204]" strokecolor="#091723 [484]" strokeweight="1pt">
+                <v:stroke joinstyle="miter"/>
+                <v:textbox>
+                  <w:txbxContent>
+                    <w:p>
+                      <w:r>
+                        <w:t>SW/SW / HW/SW / ACP Testing</w:t>
+                      </w:r>
+                    </w:p>
+                  </w:txbxContent>
+                </v:textbox>
+              </v:roundrect>
+            </w:pict>
+          </mc:Fallback>
+        </mc:AlternateContent>
+      </w:r>
+    </w:p>
+    <w:p/>
+    <w:p>
+      <w:r>
+        <w:rPr>
+          <w:noProof/>
+        </w:rPr>
+        <mc:AlternateContent>
+          <mc:Choice Requires="wps">
+            <w:drawing>
+              <wp:anchor distT="0" distB="0" distL="114300" distR="114300" simplePos="0" relativeHeight="251703296" behindDoc="0" locked="0" layoutInCell="1" allowOverlap="1" wp14:anchorId="799D255F" wp14:editId="383A7263">
+                <wp:simplePos x="0" y="0"/>
+                <wp:positionH relativeFrom="column">
+                  <wp:posOffset>2064385</wp:posOffset>
+                </wp:positionH>
+                <wp:positionV relativeFrom="paragraph">
+                  <wp:posOffset>153035</wp:posOffset>
+                </wp:positionV>
+                <wp:extent cx="376238" cy="290513"/>
+                <wp:effectExtent l="19050" t="19050" r="43180" b="14605"/>
+                <wp:wrapNone/>
+                <wp:docPr id="1761759453" name="Isosceles Triangle 7"/>
+                <wp:cNvGraphicFramePr/>
+                <a:graphic xmlns:a="http://schemas.openxmlformats.org/drawingml/2006/main">
+                  <a:graphicData uri="http://schemas.microsoft.com/office/word/2010/wordprocessingShape">
+                    <wps:wsp>
+                      <wps:cNvSpPr/>
+                      <wps:spPr>
+                        <a:xfrm>
+                          <a:off x="0" y="0"/>
+                          <a:ext cx="376238" cy="290513"/>
+                        </a:xfrm>
+                        <a:prstGeom prst="triangle">
+                          <a:avLst/>
+                        </a:prstGeom>
+                      </wps:spPr>
+                      <wps:style>
+                        <a:lnRef idx="2">
+                          <a:schemeClr val="accent1">
+                            <a:shade val="15000"/>
+                          </a:schemeClr>
+                        </a:lnRef>
+                        <a:fillRef idx="1">
+                          <a:schemeClr val="accent1"/>
+                        </a:fillRef>
+                        <a:effectRef idx="0">
+                          <a:schemeClr val="accent1"/>
+                        </a:effectRef>
+                        <a:fontRef idx="minor">
+                          <a:schemeClr val="lt1"/>
+                        </a:fontRef>
+                      </wps:style>
+                      <wps:bodyPr rot="0" spcFirstLastPara="0" vertOverflow="overflow" horzOverflow="overflow" vert="horz" wrap="square" lIns="91440" tIns="45720" rIns="91440" bIns="45720" numCol="1" spcCol="0" rtlCol="0" fromWordArt="0" anchor="ctr" anchorCtr="0" forceAA="0" compatLnSpc="1">
+                        <a:prstTxWarp prst="textNoShape">
+                          <a:avLst/>
+                        </a:prstTxWarp>
+                        <a:noAutofit/>
+                      </wps:bodyPr>
+                    </wps:wsp>
+                  </a:graphicData>
+                </a:graphic>
+              </wp:anchor>
+            </w:drawing>
+          </mc:Choice>
+          <mc:Fallback>
+            <w:pict>
+              <v:shape w14:anchorId="52FB35B2" id="Isosceles Triangle 7" o:spid="_x0000_s1026" type="#_x0000_t5" style="position:absolute;margin-left:162.55pt;margin-top:12.05pt;width:29.65pt;height:22.9pt;z-index:251703296;visibility:visible;mso-wrap-style:square;mso-wrap-distance-left:9pt;mso-wrap-distance-top:0;mso-wrap-distance-right:9pt;mso-wrap-distance-bottom:0;mso-position-horizontal:absolute;mso-position-horizontal-relative:text;mso-position-vertical:absolute;mso-position-vertical-relative:text;v-text-anchor:middle" o:gfxdata="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" fillcolor="#5b9bd5 [3204]" strokecolor="#091723 [484]" strokeweight="1pt"/>
+            </w:pict>
+          </mc:Fallback>
+        </mc:AlternateContent>
+      </w:r>
+      <w:r>
+        <w:rPr>
+          <w:noProof/>
+        </w:rPr>
+        <mc:AlternateContent>
+          <mc:Choice Requires="wps">
+            <w:drawing>
+              <wp:anchor distT="0" distB="0" distL="114300" distR="114300" simplePos="0" relativeHeight="251691008" behindDoc="0" locked="0" layoutInCell="1" allowOverlap="1" wp14:anchorId="6D03DEC2" wp14:editId="6F36BEC5">
+                <wp:simplePos x="0" y="0"/>
+                <wp:positionH relativeFrom="column">
+                  <wp:posOffset>1582737</wp:posOffset>
+                </wp:positionH>
+                <wp:positionV relativeFrom="paragraph">
+                  <wp:posOffset>5080</wp:posOffset>
+                </wp:positionV>
+                <wp:extent cx="1537970" cy="0"/>
+                <wp:effectExtent l="38100" t="76200" r="0" b="95250"/>
+                <wp:wrapNone/>
+                <wp:docPr id="1224006929" name="Straight Arrow Connector 5"/>
+                <wp:cNvGraphicFramePr/>
+                <a:graphic xmlns:a="http://schemas.openxmlformats.org/drawingml/2006/main">
+                  <a:graphicData uri="http://schemas.microsoft.com/office/word/2010/wordprocessingShape">
+                    <wps:wsp>
+                      <wps:cNvCnPr/>
+                      <wps:spPr>
+                        <a:xfrm flipH="1">
+                          <a:off x="0" y="0"/>
+                          <a:ext cx="1537970" cy="0"/>
+                        </a:xfrm>
+                        <a:prstGeom prst="straightConnector1">
+                          <a:avLst/>
+                        </a:prstGeom>
+                        <a:ln>
+                          <a:tailEnd type="triangle"/>
+                        </a:ln>
+                      </wps:spPr>
+                      <wps:style>
+                        <a:lnRef idx="1">
+                          <a:schemeClr val="accent1"/>
+                        </a:lnRef>
+                        <a:fillRef idx="0">
+                          <a:schemeClr val="accent1"/>
+                        </a:fillRef>
+                        <a:effectRef idx="0">
+                          <a:schemeClr val="accent1"/>
+                        </a:effectRef>
+                        <a:fontRef idx="minor">
+                          <a:schemeClr val="tx1"/>
+                        </a:fontRef>
+                      </wps:style>
+                      <wps:bodyPr/>
+                    </wps:wsp>
+                  </a:graphicData>
+                </a:graphic>
+              </wp:anchor>
+            </w:drawing>
+          </mc:Choice>
+          <mc:Fallback>
+            <w:pict>
+              <v:shape w14:anchorId="28F2B3D0" id="Straight Arrow Connector 5" o:spid="_x0000_s1026" type="#_x0000_t32" style="position:absolute;margin-left:124.6pt;margin-top:.4pt;width:121.1pt;height:0;flip:x;z-index:251691008;visibility:visible;mso-wrap-style:square;mso-wrap-distance-left:9pt;mso-wrap-distance-top:0;mso-wrap-distance-right:9pt;mso-wrap-distance-bottom:0;mso-position-horizontal:absolute;mso-position-horizontal-relative:text;mso-position-vertical:absolute;mso-position-vertical-relative:text" o:gfxdata="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" strokecolor="#5b9bd5 [3204]" strokeweight=".5pt">
+                <v:stroke endarrow="block" joinstyle="miter"/>
+              </v:shape>
+            </w:pict>
+          </mc:Fallback>
+        </mc:AlternateContent>
+      </w:r>
+    </w:p>
+    <w:p>
+      <w:r>
+        <w:rPr>
+          <w:noProof/>
+        </w:rPr>
+        <mc:AlternateContent>
+          <mc:Choice Requires="wps">
+            <w:drawing>
+              <wp:anchor distT="0" distB="0" distL="114300" distR="114300" simplePos="0" relativeHeight="251679744" behindDoc="0" locked="0" layoutInCell="1" allowOverlap="1" wp14:anchorId="1DE10667" wp14:editId="761B5ACB">
+                <wp:simplePos x="0" y="0"/>
+                <wp:positionH relativeFrom="column">
+                  <wp:posOffset>1578610</wp:posOffset>
+                </wp:positionH>
+                <wp:positionV relativeFrom="paragraph">
+                  <wp:posOffset>141923</wp:posOffset>
+                </wp:positionV>
+                <wp:extent cx="1537970" cy="0"/>
+                <wp:effectExtent l="0" t="76200" r="24130" b="95250"/>
+                <wp:wrapNone/>
+                <wp:docPr id="1727922092" name="Straight Arrow Connector 4"/>
+                <wp:cNvGraphicFramePr/>
+                <a:graphic xmlns:a="http://schemas.openxmlformats.org/drawingml/2006/main">
+                  <a:graphicData uri="http://schemas.microsoft.com/office/word/2010/wordprocessingShape">
+                    <wps:wsp>
+                      <wps:cNvCnPr/>
+                      <wps:spPr>
+                        <a:xfrm>
+                          <a:off x="0" y="0"/>
+                          <a:ext cx="1537970" cy="0"/>
+                        </a:xfrm>
+                        <a:prstGeom prst="straightConnector1">
+                          <a:avLst/>
+                        </a:prstGeom>
+                        <a:ln>
+                          <a:tailEnd type="triangle"/>
+                        </a:ln>
+                      </wps:spPr>
+                      <wps:style>
+                        <a:lnRef idx="1">
+                          <a:schemeClr val="accent1"/>
+                        </a:lnRef>
+                        <a:fillRef idx="0">
+                          <a:schemeClr val="accent1"/>
+                        </a:fillRef>
+                        <a:effectRef idx="0">
+                          <a:schemeClr val="accent1"/>
+                        </a:effectRef>
+                        <a:fontRef idx="minor">
+                          <a:schemeClr val="tx1"/>
+                        </a:fontRef>
+                      </wps:style>
+                      <wps:bodyPr/>
+                    </wps:wsp>
+                  </a:graphicData>
+                </a:graphic>
+              </wp:anchor>
+            </w:drawing>
+          </mc:Choice>
+          <mc:Fallback>
+            <w:pict>
+              <v:shape w14:anchorId="493B9ACB" id="Straight Arrow Connector 4" o:spid="_x0000_s1026" type="#_x0000_t32" style="position:absolute;margin-left:124.3pt;margin-top:11.2pt;width:121.1pt;height:0;z-index:251679744;visibility:visible;mso-wrap-style:square;mso-wrap-distance-left:9pt;mso-wrap-distance-top:0;mso-wrap-distance-right:9pt;mso-wrap-distance-bottom:0;mso-position-horizontal:absolute;mso-position-horizontal-relative:text;mso-position-vertical:absolute;mso-position-vertical-relative:text" o:gfxdata="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" strokecolor="#5b9bd5 [3204]" strokeweight=".5pt">
+                <v:stroke endarrow="block" joinstyle="miter"/>
+              </v:shape>
+            </w:pict>
+          </mc:Fallback>
+        </mc:AlternateContent>
+      </w:r>
+    </w:p>
+    <w:p/>
+    <w:p/>
+    <w:p/>
+    <w:p/>
+    <w:p/>
+    <w:p>
+      <w:r>
         <w:t>WHAT IT ACHIEVES</w:t>
       </w:r>
     </w:p>
@@ -896,9 +3144,24 @@
     <w:p/>
     <w:p>
       <w:pPr>
+        <w:rPr>
+          <w:rFonts w:eastAsiaTheme="majorEastAsia" w:cstheme="majorBidi"/>
+          <w:b/>
+          <w:color w:val="442B58"/>
+          <w:sz w:val="28"/>
+          <w:szCs w:val="28"/>
+        </w:rPr>
+      </w:pPr>
+      <w:r>
+        <w:br w:type="page"/>
+      </w:r>
+    </w:p>
+    <w:p>
+      <w:pPr>
         <w:pStyle w:val="Heading3"/>
       </w:pPr>
       <w:r>
+        <w:lastRenderedPageBreak/>
         <w:t>Methodology Review 2: Agentic Team Based FEL</w:t>
       </w:r>
     </w:p>
@@ -1032,7 +3295,7 @@
 </file>
 
 <file path=word/endnotes.xml><?xml version="1.0" encoding="utf-8"?>
-<w:endnotes xmlns:wpc="http://schemas.microsoft.com/office/word/2010/wordprocessingCanvas" xmlns:cx="http://schemas.microsoft.com/office/drawing/2014/chartex" xmlns:cx1="http://schemas.microsoft.com/office/drawing/2015/9/8/chartex" xmlns:cx2="http://schemas.microsoft.com/office/drawing/2015/10/21/chartex" xmlns:cx3="http://schemas.microsoft.com/office/drawing/2016/5/9/chartex" xmlns:cx4="http://schemas.microsoft.com/office/drawing/2016/5/10/chartex" xmlns:cx5="http://schemas.microsoft.com/office/drawing/2016/5/11/chartex" xmlns:cx6="http://schemas.microsoft.com/office/drawing/2016/5/12/chartex" xmlns:cx7="http://schemas.microsoft.com/office/drawing/2016/5/13/chartex" xmlns:cx8="http://schemas.microsoft.com/office/drawing/2016/5/14/chartex" xmlns:mc="http://schemas.openxmlformats.org/markup-compatibility/2006" xmlns:aink="http://schemas.microsoft.com/office/drawing/2016/ink" xmlns:am3d="http://schemas.microsoft.com/office/drawing/2017/model3d" xmlns:o="urn:schemas-microsoft-com:office:office" xmlns:oel="http://schemas.microsoft.com/office/2019/extlst" xmlns:r="http://schemas.openxmlformats.org/officeDocument/2006/relationships" xmlns:m="http://schemas.openxmlformats.org/officeDocument/2006/math" xmlns:v="urn:schemas-microsoft-com:vml" xmlns:wp14="http://schemas.microsoft.com/office/word/2010/wordprocessingDrawing" xmlns:wp="http://schemas.openxmlformats.org/drawingml/2006/wordprocessingDrawing" xmlns:w10="urn:schemas-microsoft-com:office:word" xmlns:w="http://schemas.openxmlformats.org/wordprocessingml/2006/main" xmlns:w14="http://schemas.microsoft.com/office/word/2010/wordml" xmlns:w15="http://schemas.microsoft.com/office/word/2012/wordml" xmlns:w16cei="http://schemas.microsoft.com/office/word/2026/wordml/cei" xmlns:w16cex="http://schemas.microsoft.com/office/word/2018/wordml/cex" xmlns:w16cid="http://schemas.microsoft.com/office/word/2016/wordml/cid" xmlns:w16="http://schemas.microsoft.com/office/word/2018/wordml" xmlns:w16du="http://schemas.microsoft.com/office/word/2023/wordml/word16du" xmlns:w16sdtdh="http://schemas.microsoft.com/office/word/2020/wordml/sdtdatahash" xmlns:w16sdtfl="http://schemas.microsoft.com/office/word/2024/wordml/sdtformatlock" xmlns:w16se="http://schemas.microsoft.com/office/word/2015/wordml/symex" xmlns:wpg="http://schemas.microsoft.com/office/word/2010/wordprocessingGroup" xmlns:wpi="http://schemas.microsoft.com/office/word/2010/wordprocessingInk" xmlns:wne="http://schemas.microsoft.com/office/word/2006/wordml" xmlns:wps="http://schemas.microsoft.com/office/word/2010/wordprocessingShape" mc:Ignorable="w14 w15 w16se w16cid w16 w16cex w16sdtdh w16sdtfl w16du wp14">
+<w:endnotes xmlns:wpc="http://schemas.microsoft.com/office/word/2010/wordprocessingCanvas" xmlns:cx="http://schemas.microsoft.com/office/drawing/2014/chartex" xmlns:cx1="http://schemas.microsoft.com/office/drawing/2015/9/8/chartex" xmlns:cx2="http://schemas.microsoft.com/office/drawing/2015/10/21/chartex" xmlns:cx3="http://schemas.microsoft.com/office/drawing/2016/5/9/chartex" xmlns:cx4="http://schemas.microsoft.com/office/drawing/2016/5/10/chartex" xmlns:cx5="http://schemas.microsoft.com/office/drawing/2016/5/11/chartex" xmlns:cx6="http://schemas.microsoft.com/office/drawing/2016/5/12/chartex" xmlns:cx7="http://schemas.microsoft.com/office/drawing/2016/5/13/chartex" xmlns:cx8="http://schemas.microsoft.com/office/drawing/2016/5/14/chartex" xmlns:mc="http://schemas.openxmlformats.org/markup-compatibility/2006" xmlns:aink="http://schemas.microsoft.com/office/drawing/2016/ink" xmlns:am3d="http://schemas.microsoft.com/office/drawing/2017/model3d" xmlns:o="urn:schemas-microsoft-com:office:office" xmlns:oel="http://schemas.microsoft.com/office/2019/extlst" xmlns:r="http://schemas.openxmlformats.org/officeDocument/2006/relationships" xmlns:m="http://schemas.openxmlformats.org/officeDocument/2006/math" xmlns:v="urn:schemas-microsoft-com:vml" xmlns:wp14="http://schemas.microsoft.com/office/word/2010/wordprocessingDrawing" xmlns:wp="http://schemas.openxmlformats.org/drawingml/2006/wordprocessingDrawing" xmlns:w10="urn:schemas-microsoft-com:office:word" xmlns:w="http://schemas.openxmlformats.org/wordprocessingml/2006/main" xmlns:w14="http://schemas.microsoft.com/office/word/2010/wordml" xmlns:w15="http://schemas.microsoft.com/office/word/2012/wordml" xmlns:w16cex="http://schemas.microsoft.com/office/word/2018/wordml/cex" xmlns:w16cid="http://schemas.microsoft.com/office/word/2016/wordml/cid" xmlns:w16="http://schemas.microsoft.com/office/word/2018/wordml" xmlns:w16du="http://schemas.microsoft.com/office/word/2023/wordml/word16du" xmlns:w16sdtdh="http://schemas.microsoft.com/office/word/2020/wordml/sdtdatahash" xmlns:w16sdtfl="http://schemas.microsoft.com/office/word/2024/wordml/sdtformatlock" xmlns:w16se="http://schemas.microsoft.com/office/word/2015/wordml/symex" xmlns:wpg="http://schemas.microsoft.com/office/word/2010/wordprocessingGroup" xmlns:wpi="http://schemas.microsoft.com/office/word/2010/wordprocessingInk" xmlns:wne="http://schemas.microsoft.com/office/word/2006/wordml" xmlns:wps="http://schemas.microsoft.com/office/word/2010/wordprocessingShape" mc:Ignorable="w14 w15 w16se w16cid w16 w16cex w16sdtdh w16sdtfl w16du wp14">
   <w:endnote w:type="separator" w:id="-1">
     <w:p>
       <w:r>
@@ -1051,7 +3314,7 @@
 </file>
 
 <file path=word/footer1.xml><?xml version="1.0" encoding="utf-8"?>
-<w:ftr xmlns:wpc="http://schemas.microsoft.com/office/word/2010/wordprocessingCanvas" xmlns:cx="http://schemas.microsoft.com/office/drawing/2014/chartex" xmlns:cx1="http://schemas.microsoft.com/office/drawing/2015/9/8/chartex" xmlns:cx2="http://schemas.microsoft.com/office/drawing/2015/10/21/chartex" xmlns:cx3="http://schemas.microsoft.com/office/drawing/2016/5/9/chartex" xmlns:cx4="http://schemas.microsoft.com/office/drawing/2016/5/10/chartex" xmlns:cx5="http://schemas.microsoft.com/office/drawing/2016/5/11/chartex" xmlns:cx6="http://schemas.microsoft.com/office/drawing/2016/5/12/chartex" xmlns:cx7="http://schemas.microsoft.com/office/drawing/2016/5/13/chartex" xmlns:cx8="http://schemas.microsoft.com/office/drawing/2016/5/14/chartex" xmlns:mc="http://schemas.openxmlformats.org/markup-compatibility/2006" xmlns:aink="http://schemas.microsoft.com/office/drawing/2016/ink" xmlns:am3d="http://schemas.microsoft.com/office/drawing/2017/model3d" xmlns:o="urn:schemas-microsoft-com:office:office" xmlns:oel="http://schemas.microsoft.com/office/2019/extlst" xmlns:r="http://schemas.openxmlformats.org/officeDocument/2006/relationships" xmlns:m="http://schemas.openxmlformats.org/officeDocument/2006/math" xmlns:v="urn:schemas-microsoft-com:vml" xmlns:wp14="http://schemas.microsoft.com/office/word/2010/wordprocessingDrawing" xmlns:wp="http://schemas.openxmlformats.org/drawingml/2006/wordprocessingDrawing" xmlns:w10="urn:schemas-microsoft-com:office:word" xmlns:w="http://schemas.openxmlformats.org/wordprocessingml/2006/main" xmlns:w14="http://schemas.microsoft.com/office/word/2010/wordml" xmlns:w15="http://schemas.microsoft.com/office/word/2012/wordml" xmlns:w16cei="http://schemas.microsoft.com/office/word/2026/wordml/cei" xmlns:w16cex="http://schemas.microsoft.com/office/word/2018/wordml/cex" xmlns:w16cid="http://schemas.microsoft.com/office/word/2016/wordml/cid" xmlns:w16="http://schemas.microsoft.com/office/word/2018/wordml" xmlns:w16du="http://schemas.microsoft.com/office/word/2023/wordml/word16du" xmlns:w16sdtdh="http://schemas.microsoft.com/office/word/2020/wordml/sdtdatahash" xmlns:w16sdtfl="http://schemas.microsoft.com/office/word/2024/wordml/sdtformatlock" xmlns:w16se="http://schemas.microsoft.com/office/word/2015/wordml/symex" xmlns:wpg="http://schemas.microsoft.com/office/word/2010/wordprocessingGroup" xmlns:wpi="http://schemas.microsoft.com/office/word/2010/wordprocessingInk" xmlns:wne="http://schemas.microsoft.com/office/word/2006/wordml" xmlns:wps="http://schemas.microsoft.com/office/word/2010/wordprocessingShape" mc:Ignorable="w14 w15 w16se w16cid w16 w16cex w16sdtdh w16sdtfl w16du wp14">
+<w:ftr xmlns:wpc="http://schemas.microsoft.com/office/word/2010/wordprocessingCanvas" xmlns:cx="http://schemas.microsoft.com/office/drawing/2014/chartex" xmlns:cx1="http://schemas.microsoft.com/office/drawing/2015/9/8/chartex" xmlns:cx2="http://schemas.microsoft.com/office/drawing/2015/10/21/chartex" xmlns:cx3="http://schemas.microsoft.com/office/drawing/2016/5/9/chartex" xmlns:cx4="http://schemas.microsoft.com/office/drawing/2016/5/10/chartex" xmlns:cx5="http://schemas.microsoft.com/office/drawing/2016/5/11/chartex" xmlns:cx6="http://schemas.microsoft.com/office/drawing/2016/5/12/chartex" xmlns:cx7="http://schemas.microsoft.com/office/drawing/2016/5/13/chartex" xmlns:cx8="http://schemas.microsoft.com/office/drawing/2016/5/14/chartex" xmlns:mc="http://schemas.openxmlformats.org/markup-compatibility/2006" xmlns:aink="http://schemas.microsoft.com/office/drawing/2016/ink" xmlns:am3d="http://schemas.microsoft.com/office/drawing/2017/model3d" xmlns:o="urn:schemas-microsoft-com:office:office" xmlns:oel="http://schemas.microsoft.com/office/2019/extlst" xmlns:r="http://schemas.openxmlformats.org/officeDocument/2006/relationships" xmlns:m="http://schemas.openxmlformats.org/officeDocument/2006/math" xmlns:v="urn:schemas-microsoft-com:vml" xmlns:wp14="http://schemas.microsoft.com/office/word/2010/wordprocessingDrawing" xmlns:wp="http://schemas.openxmlformats.org/drawingml/2006/wordprocessingDrawing" xmlns:w10="urn:schemas-microsoft-com:office:word" xmlns:w="http://schemas.openxmlformats.org/wordprocessingml/2006/main" xmlns:w14="http://schemas.microsoft.com/office/word/2010/wordml" xmlns:w15="http://schemas.microsoft.com/office/word/2012/wordml" xmlns:w16cex="http://schemas.microsoft.com/office/word/2018/wordml/cex" xmlns:w16cid="http://schemas.microsoft.com/office/word/2016/wordml/cid" xmlns:w16="http://schemas.microsoft.com/office/word/2018/wordml" xmlns:w16du="http://schemas.microsoft.com/office/word/2023/wordml/word16du" xmlns:w16sdtdh="http://schemas.microsoft.com/office/word/2020/wordml/sdtdatahash" xmlns:w16sdtfl="http://schemas.microsoft.com/office/word/2024/wordml/sdtformatlock" xmlns:w16se="http://schemas.microsoft.com/office/word/2015/wordml/symex" xmlns:wpg="http://schemas.microsoft.com/office/word/2010/wordprocessingGroup" xmlns:wpi="http://schemas.microsoft.com/office/word/2010/wordprocessingInk" xmlns:wne="http://schemas.microsoft.com/office/word/2006/wordml" xmlns:wps="http://schemas.microsoft.com/office/word/2010/wordprocessingShape" mc:Ignorable="w14 w15 w16se w16cid w16 w16cex w16sdtdh w16sdtfl w16du wp14">
   <w:p>
     <w:pPr>
       <w:pStyle w:val="Footer"/>
@@ -1089,7 +3352,7 @@
 </file>
 
 <file path=word/footer2.xml><?xml version="1.0" encoding="utf-8"?>
-<w:ftr xmlns:wpc="http://schemas.microsoft.com/office/word/2010/wordprocessingCanvas" xmlns:cx="http://schemas.microsoft.com/office/drawing/2014/chartex" xmlns:cx1="http://schemas.microsoft.com/office/drawing/2015/9/8/chartex" xmlns:cx2="http://schemas.microsoft.com/office/drawing/2015/10/21/chartex" xmlns:cx3="http://schemas.microsoft.com/office/drawing/2016/5/9/chartex" xmlns:cx4="http://schemas.microsoft.com/office/drawing/2016/5/10/chartex" xmlns:cx5="http://schemas.microsoft.com/office/drawing/2016/5/11/chartex" xmlns:cx6="http://schemas.microsoft.com/office/drawing/2016/5/12/chartex" xmlns:cx7="http://schemas.microsoft.com/office/drawing/2016/5/13/chartex" xmlns:cx8="http://schemas.microsoft.com/office/drawing/2016/5/14/chartex" xmlns:mc="http://schemas.openxmlformats.org/markup-compatibility/2006" xmlns:aink="http://schemas.microsoft.com/office/drawing/2016/ink" xmlns:am3d="http://schemas.microsoft.com/office/drawing/2017/model3d" xmlns:o="urn:schemas-microsoft-com:office:office" xmlns:oel="http://schemas.microsoft.com/office/2019/extlst" xmlns:r="http://schemas.openxmlformats.org/officeDocument/2006/relationships" xmlns:m="http://schemas.openxmlformats.org/officeDocument/2006/math" xmlns:v="urn:schemas-microsoft-com:vml" xmlns:wp14="http://schemas.microsoft.com/office/word/2010/wordprocessingDrawing" xmlns:wp="http://schemas.openxmlformats.org/drawingml/2006/wordprocessingDrawing" xmlns:w10="urn:schemas-microsoft-com:office:word" xmlns:w="http://schemas.openxmlformats.org/wordprocessingml/2006/main" xmlns:w14="http://schemas.microsoft.com/office/word/2010/wordml" xmlns:w15="http://schemas.microsoft.com/office/word/2012/wordml" xmlns:w16cei="http://schemas.microsoft.com/office/word/2026/wordml/cei" xmlns:w16cex="http://schemas.microsoft.com/office/word/2018/wordml/cex" xmlns:w16cid="http://schemas.microsoft.com/office/word/2016/wordml/cid" xmlns:w16="http://schemas.microsoft.com/office/word/2018/wordml" xmlns:w16du="http://schemas.microsoft.com/office/word/2023/wordml/word16du" xmlns:w16sdtdh="http://schemas.microsoft.com/office/word/2020/wordml/sdtdatahash" xmlns:w16sdtfl="http://schemas.microsoft.com/office/word/2024/wordml/sdtformatlock" xmlns:w16se="http://schemas.microsoft.com/office/word/2015/wordml/symex" xmlns:wpg="http://schemas.microsoft.com/office/word/2010/wordprocessingGroup" xmlns:wpi="http://schemas.microsoft.com/office/word/2010/wordprocessingInk" xmlns:wne="http://schemas.microsoft.com/office/word/2006/wordml" xmlns:wps="http://schemas.microsoft.com/office/word/2010/wordprocessingShape" mc:Ignorable="w14 w15 w16se w16cid w16 w16cex w16sdtdh w16sdtfl w16du wp14">
+<w:ftr xmlns:wpc="http://schemas.microsoft.com/office/word/2010/wordprocessingCanvas" xmlns:cx="http://schemas.microsoft.com/office/drawing/2014/chartex" xmlns:cx1="http://schemas.microsoft.com/office/drawing/2015/9/8/chartex" xmlns:cx2="http://schemas.microsoft.com/office/drawing/2015/10/21/chartex" xmlns:cx3="http://schemas.microsoft.com/office/drawing/2016/5/9/chartex" xmlns:cx4="http://schemas.microsoft.com/office/drawing/2016/5/10/chartex" xmlns:cx5="http://schemas.microsoft.com/office/drawing/2016/5/11/chartex" xmlns:cx6="http://schemas.microsoft.com/office/drawing/2016/5/12/chartex" xmlns:cx7="http://schemas.microsoft.com/office/drawing/2016/5/13/chartex" xmlns:cx8="http://schemas.microsoft.com/office/drawing/2016/5/14/chartex" xmlns:mc="http://schemas.openxmlformats.org/markup-compatibility/2006" xmlns:aink="http://schemas.microsoft.com/office/drawing/2016/ink" xmlns:am3d="http://schemas.microsoft.com/office/drawing/2017/model3d" xmlns:o="urn:schemas-microsoft-com:office:office" xmlns:oel="http://schemas.microsoft.com/office/2019/extlst" xmlns:r="http://schemas.openxmlformats.org/officeDocument/2006/relationships" xmlns:m="http://schemas.openxmlformats.org/officeDocument/2006/math" xmlns:v="urn:schemas-microsoft-com:vml" xmlns:wp14="http://schemas.microsoft.com/office/word/2010/wordprocessingDrawing" xmlns:wp="http://schemas.openxmlformats.org/drawingml/2006/wordprocessingDrawing" xmlns:w10="urn:schemas-microsoft-com:office:word" xmlns:w="http://schemas.openxmlformats.org/wordprocessingml/2006/main" xmlns:w14="http://schemas.microsoft.com/office/word/2010/wordml" xmlns:w15="http://schemas.microsoft.com/office/word/2012/wordml" xmlns:w16cex="http://schemas.microsoft.com/office/word/2018/wordml/cex" xmlns:w16cid="http://schemas.microsoft.com/office/word/2016/wordml/cid" xmlns:w16="http://schemas.microsoft.com/office/word/2018/wordml" xmlns:w16du="http://schemas.microsoft.com/office/word/2023/wordml/word16du" xmlns:w16sdtdh="http://schemas.microsoft.com/office/word/2020/wordml/sdtdatahash" xmlns:w16sdtfl="http://schemas.microsoft.com/office/word/2024/wordml/sdtformatlock" xmlns:w16se="http://schemas.microsoft.com/office/word/2015/wordml/symex" xmlns:wpg="http://schemas.microsoft.com/office/word/2010/wordprocessingGroup" xmlns:wpi="http://schemas.microsoft.com/office/word/2010/wordprocessingInk" xmlns:wne="http://schemas.microsoft.com/office/word/2006/wordml" xmlns:wps="http://schemas.microsoft.com/office/word/2010/wordprocessingShape" mc:Ignorable="w14 w15 w16se w16cid w16 w16cex w16sdtdh w16sdtfl w16du wp14">
   <w:p>
     <w:pPr>
       <w:pStyle w:val="Footer"/>
@@ -1163,7 +3426,7 @@
 </file>
 
 <file path=word/footer3.xml><?xml version="1.0" encoding="utf-8"?>
-<w:ftr xmlns:wpc="http://schemas.microsoft.com/office/word/2010/wordprocessingCanvas" xmlns:cx="http://schemas.microsoft.com/office/drawing/2014/chartex" xmlns:cx1="http://schemas.microsoft.com/office/drawing/2015/9/8/chartex" xmlns:cx2="http://schemas.microsoft.com/office/drawing/2015/10/21/chartex" xmlns:cx3="http://schemas.microsoft.com/office/drawing/2016/5/9/chartex" xmlns:cx4="http://schemas.microsoft.com/office/drawing/2016/5/10/chartex" xmlns:cx5="http://schemas.microsoft.com/office/drawing/2016/5/11/chartex" xmlns:cx6="http://schemas.microsoft.com/office/drawing/2016/5/12/chartex" xmlns:cx7="http://schemas.microsoft.com/office/drawing/2016/5/13/chartex" xmlns:cx8="http://schemas.microsoft.com/office/drawing/2016/5/14/chartex" xmlns:mc="http://schemas.openxmlformats.org/markup-compatibility/2006" xmlns:aink="http://schemas.microsoft.com/office/drawing/2016/ink" xmlns:am3d="http://schemas.microsoft.com/office/drawing/2017/model3d" xmlns:o="urn:schemas-microsoft-com:office:office" xmlns:oel="http://schemas.microsoft.com/office/2019/extlst" xmlns:r="http://schemas.openxmlformats.org/officeDocument/2006/relationships" xmlns:m="http://schemas.openxmlformats.org/officeDocument/2006/math" xmlns:v="urn:schemas-microsoft-com:vml" xmlns:wp14="http://schemas.microsoft.com/office/word/2010/wordprocessingDrawing" xmlns:wp="http://schemas.openxmlformats.org/drawingml/2006/wordprocessingDrawing" xmlns:w10="urn:schemas-microsoft-com:office:word" xmlns:w="http://schemas.openxmlformats.org/wordprocessingml/2006/main" xmlns:w14="http://schemas.microsoft.com/office/word/2010/wordml" xmlns:w15="http://schemas.microsoft.com/office/word/2012/wordml" xmlns:w16cei="http://schemas.microsoft.com/office/word/2026/wordml/cei" xmlns:w16cex="http://schemas.microsoft.com/office/word/2018/wordml/cex" xmlns:w16cid="http://schemas.microsoft.com/office/word/2016/wordml/cid" xmlns:w16="http://schemas.microsoft.com/office/word/2018/wordml" xmlns:w16du="http://schemas.microsoft.com/office/word/2023/wordml/word16du" xmlns:w16sdtdh="http://schemas.microsoft.com/office/word/2020/wordml/sdtdatahash" xmlns:w16sdtfl="http://schemas.microsoft.com/office/word/2024/wordml/sdtformatlock" xmlns:w16se="http://schemas.microsoft.com/office/word/2015/wordml/symex" xmlns:wpg="http://schemas.microsoft.com/office/word/2010/wordprocessingGroup" xmlns:wpi="http://schemas.microsoft.com/office/word/2010/wordprocessingInk" xmlns:wne="http://schemas.microsoft.com/office/word/2006/wordml" xmlns:wps="http://schemas.microsoft.com/office/word/2010/wordprocessingShape" mc:Ignorable="w14 w15 w16se w16cid w16 w16cex w16sdtdh w16sdtfl w16du wp14">
+<w:ftr xmlns:wpc="http://schemas.microsoft.com/office/word/2010/wordprocessingCanvas" xmlns:cx="http://schemas.microsoft.com/office/drawing/2014/chartex" xmlns:cx1="http://schemas.microsoft.com/office/drawing/2015/9/8/chartex" xmlns:cx2="http://schemas.microsoft.com/office/drawing/2015/10/21/chartex" xmlns:cx3="http://schemas.microsoft.com/office/drawing/2016/5/9/chartex" xmlns:cx4="http://schemas.microsoft.com/office/drawing/2016/5/10/chartex" xmlns:cx5="http://schemas.microsoft.com/office/drawing/2016/5/11/chartex" xmlns:cx6="http://schemas.microsoft.com/office/drawing/2016/5/12/chartex" xmlns:cx7="http://schemas.microsoft.com/office/drawing/2016/5/13/chartex" xmlns:cx8="http://schemas.microsoft.com/office/drawing/2016/5/14/chartex" xmlns:mc="http://schemas.openxmlformats.org/markup-compatibility/2006" xmlns:aink="http://schemas.microsoft.com/office/drawing/2016/ink" xmlns:am3d="http://schemas.microsoft.com/office/drawing/2017/model3d" xmlns:o="urn:schemas-microsoft-com:office:office" xmlns:oel="http://schemas.microsoft.com/office/2019/extlst" xmlns:r="http://schemas.openxmlformats.org/officeDocument/2006/relationships" xmlns:m="http://schemas.openxmlformats.org/officeDocument/2006/math" xmlns:v="urn:schemas-microsoft-com:vml" xmlns:wp14="http://schemas.microsoft.com/office/word/2010/wordprocessingDrawing" xmlns:wp="http://schemas.openxmlformats.org/drawingml/2006/wordprocessingDrawing" xmlns:w10="urn:schemas-microsoft-com:office:word" xmlns:w="http://schemas.openxmlformats.org/wordprocessingml/2006/main" xmlns:w14="http://schemas.microsoft.com/office/word/2010/wordml" xmlns:w15="http://schemas.microsoft.com/office/word/2012/wordml" xmlns:w16cex="http://schemas.microsoft.com/office/word/2018/wordml/cex" xmlns:w16cid="http://schemas.microsoft.com/office/word/2016/wordml/cid" xmlns:w16="http://schemas.microsoft.com/office/word/2018/wordml" xmlns:w16du="http://schemas.microsoft.com/office/word/2023/wordml/word16du" xmlns:w16sdtdh="http://schemas.microsoft.com/office/word/2020/wordml/sdtdatahash" xmlns:w16sdtfl="http://schemas.microsoft.com/office/word/2024/wordml/sdtformatlock" xmlns:w16se="http://schemas.microsoft.com/office/word/2015/wordml/symex" xmlns:wpg="http://schemas.microsoft.com/office/word/2010/wordprocessingGroup" xmlns:wpi="http://schemas.microsoft.com/office/word/2010/wordprocessingInk" xmlns:wne="http://schemas.microsoft.com/office/word/2006/wordml" xmlns:wps="http://schemas.microsoft.com/office/word/2010/wordprocessingShape" mc:Ignorable="w14 w15 w16se w16cid w16 w16cex w16sdtdh w16sdtfl w16du wp14">
   <w:p>
     <w:pPr>
       <w:pStyle w:val="Header4"/>
@@ -1196,7 +3459,7 @@
 </file>
 
 <file path=word/footnotes.xml><?xml version="1.0" encoding="utf-8"?>
-<w:footnotes xmlns:wpc="http://schemas.microsoft.com/office/word/2010/wordprocessingCanvas" xmlns:cx="http://schemas.microsoft.com/office/drawing/2014/chartex" xmlns:cx1="http://schemas.microsoft.com/office/drawing/2015/9/8/chartex" xmlns:cx2="http://schemas.microsoft.com/office/drawing/2015/10/21/chartex" xmlns:cx3="http://schemas.microsoft.com/office/drawing/2016/5/9/chartex" xmlns:cx4="http://schemas.microsoft.com/office/drawing/2016/5/10/chartex" xmlns:cx5="http://schemas.microsoft.com/office/drawing/2016/5/11/chartex" xmlns:cx6="http://schemas.microsoft.com/office/drawing/2016/5/12/chartex" xmlns:cx7="http://schemas.microsoft.com/office/drawing/2016/5/13/chartex" xmlns:cx8="http://schemas.microsoft.com/office/drawing/2016/5/14/chartex" xmlns:mc="http://schemas.openxmlformats.org/markup-compatibility/2006" xmlns:aink="http://schemas.microsoft.com/office/drawing/2016/ink" xmlns:am3d="http://schemas.microsoft.com/office/drawing/2017/model3d" xmlns:o="urn:schemas-microsoft-com:office:office" xmlns:oel="http://schemas.microsoft.com/office/2019/extlst" xmlns:r="http://schemas.openxmlformats.org/officeDocument/2006/relationships" xmlns:m="http://schemas.openxmlformats.org/officeDocument/2006/math" xmlns:v="urn:schemas-microsoft-com:vml" xmlns:wp14="http://schemas.microsoft.com/office/word/2010/wordprocessingDrawing" xmlns:wp="http://schemas.openxmlformats.org/drawingml/2006/wordprocessingDrawing" xmlns:w10="urn:schemas-microsoft-com:office:word" xmlns:w="http://schemas.openxmlformats.org/wordprocessingml/2006/main" xmlns:w14="http://schemas.microsoft.com/office/word/2010/wordml" xmlns:w15="http://schemas.microsoft.com/office/word/2012/wordml" xmlns:w16cei="http://schemas.microsoft.com/office/word/2026/wordml/cei" xmlns:w16cex="http://schemas.microsoft.com/office/word/2018/wordml/cex" xmlns:w16cid="http://schemas.microsoft.com/office/word/2016/wordml/cid" xmlns:w16="http://schemas.microsoft.com/office/word/2018/wordml" xmlns:w16du="http://schemas.microsoft.com/office/word/2023/wordml/word16du" xmlns:w16sdtdh="http://schemas.microsoft.com/office/word/2020/wordml/sdtdatahash" xmlns:w16sdtfl="http://schemas.microsoft.com/office/word/2024/wordml/sdtformatlock" xmlns:w16se="http://schemas.microsoft.com/office/word/2015/wordml/symex" xmlns:wpg="http://schemas.microsoft.com/office/word/2010/wordprocessingGroup" xmlns:wpi="http://schemas.microsoft.com/office/word/2010/wordprocessingInk" xmlns:wne="http://schemas.microsoft.com/office/word/2006/wordml" xmlns:wps="http://schemas.microsoft.com/office/word/2010/wordprocessingShape" mc:Ignorable="w14 w15 w16se w16cid w16 w16cex w16sdtdh w16sdtfl w16du wp14">
+<w:footnotes xmlns:wpc="http://schemas.microsoft.com/office/word/2010/wordprocessingCanvas" xmlns:cx="http://schemas.microsoft.com/office/drawing/2014/chartex" xmlns:cx1="http://schemas.microsoft.com/office/drawing/2015/9/8/chartex" xmlns:cx2="http://schemas.microsoft.com/office/drawing/2015/10/21/chartex" xmlns:cx3="http://schemas.microsoft.com/office/drawing/2016/5/9/chartex" xmlns:cx4="http://schemas.microsoft.com/office/drawing/2016/5/10/chartex" xmlns:cx5="http://schemas.microsoft.com/office/drawing/2016/5/11/chartex" xmlns:cx6="http://schemas.microsoft.com/office/drawing/2016/5/12/chartex" xmlns:cx7="http://schemas.microsoft.com/office/drawing/2016/5/13/chartex" xmlns:cx8="http://schemas.microsoft.com/office/drawing/2016/5/14/chartex" xmlns:mc="http://schemas.openxmlformats.org/markup-compatibility/2006" xmlns:aink="http://schemas.microsoft.com/office/drawing/2016/ink" xmlns:am3d="http://schemas.microsoft.com/office/drawing/2017/model3d" xmlns:o="urn:schemas-microsoft-com:office:office" xmlns:oel="http://schemas.microsoft.com/office/2019/extlst" xmlns:r="http://schemas.openxmlformats.org/officeDocument/2006/relationships" xmlns:m="http://schemas.openxmlformats.org/officeDocument/2006/math" xmlns:v="urn:schemas-microsoft-com:vml" xmlns:wp14="http://schemas.microsoft.com/office/word/2010/wordprocessingDrawing" xmlns:wp="http://schemas.openxmlformats.org/drawingml/2006/wordprocessingDrawing" xmlns:w10="urn:schemas-microsoft-com:office:word" xmlns:w="http://schemas.openxmlformats.org/wordprocessingml/2006/main" xmlns:w14="http://schemas.microsoft.com/office/word/2010/wordml" xmlns:w15="http://schemas.microsoft.com/office/word/2012/wordml" xmlns:w16cex="http://schemas.microsoft.com/office/word/2018/wordml/cex" xmlns:w16cid="http://schemas.microsoft.com/office/word/2016/wordml/cid" xmlns:w16="http://schemas.microsoft.com/office/word/2018/wordml" xmlns:w16du="http://schemas.microsoft.com/office/word/2023/wordml/word16du" xmlns:w16sdtdh="http://schemas.microsoft.com/office/word/2020/wordml/sdtdatahash" xmlns:w16sdtfl="http://schemas.microsoft.com/office/word/2024/wordml/sdtformatlock" xmlns:w16se="http://schemas.microsoft.com/office/word/2015/wordml/symex" xmlns:wpg="http://schemas.microsoft.com/office/word/2010/wordprocessingGroup" xmlns:wpi="http://schemas.microsoft.com/office/word/2010/wordprocessingInk" xmlns:wne="http://schemas.microsoft.com/office/word/2006/wordml" xmlns:wps="http://schemas.microsoft.com/office/word/2010/wordprocessingShape" mc:Ignorable="w14 w15 w16se w16cid w16 w16cex w16sdtdh w16sdtfl w16du wp14">
   <w:footnote w:type="separator" w:id="-1">
     <w:p>
       <w:r>
@@ -1215,7 +3478,7 @@
 </file>
 
 <file path=word/numbering.xml><?xml version="1.0" encoding="utf-8"?>
-<w:numbering xmlns:wpc="http://schemas.microsoft.com/office/word/2010/wordprocessingCanvas" xmlns:cx="http://schemas.microsoft.com/office/drawing/2014/chartex" xmlns:cx1="http://schemas.microsoft.com/office/drawing/2015/9/8/chartex" xmlns:cx2="http://schemas.microsoft.com/office/drawing/2015/10/21/chartex" xmlns:cx3="http://schemas.microsoft.com/office/drawing/2016/5/9/chartex" xmlns:cx4="http://schemas.microsoft.com/office/drawing/2016/5/10/chartex" xmlns:cx5="http://schemas.microsoft.com/office/drawing/2016/5/11/chartex" xmlns:cx6="http://schemas.microsoft.com/office/drawing/2016/5/12/chartex" xmlns:cx7="http://schemas.microsoft.com/office/drawing/2016/5/13/chartex" xmlns:cx8="http://schemas.microsoft.com/office/drawing/2016/5/14/chartex" xmlns:mc="http://schemas.openxmlformats.org/markup-compatibility/2006" xmlns:aink="http://schemas.microsoft.com/office/drawing/2016/ink" xmlns:am3d="http://schemas.microsoft.com/office/drawing/2017/model3d" xmlns:o="urn:schemas-microsoft-com:office:office" xmlns:oel="http://schemas.microsoft.com/office/2019/extlst" xmlns:r="http://schemas.openxmlformats.org/officeDocument/2006/relationships" xmlns:m="http://schemas.openxmlformats.org/officeDocument/2006/math" xmlns:v="urn:schemas-microsoft-com:vml" xmlns:wp14="http://schemas.microsoft.com/office/word/2010/wordprocessingDrawing" xmlns:wp="http://schemas.openxmlformats.org/drawingml/2006/wordprocessingDrawing" xmlns:w10="urn:schemas-microsoft-com:office:word" xmlns:w="http://schemas.openxmlformats.org/wordprocessingml/2006/main" xmlns:w14="http://schemas.microsoft.com/office/word/2010/wordml" xmlns:w15="http://schemas.microsoft.com/office/word/2012/wordml" xmlns:w16cei="http://schemas.microsoft.com/office/word/2026/wordml/cei" xmlns:w16cex="http://schemas.microsoft.com/office/word/2018/wordml/cex" xmlns:w16cid="http://schemas.microsoft.com/office/word/2016/wordml/cid" xmlns:w16="http://schemas.microsoft.com/office/word/2018/wordml" xmlns:w16du="http://schemas.microsoft.com/office/word/2023/wordml/word16du" xmlns:w16sdtdh="http://schemas.microsoft.com/office/word/2020/wordml/sdtdatahash" xmlns:w16sdtfl="http://schemas.microsoft.com/office/word/2024/wordml/sdtformatlock" xmlns:w16se="http://schemas.microsoft.com/office/word/2015/wordml/symex" xmlns:wpg="http://schemas.microsoft.com/office/word/2010/wordprocessingGroup" xmlns:wpi="http://schemas.microsoft.com/office/word/2010/wordprocessingInk" xmlns:wne="http://schemas.microsoft.com/office/word/2006/wordml" xmlns:wps="http://schemas.microsoft.com/office/word/2010/wordprocessingShape" mc:Ignorable="w14 w15 w16se w16cid w16 w16cex w16sdtdh w16sdtfl w16du wp14">
+<w:numbering xmlns:wpc="http://schemas.microsoft.com/office/word/2010/wordprocessingCanvas" xmlns:cx="http://schemas.microsoft.com/office/drawing/2014/chartex" xmlns:cx1="http://schemas.microsoft.com/office/drawing/2015/9/8/chartex" xmlns:cx2="http://schemas.microsoft.com/office/drawing/2015/10/21/chartex" xmlns:cx3="http://schemas.microsoft.com/office/drawing/2016/5/9/chartex" xmlns:cx4="http://schemas.microsoft.com/office/drawing/2016/5/10/chartex" xmlns:cx5="http://schemas.microsoft.com/office/drawing/2016/5/11/chartex" xmlns:cx6="http://schemas.microsoft.com/office/drawing/2016/5/12/chartex" xmlns:cx7="http://schemas.microsoft.com/office/drawing/2016/5/13/chartex" xmlns:cx8="http://schemas.microsoft.com/office/drawing/2016/5/14/chartex" xmlns:mc="http://schemas.openxmlformats.org/markup-compatibility/2006" xmlns:aink="http://schemas.microsoft.com/office/drawing/2016/ink" xmlns:am3d="http://schemas.microsoft.com/office/drawing/2017/model3d" xmlns:o="urn:schemas-microsoft-com:office:office" xmlns:oel="http://schemas.microsoft.com/office/2019/extlst" xmlns:r="http://schemas.openxmlformats.org/officeDocument/2006/relationships" xmlns:m="http://schemas.openxmlformats.org/officeDocument/2006/math" xmlns:v="urn:schemas-microsoft-com:vml" xmlns:wp14="http://schemas.microsoft.com/office/word/2010/wordprocessingDrawing" xmlns:wp="http://schemas.openxmlformats.org/drawingml/2006/wordprocessingDrawing" xmlns:w10="urn:schemas-microsoft-com:office:word" xmlns:w="http://schemas.openxmlformats.org/wordprocessingml/2006/main" xmlns:w14="http://schemas.microsoft.com/office/word/2010/wordml" xmlns:w15="http://schemas.microsoft.com/office/word/2012/wordml" xmlns:w16cex="http://schemas.microsoft.com/office/word/2018/wordml/cex" xmlns:w16cid="http://schemas.microsoft.com/office/word/2016/wordml/cid" xmlns:w16="http://schemas.microsoft.com/office/word/2018/wordml" xmlns:w16du="http://schemas.microsoft.com/office/word/2023/wordml/word16du" xmlns:w16sdtdh="http://schemas.microsoft.com/office/word/2020/wordml/sdtdatahash" xmlns:w16sdtfl="http://schemas.microsoft.com/office/word/2024/wordml/sdtformatlock" xmlns:w16se="http://schemas.microsoft.com/office/word/2015/wordml/symex" xmlns:wpg="http://schemas.microsoft.com/office/word/2010/wordprocessingGroup" xmlns:wpi="http://schemas.microsoft.com/office/word/2010/wordprocessingInk" xmlns:wne="http://schemas.microsoft.com/office/word/2006/wordml" xmlns:wps="http://schemas.microsoft.com/office/word/2010/wordprocessingShape" mc:Ignorable="w14 w15 w16se w16cid w16 w16cex w16sdtdh w16sdtfl w16du wp14">
   <w:abstractNum w:abstractNumId="0" w15:restartNumberingAfterBreak="0">
     <w:nsid w:val="FFFFFF1D"/>
     <w:multiLevelType w:val="multilevel"/>
@@ -3758,6 +6021,81 @@
 </file>
 
 <file path=customXml/item1.xml><?xml version="1.0" encoding="utf-8"?>
+<?mso-contentType ?>
+<FormTemplates xmlns="http://schemas.microsoft.com/sharepoint/v3/contenttype/forms">
+  <Display>DocumentLibraryForm</Display>
+  <Edit>DocumentLibraryForm</Edit>
+  <New>DocumentLibraryForm</New>
+</FormTemplates>
+</file>
+
+<file path=customXml/item2.xml><?xml version="1.0" encoding="utf-8"?>
+<?mso-contentType ?>
+<spe:Receivers xmlns:spe="http://schemas.microsoft.com/sharepoint/events">
+  <Receiver>
+    <Name>Document ID Generator</Name>
+    <Synchronization>Synchronous</Synchronization>
+    <Type>10001</Type>
+    <SequenceNumber>1000</SequenceNumber>
+    <Url/>
+    <Assembly>Microsoft.Office.DocumentManagement, Version=16.0.0.0, Culture=neutral, PublicKeyToken=71e9bce111e9429c</Assembly>
+    <Class>Microsoft.Office.DocumentManagement.Internal.DocIdHandler</Class>
+    <Data/>
+    <Filter/>
+  </Receiver>
+  <Receiver>
+    <Name>Document ID Generator</Name>
+    <Synchronization>Synchronous</Synchronization>
+    <Type>10002</Type>
+    <SequenceNumber>1001</SequenceNumber>
+    <Url/>
+    <Assembly>Microsoft.Office.DocumentManagement, Version=16.0.0.0, Culture=neutral, PublicKeyToken=71e9bce111e9429c</Assembly>
+    <Class>Microsoft.Office.DocumentManagement.Internal.DocIdHandler</Class>
+    <Data/>
+    <Filter/>
+  </Receiver>
+  <Receiver>
+    <Name>Document ID Generator</Name>
+    <Synchronization>Synchronous</Synchronization>
+    <Type>10004</Type>
+    <SequenceNumber>1002</SequenceNumber>
+    <Url/>
+    <Assembly>Microsoft.Office.DocumentManagement, Version=16.0.0.0, Culture=neutral, PublicKeyToken=71e9bce111e9429c</Assembly>
+    <Class>Microsoft.Office.DocumentManagement.Internal.DocIdHandler</Class>
+    <Data/>
+    <Filter/>
+  </Receiver>
+  <Receiver>
+    <Name>Document ID Generator</Name>
+    <Synchronization>Synchronous</Synchronization>
+    <Type>10006</Type>
+    <SequenceNumber>1003</SequenceNumber>
+    <Url/>
+    <Assembly>Microsoft.Office.DocumentManagement, Version=16.0.0.0, Culture=neutral, PublicKeyToken=71e9bce111e9429c</Assembly>
+    <Class>Microsoft.Office.DocumentManagement.Internal.DocIdHandler</Class>
+    <Data/>
+    <Filter/>
+  </Receiver>
+</spe:Receivers>
+</file>
+
+<file path=customXml/item3.xml><?xml version="1.0" encoding="utf-8"?>
+<p:properties xmlns:p="http://schemas.microsoft.com/office/2006/metadata/properties" xmlns:xsi="http://www.w3.org/2001/XMLSchema-instance" xmlns:pc="http://schemas.microsoft.com/office/infopath/2007/PartnerControls">
+  <documentManagement>
+    <TaxCatchAll xmlns="d5759068-2af1-405f-8952-bba64d53795f" xsi:nil="true"/>
+    <lcf76f155ced4ddcb4097134ff3c332f xmlns="fc6929cc-5503-4d88-ab04-1ba5755a3b48">
+      <Terms xmlns="http://schemas.microsoft.com/office/infopath/2007/PartnerControls"/>
+    </lcf76f155ced4ddcb4097134ff3c332f>
+    <_dlc_DocId xmlns="d5759068-2af1-405f-8952-bba64d53795f">TQRXN6XH56H4-652439573-2884814</_dlc_DocId>
+    <_dlc_DocIdUrl xmlns="d5759068-2af1-405f-8952-bba64d53795f">
+      <Url>https://cranfield.sharepoint.com/sites/PGVibData/_layouts/15/DocIdRedir.aspx?ID=TQRXN6XH56H4-652439573-2884814</Url>
+      <Description>TQRXN6XH56H4-652439573-2884814</Description>
+    </_dlc_DocIdUrl>
+  </documentManagement>
+</p:properties>
+</file>
+
+<file path=customXml/item4.xml><?xml version="1.0" encoding="utf-8"?>
 <ct:contentTypeSchema xmlns:ct="http://schemas.microsoft.com/office/2006/metadata/contentType" xmlns:ma="http://schemas.microsoft.com/office/2006/metadata/properties/metaAttributes" ct:_="" ma:_="" ma:contentTypeName="Document" ma:contentTypeID="0x010100EC8CC33C3763BF4EA730E2D192C2DDB9" ma:contentTypeVersion="18" ma:contentTypeDescription="Create a new document." ma:contentTypeScope="" ma:versionID="1d13a82d8fbf311ad2d5c7ffcaf8a280">
   <xsd:schema xmlns:xsd="http://www.w3.org/2001/XMLSchema" xmlns:xs="http://www.w3.org/2001/XMLSchema" xmlns:p="http://schemas.microsoft.com/office/2006/metadata/properties" xmlns:ns2="d5759068-2af1-405f-8952-bba64d53795f" xmlns:ns3="fc6929cc-5503-4d88-ab04-1ba5755a3b48" targetNamespace="http://schemas.microsoft.com/office/2006/metadata/properties" ma:root="true" ma:fieldsID="9beb809c4fb16bb24a029ea3bd9fcc9e" ns2:_="" ns3:_="">
     <xsd:import namespace="d5759068-2af1-405f-8952-bba64d53795f"/>
@@ -4037,86 +6375,38 @@
 </ct:contentTypeSchema>
 </file>
 
-<file path=customXml/item2.xml><?xml version="1.0" encoding="utf-8"?>
-<p:properties xmlns:p="http://schemas.microsoft.com/office/2006/metadata/properties" xmlns:xsi="http://www.w3.org/2001/XMLSchema-instance" xmlns:pc="http://schemas.microsoft.com/office/infopath/2007/PartnerControls">
-  <documentManagement>
-    <TaxCatchAll xmlns="d5759068-2af1-405f-8952-bba64d53795f" xsi:nil="true"/>
-    <lcf76f155ced4ddcb4097134ff3c332f xmlns="fc6929cc-5503-4d88-ab04-1ba5755a3b48">
-      <Terms xmlns="http://schemas.microsoft.com/office/infopath/2007/PartnerControls"/>
-    </lcf76f155ced4ddcb4097134ff3c332f>
-    <_dlc_DocId xmlns="d5759068-2af1-405f-8952-bba64d53795f">TQRXN6XH56H4-652439573-2884814</_dlc_DocId>
-    <_dlc_DocIdUrl xmlns="d5759068-2af1-405f-8952-bba64d53795f">
-      <Url>https://cranfield.sharepoint.com/sites/PGVibData/_layouts/15/DocIdRedir.aspx?ID=TQRXN6XH56H4-652439573-2884814</Url>
-      <Description>TQRXN6XH56H4-652439573-2884814</Description>
-    </_dlc_DocIdUrl>
-  </documentManagement>
-</p:properties>
-</file>
-
-<file path=customXml/item3.xml><?xml version="1.0" encoding="utf-8"?>
-<?mso-contentType ?>
-<spe:Receivers xmlns:spe="http://schemas.microsoft.com/sharepoint/events">
-  <Receiver>
-    <Name>Document ID Generator</Name>
-    <Synchronization>Synchronous</Synchronization>
-    <Type>10001</Type>
-    <SequenceNumber>1000</SequenceNumber>
-    <Url/>
-    <Assembly>Microsoft.Office.DocumentManagement, Version=16.0.0.0, Culture=neutral, PublicKeyToken=71e9bce111e9429c</Assembly>
-    <Class>Microsoft.Office.DocumentManagement.Internal.DocIdHandler</Class>
-    <Data/>
-    <Filter/>
-  </Receiver>
-  <Receiver>
-    <Name>Document ID Generator</Name>
-    <Synchronization>Synchronous</Synchronization>
-    <Type>10002</Type>
-    <SequenceNumber>1001</SequenceNumber>
-    <Url/>
-    <Assembly>Microsoft.Office.DocumentManagement, Version=16.0.0.0, Culture=neutral, PublicKeyToken=71e9bce111e9429c</Assembly>
-    <Class>Microsoft.Office.DocumentManagement.Internal.DocIdHandler</Class>
-    <Data/>
-    <Filter/>
-  </Receiver>
-  <Receiver>
-    <Name>Document ID Generator</Name>
-    <Synchronization>Synchronous</Synchronization>
-    <Type>10004</Type>
-    <SequenceNumber>1002</SequenceNumber>
-    <Url/>
-    <Assembly>Microsoft.Office.DocumentManagement, Version=16.0.0.0, Culture=neutral, PublicKeyToken=71e9bce111e9429c</Assembly>
-    <Class>Microsoft.Office.DocumentManagement.Internal.DocIdHandler</Class>
-    <Data/>
-    <Filter/>
-  </Receiver>
-  <Receiver>
-    <Name>Document ID Generator</Name>
-    <Synchronization>Synchronous</Synchronization>
-    <Type>10006</Type>
-    <SequenceNumber>1003</SequenceNumber>
-    <Url/>
-    <Assembly>Microsoft.Office.DocumentManagement, Version=16.0.0.0, Culture=neutral, PublicKeyToken=71e9bce111e9429c</Assembly>
-    <Class>Microsoft.Office.DocumentManagement.Internal.DocIdHandler</Class>
-    <Data/>
-    <Filter/>
-  </Receiver>
-</spe:Receivers>
-</file>
-
-<file path=customXml/item4.xml><?xml version="1.0" encoding="utf-8"?>
-<?mso-contentType ?>
-<FormTemplates xmlns="http://schemas.microsoft.com/sharepoint/v3/contenttype/forms">
-  <Display>DocumentLibraryForm</Display>
-  <Edit>DocumentLibraryForm</Edit>
-  <New>DocumentLibraryForm</New>
-</FormTemplates>
-</file>
-
 <file path=customXml/item5.xml><?xml version="1.0" encoding="utf-8"?>
 <b:Sources xmlns:b="http://schemas.openxmlformats.org/officeDocument/2006/bibliography" xmlns="http://schemas.openxmlformats.org/officeDocument/2006/bibliography" SelectedStyle="/APASixthEditionOfficeOnline.xsl" StyleName="APA"/>
 </file>
 
 <file path=customXml/itemProps1.xml><?xml version="1.0" encoding="utf-8"?>
+<ds:datastoreItem xmlns:ds="http://schemas.openxmlformats.org/officeDocument/2006/customXml" ds:itemID="{1CA9BEE3-0228-47D5-9957-749897919E7C}">
+  <ds:schemaRefs>
+    <ds:schemaRef ds:uri="http://schemas.microsoft.com/sharepoint/v3/contenttype/forms"/>
+  </ds:schemaRefs>
+</ds:datastoreItem>
+</file>
+
+<file path=customXml/itemProps2.xml><?xml version="1.0" encoding="utf-8"?>
+<ds:datastoreItem xmlns:ds="http://schemas.openxmlformats.org/officeDocument/2006/customXml" ds:itemID="{9BF3BFED-8332-44D7-87FA-AF83EF4A9234}">
+  <ds:schemaRefs>
+    <ds:schemaRef ds:uri="http://schemas.microsoft.com/sharepoint/events"/>
+  </ds:schemaRefs>
+</ds:datastoreItem>
+</file>
+
+<file path=customXml/itemProps3.xml><?xml version="1.0" encoding="utf-8"?>
+<ds:datastoreItem xmlns:ds="http://schemas.openxmlformats.org/officeDocument/2006/customXml" ds:itemID="{FE6286F3-FFA3-49D9-B011-02550189FDEB}">
+  <ds:schemaRefs>
+    <ds:schemaRef ds:uri="http://schemas.microsoft.com/office/2006/metadata/properties"/>
+    <ds:schemaRef ds:uri="http://schemas.microsoft.com/office/infopath/2007/PartnerControls"/>
+    <ds:schemaRef ds:uri="d5759068-2af1-405f-8952-bba64d53795f"/>
+    <ds:schemaRef ds:uri="fc6929cc-5503-4d88-ab04-1ba5755a3b48"/>
+  </ds:schemaRefs>
+</ds:datastoreItem>
+</file>
+
+<file path=customXml/itemProps4.xml><?xml version="1.0" encoding="utf-8"?>
 <ds:datastoreItem xmlns:ds="http://schemas.openxmlformats.org/officeDocument/2006/customXml" ds:itemID="{D5F812A0-A3A2-4EE0-A6ED-E9877F3154D7}">
   <ds:schemaRefs>
     <ds:schemaRef ds:uri="http://schemas.microsoft.com/office/2006/metadata/contentType"/>
@@ -4135,33 +6425,6 @@
 </ds:datastoreItem>
 </file>
 
-<file path=customXml/itemProps2.xml><?xml version="1.0" encoding="utf-8"?>
-<ds:datastoreItem xmlns:ds="http://schemas.openxmlformats.org/officeDocument/2006/customXml" ds:itemID="{FE6286F3-FFA3-49D9-B011-02550189FDEB}">
-  <ds:schemaRefs>
-    <ds:schemaRef ds:uri="http://schemas.microsoft.com/office/2006/metadata/properties"/>
-    <ds:schemaRef ds:uri="http://schemas.microsoft.com/office/infopath/2007/PartnerControls"/>
-    <ds:schemaRef ds:uri="d5759068-2af1-405f-8952-bba64d53795f"/>
-    <ds:schemaRef ds:uri="fc6929cc-5503-4d88-ab04-1ba5755a3b48"/>
-  </ds:schemaRefs>
-</ds:datastoreItem>
-</file>
-
-<file path=customXml/itemProps3.xml><?xml version="1.0" encoding="utf-8"?>
-<ds:datastoreItem xmlns:ds="http://schemas.openxmlformats.org/officeDocument/2006/customXml" ds:itemID="{9BF3BFED-8332-44D7-87FA-AF83EF4A9234}">
-  <ds:schemaRefs>
-    <ds:schemaRef ds:uri="http://schemas.microsoft.com/sharepoint/events"/>
-  </ds:schemaRefs>
-</ds:datastoreItem>
-</file>
-
-<file path=customXml/itemProps4.xml><?xml version="1.0" encoding="utf-8"?>
-<ds:datastoreItem xmlns:ds="http://schemas.openxmlformats.org/officeDocument/2006/customXml" ds:itemID="{1CA9BEE3-0228-47D5-9957-749897919E7C}">
-  <ds:schemaRefs>
-    <ds:schemaRef ds:uri="http://schemas.microsoft.com/sharepoint/v3/contenttype/forms"/>
-  </ds:schemaRefs>
-</ds:datastoreItem>
-</file>
-
 <file path=customXml/itemProps5.xml><?xml version="1.0" encoding="utf-8"?>
 <ds:datastoreItem xmlns:ds="http://schemas.openxmlformats.org/officeDocument/2006/customXml" ds:itemID="{B37BF8BA-60FB-44B9-BFEB-4B8F946969EA}">
   <ds:schemaRefs>

</xml_diff>

<commit_message>
Further contribution to the lit review
</commit_message>
<xml_diff>
--- a/Submission/s479832 - AutomatingSafetyCriticalEngineering.docx
+++ b/Submission/s479832 - AutomatingSafetyCriticalEngineering.docx
@@ -618,10 +618,26 @@
         <w:t>RTCA D0-178C [1]</w:t>
       </w:r>
       <w:r>
-        <w:t xml:space="preserve"> against lifecycle artefacts, and supplementary standards (330, 331, 332..) are met. </w:t>
-      </w:r>
-      <w:r>
-        <w:t>The aforementioned objectives are scaled in effort, by the Design Assurance Level (DAL), where the level of evidence is required where software failure may lead to a catastrophic condition. Defence Standard 00-055 Part 1</w:t>
+        <w:t xml:space="preserve"> against lifecycle artefacts, and supplementary standards (330, 331, </w:t>
+      </w:r>
+      <w:proofErr w:type="gramStart"/>
+      <w:r>
+        <w:t>332..</w:t>
+      </w:r>
+      <w:proofErr w:type="gramEnd"/>
+      <w:r>
+        <w:t xml:space="preserve">) are met. </w:t>
+      </w:r>
+      <w:r>
+        <w:t xml:space="preserve">The </w:t>
+      </w:r>
+      <w:proofErr w:type="gramStart"/>
+      <w:r>
+        <w:t>aforementioned objectives</w:t>
+      </w:r>
+      <w:proofErr w:type="gramEnd"/>
+      <w:r>
+        <w:t xml:space="preserve"> are scaled in effort, by the Design Assurance Level (DAL), where the level of evidence is required where software failure may lead to a catastrophic condition. Defence Standard 00-055 Part 1</w:t>
       </w:r>
       <w:r>
         <w:t xml:space="preserve"> [2]</w:t>
@@ -1549,21 +1565,7 @@
                       <w:sz w:val="20"/>
                       <w:szCs w:val="20"/>
                     </w:rPr>
-                    <w:t xml:space="preserve">Software </w:t>
-                  </w:r>
-                  <w:r>
-                    <w:rPr>
-                      <w:sz w:val="20"/>
-                      <w:szCs w:val="20"/>
-                    </w:rPr>
-                    <w:t>Implementation</w:t>
-                  </w:r>
-                  <w:r>
-                    <w:rPr>
-                      <w:sz w:val="20"/>
-                      <w:szCs w:val="20"/>
-                    </w:rPr>
-                    <w:t xml:space="preserve"> Standards</w:t>
+                    <w:t>Software Implementation Standards</w:t>
                   </w:r>
                 </w:p>
               </w:tc>
@@ -1640,14 +1642,7 @@
                 <w:sz w:val="20"/>
                 <w:szCs w:val="20"/>
               </w:rPr>
-              <w:t>11.</w:t>
-            </w:r>
-            <w:r>
-              <w:rPr>
-                <w:sz w:val="20"/>
-                <w:szCs w:val="20"/>
-              </w:rPr>
-              <w:t>9</w:t>
+              <w:t>11.9</w:t>
             </w:r>
           </w:p>
         </w:tc>
@@ -1770,14 +1765,7 @@
                 <w:sz w:val="20"/>
                 <w:szCs w:val="20"/>
               </w:rPr>
-              <w:t>11.</w:t>
-            </w:r>
-            <w:r>
-              <w:rPr>
-                <w:sz w:val="20"/>
-                <w:szCs w:val="20"/>
-              </w:rPr>
-              <w:t>10</w:t>
+              <w:t>11.10</w:t>
             </w:r>
           </w:p>
         </w:tc>
@@ -1863,14 +1851,7 @@
                 <w:sz w:val="20"/>
                 <w:szCs w:val="20"/>
               </w:rPr>
-              <w:t>11.</w:t>
-            </w:r>
-            <w:r>
-              <w:rPr>
-                <w:sz w:val="20"/>
-                <w:szCs w:val="20"/>
-              </w:rPr>
-              <w:t>11</w:t>
+              <w:t>11.11</w:t>
             </w:r>
           </w:p>
         </w:tc>
@@ -1956,14 +1937,7 @@
                 <w:sz w:val="20"/>
                 <w:szCs w:val="20"/>
               </w:rPr>
-              <w:t>11.</w:t>
-            </w:r>
-            <w:r>
-              <w:rPr>
-                <w:sz w:val="20"/>
-                <w:szCs w:val="20"/>
-              </w:rPr>
-              <w:t>12</w:t>
+              <w:t>11.12</w:t>
             </w:r>
           </w:p>
         </w:tc>
@@ -2049,14 +2023,7 @@
                 <w:sz w:val="20"/>
                 <w:szCs w:val="20"/>
               </w:rPr>
-              <w:t>11.</w:t>
-            </w:r>
-            <w:r>
-              <w:rPr>
-                <w:sz w:val="20"/>
-                <w:szCs w:val="20"/>
-              </w:rPr>
-              <w:t>13</w:t>
+              <w:t>11.13</w:t>
             </w:r>
           </w:p>
         </w:tc>
@@ -2144,14 +2111,7 @@
                 <w:sz w:val="20"/>
                 <w:szCs w:val="20"/>
               </w:rPr>
-              <w:t>11.</w:t>
-            </w:r>
-            <w:r>
-              <w:rPr>
-                <w:sz w:val="20"/>
-                <w:szCs w:val="20"/>
-              </w:rPr>
-              <w:t>14</w:t>
+              <w:t>11.14</w:t>
             </w:r>
           </w:p>
         </w:tc>
@@ -2274,14 +2234,7 @@
                 <w:sz w:val="20"/>
                 <w:szCs w:val="20"/>
               </w:rPr>
-              <w:t>11.</w:t>
-            </w:r>
-            <w:r>
-              <w:rPr>
-                <w:sz w:val="20"/>
-                <w:szCs w:val="20"/>
-              </w:rPr>
-              <w:t>15</w:t>
+              <w:t>11.15</w:t>
             </w:r>
           </w:p>
         </w:tc>
@@ -2404,14 +2357,7 @@
                 <w:sz w:val="20"/>
                 <w:szCs w:val="20"/>
               </w:rPr>
-              <w:t>11.</w:t>
-            </w:r>
-            <w:r>
-              <w:rPr>
-                <w:sz w:val="20"/>
-                <w:szCs w:val="20"/>
-              </w:rPr>
-              <w:t>16</w:t>
+              <w:t>11.16</w:t>
             </w:r>
           </w:p>
         </w:tc>
@@ -2497,14 +2443,7 @@
                 <w:sz w:val="20"/>
                 <w:szCs w:val="20"/>
               </w:rPr>
-              <w:t>11.</w:t>
-            </w:r>
-            <w:r>
-              <w:rPr>
-                <w:sz w:val="20"/>
-                <w:szCs w:val="20"/>
-              </w:rPr>
-              <w:t>17</w:t>
+              <w:t>11.17</w:t>
             </w:r>
           </w:p>
         </w:tc>
@@ -2627,14 +2566,7 @@
                 <w:sz w:val="20"/>
                 <w:szCs w:val="20"/>
               </w:rPr>
-              <w:t>11.</w:t>
-            </w:r>
-            <w:r>
-              <w:rPr>
-                <w:sz w:val="20"/>
-                <w:szCs w:val="20"/>
-              </w:rPr>
-              <w:t>18</w:t>
+              <w:t>11.18</w:t>
             </w:r>
           </w:p>
         </w:tc>
@@ -2720,14 +2652,7 @@
                 <w:sz w:val="20"/>
                 <w:szCs w:val="20"/>
               </w:rPr>
-              <w:t>11.</w:t>
-            </w:r>
-            <w:r>
-              <w:rPr>
-                <w:sz w:val="20"/>
-                <w:szCs w:val="20"/>
-              </w:rPr>
-              <w:t>19</w:t>
+              <w:t>11.19</w:t>
             </w:r>
           </w:p>
         </w:tc>
@@ -2813,14 +2738,7 @@
                 <w:sz w:val="20"/>
                 <w:szCs w:val="20"/>
               </w:rPr>
-              <w:t>11.</w:t>
-            </w:r>
-            <w:r>
-              <w:rPr>
-                <w:sz w:val="20"/>
-                <w:szCs w:val="20"/>
-              </w:rPr>
-              <w:t>20</w:t>
+              <w:t>11.20</w:t>
             </w:r>
           </w:p>
         </w:tc>
@@ -2906,14 +2824,7 @@
                 <w:sz w:val="20"/>
                 <w:szCs w:val="20"/>
               </w:rPr>
-              <w:t>11.</w:t>
-            </w:r>
-            <w:r>
-              <w:rPr>
-                <w:sz w:val="20"/>
-                <w:szCs w:val="20"/>
-              </w:rPr>
-              <w:t>21</w:t>
+              <w:t>11.21</w:t>
             </w:r>
           </w:p>
         </w:tc>
@@ -2999,14 +2910,7 @@
                 <w:sz w:val="20"/>
                 <w:szCs w:val="20"/>
               </w:rPr>
-              <w:t>11.</w:t>
-            </w:r>
-            <w:r>
-              <w:rPr>
-                <w:sz w:val="20"/>
-                <w:szCs w:val="20"/>
-              </w:rPr>
-              <w:t>22</w:t>
+              <w:t>11.22</w:t>
             </w:r>
           </w:p>
         </w:tc>
@@ -3176,7 +3080,23 @@
         <w:t>Mandrollic process automation is therefore supported by the characteristics of the supportive standard, the work is structured, requirements driven and evidence rich in nature, relying upon deterministic toolsets to maintain a standardised approach to the delivery of artefacts.</w:t>
       </w:r>
       <w:r>
-        <w:t xml:space="preserve"> Large Language Models (LLMs) can ingest natural language, code and prompted context, while Retrieval Augmented Generation (RAG) can instead route responses through the projects corpus of information, rather than relying upon model parameters alone [6]. An extension of these approaches, is agentic orchestration, where model instantiations can plan, use toolsets and coordinate highly specialised/constrained agents for the fulfilment of a task. The extent of agentic orchestration enables parallelised planning, development and review of lifecycle activities, with or without human supervision.</w:t>
+        <w:t xml:space="preserve"> Large Language Models (LLMs) can ingest natural language, code and prompted context, while Retrieval Augmented Generation (RAG) can instead route responses through the </w:t>
+      </w:r>
+      <w:proofErr w:type="gramStart"/>
+      <w:r>
+        <w:t>projects</w:t>
+      </w:r>
+      <w:proofErr w:type="gramEnd"/>
+      <w:r>
+        <w:t xml:space="preserve"> corpus of information, rather than relying upon model parameters alone [6]. </w:t>
+      </w:r>
+      <w:proofErr w:type="gramStart"/>
+      <w:r>
+        <w:t>An extension of these approaches,</w:t>
+      </w:r>
+      <w:proofErr w:type="gramEnd"/>
+      <w:r>
+        <w:t xml:space="preserve"> is agentic orchestration, where model instantiations can plan, use toolsets and coordinate highly specialised/constrained agents for the fulfilment of a task. The extent of agentic orchestration enables parallelised planning, development and review of lifecycle activities, with or without human supervision.</w:t>
       </w:r>
     </w:p>
     <w:p>
@@ -3205,17 +3125,13 @@
       <w:pPr>
         <w:jc w:val="both"/>
       </w:pPr>
-      <w:r>
-        <w:t>Therefore it</w:t>
-      </w:r>
-      <w:r>
-        <w:t xml:space="preserve"> is my view the integration of AI, or Machine Learning Algorithms (MLA) into the software engineering lifecycle, should be performed with </w:t>
-      </w:r>
-      <w:r>
-        <w:t>awareness of progress</w:t>
-      </w:r>
-      <w:r>
-        <w:t xml:space="preserve"> and through adaptive, morale focused change. </w:t>
+      <w:proofErr w:type="gramStart"/>
+      <w:r>
+        <w:t>Therefore</w:t>
+      </w:r>
+      <w:proofErr w:type="gramEnd"/>
+      <w:r>
+        <w:t xml:space="preserve"> it is my view the integration of AI, or Machine Learning Algorithms (MLA) into the software engineering lifecycle, should be performed with awareness of progress and through adaptive, morale focused change. </w:t>
       </w:r>
     </w:p>
     <w:p/>
@@ -3224,7 +3140,23 @@
         <w:jc w:val="both"/>
       </w:pPr>
       <w:r>
-        <w:t>Considering the proprietary nature of MBSE tools, and so as to smoothly and easily integrate such tools into an agentic workflow, they shall be used, as far as possible, to produce associated artefacts, and must remain used according to license and fair use stipulations. A process which considers impacts to established safety case driven evidence substantiation, must be prioritised, so as to not increase certification challenge. The associated airworthiness authority must validate the defined Acceptable Means of Compliance, and as such this must be substantiated by defined and considered processes. These shall be defined within this document, to produce a preliminary response.</w:t>
+        <w:t xml:space="preserve">Considering the proprietary nature of MBSE tools, and </w:t>
+      </w:r>
+      <w:proofErr w:type="gramStart"/>
+      <w:r>
+        <w:t>so as to</w:t>
+      </w:r>
+      <w:proofErr w:type="gramEnd"/>
+      <w:r>
+        <w:t xml:space="preserve"> smoothly and easily integrate such tools into an agentic workflow, they shall be used, as far as possible, to produce associated artefacts, and must remain used according to license and fair use stipulations. A process which considers impacts to established safety case driven evidence substantiation, must be prioritised, </w:t>
+      </w:r>
+      <w:proofErr w:type="gramStart"/>
+      <w:r>
+        <w:t>so as to</w:t>
+      </w:r>
+      <w:proofErr w:type="gramEnd"/>
+      <w:r>
+        <w:t xml:space="preserve"> not increase certification challenge. The associated airworthiness authority must validate the defined Acceptable Means of Compliance, and as such this must be substantiated by defined and considered processes. These shall be defined within this document, to produce a preliminary response.</w:t>
       </w:r>
     </w:p>
     <w:p/>
@@ -3312,8 +3244,13 @@
       <w:pPr>
         <w:jc w:val="both"/>
       </w:pPr>
-      <w:r>
-        <w:t xml:space="preserve">Therefore any safe process transformation, must </w:t>
+      <w:proofErr w:type="gramStart"/>
+      <w:r>
+        <w:t>Therefore</w:t>
+      </w:r>
+      <w:proofErr w:type="gramEnd"/>
+      <w:r>
+        <w:t xml:space="preserve"> any safe process transformation, must </w:t>
       </w:r>
       <w:r>
         <w:t xml:space="preserve">provably </w:t>
@@ -3381,18 +3318,6 @@
     </w:p>
     <w:p/>
     <w:p>
-      <w:r>
-        <w:rPr>
-          <w:highlight w:val="yellow"/>
-        </w:rPr>
-        <w:t>Introduce previous and current technology in this area. What are their benefits and draw backs, how do they interrelate? Reference your findings</w:t>
-      </w:r>
-      <w:r>
-        <w:t xml:space="preserve"> 25</w:t>
-      </w:r>
-    </w:p>
-    <w:p/>
-    <w:p>
       <w:pPr>
         <w:rPr>
           <w:b/>
@@ -3460,10 +3385,26 @@
         <w:jc w:val="both"/>
       </w:pPr>
       <w:r>
-        <w:t>At each stage of delivery, these artefacts are reviewed to confirm compliance against these aforementioned plans and standards, and later, to confirm their functional correctness as per the stated requirements. This is a sequential process, where system level requirements (and associated de-risking activities) are produced, as pre-requisit</w:t>
-      </w:r>
-      <w:r>
-        <w:t>e deliverables, to the commencement of high level requirement (HLR) implementation, just as HLRs, precede the commencement of low level requirement (LLR) implementation.</w:t>
+        <w:t>At each stage of delivery, these artefacts are reviewed to confirm compliance against plans and standards, and later, to confirm their functional correctness as per the stated requirements. This is a sequential process, where system level requirements (and associated de-risking activities) are produced, as pre-requisit</w:t>
+      </w:r>
+      <w:r>
+        <w:t xml:space="preserve">e deliverables, to the commencement of </w:t>
+      </w:r>
+      <w:proofErr w:type="gramStart"/>
+      <w:r>
+        <w:t>high level</w:t>
+      </w:r>
+      <w:proofErr w:type="gramEnd"/>
+      <w:r>
+        <w:t xml:space="preserve"> requirement (HLR) implementation, just as HLRs, precede the commencement of </w:t>
+      </w:r>
+      <w:proofErr w:type="gramStart"/>
+      <w:r>
+        <w:t>low level</w:t>
+      </w:r>
+      <w:proofErr w:type="gramEnd"/>
+      <w:r>
+        <w:t xml:space="preserve"> requirement (LLR) implementation.</w:t>
       </w:r>
     </w:p>
     <w:p>
@@ -3476,7 +3417,46 @@
         <w:jc w:val="both"/>
       </w:pPr>
       <w:r>
-        <w:t>This sequential manner of delivery, serves to facilitate the parallel completion of tasks which relate to each other, at each level in the hierarchy of deliverables. This benefits traditional software teams, who gain suitable time to conduct reviews, whilst other work items can be progressed, or reviewed at the same time.</w:t>
+        <w:t>Processes</w:t>
+      </w:r>
+      <w:r>
+        <w:t xml:space="preserve"> </w:t>
+      </w:r>
+      <w:r>
+        <w:t>which</w:t>
+      </w:r>
+      <w:r>
+        <w:t xml:space="preserve"> increase the quality</w:t>
+      </w:r>
+      <w:r>
+        <w:t xml:space="preserve"> of</w:t>
+      </w:r>
+      <w:r>
+        <w:t xml:space="preserve"> </w:t>
+      </w:r>
+      <w:r>
+        <w:t>any</w:t>
+      </w:r>
+      <w:r>
+        <w:t xml:space="preserve"> delivered artefact, </w:t>
+      </w:r>
+      <w:r>
+        <w:t>tend to cost the</w:t>
+      </w:r>
+      <w:r>
+        <w:t xml:space="preserve"> project </w:t>
+      </w:r>
+      <w:r>
+        <w:t xml:space="preserve">more time and </w:t>
+      </w:r>
+      <w:r>
+        <w:t xml:space="preserve">money, </w:t>
+      </w:r>
+      <w:r>
+        <w:t>with effort scaling in orders of magnitude</w:t>
+      </w:r>
+      <w:r>
+        <w:t>, according to an increase in the Design Assurance Level (DAL) associated with the project / domain.</w:t>
       </w:r>
     </w:p>
     <w:p>
@@ -3489,26 +3469,20 @@
         <w:jc w:val="both"/>
       </w:pPr>
       <w:r>
-        <w:t>This additional time, serving to increase the quality in the delivered artefact, ultimately costs the project money, scaling in an almost exponential manner, according to an increase in the Design Assurance Level (DAL) associated with the project / domain.</w:t>
-      </w:r>
-    </w:p>
-    <w:p>
-      <w:pPr>
-        <w:jc w:val="both"/>
-      </w:pPr>
-    </w:p>
-    <w:p>
-      <w:pPr>
-        <w:jc w:val="both"/>
-      </w:pPr>
-      <w:r>
-        <w:t>As a result, high integrity software, would see the greatest cost savings, from complete automation, yet incurs the highest potential penalty, as a consequence of failure in the loss of human life.</w:t>
+        <w:t xml:space="preserve">As a result, high integrity software, would see the greatest cost savings, from complete automation, yet incurs the highest potential penalty, </w:t>
+      </w:r>
+      <w:proofErr w:type="gramStart"/>
+      <w:r>
+        <w:t>as a consequence of</w:t>
+      </w:r>
+      <w:proofErr w:type="gramEnd"/>
+      <w:r>
+        <w:t xml:space="preserve"> failure in the loss of human life.</w:t>
       </w:r>
       <w:r>
         <w:t xml:space="preserve"> For this reason, the integration of AI/ML into the domain of safety critical software engineering, is rife with concern and scepticism. As it currently stands, no established means of compliance, for deployed AI/ML has been agreed by the military certification authorities. Ongoing work maintains a position of caution, advising against Level 3 (fully autonomous/human out of the loop) operation.</w:t>
       </w:r>
     </w:p>
-    <w:p/>
     <w:p>
       <w:pPr>
         <w:rPr>
@@ -3532,14 +3506,13 @@
           <w:bCs/>
         </w:rPr>
       </w:pPr>
-    </w:p>
-    <w:p>
-      <w:pPr>
+      <w:r>
         <w:rPr>
           <w:b/>
           <w:bCs/>
         </w:rPr>
-      </w:pPr>
+        <w:br w:type="page"/>
+      </w:r>
     </w:p>
     <w:p>
       <w:pPr>
@@ -3554,18 +3527,78 @@
           <w:bCs/>
         </w:rPr>
         <w:lastRenderedPageBreak/>
-        <w:t xml:space="preserve">LLM Supported </w:t>
-      </w:r>
-      <w:r>
+        <w:t>LLM Supported Safety Critical Software Development</w:t>
+      </w:r>
+    </w:p>
+    <w:p>
+      <w:pPr>
         <w:rPr>
           <w:b/>
           <w:bCs/>
         </w:rPr>
-        <w:t>Safety Critical Software Development</w:t>
-      </w:r>
-    </w:p>
-    <w:p>
-      <w:pPr>
+      </w:pPr>
+    </w:p>
+    <w:p>
+      <w:r>
+        <w:t xml:space="preserve">Current software engineering literature, anecdotal evidence and the prevailing public opinion align in the identification of LLMs as a transformative offer of capability. RAG integration indeed offers a practical route for the grounding of models, in the corpus of project data, bounding responses in that which can be </w:t>
+      </w:r>
+      <w:proofErr w:type="gramStart"/>
+      <w:r>
+        <w:t>definitely observed</w:t>
+      </w:r>
+      <w:proofErr w:type="gramEnd"/>
+      <w:r>
+        <w:t xml:space="preserve"> as fact [6]. For any LLM exploitation in a safety critical context, an increased level of logging</w:t>
+      </w:r>
+      <w:r>
+        <w:t xml:space="preserve"> should be performed. T</w:t>
+      </w:r>
+      <w:r>
+        <w:t xml:space="preserve">raceability and </w:t>
+      </w:r>
+      <w:r>
+        <w:t xml:space="preserve">explicit location references for any decision making shall be treated as a configurable artefact for the purpose of future audit. </w:t>
+      </w:r>
+    </w:p>
+    <w:p/>
+    <w:p>
+      <w:pPr>
+        <w:jc w:val="both"/>
+      </w:pPr>
+      <w:r>
+        <w:t xml:space="preserve">Increases in productivity have been measured across the literature, but the magnitude of results </w:t>
+      </w:r>
+      <w:proofErr w:type="gramStart"/>
+      <w:r>
+        <w:t>are</w:t>
+      </w:r>
+      <w:proofErr w:type="gramEnd"/>
+      <w:r>
+        <w:t xml:space="preserve"> dependent on the setting and context. As part of a bounded programming task, developers were asked to utilise GitHub Copilot, with 55.8% of these completing the task faster than a control group [9]. Despite this, a randomised study querying </w:t>
+      </w:r>
+      <w:proofErr w:type="gramStart"/>
+      <w:r>
+        <w:t>open source</w:t>
+      </w:r>
+      <w:proofErr w:type="gramEnd"/>
+      <w:r>
+        <w:t xml:space="preserve"> software developers, working with mature, known codebases in 2025 found completion time increased by 19%, conflating with expected increases in productivity, which were higher [10]. These results indicate that AI excels at greenfield programming tasks, whereas additional reasoning and context is required to parse and measurably improve a highly optimised code base, which is an expected outcome. </w:t>
+      </w:r>
+      <w:proofErr w:type="gramStart"/>
+      <w:r>
+        <w:t>Indeed</w:t>
+      </w:r>
+      <w:proofErr w:type="gramEnd"/>
+      <w:r>
+        <w:t xml:space="preserve"> any safety critical improvement would be mired by additional QA confirmation delays, review timeframes, timing analysis and failure mode analysis. These studies indicate why this experiment must measure human active development time, waiting time, review time and rework, as separate considerations, rather than apply a single productivity </w:t>
+      </w:r>
+      <w:r>
+        <w:t>increase factor, to any later scheduling.</w:t>
+      </w:r>
+    </w:p>
+    <w:p>
+      <w:pPr>
+        <w:jc w:val="both"/>
         <w:rPr>
           <w:b/>
           <w:bCs/>
@@ -3574,6 +3607,17 @@
     </w:p>
     <w:p>
       <w:pPr>
+        <w:jc w:val="both"/>
+      </w:pPr>
+      <w:r>
+        <w:t>Quality focused studies on LLM enabled development, purport wider potential dangers. Perry et al [11]</w:t>
+      </w:r>
+      <w:r>
+        <w:t xml:space="preserve"> found participants in a study produced less secure solutions for a given task, whilst exhibiting more confidence in the security and correctness of their implementation. Reasoning ability in models, is not enough to infer the additional context or instruction, where poor prompting or key details are omitted, in a safety critical context. Model knowledge of planning and standards documentation and all pertinent requirements is not enough to confirm usage, orchestration or ‘master-prompting’ must be used to ensure the context window contains the complete extent of information pertinent to any task. NASAs review of LLM usage in assurance case argument composition indicated available studies do not demonstrate general efficacy in the production of complete safety arguments, in comparison with human produced examples, with time and cost savings being compromised by rework cycles [12].</w:t>
+      </w:r>
+    </w:p>
+    <w:p>
+      <w:pPr>
         <w:rPr>
           <w:b/>
           <w:bCs/>
@@ -3581,6 +3625,14 @@
       </w:pPr>
     </w:p>
     <w:p>
+      <w:r>
+        <w:t>Any defensible use of this technology in safety critical fields may only be realised with explicit, human based, independent acceptance of any produced output</w:t>
+      </w:r>
+      <w:r>
+        <w:t>.</w:t>
+      </w:r>
+    </w:p>
+    <w:p>
       <w:pPr>
         <w:rPr>
           <w:b/>
@@ -3608,7 +3660,7 @@
           <w:b/>
           <w:bCs/>
         </w:rPr>
-        <w:t>Agentic Safety Critical Software Development</w:t>
+        <w:br w:type="page"/>
       </w:r>
     </w:p>
     <w:p>
@@ -3618,14 +3670,50 @@
           <w:bCs/>
         </w:rPr>
       </w:pPr>
-    </w:p>
-    <w:p>
-      <w:pPr>
+      <w:r>
         <w:rPr>
           <w:b/>
           <w:bCs/>
         </w:rPr>
-      </w:pPr>
+        <w:lastRenderedPageBreak/>
+        <w:t>Agentic Safety Critical Software Development</w:t>
+      </w:r>
+    </w:p>
+    <w:p>
+      <w:pPr>
+        <w:jc w:val="both"/>
+      </w:pPr>
+      <w:r>
+        <w:t xml:space="preserve">Agentic approaches </w:t>
+      </w:r>
+      <w:r>
+        <w:t>represent a step change in the utilisation of LLMs. Web based solutions provide some orchestration capability, but the true extent of what is possible can only be realised once planning, memory, tool usage and role definitions are exploited.</w:t>
+      </w:r>
+      <w:r>
+        <w:t xml:space="preserve"> SWE-bench [13], provides a measure of model performance, tallied against cost, where models are assessed in their application of fixes to real code bases.</w:t>
+      </w:r>
+      <w:r>
+        <w:t xml:space="preserve"> Although this provides a decent comparative measure, no consideration is placed towards adherence to outlined programming standards or towards the introduction of defects, increasing risk during operation. SWE-agent is a GitHub repository for an agent-computer interface, permitting repository interaction and editing. It is evident that the tools necessary to permit agentic interaction within a local machine, exist and are freely available. Orchestration frameworks such as </w:t>
+      </w:r>
+      <w:proofErr w:type="spellStart"/>
+      <w:r>
+        <w:t>MetaGPT</w:t>
+      </w:r>
+      <w:proofErr w:type="spellEnd"/>
+      <w:r>
+        <w:t xml:space="preserve"> and </w:t>
+      </w:r>
+      <w:proofErr w:type="spellStart"/>
+      <w:r>
+        <w:t>ChatDev</w:t>
+      </w:r>
+      <w:proofErr w:type="spellEnd"/>
+      <w:r>
+        <w:t xml:space="preserve"> organise model instances into roles, for the coordination and parallelisation of tasks, resembling a deployed software engineering team. It is this similarity, which has in part prompted an investigation into the optimal structure of an agentic software team, which shall be evaluated as part of the overall methodology assessment.</w:t>
+      </w:r>
+      <w:r>
+        <w:t xml:space="preserve"> The technical feasibility of agentic employment for the development of software, against stated requirements has been demonstrated to a high level, it is still however a requirement, for the quantifiable performance of these systems in the development of software to a DAL B standard.</w:t>
+      </w:r>
     </w:p>
     <w:p>
       <w:pPr>
@@ -3637,6 +3725,65 @@
     </w:p>
     <w:p>
       <w:pPr>
+        <w:jc w:val="both"/>
+      </w:pPr>
+      <w:r>
+        <w:t xml:space="preserve">Orchestration </w:t>
+      </w:r>
+      <w:r>
+        <w:t>frameworks each operate with unique characteristics and capabilities. Multi-role, singular agent deployment has yielded promising results, evidenced by ‘Agentless’, where localised, repair and validation loops achieve strong results, without the specialisation or deployment of multiple agents. It is therefore prudent to understand the token cache size, which each agent can utilise, when attempting to solve a problem, according to the corpus of project information such as plans and standards documentation. Each additional agent eats into VRAM and memory limitations, where localised deployment is prioritised due to classification or access limitations, a single agent deployment may be desired. This provides a need for the Agentic FEL to demonstrate significant time and cost reductions through efficient and optimised parallelisation of tasks, such that related system components can be reviewed and evaluated together, to minimise human delays.</w:t>
+      </w:r>
+    </w:p>
+    <w:p>
+      <w:pPr>
+        <w:jc w:val="both"/>
+      </w:pPr>
+    </w:p>
+    <w:p>
+      <w:pPr>
+        <w:jc w:val="both"/>
+      </w:pPr>
+      <w:r>
+        <w:t>Agentic integration with SCADE has been demonstrated and is indeed available as a capability with SCADE Suite. ANSYS, or SYNOPSYS have also provided an interface through the SCADE API, which shall be utilised in these methodology evaluations</w:t>
+      </w:r>
+      <w:r>
+        <w:t xml:space="preserve">, </w:t>
+      </w:r>
+      <w:proofErr w:type="gramStart"/>
+      <w:r>
+        <w:t>so as to</w:t>
+      </w:r>
+      <w:proofErr w:type="gramEnd"/>
+      <w:r>
+        <w:t xml:space="preserve"> permit easier integration into a CI/CD pipeline. Due to the use of additional toolsets, the security boundary of agentic interaction extends, it is therefore prudent to isolate such a model to within the confinement of a virtual machine. This allocated aligns with the expected initiation of agentic action, as the fulfilment of a prior action, would trigger agentic execution of the next sequentially blocked item, such a virtual machine would then be created, to permit the execution of the task in a safe environment. NIST defines data governance restrictions which shall be followed in any further deployment of this framework [13].</w:t>
+      </w:r>
+      <w:r>
+        <w:t xml:space="preserve"> </w:t>
+      </w:r>
+      <w:r>
+        <w:t>SP 800-218A applies secure</w:t>
+      </w:r>
+      <w:r>
+        <w:t xml:space="preserve"> </w:t>
+      </w:r>
+      <w:r>
+        <w:t xml:space="preserve">development practices to generative AI and model-dependent systems </w:t>
+      </w:r>
+      <w:r>
+        <w:t>[14].</w:t>
+      </w:r>
+      <w:r>
+        <w:t xml:space="preserve"> Relevant controls </w:t>
+      </w:r>
+      <w:r>
+        <w:t xml:space="preserve">are </w:t>
+      </w:r>
+      <w:r>
+        <w:t>included in the Agentic FEL methodology discussion.</w:t>
+      </w:r>
+    </w:p>
+    <w:p>
+      <w:pPr>
         <w:rPr>
           <w:b/>
           <w:bCs/>
@@ -3655,8 +3802,160 @@
           <w:b/>
           <w:bCs/>
         </w:rPr>
+        <w:br w:type="page"/>
+      </w:r>
+    </w:p>
+    <w:p>
+      <w:pPr>
+        <w:rPr>
+          <w:b/>
+          <w:bCs/>
+        </w:rPr>
+      </w:pPr>
+      <w:r>
+        <w:rPr>
+          <w:b/>
+          <w:bCs/>
+        </w:rPr>
+        <w:lastRenderedPageBreak/>
         <w:t>Regulatory Position</w:t>
       </w:r>
+    </w:p>
+    <w:p>
+      <w:pPr>
+        <w:rPr>
+          <w:b/>
+          <w:bCs/>
+        </w:rPr>
+      </w:pPr>
+    </w:p>
+    <w:p>
+      <w:pPr>
+        <w:rPr>
+          <w:b/>
+          <w:bCs/>
+        </w:rPr>
+      </w:pPr>
+    </w:p>
+    <w:p>
+      <w:pPr>
+        <w:rPr>
+          <w:b/>
+          <w:bCs/>
+        </w:rPr>
+      </w:pPr>
+    </w:p>
+    <w:p>
+      <w:pPr>
+        <w:rPr>
+          <w:b/>
+          <w:bCs/>
+        </w:rPr>
+      </w:pPr>
+    </w:p>
+    <w:p>
+      <w:pPr>
+        <w:rPr>
+          <w:b/>
+          <w:bCs/>
+        </w:rPr>
+      </w:pPr>
+    </w:p>
+    <w:p>
+      <w:pPr>
+        <w:rPr>
+          <w:b/>
+          <w:bCs/>
+        </w:rPr>
+      </w:pPr>
+    </w:p>
+    <w:p>
+      <w:pPr>
+        <w:rPr>
+          <w:b/>
+          <w:bCs/>
+        </w:rPr>
+      </w:pPr>
+    </w:p>
+    <w:p>
+      <w:pPr>
+        <w:rPr>
+          <w:b/>
+          <w:bCs/>
+        </w:rPr>
+      </w:pPr>
+    </w:p>
+    <w:p>
+      <w:pPr>
+        <w:rPr>
+          <w:b/>
+          <w:bCs/>
+        </w:rPr>
+      </w:pPr>
+    </w:p>
+    <w:p>
+      <w:pPr>
+        <w:rPr>
+          <w:b/>
+          <w:bCs/>
+        </w:rPr>
+      </w:pPr>
+    </w:p>
+    <w:p>
+      <w:pPr>
+        <w:rPr>
+          <w:b/>
+          <w:bCs/>
+        </w:rPr>
+      </w:pPr>
+    </w:p>
+    <w:p>
+      <w:pPr>
+        <w:rPr>
+          <w:b/>
+          <w:bCs/>
+        </w:rPr>
+      </w:pPr>
+    </w:p>
+    <w:p>
+      <w:pPr>
+        <w:rPr>
+          <w:b/>
+          <w:bCs/>
+        </w:rPr>
+      </w:pPr>
+    </w:p>
+    <w:p>
+      <w:pPr>
+        <w:rPr>
+          <w:b/>
+          <w:bCs/>
+        </w:rPr>
+      </w:pPr>
+    </w:p>
+    <w:p>
+      <w:pPr>
+        <w:rPr>
+          <w:b/>
+          <w:bCs/>
+        </w:rPr>
+      </w:pPr>
+    </w:p>
+    <w:p>
+      <w:pPr>
+        <w:rPr>
+          <w:b/>
+          <w:bCs/>
+        </w:rPr>
+      </w:pPr>
+    </w:p>
+    <w:p>
+      <w:pPr>
+        <w:rPr>
+          <w:b/>
+          <w:bCs/>
+        </w:rPr>
+      </w:pPr>
     </w:p>
     <w:p>
       <w:pPr>
@@ -7474,13 +7773,7 @@
                           </w:p>
                           <w:p>
                             <w:r>
-                              <w:t xml:space="preserve">In this process, LLM enablement drives the </w:t>
-                            </w:r>
-                            <w:r>
-                              <w:t>creation of artefacts.</w:t>
-                            </w:r>
-                            <w:r>
-                              <w:t xml:space="preserve"> </w:t>
+                              <w:t xml:space="preserve">In this process, LLM enablement drives the creation of artefacts. </w:t>
                             </w:r>
                           </w:p>
                           <w:p/>
@@ -7526,13 +7819,7 @@
                     </w:p>
                     <w:p>
                       <w:r>
-                        <w:t xml:space="preserve">In this process, LLM enablement drives the </w:t>
-                      </w:r>
-                      <w:r>
-                        <w:t>creation of artefacts.</w:t>
-                      </w:r>
-                      <w:r>
-                        <w:t xml:space="preserve"> </w:t>
+                        <w:t xml:space="preserve">In this process, LLM enablement drives the creation of artefacts. </w:t>
                       </w:r>
                     </w:p>
                     <w:p/>
@@ -11142,13 +11429,15 @@
         <w:jc w:val="both"/>
       </w:pPr>
       <w:r>
-        <w:t>Large Language models, when hosted on premises and load balanced to permit parallel user access, are limited in their capacity, according to hardware limitations such as memory capacity and throughput. According to this limitation, businesses may limit both the size of the model, or the floating point accuracy provided to the model weights and bias node values to improve the cost/value model, therefore frontier model utilisation will be considered as a secondary control</w:t>
-      </w:r>
-      <w:r>
-        <w:t xml:space="preserve"> when estimating the efficacy of local deployment</w:t>
-      </w:r>
-      <w:r>
-        <w:t>.</w:t>
+        <w:t xml:space="preserve">Large Language models, when hosted on premises and load balanced to permit parallel user access, are limited in their capacity, according to hardware limitations such as memory capacity and throughput. According to this limitation, businesses may limit both the size of the model, or the </w:t>
+      </w:r>
+      <w:proofErr w:type="gramStart"/>
+      <w:r>
+        <w:t>floating point</w:t>
+      </w:r>
+      <w:proofErr w:type="gramEnd"/>
+      <w:r>
+        <w:t xml:space="preserve"> accuracy provided to the model weights and bias node values to improve the cost/value model, therefore frontier model utilisation will be considered as a secondary control when estimating the efficacy of local deployment.</w:t>
       </w:r>
     </w:p>
     <w:p/>
@@ -12632,9 +12921,11 @@
                             <w:r>
                               <w:t xml:space="preserve">A confidence and </w:t>
                             </w:r>
+                            <w:proofErr w:type="gramStart"/>
                             <w:r>
                               <w:t>requirements based</w:t>
                             </w:r>
+                            <w:proofErr w:type="gramEnd"/>
                             <w:r>
                               <w:t xml:space="preserve"> analysis is performed</w:t>
                             </w:r>
@@ -12700,9 +12991,11 @@
                       <w:r>
                         <w:t xml:space="preserve">A confidence and </w:t>
                       </w:r>
+                      <w:proofErr w:type="gramStart"/>
                       <w:r>
                         <w:t>requirements based</w:t>
                       </w:r>
+                      <w:proofErr w:type="gramEnd"/>
                       <w:r>
                         <w:t xml:space="preserve"> analysis is performed</w:t>
                       </w:r>
@@ -14841,7 +15134,15 @@
         <w:t>The next step in this analysis, involves the production of a controlled benchmark system using manual programming techniques.</w:t>
       </w:r>
       <w:r>
-        <w:t xml:space="preserve"> The chosen benchmark is a Command and Control system for an automatic drone, developed in SCADE Suite and Display, with 4 representative data panels. </w:t>
+        <w:t xml:space="preserve"> The chosen benchmark is a </w:t>
+      </w:r>
+      <w:proofErr w:type="gramStart"/>
+      <w:r>
+        <w:t>Command and Control</w:t>
+      </w:r>
+      <w:proofErr w:type="gramEnd"/>
+      <w:r>
+        <w:t xml:space="preserve"> system for an automatic drone, developed in SCADE Suite and Display, with 4 representative data panels. </w:t>
       </w:r>
       <w:r>
         <w:t xml:space="preserve">An MQTT based communication system shall emulate communication/control of a </w:t>
@@ -14908,13 +15209,29 @@
         <w:t>, included in Table X below.</w:t>
       </w:r>
       <w:r>
-        <w:t xml:space="preserve"> Delays associated with review periods, learning new processes, and rework cycles are only mitigated in part, by the LLM Enabled FEL, but are nearly completely eliminated in the Agentic FEL. Later stages involving hardware integration </w:t>
+        <w:t xml:space="preserve"> Delays associated with review periods, learning new processes, and rework cycles are only mitigated in part, by the LLM Enabled FEL, but are nearly </w:t>
+      </w:r>
+      <w:proofErr w:type="gramStart"/>
+      <w:r>
+        <w:t>completely eliminated</w:t>
+      </w:r>
+      <w:proofErr w:type="gramEnd"/>
+      <w:r>
+        <w:t xml:space="preserve"> in the Agentic FEL. Later stages involving hardware integration </w:t>
       </w:r>
       <w:r>
         <w:t>are only partly accelerated by agentic or LLM enabled approaches, therefore see the least reduction in acceleration.</w:t>
       </w:r>
       <w:r>
-        <w:t xml:space="preserve"> The introduction of a certification evidence management system, aims to achieve the time savings at the QA, Configuration and Evidence Closure stage</w:t>
+        <w:t xml:space="preserve"> </w:t>
+      </w:r>
+      <w:proofErr w:type="gramStart"/>
+      <w:r>
+        <w:t>The introduction of a certification evidence management system,</w:t>
+      </w:r>
+      <w:proofErr w:type="gramEnd"/>
+      <w:r>
+        <w:t xml:space="preserve"> aims to achieve the time savings at the QA, Configuration and Evidence Closure stage</w:t>
       </w:r>
       <w:r>
         <w:t xml:space="preserve"> for both the LLM enabled and agentic approaches.</w:t>
@@ -15054,10 +15371,7 @@
           </w:tcPr>
           <w:p>
             <w:r>
-              <w:t>Week</w:t>
-            </w:r>
-            <w:r>
-              <w:t>s 1-2</w:t>
+              <w:t>Weeks 1-2</w:t>
             </w:r>
           </w:p>
         </w:tc>
@@ -15067,10 +15381,7 @@
           </w:tcPr>
           <w:p>
             <w:r>
-              <w:t>Week</w:t>
-            </w:r>
-            <w:r>
-              <w:t xml:space="preserve"> 1</w:t>
+              <w:t>Week 1</w:t>
             </w:r>
           </w:p>
         </w:tc>
@@ -15092,10 +15403,7 @@
           </w:tcPr>
           <w:p>
             <w:r>
-              <w:t>Weeks</w:t>
-            </w:r>
-            <w:r>
-              <w:t xml:space="preserve"> 4-12</w:t>
+              <w:t>Weeks 4-12</w:t>
             </w:r>
           </w:p>
         </w:tc>
@@ -15124,10 +15432,7 @@
           </w:tcPr>
           <w:p>
             <w:r>
-              <w:t xml:space="preserve">Week </w:t>
-            </w:r>
-            <w:r>
-              <w:t>2</w:t>
+              <w:t>Week 2</w:t>
             </w:r>
           </w:p>
         </w:tc>
@@ -15149,10 +15454,7 @@
           </w:tcPr>
           <w:p>
             <w:r>
-              <w:t>Weeks</w:t>
-            </w:r>
-            <w:r>
-              <w:t xml:space="preserve"> 9-18</w:t>
+              <w:t>Weeks 9-18</w:t>
             </w:r>
           </w:p>
         </w:tc>
@@ -15181,10 +15483,7 @@
           </w:tcPr>
           <w:p>
             <w:r>
-              <w:t xml:space="preserve">Week </w:t>
-            </w:r>
-            <w:r>
-              <w:t>3</w:t>
+              <w:t>Week 3</w:t>
             </w:r>
           </w:p>
         </w:tc>
@@ -15206,10 +15505,7 @@
           </w:tcPr>
           <w:p>
             <w:r>
-              <w:t>Weeks</w:t>
-            </w:r>
-            <w:r>
-              <w:t xml:space="preserve"> 15-25</w:t>
+              <w:t>Weeks 15-25</w:t>
             </w:r>
           </w:p>
         </w:tc>
@@ -15238,16 +15534,7 @@
           </w:tcPr>
           <w:p>
             <w:r>
-              <w:t>Week</w:t>
-            </w:r>
-            <w:r>
-              <w:t>s</w:t>
-            </w:r>
-            <w:r>
-              <w:t xml:space="preserve"> </w:t>
-            </w:r>
-            <w:r>
-              <w:t>4-5</w:t>
+              <w:t>Weeks 4-5</w:t>
             </w:r>
           </w:p>
         </w:tc>
@@ -15269,10 +15556,7 @@
           </w:tcPr>
           <w:p>
             <w:r>
-              <w:t>Weeks</w:t>
-            </w:r>
-            <w:r>
-              <w:t xml:space="preserve"> 17-27</w:t>
+              <w:t>Weeks 17-27</w:t>
             </w:r>
           </w:p>
         </w:tc>
@@ -15301,10 +15585,7 @@
           </w:tcPr>
           <w:p>
             <w:r>
-              <w:t xml:space="preserve">Weeks </w:t>
-            </w:r>
-            <w:r>
-              <w:t>4-5</w:t>
+              <w:t>Weeks 4-5</w:t>
             </w:r>
           </w:p>
         </w:tc>
@@ -15326,10 +15607,7 @@
           </w:tcPr>
           <w:p>
             <w:r>
-              <w:t>Weeks</w:t>
-            </w:r>
-            <w:r>
-              <w:t xml:space="preserve"> 24-35</w:t>
+              <w:t>Weeks 24-35</w:t>
             </w:r>
           </w:p>
         </w:tc>
@@ -15358,10 +15636,7 @@
           </w:tcPr>
           <w:p>
             <w:r>
-              <w:t xml:space="preserve">Weeks </w:t>
-            </w:r>
-            <w:r>
-              <w:t>4-5</w:t>
+              <w:t>Weeks 4-5</w:t>
             </w:r>
           </w:p>
         </w:tc>
@@ -15383,10 +15658,7 @@
           </w:tcPr>
           <w:p>
             <w:r>
-              <w:t>Weeks</w:t>
-            </w:r>
-            <w:r>
-              <w:t xml:space="preserve"> 27-28</w:t>
+              <w:t>Weeks 27-28</w:t>
             </w:r>
           </w:p>
         </w:tc>
@@ -15415,10 +15687,7 @@
           </w:tcPr>
           <w:p>
             <w:r>
-              <w:t>Week</w:t>
-            </w:r>
-            <w:r>
-              <w:t xml:space="preserve"> 6</w:t>
+              <w:t>Week 6</w:t>
             </w:r>
           </w:p>
         </w:tc>
@@ -15440,10 +15709,7 @@
           </w:tcPr>
           <w:p>
             <w:r>
-              <w:t>Weeks</w:t>
-            </w:r>
-            <w:r>
-              <w:t xml:space="preserve"> 27-35</w:t>
+              <w:t>Weeks 27-35</w:t>
             </w:r>
           </w:p>
         </w:tc>
@@ -15472,10 +15738,7 @@
           </w:tcPr>
           <w:p>
             <w:r>
-              <w:t xml:space="preserve">Weeks </w:t>
-            </w:r>
-            <w:r>
-              <w:t>6</w:t>
+              <w:t>Weeks 6</w:t>
             </w:r>
           </w:p>
         </w:tc>
@@ -15503,10 +15766,7 @@
           </w:tcPr>
           <w:p>
             <w:r>
-              <w:t>Weeks</w:t>
-            </w:r>
-            <w:r>
-              <w:t xml:space="preserve"> 28-35</w:t>
+              <w:t>Weeks 28-35</w:t>
             </w:r>
           </w:p>
         </w:tc>
@@ -15535,10 +15795,7 @@
           </w:tcPr>
           <w:p>
             <w:r>
-              <w:t xml:space="preserve">Weeks </w:t>
-            </w:r>
-            <w:r>
-              <w:t>4-6</w:t>
+              <w:t>Weeks 4-6</w:t>
             </w:r>
           </w:p>
         </w:tc>
@@ -15560,10 +15817,7 @@
           </w:tcPr>
           <w:p>
             <w:r>
-              <w:t>Weeks</w:t>
-            </w:r>
-            <w:r>
-              <w:t xml:space="preserve"> 35-40</w:t>
+              <w:t>Weeks 35-40</w:t>
             </w:r>
           </w:p>
         </w:tc>
@@ -15592,10 +15846,7 @@
           </w:tcPr>
           <w:p>
             <w:r>
-              <w:t xml:space="preserve">Week </w:t>
-            </w:r>
-            <w:r>
-              <w:t>7</w:t>
+              <w:t>Week 7</w:t>
             </w:r>
           </w:p>
         </w:tc>
@@ -15620,10 +15871,7 @@
           </w:tcPr>
           <w:p>
             <w:r>
-              <w:t>Weeks</w:t>
-            </w:r>
-            <w:r>
-              <w:t xml:space="preserve"> 37-4</w:t>
+              <w:t>Weeks 37-4</w:t>
             </w:r>
             <w:r>
               <w:t>3</w:t>
@@ -15655,10 +15903,7 @@
           </w:tcPr>
           <w:p>
             <w:r>
-              <w:t xml:space="preserve">Weeks </w:t>
-            </w:r>
-            <w:r>
-              <w:t>7-12</w:t>
+              <w:t>Weeks 7-12</w:t>
             </w:r>
           </w:p>
         </w:tc>
@@ -15680,10 +15925,7 @@
           </w:tcPr>
           <w:p>
             <w:r>
-              <w:t>Weeks</w:t>
-            </w:r>
-            <w:r>
-              <w:t xml:space="preserve"> </w:t>
+              <w:t xml:space="preserve">Weeks </w:t>
             </w:r>
             <w:r>
               <w:t>40</w:t>
@@ -15724,10 +15966,7 @@
               <w:keepNext/>
             </w:pPr>
             <w:r>
-              <w:t xml:space="preserve">Weeks </w:t>
-            </w:r>
-            <w:r>
-              <w:t>12-15</w:t>
+              <w:t>Weeks 12-15</w:t>
             </w:r>
           </w:p>
         </w:tc>
@@ -15779,7 +16018,6 @@
         <w:t>Experiment Design</w:t>
       </w:r>
     </w:p>
-    <w:p/>
     <w:p>
       <w:r>
         <w:t xml:space="preserve">Table </w:t>
@@ -15803,13 +16041,7 @@
         <w:t xml:space="preserve"> C2 system will intentionally contain seeded defects, introduced at the requirement level and based upon real world examples which shall be designed to produce failure modes, in the resulting operation of the system.</w:t>
       </w:r>
       <w:r>
-        <w:t xml:space="preserve"> The results of the ‘</w:t>
-      </w:r>
-      <w:r>
-        <w:t>Failure Analysis</w:t>
-      </w:r>
-      <w:r>
-        <w:t>’ and ‘Security’ analyses will form part of the argument around the applicability of both methodologies, in a safety critical</w:t>
+        <w:t xml:space="preserve"> The results of the ‘Failure Analysis’ and ‘Security’ analyses will form part of the argument around the applicability of both methodologies, in a safety critical</w:t>
       </w:r>
       <w:r>
         <w:t>, classified</w:t>
@@ -15821,13 +16053,7 @@
         <w:t>environment</w:t>
       </w:r>
       <w:r>
-        <w:t>. The ‘</w:t>
-      </w:r>
-      <w:r>
-        <w:t>Timing Benchmark</w:t>
-      </w:r>
-      <w:r>
-        <w:t xml:space="preserve">’ shall establish if real cost savings can be made from the application of the approaches and the </w:t>
+        <w:t xml:space="preserve">. The ‘Timing Benchmark’ shall establish if real cost savings can be made from the application of the approaches and the </w:t>
       </w:r>
       <w:r>
         <w:t>‘Human Factors’ assessment shall evaluate the design philosophy for the display panels, to identify usability considerations.</w:t>
@@ -15945,6 +16171,9 @@
             <w:r>
               <w:t>Measure effect of AI enabled (LLM) and incremental (agentic) approaches against baseline effort.</w:t>
             </w:r>
+            <w:r>
+              <w:t xml:space="preserve"> Agentic approaches shall be tested according to deployed agentic team structure and size.</w:t>
+            </w:r>
           </w:p>
         </w:tc>
       </w:tr>
@@ -16012,7 +16241,7 @@
           </w:tcPr>
           <w:p>
             <w:r>
-              <w:t>Identify baseline performance in traceability error, functionality error, coverage, independent review.</w:t>
+              <w:t>Identify baseline performance in traceability, functionality error, coverage, independent review.</w:t>
             </w:r>
           </w:p>
         </w:tc>
@@ -16028,10 +16257,7 @@
               <w:t>LLM</w:t>
             </w:r>
             <w:r>
-              <w:t xml:space="preserve"> enabled / agentic </w:t>
-            </w:r>
-            <w:r>
-              <w:t>performance in traceability error, functionality error, coverage, independent review.</w:t>
+              <w:t xml:space="preserve"> enabled / agentic performance in traceability error, functionality error, coverage, independent review.</w:t>
             </w:r>
           </w:p>
         </w:tc>
@@ -16264,7 +16490,6 @@
           <w:b/>
           <w:bCs/>
         </w:rPr>
-        <w:lastRenderedPageBreak/>
         <w:t>Failure, Security and Assurance Analysis</w:t>
       </w:r>
     </w:p>
@@ -16275,21 +16500,21 @@
           <w:bCs/>
         </w:rPr>
       </w:pPr>
-    </w:p>
-    <w:p>
-      <w:pPr>
+      <w:r>
         <w:rPr>
           <w:b/>
           <w:bCs/>
         </w:rPr>
-      </w:pPr>
-      <w:r>
+        <w:t>TBD</w:t>
+      </w:r>
+    </w:p>
+    <w:p>
+      <w:pPr>
         <w:rPr>
           <w:b/>
           <w:bCs/>
         </w:rPr>
-        <w:t>Methodology Selection Process</w:t>
-      </w:r>
+      </w:pPr>
     </w:p>
     <w:p>
       <w:pPr>
@@ -16311,7 +16536,7 @@
           <w:b/>
           <w:bCs/>
         </w:rPr>
-        <w:t>Design Reviews and Milestones</w:t>
+        <w:t>Methodology Selection Process</w:t>
       </w:r>
     </w:p>
     <w:p>
@@ -16321,25 +16546,102 @@
           <w:bCs/>
         </w:rPr>
       </w:pPr>
-    </w:p>
-    <w:p>
-      <w:pPr>
+      <w:r>
         <w:rPr>
           <w:b/>
           <w:bCs/>
         </w:rPr>
-      </w:pPr>
-      <w:r>
+        <w:t>TBD</w:t>
+      </w:r>
+    </w:p>
+    <w:p>
+      <w:pPr>
         <w:rPr>
           <w:b/>
           <w:bCs/>
         </w:rPr>
+      </w:pPr>
+    </w:p>
+    <w:p>
+      <w:pPr>
+        <w:rPr>
+          <w:b/>
+          <w:bCs/>
+        </w:rPr>
+      </w:pPr>
+    </w:p>
+    <w:p>
+      <w:pPr>
+        <w:rPr>
+          <w:b/>
+          <w:bCs/>
+        </w:rPr>
+      </w:pPr>
+      <w:r>
+        <w:rPr>
+          <w:b/>
+          <w:bCs/>
+        </w:rPr>
+        <w:t>Design Reviews and Milestones</w:t>
+      </w:r>
+    </w:p>
+    <w:p>
+      <w:pPr>
+        <w:rPr>
+          <w:b/>
+          <w:bCs/>
+        </w:rPr>
+      </w:pPr>
+      <w:r>
+        <w:rPr>
+          <w:b/>
+          <w:bCs/>
+        </w:rPr>
+        <w:t>TBD</w:t>
+      </w:r>
+    </w:p>
+    <w:p>
+      <w:pPr>
+        <w:rPr>
+          <w:b/>
+          <w:bCs/>
+        </w:rPr>
+      </w:pPr>
+    </w:p>
+    <w:p>
+      <w:pPr>
+        <w:rPr>
+          <w:b/>
+          <w:bCs/>
+        </w:rPr>
+      </w:pPr>
+    </w:p>
+    <w:p>
+      <w:pPr>
+        <w:rPr>
+          <w:b/>
+          <w:bCs/>
+        </w:rPr>
+      </w:pPr>
+      <w:r>
+        <w:rPr>
+          <w:b/>
+          <w:bCs/>
+        </w:rPr>
         <w:t>Future Development</w:t>
       </w:r>
     </w:p>
     <w:p>
       <w:r>
-        <w:t xml:space="preserve">Following this investigation, aspects of either process proving to not negatively impact any quality, timeliness and compliance based metric, should be taken forward for introduction into the current FEL. A similar experiment can be completed against </w:t>
+        <w:t xml:space="preserve">Following this investigation, aspects of either process proving to not negatively impact any quality, timeliness and </w:t>
+      </w:r>
+      <w:proofErr w:type="gramStart"/>
+      <w:r>
+        <w:t>compliance based</w:t>
+      </w:r>
+      <w:proofErr w:type="gramEnd"/>
+      <w:r>
+        <w:t xml:space="preserve"> metric, should be taken forward for introduction into the current FEL. A similar experiment can be completed against </w:t>
       </w:r>
     </w:p>
     <w:p/>
@@ -16481,14 +16783,119 @@
     </w:p>
     <w:p>
       <w:pPr>
+        <w:pStyle w:val="ListParagraph"/>
+        <w:numPr>
+          <w:ilvl w:val="0"/>
+          <w:numId w:val="10"/>
+        </w:numPr>
+        <w:spacing w:before="26"/>
+      </w:pPr>
+      <w:r>
+        <w:t>(Peng et al., 2023)</w:t>
+      </w:r>
+    </w:p>
+    <w:p>
+      <w:pPr>
+        <w:pStyle w:val="ListParagraph"/>
+        <w:numPr>
+          <w:ilvl w:val="0"/>
+          <w:numId w:val="10"/>
+        </w:numPr>
+        <w:spacing w:before="26"/>
+      </w:pPr>
+      <w:r>
+        <w:t>(Becker et al., 2025)</w:t>
+      </w:r>
+    </w:p>
+    <w:p>
+      <w:pPr>
+        <w:pStyle w:val="ListParagraph"/>
+        <w:numPr>
+          <w:ilvl w:val="0"/>
+          <w:numId w:val="10"/>
+        </w:numPr>
+        <w:spacing w:before="26"/>
+      </w:pPr>
+      <w:r>
+        <w:t>P</w:t>
+      </w:r>
+      <w:r>
+        <w:t>erry et al. (2023</w:t>
+      </w:r>
+      <w:r>
+        <w:t>)</w:t>
+      </w:r>
+    </w:p>
+    <w:p>
+      <w:pPr>
+        <w:pStyle w:val="ListParagraph"/>
+        <w:numPr>
+          <w:ilvl w:val="0"/>
+          <w:numId w:val="10"/>
+        </w:numPr>
+        <w:spacing w:before="26"/>
+      </w:pPr>
+      <w:r>
+        <w:t>(Graydon and Lehman, 2025)</w:t>
+      </w:r>
+    </w:p>
+    <w:p>
+      <w:pPr>
+        <w:pStyle w:val="ListParagraph"/>
+        <w:numPr>
+          <w:ilvl w:val="0"/>
+          <w:numId w:val="10"/>
+        </w:numPr>
+        <w:spacing w:before="26"/>
+      </w:pPr>
+      <w:hyperlink r:id="rId14" w:history="1">
+        <w:r>
+          <w:rPr>
+            <w:rStyle w:val="Hyperlink"/>
+          </w:rPr>
+          <w:t>https://www.swebench.com/</w:t>
+        </w:r>
+      </w:hyperlink>
+    </w:p>
+    <w:p>
+      <w:pPr>
+        <w:pStyle w:val="ListParagraph"/>
+        <w:numPr>
+          <w:ilvl w:val="0"/>
+          <w:numId w:val="10"/>
+        </w:numPr>
+        <w:spacing w:before="26"/>
+      </w:pPr>
+      <w:r>
+        <w:t>NIST's Generative AI Profile</w:t>
+      </w:r>
+      <w:r>
+        <w:t xml:space="preserve"> 2024</w:t>
+      </w:r>
+    </w:p>
+    <w:p>
+      <w:pPr>
+        <w:pStyle w:val="ListParagraph"/>
+        <w:numPr>
+          <w:ilvl w:val="0"/>
+          <w:numId w:val="10"/>
+        </w:numPr>
+        <w:spacing w:before="26"/>
+      </w:pPr>
+      <w:r>
+        <w:t>NIST 2025</w:t>
+      </w:r>
+    </w:p>
+    <w:p>
+      <w:pPr>
         <w:spacing w:before="26"/>
         <w:ind w:left="720" w:hanging="720"/>
       </w:pPr>
     </w:p>
     <w:sectPr>
-      <w:footerReference w:type="even" r:id="rId14"/>
-      <w:footerReference w:type="default" r:id="rId15"/>
-      <w:footerReference w:type="first" r:id="rId16"/>
+      <w:footerReference w:type="even" r:id="rId15"/>
+      <w:footerReference w:type="default" r:id="rId16"/>
+      <w:footerReference w:type="first" r:id="rId17"/>
       <w:pgSz w:w="11900" w:h="16840"/>
       <w:pgMar w:top="851" w:right="851" w:bottom="851" w:left="851" w:header="850" w:footer="709" w:gutter="0"/>
       <w:cols w:space="708"/>
@@ -19317,6 +19724,81 @@
 </file>
 
 <file path=customXml/item1.xml><?xml version="1.0" encoding="utf-8"?>
+<?mso-contentType ?>
+<FormTemplates xmlns="http://schemas.microsoft.com/sharepoint/v3/contenttype/forms">
+  <Display>DocumentLibraryForm</Display>
+  <Edit>DocumentLibraryForm</Edit>
+  <New>DocumentLibraryForm</New>
+</FormTemplates>
+</file>
+
+<file path=customXml/item2.xml><?xml version="1.0" encoding="utf-8"?>
+<?mso-contentType ?>
+<spe:Receivers xmlns:spe="http://schemas.microsoft.com/sharepoint/events">
+  <Receiver>
+    <Name>Document ID Generator</Name>
+    <Synchronization>Synchronous</Synchronization>
+    <Type>10001</Type>
+    <SequenceNumber>1000</SequenceNumber>
+    <Url/>
+    <Assembly>Microsoft.Office.DocumentManagement, Version=16.0.0.0, Culture=neutral, PublicKeyToken=71e9bce111e9429c</Assembly>
+    <Class>Microsoft.Office.DocumentManagement.Internal.DocIdHandler</Class>
+    <Data/>
+    <Filter/>
+  </Receiver>
+  <Receiver>
+    <Name>Document ID Generator</Name>
+    <Synchronization>Synchronous</Synchronization>
+    <Type>10002</Type>
+    <SequenceNumber>1001</SequenceNumber>
+    <Url/>
+    <Assembly>Microsoft.Office.DocumentManagement, Version=16.0.0.0, Culture=neutral, PublicKeyToken=71e9bce111e9429c</Assembly>
+    <Class>Microsoft.Office.DocumentManagement.Internal.DocIdHandler</Class>
+    <Data/>
+    <Filter/>
+  </Receiver>
+  <Receiver>
+    <Name>Document ID Generator</Name>
+    <Synchronization>Synchronous</Synchronization>
+    <Type>10004</Type>
+    <SequenceNumber>1002</SequenceNumber>
+    <Url/>
+    <Assembly>Microsoft.Office.DocumentManagement, Version=16.0.0.0, Culture=neutral, PublicKeyToken=71e9bce111e9429c</Assembly>
+    <Class>Microsoft.Office.DocumentManagement.Internal.DocIdHandler</Class>
+    <Data/>
+    <Filter/>
+  </Receiver>
+  <Receiver>
+    <Name>Document ID Generator</Name>
+    <Synchronization>Synchronous</Synchronization>
+    <Type>10006</Type>
+    <SequenceNumber>1003</SequenceNumber>
+    <Url/>
+    <Assembly>Microsoft.Office.DocumentManagement, Version=16.0.0.0, Culture=neutral, PublicKeyToken=71e9bce111e9429c</Assembly>
+    <Class>Microsoft.Office.DocumentManagement.Internal.DocIdHandler</Class>
+    <Data/>
+    <Filter/>
+  </Receiver>
+</spe:Receivers>
+</file>
+
+<file path=customXml/item3.xml><?xml version="1.0" encoding="utf-8"?>
+<p:properties xmlns:p="http://schemas.microsoft.com/office/2006/metadata/properties" xmlns:xsi="http://www.w3.org/2001/XMLSchema-instance" xmlns:pc="http://schemas.microsoft.com/office/infopath/2007/PartnerControls">
+  <documentManagement>
+    <TaxCatchAll xmlns="d5759068-2af1-405f-8952-bba64d53795f" xsi:nil="true"/>
+    <lcf76f155ced4ddcb4097134ff3c332f xmlns="fc6929cc-5503-4d88-ab04-1ba5755a3b48">
+      <Terms xmlns="http://schemas.microsoft.com/office/infopath/2007/PartnerControls"/>
+    </lcf76f155ced4ddcb4097134ff3c332f>
+    <_dlc_DocId xmlns="d5759068-2af1-405f-8952-bba64d53795f">TQRXN6XH56H4-652439573-2884814</_dlc_DocId>
+    <_dlc_DocIdUrl xmlns="d5759068-2af1-405f-8952-bba64d53795f">
+      <Url>https://cranfield.sharepoint.com/sites/PGVibData/_layouts/15/DocIdRedir.aspx?ID=TQRXN6XH56H4-652439573-2884814</Url>
+      <Description>TQRXN6XH56H4-652439573-2884814</Description>
+    </_dlc_DocIdUrl>
+  </documentManagement>
+</p:properties>
+</file>
+
+<file path=customXml/item4.xml><?xml version="1.0" encoding="utf-8"?>
 <ct:contentTypeSchema xmlns:ct="http://schemas.microsoft.com/office/2006/metadata/contentType" xmlns:ma="http://schemas.microsoft.com/office/2006/metadata/properties/metaAttributes" ct:_="" ma:_="" ma:contentTypeName="Document" ma:contentTypeID="0x010100EC8CC33C3763BF4EA730E2D192C2DDB9" ma:contentTypeVersion="18" ma:contentTypeDescription="Create a new document." ma:contentTypeScope="" ma:versionID="1d13a82d8fbf311ad2d5c7ffcaf8a280">
   <xsd:schema xmlns:xsd="http://www.w3.org/2001/XMLSchema" xmlns:xs="http://www.w3.org/2001/XMLSchema" xmlns:p="http://schemas.microsoft.com/office/2006/metadata/properties" xmlns:ns2="d5759068-2af1-405f-8952-bba64d53795f" xmlns:ns3="fc6929cc-5503-4d88-ab04-1ba5755a3b48" targetNamespace="http://schemas.microsoft.com/office/2006/metadata/properties" ma:root="true" ma:fieldsID="9beb809c4fb16bb24a029ea3bd9fcc9e" ns2:_="" ns3:_="">
     <xsd:import namespace="d5759068-2af1-405f-8952-bba64d53795f"/>
@@ -19596,86 +20078,38 @@
 </ct:contentTypeSchema>
 </file>
 
-<file path=customXml/item2.xml><?xml version="1.0" encoding="utf-8"?>
-<p:properties xmlns:p="http://schemas.microsoft.com/office/2006/metadata/properties" xmlns:xsi="http://www.w3.org/2001/XMLSchema-instance" xmlns:pc="http://schemas.microsoft.com/office/infopath/2007/PartnerControls">
-  <documentManagement>
-    <TaxCatchAll xmlns="d5759068-2af1-405f-8952-bba64d53795f" xsi:nil="true"/>
-    <lcf76f155ced4ddcb4097134ff3c332f xmlns="fc6929cc-5503-4d88-ab04-1ba5755a3b48">
-      <Terms xmlns="http://schemas.microsoft.com/office/infopath/2007/PartnerControls"/>
-    </lcf76f155ced4ddcb4097134ff3c332f>
-    <_dlc_DocId xmlns="d5759068-2af1-405f-8952-bba64d53795f">TQRXN6XH56H4-652439573-2884814</_dlc_DocId>
-    <_dlc_DocIdUrl xmlns="d5759068-2af1-405f-8952-bba64d53795f">
-      <Url>https://cranfield.sharepoint.com/sites/PGVibData/_layouts/15/DocIdRedir.aspx?ID=TQRXN6XH56H4-652439573-2884814</Url>
-      <Description>TQRXN6XH56H4-652439573-2884814</Description>
-    </_dlc_DocIdUrl>
-  </documentManagement>
-</p:properties>
-</file>
-
-<file path=customXml/item3.xml><?xml version="1.0" encoding="utf-8"?>
-<?mso-contentType ?>
-<spe:Receivers xmlns:spe="http://schemas.microsoft.com/sharepoint/events">
-  <Receiver>
-    <Name>Document ID Generator</Name>
-    <Synchronization>Synchronous</Synchronization>
-    <Type>10001</Type>
-    <SequenceNumber>1000</SequenceNumber>
-    <Url/>
-    <Assembly>Microsoft.Office.DocumentManagement, Version=16.0.0.0, Culture=neutral, PublicKeyToken=71e9bce111e9429c</Assembly>
-    <Class>Microsoft.Office.DocumentManagement.Internal.DocIdHandler</Class>
-    <Data/>
-    <Filter/>
-  </Receiver>
-  <Receiver>
-    <Name>Document ID Generator</Name>
-    <Synchronization>Synchronous</Synchronization>
-    <Type>10002</Type>
-    <SequenceNumber>1001</SequenceNumber>
-    <Url/>
-    <Assembly>Microsoft.Office.DocumentManagement, Version=16.0.0.0, Culture=neutral, PublicKeyToken=71e9bce111e9429c</Assembly>
-    <Class>Microsoft.Office.DocumentManagement.Internal.DocIdHandler</Class>
-    <Data/>
-    <Filter/>
-  </Receiver>
-  <Receiver>
-    <Name>Document ID Generator</Name>
-    <Synchronization>Synchronous</Synchronization>
-    <Type>10004</Type>
-    <SequenceNumber>1002</SequenceNumber>
-    <Url/>
-    <Assembly>Microsoft.Office.DocumentManagement, Version=16.0.0.0, Culture=neutral, PublicKeyToken=71e9bce111e9429c</Assembly>
-    <Class>Microsoft.Office.DocumentManagement.Internal.DocIdHandler</Class>
-    <Data/>
-    <Filter/>
-  </Receiver>
-  <Receiver>
-    <Name>Document ID Generator</Name>
-    <Synchronization>Synchronous</Synchronization>
-    <Type>10006</Type>
-    <SequenceNumber>1003</SequenceNumber>
-    <Url/>
-    <Assembly>Microsoft.Office.DocumentManagement, Version=16.0.0.0, Culture=neutral, PublicKeyToken=71e9bce111e9429c</Assembly>
-    <Class>Microsoft.Office.DocumentManagement.Internal.DocIdHandler</Class>
-    <Data/>
-    <Filter/>
-  </Receiver>
-</spe:Receivers>
-</file>
-
-<file path=customXml/item4.xml><?xml version="1.0" encoding="utf-8"?>
-<?mso-contentType ?>
-<FormTemplates xmlns="http://schemas.microsoft.com/sharepoint/v3/contenttype/forms">
-  <Display>DocumentLibraryForm</Display>
-  <Edit>DocumentLibraryForm</Edit>
-  <New>DocumentLibraryForm</New>
-</FormTemplates>
-</file>
-
 <file path=customXml/item5.xml><?xml version="1.0" encoding="utf-8"?>
 <b:Sources xmlns:b="http://schemas.openxmlformats.org/officeDocument/2006/bibliography" xmlns="http://schemas.openxmlformats.org/officeDocument/2006/bibliography" SelectedStyle="/APASixthEditionOfficeOnline.xsl" StyleName="APA"/>
 </file>
 
 <file path=customXml/itemProps1.xml><?xml version="1.0" encoding="utf-8"?>
+<ds:datastoreItem xmlns:ds="http://schemas.openxmlformats.org/officeDocument/2006/customXml" ds:itemID="{1CA9BEE3-0228-47D5-9957-749897919E7C}">
+  <ds:schemaRefs>
+    <ds:schemaRef ds:uri="http://schemas.microsoft.com/sharepoint/v3/contenttype/forms"/>
+  </ds:schemaRefs>
+</ds:datastoreItem>
+</file>
+
+<file path=customXml/itemProps2.xml><?xml version="1.0" encoding="utf-8"?>
+<ds:datastoreItem xmlns:ds="http://schemas.openxmlformats.org/officeDocument/2006/customXml" ds:itemID="{9BF3BFED-8332-44D7-87FA-AF83EF4A9234}">
+  <ds:schemaRefs>
+    <ds:schemaRef ds:uri="http://schemas.microsoft.com/sharepoint/events"/>
+  </ds:schemaRefs>
+</ds:datastoreItem>
+</file>
+
+<file path=customXml/itemProps3.xml><?xml version="1.0" encoding="utf-8"?>
+<ds:datastoreItem xmlns:ds="http://schemas.openxmlformats.org/officeDocument/2006/customXml" ds:itemID="{FE6286F3-FFA3-49D9-B011-02550189FDEB}">
+  <ds:schemaRefs>
+    <ds:schemaRef ds:uri="http://schemas.microsoft.com/office/2006/metadata/properties"/>
+    <ds:schemaRef ds:uri="http://schemas.microsoft.com/office/infopath/2007/PartnerControls"/>
+    <ds:schemaRef ds:uri="d5759068-2af1-405f-8952-bba64d53795f"/>
+    <ds:schemaRef ds:uri="fc6929cc-5503-4d88-ab04-1ba5755a3b48"/>
+  </ds:schemaRefs>
+</ds:datastoreItem>
+</file>
+
+<file path=customXml/itemProps4.xml><?xml version="1.0" encoding="utf-8"?>
 <ds:datastoreItem xmlns:ds="http://schemas.openxmlformats.org/officeDocument/2006/customXml" ds:itemID="{D5F812A0-A3A2-4EE0-A6ED-E9877F3154D7}">
   <ds:schemaRefs>
     <ds:schemaRef ds:uri="http://schemas.microsoft.com/office/2006/metadata/contentType"/>
@@ -19694,33 +20128,6 @@
 </ds:datastoreItem>
 </file>
 
-<file path=customXml/itemProps2.xml><?xml version="1.0" encoding="utf-8"?>
-<ds:datastoreItem xmlns:ds="http://schemas.openxmlformats.org/officeDocument/2006/customXml" ds:itemID="{FE6286F3-FFA3-49D9-B011-02550189FDEB}">
-  <ds:schemaRefs>
-    <ds:schemaRef ds:uri="http://schemas.microsoft.com/office/2006/metadata/properties"/>
-    <ds:schemaRef ds:uri="http://schemas.microsoft.com/office/infopath/2007/PartnerControls"/>
-    <ds:schemaRef ds:uri="d5759068-2af1-405f-8952-bba64d53795f"/>
-    <ds:schemaRef ds:uri="fc6929cc-5503-4d88-ab04-1ba5755a3b48"/>
-  </ds:schemaRefs>
-</ds:datastoreItem>
-</file>
-
-<file path=customXml/itemProps3.xml><?xml version="1.0" encoding="utf-8"?>
-<ds:datastoreItem xmlns:ds="http://schemas.openxmlformats.org/officeDocument/2006/customXml" ds:itemID="{9BF3BFED-8332-44D7-87FA-AF83EF4A9234}">
-  <ds:schemaRefs>
-    <ds:schemaRef ds:uri="http://schemas.microsoft.com/sharepoint/events"/>
-  </ds:schemaRefs>
-</ds:datastoreItem>
-</file>
-
-<file path=customXml/itemProps4.xml><?xml version="1.0" encoding="utf-8"?>
-<ds:datastoreItem xmlns:ds="http://schemas.openxmlformats.org/officeDocument/2006/customXml" ds:itemID="{1CA9BEE3-0228-47D5-9957-749897919E7C}">
-  <ds:schemaRefs>
-    <ds:schemaRef ds:uri="http://schemas.microsoft.com/sharepoint/v3/contenttype/forms"/>
-  </ds:schemaRefs>
-</ds:datastoreItem>
-</file>
-
 <file path=customXml/itemProps5.xml><?xml version="1.0" encoding="utf-8"?>
 <ds:datastoreItem xmlns:ds="http://schemas.openxmlformats.org/officeDocument/2006/customXml" ds:itemID="{B37BF8BA-60FB-44B9-BFEB-4B8F946969EA}">
   <ds:schemaRefs>

</xml_diff>

<commit_message>
Document restructuring and corrections.,
</commit_message>
<xml_diff>
--- a/Submission/s479832 - AutomatingSafetyCriticalEngineering.docx
+++ b/Submission/s479832 - AutomatingSafetyCriticalEngineering.docx
@@ -7587,6 +7587,9 @@
       </w:r>
     </w:p>
     <w:p>
+      <w:pPr>
+        <w:jc w:val="both"/>
+      </w:pPr>
       <w:r>
         <w:t xml:space="preserve">In this assessment, it is a requirement that CCB measures are applied, to retain meaningful modification to requirement baselines. Associated evidence shall not be produced as part of this study, but any modification to the baseline shall be accompanied by a Software Problem Report (SPR) to raise the issue, and a Software Change Report (SCA) to action any change. </w:t>
       </w:r>
@@ -11508,14 +11511,50 @@
       </w:r>
     </w:p>
     <w:p>
+      <w:pPr>
+        <w:jc w:val="both"/>
+      </w:pPr>
       <w:r>
         <w:t>Th</w:t>
       </w:r>
       <w:r>
-        <w:t>is LLM Enabled FEL, adapted from existing examples of DAL A compatible approaches, is driven by LLM generation, HIL guidance, verification, modelling and review. The review of any associated artefact in a traditional FEL requires SQEP, project context, tool knowledge and intimate knowledge of plans and standards</w:t>
-      </w:r>
-      <w:r>
-        <w:t>. Through the application of LLMs and token sensitive orchestration, this information can be provided through a RAG system, or prompting, immediately removing ‘new starter’ debt, incurred by human parsing delays.</w:t>
+        <w:t xml:space="preserve">is LLM Enabled FEL, adapted from existing examples of DAL A compatible approaches, is driven by LLM generation, HIL guidance, verification, modelling and review. The </w:t>
+      </w:r>
+      <w:r>
+        <w:t>production</w:t>
+      </w:r>
+      <w:r>
+        <w:t xml:space="preserve"> of </w:t>
+      </w:r>
+      <w:r>
+        <w:t xml:space="preserve">traditional FEL </w:t>
+      </w:r>
+      <w:r>
+        <w:t>associated artefact</w:t>
+      </w:r>
+      <w:r>
+        <w:t xml:space="preserve">s </w:t>
+      </w:r>
+      <w:r>
+        <w:t>requires SQEP, project context, tool knowledge and intimate knowledge of plans and standards</w:t>
+      </w:r>
+      <w:r>
+        <w:t xml:space="preserve">. Through token sensitive orchestration, this information can be provided </w:t>
+      </w:r>
+      <w:r>
+        <w:t xml:space="preserve">using </w:t>
+      </w:r>
+      <w:r>
+        <w:t>Retrieval Augmented Generation (RAG)</w:t>
+      </w:r>
+      <w:r>
+        <w:t xml:space="preserve">, or prompting, </w:t>
+      </w:r>
+      <w:r>
+        <w:t>thereby accelerating any data dependent process.</w:t>
+      </w:r>
+      <w:r>
+        <w:t xml:space="preserve"> RAG is the basis by which model responses shall be grounded in fact, where responses will be required to include references to any associated requirement, or stipulation within plans and standards documentation. </w:t>
       </w:r>
     </w:p>
     <w:p>
@@ -11541,9 +11580,24 @@
           <w:b/>
           <w:bCs/>
         </w:rPr>
-        <w:lastRenderedPageBreak/>
         <w:t>Credibility of Approach</w:t>
       </w:r>
+    </w:p>
+    <w:p>
+      <w:r>
+        <w:t>This lifecycle represents the minimum adjustment required to safely integrate this capability into existing processes</w:t>
+      </w:r>
+      <w:r>
+        <w:t>, the allocation of HIL guidance is necessary to efficiently utilise interruption, and review to avoid wasting time and tokens.</w:t>
+      </w:r>
+    </w:p>
+    <w:p>
+      <w:pPr>
+        <w:rPr>
+          <w:b/>
+          <w:bCs/>
+        </w:rPr>
+      </w:pPr>
     </w:p>
     <w:p>
       <w:pPr>
@@ -11627,6 +11681,9 @@
       </w:r>
     </w:p>
     <w:p>
+      <w:pPr>
+        <w:jc w:val="both"/>
+      </w:pPr>
       <w:r>
         <w:t>This metho</w:t>
       </w:r>
@@ -11647,6 +11704,9 @@
       </w:r>
     </w:p>
     <w:p>
+      <w:pPr>
+        <w:jc w:val="both"/>
+      </w:pPr>
       <w:r>
         <w:t>Quality measures will include establishment of the removal of severity weighted defects, violations of plans and standards, requirement ambiguity, traceability precision and the extent of tool integration</w:t>
       </w:r>
@@ -11655,6 +11715,9 @@
       </w:r>
     </w:p>
     <w:p>
+      <w:pPr>
+        <w:jc w:val="both"/>
+      </w:pPr>
       <w:r>
         <w:t xml:space="preserve">The repeatability or determinism of results shall be established according to a repeat execution of a selection of </w:t>
       </w:r>
@@ -11668,11 +11731,17 @@
       </w:r>
     </w:p>
     <w:p>
+      <w:pPr>
+        <w:jc w:val="both"/>
+      </w:pPr>
       <w:r>
         <w:t>The performance of the RAG capability shall be established separately, to ensure a bottleneck in context awareness is not introduced. The same RAG capability shall be integrated into the agentic orchestration capability, such that no associated tool quality bias is introduced.</w:t>
       </w:r>
     </w:p>
     <w:p>
+      <w:pPr>
+        <w:jc w:val="both"/>
+      </w:pPr>
       <w:r>
         <w:t>Review gates shall be utilised at the delivery of each stage of requirement decomposition, to establish the presence of defects, at those stages.</w:t>
       </w:r>
@@ -11708,7 +11777,11 @@
         <w:t>The LLM supported FEL represents a preferable approach to the preservation of attributability, whilst enabling measurement of the effect of LLM support. No presumption of safety or security benefit</w:t>
       </w:r>
       <w:r>
-        <w:t xml:space="preserve"> can be made without analysis of artefacts against stated requirements. According to the utilisation of human review, steering and accountability, existing review and verification measures are expected to mitigate any potential defect introduced by such enablement. Should this claim not be quantifiably substantiated, or should bottlenecks in this process not be identified, the Agentic FEL </w:t>
+        <w:t xml:space="preserve"> can be made without analysis of artefacts against stated requirements. According to the utilisation of human review, steering and accountability, existing review and verification measures are expected to mitigate any potential defect introduced by such enablement. Should this claim </w:t>
+      </w:r>
+      <w:r>
+        <w:lastRenderedPageBreak/>
+        <w:t xml:space="preserve">not be quantifiably substantiated, or should bottlenecks in this process not be identified, the Agentic FEL </w:t>
       </w:r>
       <w:proofErr w:type="spellStart"/>
       <w:r>
@@ -11756,6 +11829,9 @@
     </w:p>
     <w:p/>
     <w:p>
+      <w:pPr>
+        <w:jc w:val="both"/>
+      </w:pPr>
       <w:r>
         <w:t>According to the benefits, able to be realised from agentic automation of the development pipeline, the need for human in the loop validation and any requirements to steer/reprompt agentic processes, the existing FEL must be modified. A high-level definition of this lifecycle is proposed below.</w:t>
       </w:r>
@@ -15273,8 +15349,6 @@
     <w:p/>
     <w:p/>
     <w:p/>
-    <w:p/>
-    <w:p/>
     <w:p>
       <w:pPr>
         <w:rPr>
@@ -15291,13 +15365,23 @@
       </w:r>
     </w:p>
     <w:p>
-      <w:r>
-        <w:t>Safe parallelisation of tasks is a desired outcome of the traditional FEL, but a variety of factors mean the associated benefits are not realistically achieved.</w:t>
+      <w:pPr>
+        <w:jc w:val="both"/>
+      </w:pPr>
+      <w:r>
+        <w:t xml:space="preserve">Safe parallelisation of tasks is a desired outcome of the traditional FEL, but a variety of factors mean the associated benefits are not </w:t>
+      </w:r>
+      <w:r>
+        <w:t xml:space="preserve">exploited in practise. Here, immediately after a requirements baseline is issued, parallel completion of model implementation, informal tests, simulation verification, and traceability analysis can be commenced. Gated confirmation stages, where human in the loop steering can be utilised if required, serve as incremental controllers for the acceptance of an artefact. Should the requirements of the task not be met according to an independent verifying agent, or human, incremental development shall </w:t>
+      </w:r>
+      <w:r>
+        <w:t>recommence.</w:t>
       </w:r>
     </w:p>
     <w:p/>
     <w:p/>
     <w:p/>
+    <w:p/>
     <w:p>
       <w:pPr>
         <w:rPr>
@@ -15310,13 +15394,95 @@
           <w:b/>
           <w:bCs/>
         </w:rPr>
-        <w:lastRenderedPageBreak/>
         <w:t>Credibility of Approach</w:t>
+      </w:r>
+    </w:p>
+    <w:p>
+      <w:pPr>
+        <w:jc w:val="both"/>
+      </w:pPr>
+      <w:r>
+        <w:t>Under DO-178C, independent verification must be provably utilised in the review of artefacts, accordingly if independence is not provable through model selection, finetuning or prompting, human review must be preserved.</w:t>
+      </w:r>
+    </w:p>
+    <w:p>
+      <w:pPr>
+        <w:jc w:val="both"/>
+      </w:pPr>
+      <w:r>
+        <w:t>The burden of assurance associated with this approach is high, therefore the quality of the plans and standards documentation must be absolute.</w:t>
+      </w:r>
+      <w:r>
+        <w:t xml:space="preserve"> Agentic output must still be treated as tool output, and automated review must be substantiated by human approval, therefore human attributable artefacts must be retained.</w:t>
+      </w:r>
+    </w:p>
+    <w:p>
+      <w:pPr>
+        <w:jc w:val="both"/>
+      </w:pPr>
+    </w:p>
+    <w:p>
+      <w:pPr>
+        <w:jc w:val="both"/>
+      </w:pPr>
+    </w:p>
+    <w:p>
+      <w:pPr>
+        <w:jc w:val="both"/>
+        <w:rPr>
+          <w:b/>
+          <w:bCs/>
+        </w:rPr>
+      </w:pPr>
+      <w:r>
+        <w:rPr>
+          <w:b/>
+          <w:bCs/>
+        </w:rPr>
+        <w:t>Lifecycle Modifications</w:t>
+      </w:r>
+    </w:p>
+    <w:p>
+      <w:pPr>
+        <w:jc w:val="both"/>
+      </w:pPr>
+      <w:r>
+        <w:t>Specialisation allows for the measurement of model specific task performance, according to role, associated metrics therefore must be designed to establish per task quality.</w:t>
+      </w:r>
+      <w:r>
+        <w:t xml:space="preserve"> The orchestration model, responsible for marshalling agent deployment and gauging task success, must permit interruption according to lifecycle review gates, where the review agent shall establish </w:t>
+      </w:r>
+      <w:r>
+        <w:t xml:space="preserve">this </w:t>
+      </w:r>
+      <w:r>
+        <w:t>quality, before accepting, replacing a traditional software review.</w:t>
+      </w:r>
+      <w:r>
+        <w:t xml:space="preserve"> </w:t>
+      </w:r>
+    </w:p>
+    <w:p>
+      <w:pPr>
+        <w:jc w:val="both"/>
+      </w:pPr>
+      <w:r>
+        <w:t xml:space="preserve">The traditional FEL is interrupted, where work must be sequentially handed off, such that stages of collaborative work can </w:t>
+      </w:r>
+      <w:r>
+        <w:t xml:space="preserve">occur. This removes associated hand off delays, </w:t>
+      </w:r>
+      <w:proofErr w:type="gramStart"/>
+      <w:r>
+        <w:t>however</w:t>
+      </w:r>
+      <w:proofErr w:type="gramEnd"/>
+      <w:r>
+        <w:t xml:space="preserve"> introduces the risk of accelerated error, or baselining of an incorrect assumption.</w:t>
       </w:r>
     </w:p>
     <w:p/>
     <w:p/>
-    <w:p/>
     <w:p>
       <w:pPr>
         <w:rPr>
@@ -15329,23 +15495,6 @@
           <w:b/>
           <w:bCs/>
         </w:rPr>
-        <w:t>Lifecycle Modifications</w:t>
-      </w:r>
-    </w:p>
-    <w:p/>
-    <w:p/>
-    <w:p>
-      <w:pPr>
-        <w:rPr>
-          <w:b/>
-          <w:bCs/>
-        </w:rPr>
-      </w:pPr>
-      <w:r>
-        <w:rPr>
-          <w:b/>
-          <w:bCs/>
-        </w:rPr>
         <w:t>Methodology Analysis</w:t>
       </w:r>
     </w:p>
@@ -15354,46 +15503,25 @@
         <w:jc w:val="both"/>
       </w:pPr>
       <w:r>
-        <w:t xml:space="preserve">Measurable characteristics such as authoring time, search time, tool waiting time, review time, generated tokens, prompting cycles and manual debug time shall be </w:t>
-      </w:r>
-      <w:r>
-        <w:t>automatically logged against</w:t>
-      </w:r>
-      <w:r>
-        <w:t xml:space="preserve"> each artefact.</w:t>
+        <w:t>Measurable characteristics such as authoring time, search time, tool waiting time, review time, generated tokens, prompting cycles and manual debug time shall be automatically logged against each artefact.</w:t>
       </w:r>
       <w:r>
         <w:t xml:space="preserve"> </w:t>
       </w:r>
       <w:r>
-        <w:t xml:space="preserve">Quality measures will include establishment of the removal of severity weighted defects, violations of plans and standards, requirement ambiguity, traceability precision and the extent of </w:t>
-      </w:r>
-      <w:r>
-        <w:t>agentic tool integration capability.</w:t>
+        <w:t>Quality measures will include establishment of the removal of severity weighted defects, violations of plans and standards, requirement ambiguity, traceability precision and the extent of agentic tool integration capability.</w:t>
       </w:r>
       <w:r>
         <w:t xml:space="preserve"> </w:t>
       </w:r>
       <w:r>
-        <w:t>The repeatability or determinism of results shall be established according to a</w:t>
-      </w:r>
-      <w:r>
-        <w:t>n automatic,</w:t>
-      </w:r>
-      <w:r>
-        <w:t xml:space="preserve"> repeat execution of a selection of tasks</w:t>
-      </w:r>
-      <w:r>
-        <w:t>, with the potential for the project to be recreated and compared for the quantification of difference.</w:t>
+        <w:t>The repeatability or determinism of results shall be established according to an automatic, repeat execution of a selection of tasks, with the potential for the project to be recreated and compared for the quantification of difference.</w:t>
       </w:r>
       <w:r>
         <w:t xml:space="preserve"> </w:t>
       </w:r>
       <w:r>
-        <w:t>Human r</w:t>
-      </w:r>
-      <w:r>
-        <w:t>eview gates shall be utilised at the delivery of each stage of requirement decomposition, to establish the presence of defects, at those stages.</w:t>
+        <w:t>Human review gates shall be utilised at the delivery of each stage of requirement decomposition, to establish the presence of defects, at those stages.</w:t>
       </w:r>
     </w:p>
     <w:p>
@@ -15597,17 +15725,6 @@
       </w:r>
       <w:r>
         <w:t xml:space="preserve"> </w:t>
-      </w:r>
-      <w:proofErr w:type="gramStart"/>
-      <w:r>
-        <w:t>The introduction of a certification evidence management system,</w:t>
-      </w:r>
-      <w:proofErr w:type="gramEnd"/>
-      <w:r>
-        <w:t xml:space="preserve"> aims to achieve the time savings at the QA, Configuration and Evidence Closure stage</w:t>
-      </w:r>
-      <w:r>
-        <w:t xml:space="preserve"> for both the LLM enabled and agentic approaches.</w:t>
       </w:r>
     </w:p>
     <w:p/>
@@ -16400,6 +16517,9 @@
       </w:r>
     </w:p>
     <w:p>
+      <w:pPr>
+        <w:jc w:val="both"/>
+      </w:pPr>
       <w:r>
         <w:t xml:space="preserve">Table </w:t>
       </w:r>
@@ -16825,6 +16945,9 @@
       </w:r>
     </w:p>
     <w:p>
+      <w:pPr>
+        <w:jc w:val="both"/>
+      </w:pPr>
       <w:r>
         <w:t>The applied system of t</w:t>
       </w:r>
@@ -16833,6 +16956,9 @@
       </w:r>
     </w:p>
     <w:p>
+      <w:pPr>
+        <w:jc w:val="both"/>
+      </w:pPr>
       <w:r>
         <w:t>Failure, Security, Safety and Assurance Considerations</w:t>
       </w:r>
@@ -19174,6 +19300,7 @@
   <w:style w:type="character" w:default="1" w:styleId="DefaultParagraphFont">
     <w:name w:val="Default Paragraph Font"/>
     <w:uiPriority w:val="1"/>
+    <w:semiHidden/>
     <w:unhideWhenUsed/>
   </w:style>
   <w:style w:type="table" w:default="1" w:styleId="TableNormal">
@@ -20145,6 +20272,81 @@
 </file>
 
 <file path=customXml/item1.xml><?xml version="1.0" encoding="utf-8"?>
+<?mso-contentType ?>
+<FormTemplates xmlns="http://schemas.microsoft.com/sharepoint/v3/contenttype/forms">
+  <Display>DocumentLibraryForm</Display>
+  <Edit>DocumentLibraryForm</Edit>
+  <New>DocumentLibraryForm</New>
+</FormTemplates>
+</file>
+
+<file path=customXml/item2.xml><?xml version="1.0" encoding="utf-8"?>
+<?mso-contentType ?>
+<spe:Receivers xmlns:spe="http://schemas.microsoft.com/sharepoint/events">
+  <Receiver>
+    <Name>Document ID Generator</Name>
+    <Synchronization>Synchronous</Synchronization>
+    <Type>10001</Type>
+    <SequenceNumber>1000</SequenceNumber>
+    <Url/>
+    <Assembly>Microsoft.Office.DocumentManagement, Version=16.0.0.0, Culture=neutral, PublicKeyToken=71e9bce111e9429c</Assembly>
+    <Class>Microsoft.Office.DocumentManagement.Internal.DocIdHandler</Class>
+    <Data/>
+    <Filter/>
+  </Receiver>
+  <Receiver>
+    <Name>Document ID Generator</Name>
+    <Synchronization>Synchronous</Synchronization>
+    <Type>10002</Type>
+    <SequenceNumber>1001</SequenceNumber>
+    <Url/>
+    <Assembly>Microsoft.Office.DocumentManagement, Version=16.0.0.0, Culture=neutral, PublicKeyToken=71e9bce111e9429c</Assembly>
+    <Class>Microsoft.Office.DocumentManagement.Internal.DocIdHandler</Class>
+    <Data/>
+    <Filter/>
+  </Receiver>
+  <Receiver>
+    <Name>Document ID Generator</Name>
+    <Synchronization>Synchronous</Synchronization>
+    <Type>10004</Type>
+    <SequenceNumber>1002</SequenceNumber>
+    <Url/>
+    <Assembly>Microsoft.Office.DocumentManagement, Version=16.0.0.0, Culture=neutral, PublicKeyToken=71e9bce111e9429c</Assembly>
+    <Class>Microsoft.Office.DocumentManagement.Internal.DocIdHandler</Class>
+    <Data/>
+    <Filter/>
+  </Receiver>
+  <Receiver>
+    <Name>Document ID Generator</Name>
+    <Synchronization>Synchronous</Synchronization>
+    <Type>10006</Type>
+    <SequenceNumber>1003</SequenceNumber>
+    <Url/>
+    <Assembly>Microsoft.Office.DocumentManagement, Version=16.0.0.0, Culture=neutral, PublicKeyToken=71e9bce111e9429c</Assembly>
+    <Class>Microsoft.Office.DocumentManagement.Internal.DocIdHandler</Class>
+    <Data/>
+    <Filter/>
+  </Receiver>
+</spe:Receivers>
+</file>
+
+<file path=customXml/item3.xml><?xml version="1.0" encoding="utf-8"?>
+<p:properties xmlns:p="http://schemas.microsoft.com/office/2006/metadata/properties" xmlns:xsi="http://www.w3.org/2001/XMLSchema-instance" xmlns:pc="http://schemas.microsoft.com/office/infopath/2007/PartnerControls">
+  <documentManagement>
+    <TaxCatchAll xmlns="d5759068-2af1-405f-8952-bba64d53795f" xsi:nil="true"/>
+    <lcf76f155ced4ddcb4097134ff3c332f xmlns="fc6929cc-5503-4d88-ab04-1ba5755a3b48">
+      <Terms xmlns="http://schemas.microsoft.com/office/infopath/2007/PartnerControls"/>
+    </lcf76f155ced4ddcb4097134ff3c332f>
+    <_dlc_DocId xmlns="d5759068-2af1-405f-8952-bba64d53795f">TQRXN6XH56H4-652439573-2884814</_dlc_DocId>
+    <_dlc_DocIdUrl xmlns="d5759068-2af1-405f-8952-bba64d53795f">
+      <Url>https://cranfield.sharepoint.com/sites/PGVibData/_layouts/15/DocIdRedir.aspx?ID=TQRXN6XH56H4-652439573-2884814</Url>
+      <Description>TQRXN6XH56H4-652439573-2884814</Description>
+    </_dlc_DocIdUrl>
+  </documentManagement>
+</p:properties>
+</file>
+
+<file path=customXml/item4.xml><?xml version="1.0" encoding="utf-8"?>
 <ct:contentTypeSchema xmlns:ct="http://schemas.microsoft.com/office/2006/metadata/contentType" xmlns:ma="http://schemas.microsoft.com/office/2006/metadata/properties/metaAttributes" ct:_="" ma:_="" ma:contentTypeName="Document" ma:contentTypeID="0x010100EC8CC33C3763BF4EA730E2D192C2DDB9" ma:contentTypeVersion="18" ma:contentTypeDescription="Create a new document." ma:contentTypeScope="" ma:versionID="1d13a82d8fbf311ad2d5c7ffcaf8a280">
   <xsd:schema xmlns:xsd="http://www.w3.org/2001/XMLSchema" xmlns:xs="http://www.w3.org/2001/XMLSchema" xmlns:p="http://schemas.microsoft.com/office/2006/metadata/properties" xmlns:ns2="d5759068-2af1-405f-8952-bba64d53795f" xmlns:ns3="fc6929cc-5503-4d88-ab04-1ba5755a3b48" targetNamespace="http://schemas.microsoft.com/office/2006/metadata/properties" ma:root="true" ma:fieldsID="9beb809c4fb16bb24a029ea3bd9fcc9e" ns2:_="" ns3:_="">
     <xsd:import namespace="d5759068-2af1-405f-8952-bba64d53795f"/>
@@ -20424,86 +20626,38 @@
 </ct:contentTypeSchema>
 </file>
 
-<file path=customXml/item2.xml><?xml version="1.0" encoding="utf-8"?>
-<p:properties xmlns:p="http://schemas.microsoft.com/office/2006/metadata/properties" xmlns:xsi="http://www.w3.org/2001/XMLSchema-instance" xmlns:pc="http://schemas.microsoft.com/office/infopath/2007/PartnerControls">
-  <documentManagement>
-    <TaxCatchAll xmlns="d5759068-2af1-405f-8952-bba64d53795f" xsi:nil="true"/>
-    <lcf76f155ced4ddcb4097134ff3c332f xmlns="fc6929cc-5503-4d88-ab04-1ba5755a3b48">
-      <Terms xmlns="http://schemas.microsoft.com/office/infopath/2007/PartnerControls"/>
-    </lcf76f155ced4ddcb4097134ff3c332f>
-    <_dlc_DocId xmlns="d5759068-2af1-405f-8952-bba64d53795f">TQRXN6XH56H4-652439573-2884814</_dlc_DocId>
-    <_dlc_DocIdUrl xmlns="d5759068-2af1-405f-8952-bba64d53795f">
-      <Url>https://cranfield.sharepoint.com/sites/PGVibData/_layouts/15/DocIdRedir.aspx?ID=TQRXN6XH56H4-652439573-2884814</Url>
-      <Description>TQRXN6XH56H4-652439573-2884814</Description>
-    </_dlc_DocIdUrl>
-  </documentManagement>
-</p:properties>
-</file>
-
-<file path=customXml/item3.xml><?xml version="1.0" encoding="utf-8"?>
-<?mso-contentType ?>
-<spe:Receivers xmlns:spe="http://schemas.microsoft.com/sharepoint/events">
-  <Receiver>
-    <Name>Document ID Generator</Name>
-    <Synchronization>Synchronous</Synchronization>
-    <Type>10001</Type>
-    <SequenceNumber>1000</SequenceNumber>
-    <Url/>
-    <Assembly>Microsoft.Office.DocumentManagement, Version=16.0.0.0, Culture=neutral, PublicKeyToken=71e9bce111e9429c</Assembly>
-    <Class>Microsoft.Office.DocumentManagement.Internal.DocIdHandler</Class>
-    <Data/>
-    <Filter/>
-  </Receiver>
-  <Receiver>
-    <Name>Document ID Generator</Name>
-    <Synchronization>Synchronous</Synchronization>
-    <Type>10002</Type>
-    <SequenceNumber>1001</SequenceNumber>
-    <Url/>
-    <Assembly>Microsoft.Office.DocumentManagement, Version=16.0.0.0, Culture=neutral, PublicKeyToken=71e9bce111e9429c</Assembly>
-    <Class>Microsoft.Office.DocumentManagement.Internal.DocIdHandler</Class>
-    <Data/>
-    <Filter/>
-  </Receiver>
-  <Receiver>
-    <Name>Document ID Generator</Name>
-    <Synchronization>Synchronous</Synchronization>
-    <Type>10004</Type>
-    <SequenceNumber>1002</SequenceNumber>
-    <Url/>
-    <Assembly>Microsoft.Office.DocumentManagement, Version=16.0.0.0, Culture=neutral, PublicKeyToken=71e9bce111e9429c</Assembly>
-    <Class>Microsoft.Office.DocumentManagement.Internal.DocIdHandler</Class>
-    <Data/>
-    <Filter/>
-  </Receiver>
-  <Receiver>
-    <Name>Document ID Generator</Name>
-    <Synchronization>Synchronous</Synchronization>
-    <Type>10006</Type>
-    <SequenceNumber>1003</SequenceNumber>
-    <Url/>
-    <Assembly>Microsoft.Office.DocumentManagement, Version=16.0.0.0, Culture=neutral, PublicKeyToken=71e9bce111e9429c</Assembly>
-    <Class>Microsoft.Office.DocumentManagement.Internal.DocIdHandler</Class>
-    <Data/>
-    <Filter/>
-  </Receiver>
-</spe:Receivers>
-</file>
-
-<file path=customXml/item4.xml><?xml version="1.0" encoding="utf-8"?>
-<?mso-contentType ?>
-<FormTemplates xmlns="http://schemas.microsoft.com/sharepoint/v3/contenttype/forms">
-  <Display>DocumentLibraryForm</Display>
-  <Edit>DocumentLibraryForm</Edit>
-  <New>DocumentLibraryForm</New>
-</FormTemplates>
-</file>
-
 <file path=customXml/item5.xml><?xml version="1.0" encoding="utf-8"?>
 <b:Sources xmlns:b="http://schemas.openxmlformats.org/officeDocument/2006/bibliography" xmlns="http://schemas.openxmlformats.org/officeDocument/2006/bibliography" SelectedStyle="/APASixthEditionOfficeOnline.xsl" StyleName="APA"/>
 </file>
 
 <file path=customXml/itemProps1.xml><?xml version="1.0" encoding="utf-8"?>
+<ds:datastoreItem xmlns:ds="http://schemas.openxmlformats.org/officeDocument/2006/customXml" ds:itemID="{1CA9BEE3-0228-47D5-9957-749897919E7C}">
+  <ds:schemaRefs>
+    <ds:schemaRef ds:uri="http://schemas.microsoft.com/sharepoint/v3/contenttype/forms"/>
+  </ds:schemaRefs>
+</ds:datastoreItem>
+</file>
+
+<file path=customXml/itemProps2.xml><?xml version="1.0" encoding="utf-8"?>
+<ds:datastoreItem xmlns:ds="http://schemas.openxmlformats.org/officeDocument/2006/customXml" ds:itemID="{9BF3BFED-8332-44D7-87FA-AF83EF4A9234}">
+  <ds:schemaRefs>
+    <ds:schemaRef ds:uri="http://schemas.microsoft.com/sharepoint/events"/>
+  </ds:schemaRefs>
+</ds:datastoreItem>
+</file>
+
+<file path=customXml/itemProps3.xml><?xml version="1.0" encoding="utf-8"?>
+<ds:datastoreItem xmlns:ds="http://schemas.openxmlformats.org/officeDocument/2006/customXml" ds:itemID="{FE6286F3-FFA3-49D9-B011-02550189FDEB}">
+  <ds:schemaRefs>
+    <ds:schemaRef ds:uri="http://schemas.microsoft.com/office/2006/metadata/properties"/>
+    <ds:schemaRef ds:uri="http://schemas.microsoft.com/office/infopath/2007/PartnerControls"/>
+    <ds:schemaRef ds:uri="d5759068-2af1-405f-8952-bba64d53795f"/>
+    <ds:schemaRef ds:uri="fc6929cc-5503-4d88-ab04-1ba5755a3b48"/>
+  </ds:schemaRefs>
+</ds:datastoreItem>
+</file>
+
+<file path=customXml/itemProps4.xml><?xml version="1.0" encoding="utf-8"?>
 <ds:datastoreItem xmlns:ds="http://schemas.openxmlformats.org/officeDocument/2006/customXml" ds:itemID="{D5F812A0-A3A2-4EE0-A6ED-E9877F3154D7}">
   <ds:schemaRefs>
     <ds:schemaRef ds:uri="http://schemas.microsoft.com/office/2006/metadata/contentType"/>
@@ -20522,33 +20676,6 @@
 </ds:datastoreItem>
 </file>
 
-<file path=customXml/itemProps2.xml><?xml version="1.0" encoding="utf-8"?>
-<ds:datastoreItem xmlns:ds="http://schemas.openxmlformats.org/officeDocument/2006/customXml" ds:itemID="{FE6286F3-FFA3-49D9-B011-02550189FDEB}">
-  <ds:schemaRefs>
-    <ds:schemaRef ds:uri="http://schemas.microsoft.com/office/2006/metadata/properties"/>
-    <ds:schemaRef ds:uri="http://schemas.microsoft.com/office/infopath/2007/PartnerControls"/>
-    <ds:schemaRef ds:uri="d5759068-2af1-405f-8952-bba64d53795f"/>
-    <ds:schemaRef ds:uri="fc6929cc-5503-4d88-ab04-1ba5755a3b48"/>
-  </ds:schemaRefs>
-</ds:datastoreItem>
-</file>
-
-<file path=customXml/itemProps3.xml><?xml version="1.0" encoding="utf-8"?>
-<ds:datastoreItem xmlns:ds="http://schemas.openxmlformats.org/officeDocument/2006/customXml" ds:itemID="{9BF3BFED-8332-44D7-87FA-AF83EF4A9234}">
-  <ds:schemaRefs>
-    <ds:schemaRef ds:uri="http://schemas.microsoft.com/sharepoint/events"/>
-  </ds:schemaRefs>
-</ds:datastoreItem>
-</file>
-
-<file path=customXml/itemProps4.xml><?xml version="1.0" encoding="utf-8"?>
-<ds:datastoreItem xmlns:ds="http://schemas.openxmlformats.org/officeDocument/2006/customXml" ds:itemID="{1CA9BEE3-0228-47D5-9957-749897919E7C}">
-  <ds:schemaRefs>
-    <ds:schemaRef ds:uri="http://schemas.microsoft.com/sharepoint/v3/contenttype/forms"/>
-  </ds:schemaRefs>
-</ds:datastoreItem>
-</file>
-
 <file path=customXml/itemProps5.xml><?xml version="1.0" encoding="utf-8"?>
 <ds:datastoreItem xmlns:ds="http://schemas.openxmlformats.org/officeDocument/2006/customXml" ds:itemID="{B37BF8BA-60FB-44B9-BFEB-4B8F946969EA}">
   <ds:schemaRefs>

</xml_diff>

<commit_message>
Ready for submission/final check
</commit_message>
<xml_diff>
--- a/Submission/s479832 - AutomatingSafetyCriticalEngineering.docx
+++ b/Submission/s479832 - AutomatingSafetyCriticalEngineering.docx
@@ -678,12 +678,15 @@
         <w:t xml:space="preserve"> RTCA</w:t>
       </w:r>
       <w:r>
-        <w:t xml:space="preserve"> D0-178C</w:t>
-      </w:r>
-      <w:r>
         <w:t xml:space="preserve"> </w:t>
       </w:r>
       <w:r>
+        <w:t>DO-178C</w:t>
+      </w:r>
+      <w:r>
+        <w:t xml:space="preserve"> </w:t>
+      </w:r>
+      <w:r>
         <w:t xml:space="preserve">[1] </w:t>
       </w:r>
       <w:r>
@@ -702,7 +705,13 @@
         <w:t xml:space="preserve"> in </w:t>
       </w:r>
       <w:r>
-        <w:t>RTCA D0-178C [1]</w:t>
+        <w:t xml:space="preserve">RTCA </w:t>
+      </w:r>
+      <w:r>
+        <w:t>DO-178C</w:t>
+      </w:r>
+      <w:r>
+        <w:t xml:space="preserve"> [1]</w:t>
       </w:r>
       <w:r>
         <w:t xml:space="preserve"> against lifecycle artefacts, and supplementary standards (330, 331, 332..) are met. </w:t>
@@ -717,7 +726,13 @@
         <w:t xml:space="preserve"> defines </w:t>
       </w:r>
       <w:r>
-        <w:t>RTCA D0-178C [1]</w:t>
+        <w:t xml:space="preserve">RTCA </w:t>
+      </w:r>
+      <w:r>
+        <w:t>DO-178C</w:t>
+      </w:r>
+      <w:r>
+        <w:t xml:space="preserve"> [1]</w:t>
       </w:r>
       <w:r>
         <w:t xml:space="preserve"> as an acceptable means of demonstrating compliance for the mitigation of such conditions. Further the FAA Advisory Circular 20-115D</w:t>
@@ -729,7 +744,13 @@
         <w:t xml:space="preserve"> substantiates </w:t>
       </w:r>
       <w:r>
-        <w:t>RTCA D0-178C [1]</w:t>
+        <w:t xml:space="preserve">RTCA </w:t>
+      </w:r>
+      <w:r>
+        <w:t>DO-178C</w:t>
+      </w:r>
+      <w:r>
+        <w:t xml:space="preserve"> [1]</w:t>
       </w:r>
       <w:r>
         <w:t xml:space="preserve"> suitability as a means of compliance, reiterating the responsibility of the integrator, in the satisfaction of applicable objectives.</w:t>
@@ -974,7 +995,10 @@
         <w:jc w:val="both"/>
       </w:pPr>
       <w:r>
-        <w:t>Mandrollic process automation is therefore supported by the characteristics of the supportive standard, the work is structured, requirements driven and evidence rich in nature, relying upon deterministic toolsets to maintain a standardised approach to the delivery of artefacts.</w:t>
+        <w:t>Manual</w:t>
+      </w:r>
+      <w:r>
+        <w:t xml:space="preserve"> process automation is therefore supported by the characteristics of the supportive standard, the work is structured, requirements driven and evidence rich in nature, relying upon deterministic toolsets to maintain a standardised approach to the delivery of artefacts.</w:t>
       </w:r>
       <w:r>
         <w:t xml:space="preserve"> Large Language Models (LLMs) can ingest natural language, code and prompted context, while Retrieval Augmented Generation (RAG) can instead route responses through the projects corpus of information, rather than relying upon model parameters alone [6]. </w:t>
@@ -1140,29 +1164,98 @@
         <w:t xml:space="preserve"> [7], whilst concerned with deployed AI, relies upon concepts such as operational domains/design domains, human factors, governance and safety cases, which is also applicable to the enablement piece. </w:t>
       </w:r>
       <w:r>
-        <w:t xml:space="preserve">EASA and MOD guidance provides useful governance and as such, their recommendations shall be adhered to where applicable, but DO-178C, DO-330 and DO-331 remain as the basis for assurance through </w:t>
-      </w:r>
-      <w:r>
-        <w:t>Defence Standard 00-055 Part 1</w:t>
-      </w:r>
-      <w:r>
-        <w:t>[2].</w:t>
-      </w:r>
-    </w:p>
-    <w:p>
-      <w:pPr>
-        <w:jc w:val="both"/>
-      </w:pPr>
-    </w:p>
-    <w:p>
-      <w:pPr>
-        <w:jc w:val="both"/>
-      </w:pPr>
-      <w:r>
-        <w:t xml:space="preserve">According to DO-330 any tool which </w:t>
-      </w:r>
-      <w:r>
-        <w:t>may introduce or fail to identify a defect may require additional qualification, however if all AI associated artefacts are subjected to the formal review, the development aid can be treated as unqualified. The cost and engineering ability required to perform such review, is already considered at the project planning stage, according to any assumed DAL rating [1].</w:t>
+        <w:t>EASA and MOD guidance provides useful governance and as such, their recommendations shall be adhered to where applicable, but DO-178C, DO-330 and DO-331 remain as the basis for assurance through Defence Standard 00-055 Part 1[2].</w:t>
+      </w:r>
+    </w:p>
+    <w:p>
+      <w:pPr>
+        <w:jc w:val="both"/>
+      </w:pPr>
+    </w:p>
+    <w:p>
+      <w:pPr>
+        <w:jc w:val="both"/>
+      </w:pPr>
+      <w:r>
+        <w:t xml:space="preserve">Where </w:t>
+      </w:r>
+      <w:r>
+        <w:t xml:space="preserve">no </w:t>
+      </w:r>
+      <w:r>
+        <w:t xml:space="preserve">certification credit is claimed </w:t>
+      </w:r>
+      <w:r>
+        <w:t>for the development aid</w:t>
+      </w:r>
+      <w:r>
+        <w:t xml:space="preserve"> and where </w:t>
+      </w:r>
+      <w:r>
+        <w:t xml:space="preserve">output </w:t>
+      </w:r>
+      <w:r>
+        <w:t>is</w:t>
+      </w:r>
+      <w:r>
+        <w:t xml:space="preserve"> fully reviewed via an independently controlled review process</w:t>
+      </w:r>
+      <w:r>
+        <w:t>,</w:t>
+      </w:r>
+      <w:r>
+        <w:t xml:space="preserve"> </w:t>
+      </w:r>
+      <w:r>
+        <w:t>tool qualification may not be required.</w:t>
+      </w:r>
+      <w:r>
+        <w:t xml:space="preserve"> </w:t>
+      </w:r>
+      <w:r>
+        <w:t>The cost and engineering ability required to perform such review</w:t>
+      </w:r>
+      <w:r>
+        <w:t>ing</w:t>
+      </w:r>
+      <w:r>
+        <w:t>, is already considered at the project planning stage, according to any assumed DAL rating [1].</w:t>
+      </w:r>
+      <w:r>
+        <w:t xml:space="preserve"> The practicable route towards attaining this requires </w:t>
+      </w:r>
+      <w:r>
+        <w:t>complete integration with proven and qualified toolsets</w:t>
+      </w:r>
+      <w:r>
+        <w:t>.</w:t>
+      </w:r>
+      <w:r>
+        <w:t xml:space="preserve"> LLM produced model code, can be imported into SCADE, from which qualified code is generated, using</w:t>
+      </w:r>
+      <w:r>
+        <w:t xml:space="preserve"> </w:t>
+      </w:r>
+      <w:r>
+        <w:t>SCADE</w:t>
+      </w:r>
+      <w:r>
+        <w:t>’</w:t>
+      </w:r>
+      <w:r>
+        <w:t xml:space="preserve">s </w:t>
+      </w:r>
+      <w:r>
+        <w:t xml:space="preserve">KCG facility </w:t>
+      </w:r>
+      <w:r>
+        <w:t>notwithstanding, the correctness of any generated model must still be verified against requirements</w:t>
+      </w:r>
+      <w:r>
+        <w:t xml:space="preserve"> </w:t>
+      </w:r>
+      <w:r>
+        <w:t>[4].</w:t>
       </w:r>
     </w:p>
     <w:p/>
@@ -1177,8 +1270,19 @@
         <w:t xml:space="preserve">engineering teams is formed according to the needs of a specific project, its associated budget and timeframe. </w:t>
       </w:r>
       <w:r>
-        <w:t xml:space="preserve">It is the intent of this review to maintain such a structure, to retain attribution, for the establishment of assurance. It is recognised human review is most useful when involving Suitably Qualified and Experienced Personal (SQEP), however such reviewers require sufficient context, time and capability to detect an obfuscated defect. </w:t>
-      </w:r>
+        <w:t>It is the intent of this review to maintain such a structure, to retain attribution, for the establishment of assurance. It is recognised human review is most useful when involving Suitably Qualified and Experienced Perso</w:t>
+      </w:r>
+      <w:r>
+        <w:t>nne</w:t>
+      </w:r>
+      <w:r>
+        <w:t xml:space="preserve">l (SQEP), however such reviewers require sufficient context, time and capability to detect an obfuscated defect. </w:t>
+      </w:r>
+    </w:p>
+    <w:p>
+      <w:pPr>
+        <w:jc w:val="both"/>
+      </w:pPr>
     </w:p>
     <w:p>
       <w:pPr>
@@ -1308,7 +1412,13 @@
         <w:t xml:space="preserve"> increase in software complexity, </w:t>
       </w:r>
       <w:r>
-        <w:t>provably permutative approaches to verification, and formal methods of software implementation become infeasible. D0178A defined processes, requiring the correct documentation, review and testing of software, across a structured lifecycle. The standards next releas</w:t>
+        <w:t xml:space="preserve">provably permutative approaches to verification, and formal methods of software implementation become infeasible. </w:t>
+      </w:r>
+      <w:r>
+        <w:t>DO-178A</w:t>
+      </w:r>
+      <w:r>
+        <w:t xml:space="preserve"> defined processes, requiring the correct documentation, review and testing of software, across a structured lifecycle. The standards next releas</w:t>
       </w:r>
       <w:r>
         <w:t>es D0178B and D0178C, shifted to promote compliance to objectives (themselves split according to Design Assurance Levels (DAL), through the collection and demonstration of evidence, defined in plans and standards, which are defined to meet D0178Cs objectives.</w:t>
@@ -1320,7 +1430,13 @@
         <w:jc w:val="both"/>
       </w:pPr>
       <w:r>
-        <w:t xml:space="preserve">The traditional software lifecycle, when exacted in an Agile manner, is driven by the delivery of artefacts, which provide the necessary evidence, to claim compliance, against pertinent plans and standards documentation, implementing the means of compliance for high level standards such as D0-178C. </w:t>
+        <w:t xml:space="preserve">The traditional software lifecycle, when exacted in an Agile manner, is driven by the delivery of artefacts, which provide the necessary evidence, to claim compliance, against pertinent plans and standards documentation, implementing the means of compliance for high level standards such as </w:t>
+      </w:r>
+      <w:r>
+        <w:t>DO-178C</w:t>
+      </w:r>
+      <w:r>
+        <w:t xml:space="preserve">. </w:t>
       </w:r>
     </w:p>
     <w:p>
@@ -1390,11 +1506,6 @@
       <w:r>
         <w:t>, according to an increase in the Design Assurance Level (DAL) associated with the project / domain.</w:t>
       </w:r>
-    </w:p>
-    <w:p>
-      <w:pPr>
-        <w:jc w:val="both"/>
-      </w:pPr>
     </w:p>
     <w:p>
       <w:pPr>
@@ -1490,13 +1601,28 @@
         <w:t>is</w:t>
       </w:r>
       <w:r>
-        <w:t xml:space="preserve"> dependent on the setting and context. As part of a bounded programming task, developers were asked to utilise GitHub Copilot, with 55.8% of these completing the task faster than a control group [9]. Despite this, a randomised study querying </w:t>
+        <w:t xml:space="preserve"> dependent on the setting and context. As part of a bounded programming task, developers were asked to utilise GitHub Copilot, with </w:t>
+      </w:r>
+      <w:r>
+        <w:t>a treatment group completing the task 55.8% faster than a control</w:t>
+      </w:r>
+      <w:r>
+        <w:t xml:space="preserve"> group</w:t>
+      </w:r>
+      <w:r>
+        <w:t xml:space="preserve"> [9]. Despite this, a randomised study querying </w:t>
       </w:r>
       <w:r>
         <w:t>open-source</w:t>
       </w:r>
       <w:r>
-        <w:t xml:space="preserve"> software developers, working with mature, known codebases in 2025 found completion time increased by 19%, conflating with expected increases in productivity, which were higher [10]. These results indicate that AI excels at greenfield programming tasks, whereas additional reasoning and context is required to parse and measurably improve a highly optimised code base, which is an expected outcome. </w:t>
+        <w:t xml:space="preserve"> software developers, working with mature, known codebases in 2025 found completion time increased by 19%, </w:t>
+      </w:r>
+      <w:r>
+        <w:t>contradicting expected</w:t>
+      </w:r>
+      <w:r>
+        <w:t xml:space="preserve"> increases in productivity, which were higher [10]. These results indicate that AI excels at greenfield programming tasks, whereas additional reasoning and context is required to parse and measurably improve a highly optimised code base, which is an expected outcome. </w:t>
       </w:r>
       <w:r>
         <w:t>Indeed,</w:t>
@@ -1525,7 +1651,13 @@
         <w:t>Quality focused studies on LLM enabled development, purport wider potential dangers. Perry et al [11]</w:t>
       </w:r>
       <w:r>
-        <w:t xml:space="preserve"> found participants in a study produced less secure solutions for a given task, whilst exhibiting more confidence in the security and correctness of their implementation. Reasoning ability in models, is not enough to infer the additional context or instruction, where poor prompting or key details are omitted, in a safety critical context. Model knowledge of planning and standards documentation and all pertinent requirements is not enough to confirm usage, orchestration or ‘master-prompting’ must be used to ensure the context window contains the complete extent of information pertinent to any task. NASAs review of LLM usage in assurance case argument composition indicated available studies do not demonstrate general efficacy in the production of complete safety arguments, in comparison with human produced examples, with time and cost savings being compromised by rework cycles [12].</w:t>
+        <w:t xml:space="preserve"> found participants in a study produced less secure solutions for a given task, whilst exhibiting more confidence in the security and correctness of their implementation. Reasoning ability in models, is not enough to infer the additional context or instruction, where poor prompting or key details are omitted, in a safety critical context. Model knowledge of planning and standards documentation and all pertinent requirements is not enough to confirm usage, orchestration or ‘master-prompting’ must be used to ensure the context window contains the complete extent of information pertinent to any task. NASA</w:t>
+      </w:r>
+      <w:r>
+        <w:t>’</w:t>
+      </w:r>
+      <w:r>
+        <w:t>s review of LLM usage in assurance case argument composition indicated available studies do not demonstrate general efficacy in the production of complete safety arguments, in comparison with human produced examples, with time and cost savings being compromised by rework cycles [12].</w:t>
       </w:r>
     </w:p>
     <w:p>
@@ -1621,7 +1753,10 @@
         <w:t xml:space="preserve"> [13]</w:t>
       </w:r>
       <w:r>
-        <w:t xml:space="preserve"> found the best agentic model only resolved 1.96% of 2294 issues, in contrast localisation-repair-validation approaches have achieved a 32% completion rate, against the same benchmark.</w:t>
+        <w:t xml:space="preserve"> found the best agentic model only resolved 1.96% of 2294 issues, in contrast localisation-repair-validation approaches have achieved a 32% completion rate, against the</w:t>
+      </w:r>
+      <w:r>
+        <w:t xml:space="preserve"> comparable ‘SWE-bench Lite’ benchmark.</w:t>
       </w:r>
       <w:r>
         <w:t xml:space="preserve"> </w:t>
@@ -1634,6 +1769,53 @@
       <w:r>
         <w:t>Although this provides a decent comparative measure, no consideration is placed towards adherence to outlined programming standards or towards the introduction of defects, increasing risk during operation.</w:t>
       </w:r>
+      <w:r>
+        <w:t xml:space="preserve"> The</w:t>
+      </w:r>
+      <w:r>
+        <w:t xml:space="preserve"> Agentic FEL </w:t>
+      </w:r>
+      <w:r>
+        <w:t xml:space="preserve">must </w:t>
+      </w:r>
+      <w:r>
+        <w:t xml:space="preserve">be designed </w:t>
+      </w:r>
+      <w:r>
+        <w:t>such that related system components can be reviewed and evaluated together, to minimise human delays</w:t>
+      </w:r>
+      <w:r>
+        <w:t xml:space="preserve">, </w:t>
+      </w:r>
+      <w:r>
+        <w:t>whilst</w:t>
+      </w:r>
+      <w:r>
+        <w:t xml:space="preserve"> identifying and removing defects, </w:t>
+      </w:r>
+      <w:r>
+        <w:t>achievable</w:t>
+      </w:r>
+      <w:r>
+        <w:t xml:space="preserve"> through</w:t>
+      </w:r>
+      <w:r>
+        <w:t xml:space="preserve"> SW/SW</w:t>
+      </w:r>
+      <w:r>
+        <w:t xml:space="preserve"> integration</w:t>
+      </w:r>
+      <w:r>
+        <w:t xml:space="preserve"> and Unit</w:t>
+      </w:r>
+      <w:r>
+        <w:t xml:space="preserve"> testing.</w:t>
+      </w:r>
+    </w:p>
+    <w:p>
+      <w:pPr>
+        <w:jc w:val="both"/>
+      </w:pPr>
     </w:p>
     <w:p>
       <w:pPr>
@@ -1689,7 +1871,7 @@
         <w:t>agents.</w:t>
       </w:r>
       <w:r>
-        <w:t xml:space="preserve"> It is therefore prudent to understand the token cache size, which each agent can utilise, when attempting to solve a problem, according to the corpus of project information such as plans and standards documentation. Each additional agent eats into VRAM and memory limitations, where localised deployment is prioritised due to classification or access limitations, a single agent deployment may be desired. This provides a need for the Agentic FEL to demonstrate significant time and cost reductions through efficient and optimised parallelisation of tasks, such that related system components can be reviewed and evaluated together, to minimise human delays.</w:t>
+        <w:t xml:space="preserve"> It is therefore prudent to understand the token cache size, which each agent can utilise, when attempting to solve a problem, according to the corpus of project information such as plans and standards documentation. </w:t>
       </w:r>
     </w:p>
     <w:p>
@@ -1705,10 +1887,40 @@
         <w:t xml:space="preserve">Prototyping has confirmed the feasibility of LLM integration with SCADE Suite. </w:t>
       </w:r>
       <w:r>
-        <w:t>ANSYS, or SYNOPSYS have also provided an interface through the SCADE API, which shall be utilised in these methodology evaluations</w:t>
-      </w:r>
-      <w:r>
-        <w:t>, so as to permit easier integration into a CI/CD pipeline. Due to the use of additional toolsets, the security boundary of agentic interaction extends, it is therefore prudent to isolate such a model to within the confinement of a virtual machine</w:t>
+        <w:t>A</w:t>
+      </w:r>
+      <w:r>
+        <w:t xml:space="preserve">nsys </w:t>
+      </w:r>
+      <w:r>
+        <w:t>provides</w:t>
+      </w:r>
+      <w:r>
+        <w:t xml:space="preserve"> </w:t>
+      </w:r>
+      <w:r>
+        <w:t xml:space="preserve">the </w:t>
+      </w:r>
+      <w:r>
+        <w:t>SCADE</w:t>
+      </w:r>
+      <w:r>
+        <w:t xml:space="preserve"> Python</w:t>
+      </w:r>
+      <w:r>
+        <w:t xml:space="preserve"> API</w:t>
+      </w:r>
+      <w:r>
+        <w:t>s</w:t>
+      </w:r>
+      <w:r>
+        <w:t xml:space="preserve">, </w:t>
+      </w:r>
+      <w:r>
+        <w:t>by which process automation can be achieved</w:t>
+      </w:r>
+      <w:r>
+        <w:t>. Due to the use of additional toolsets, the security boundary of agentic interaction extends, it is therefore prudent to isolate such a model to within the confinement of a virtual machine</w:t>
       </w:r>
       <w:r>
         <w:t xml:space="preserve"> or sandbox</w:t>
@@ -1831,16 +2043,63 @@
         <w:jc w:val="both"/>
       </w:pPr>
       <w:r>
+        <w:t xml:space="preserve">The proposed </w:t>
+      </w:r>
+      <w:r>
         <w:t>EASA’s AI Concept Paper [7]</w:t>
       </w:r>
       <w:r>
         <w:t xml:space="preserve"> defines an approach to software assurance based upon the satisfactory consideration of concepts such as operational and design domains, learning assurance, explainability, risk mitigation and human factors.</w:t>
       </w:r>
       <w:r>
-        <w:t xml:space="preserve"> The UK Military Aviation Authorities (MAA) Regulatory Notice 2025/04 tends the requirement for sufficient evidence of similar considerations, including defined operational domains, learning related assessments and architectural mitigation of risk</w:t>
-      </w:r>
-      <w:r>
-        <w:t xml:space="preserve"> (deterministic bounding/failsafe operation) [16]. The MOD published JSP-936, requires departmental and defence contractor adherence to governance around attributability, through life risk management and dependability assessments. All 3 of these publications support the utilisation of AI, but recognise the need for additional verification across varying characteristics of operation. The provision of such verification evidence requires modification to the traditional FEL, such that these activities can be costed and accounted for during scheduling. All 3 sources require the production and agreement of a credible means of compliance, within a defined safety case, which safety critical software development already achieves through satisfaction of Def Stan 00-055 [2], and by extension DO-178C.</w:t>
+        <w:t xml:space="preserve"> The UK Military Aviation Authorities (MAA) </w:t>
+      </w:r>
+      <w:r>
+        <w:t>administrative</w:t>
+      </w:r>
+      <w:r>
+        <w:t xml:space="preserve"> </w:t>
+      </w:r>
+      <w:r>
+        <w:t xml:space="preserve">Regulatory Notice 2025/04 </w:t>
+      </w:r>
+      <w:r>
+        <w:t>advises</w:t>
+      </w:r>
+      <w:r>
+        <w:t xml:space="preserve"> similar considerations, including defined operational domains, learning related assessments and architectural mitigation of risk</w:t>
+      </w:r>
+      <w:r>
+        <w:t xml:space="preserve"> (deterministic bounding/failsafe operation) [16]. The MOD published JSP-936, requires departmental and defence contractor adherence to governance around attributability, through life risk management and dependability assessments. All 3 of these publications support the utilisation of AI, but recognise the need for additional verification across varying characteristics of operation. The provision of such verification evidence requires modification to the traditional FEL, such that these activities can be costed and accounted for during scheduling. </w:t>
+      </w:r>
+    </w:p>
+    <w:p>
+      <w:pPr>
+        <w:jc w:val="both"/>
+      </w:pPr>
+      <w:r>
+        <w:t>The applicable</w:t>
+      </w:r>
+      <w:r>
+        <w:t xml:space="preserve"> means of compliance</w:t>
+      </w:r>
+      <w:r>
+        <w:t xml:space="preserve"> must be agreed and allocated</w:t>
+      </w:r>
+      <w:r>
+        <w:t xml:space="preserve"> within a defined safety case</w:t>
+      </w:r>
+      <w:r>
+        <w:t xml:space="preserve"> </w:t>
+      </w:r>
+      <w:r>
+        <w:t>which safety critical software development already achieves through satisfaction of Def Stan 00-055 [2], and by extension DO-178C</w:t>
+      </w:r>
+      <w:r>
+        <w:t xml:space="preserve"> [1]</w:t>
+      </w:r>
+      <w:r>
+        <w:t>.</w:t>
       </w:r>
     </w:p>
     <w:p>
@@ -1864,13 +2123,25 @@
         <w:t xml:space="preserve">Parasuraman and Manzey </w:t>
       </w:r>
       <w:r>
-        <w:t>[18]</w:t>
+        <w:t>[8]</w:t>
       </w:r>
       <w:r>
         <w:t xml:space="preserve"> distinguish commission errors, where an incorrect automation recommendation is followed, from omission errors, where contradictory information is not sought.</w:t>
       </w:r>
       <w:r>
-        <w:t xml:space="preserve"> It is the principle of confirmation bias, and laziness which may prevent an originator from repromting the review of an artefact, if the model initially indicates no errors are present. Such eventualities must be </w:t>
+        <w:t xml:space="preserve"> It is the principle of confirmation bias, and laziness which may prevent an originator from re</w:t>
+      </w:r>
+      <w:r>
+        <w:t>-</w:t>
+      </w:r>
+      <w:r>
+        <w:t>prom</w:t>
+      </w:r>
+      <w:r>
+        <w:t>p</w:t>
+      </w:r>
+      <w:r>
+        <w:t xml:space="preserve">ting the review of an artefact, if the model initially indicates no errors are present. Such eventualities must be </w:t>
       </w:r>
       <w:r>
         <w:t>avoided</w:t>
@@ -2054,7 +2325,13 @@
         <w:t>Two methodologies are selected and reviewed here, against the traditional and state of the art approaches, to the exaction of the full engineering lifecycle (FEL) of a product.</w:t>
       </w:r>
       <w:r>
-        <w:t xml:space="preserve"> According to the scope of this report, RTCA DO-178C shall be selected and applied as the basis for the adaptation of any process, particularly section 11, which defines the software lifecycle data.</w:t>
+        <w:t xml:space="preserve"> According to the scope of this report, RTCA DO-178C</w:t>
+      </w:r>
+      <w:r>
+        <w:t xml:space="preserve"> [1]</w:t>
+      </w:r>
+      <w:r>
+        <w:t xml:space="preserve"> shall be selected and applied as the basis for the adaptation of any process, particularly section 11, which defines the software lifecycle data.</w:t>
       </w:r>
       <w:r>
         <w:t xml:space="preserve"> </w:t>
@@ -2160,13 +2437,31 @@
         <w:jc w:val="both"/>
       </w:pPr>
       <w:r>
-        <w:t xml:space="preserve">To ensure adherence to DO-178C remains viable through the transformation of any traditional process, Section 5 and Section 6 of Figure </w:t>
-      </w:r>
-      <w:r>
-        <w:t>2</w:t>
-      </w:r>
-      <w:r>
-        <w:t xml:space="preserve"> is captured in their entirety within the FEL Figures below. All artefacts required as per the allocated DAL rating, must be preserved.</w:t>
+        <w:t>To ensure adherence to DO-178C</w:t>
+      </w:r>
+      <w:r>
+        <w:t xml:space="preserve"> [1]</w:t>
+      </w:r>
+      <w:r>
+        <w:t xml:space="preserve"> remains viable through the transformation of any traditional process, Section 5 and Section 6 of Figure </w:t>
+      </w:r>
+      <w:r>
+        <w:t>1</w:t>
+      </w:r>
+      <w:r>
+        <w:t xml:space="preserve"> </w:t>
+      </w:r>
+      <w:r>
+        <w:t>are</w:t>
+      </w:r>
+      <w:r>
+        <w:t xml:space="preserve"> captured in their entirety within the FEL </w:t>
+      </w:r>
+      <w:r>
+        <w:t>illustrations</w:t>
+      </w:r>
+      <w:r>
+        <w:t xml:space="preserve"> below. All artefacts required as per the allocated DAL rating, must be preserved.</w:t>
       </w:r>
     </w:p>
     <w:p>
@@ -2182,7 +2477,16 @@
         <w:t>The methodology reviews compare traditional approaches (acting as a control), with the stated methodologies, and with the output from a comparable request submitted to a frontier LLM.</w:t>
       </w:r>
       <w:r>
-        <w:t xml:space="preserve"> The selection of a methodology will be performed according to a lesser inferiority investigation, where compliance to standards, quality, safety, traceability and independence must not be compromised, in any regard.</w:t>
+        <w:t xml:space="preserve"> The selection of a methodology will be performed according to a </w:t>
+      </w:r>
+      <w:r>
+        <w:t>non</w:t>
+      </w:r>
+      <w:r>
+        <w:t>-</w:t>
+      </w:r>
+      <w:r>
+        <w:t>inferiority investigation, where compliance to standards, quality, safety, traceability and independence must not be compromised, in any regard.</w:t>
       </w:r>
       <w:r>
         <w:t xml:space="preserve"> </w:t>
@@ -3844,7 +4148,34 @@
         <w:t>thereby accelerating any data dependent process.</w:t>
       </w:r>
       <w:r>
-        <w:t xml:space="preserve"> RAG is the basis by which model responses shall be grounded in fact, where responses will be required to include references to any associated requirement, or stipulation within plans and standards documentation. </w:t>
+        <w:t xml:space="preserve"> </w:t>
+      </w:r>
+      <w:r>
+        <w:t xml:space="preserve">RAG provides retrieved evidence, against which responses </w:t>
+      </w:r>
+      <w:r>
+        <w:t>ca</w:t>
+      </w:r>
+      <w:r>
+        <w:t>n</w:t>
+      </w:r>
+      <w:r>
+        <w:t xml:space="preserve"> be grounded</w:t>
+      </w:r>
+      <w:r>
+        <w:t xml:space="preserve">, where responses </w:t>
+      </w:r>
+      <w:r>
+        <w:t>must</w:t>
+      </w:r>
+      <w:r>
+        <w:t xml:space="preserve"> include </w:t>
+      </w:r>
+      <w:r>
+        <w:t xml:space="preserve">accurate </w:t>
+      </w:r>
+      <w:r>
+        <w:t xml:space="preserve">reference to any associated requirement, or stipulation within plans and standards documentation. </w:t>
       </w:r>
     </w:p>
     <w:p/>
@@ -3933,6 +4264,11 @@
       <w:pPr>
         <w:jc w:val="both"/>
       </w:pPr>
+    </w:p>
+    <w:p>
+      <w:pPr>
+        <w:jc w:val="both"/>
+      </w:pPr>
       <w:r>
         <w:t xml:space="preserve">The speed with which the production of artefacts is possible may </w:t>
       </w:r>
@@ -3950,6 +4286,11 @@
       <w:pPr>
         <w:jc w:val="both"/>
       </w:pPr>
+    </w:p>
+    <w:p>
+      <w:pPr>
+        <w:jc w:val="both"/>
+      </w:pPr>
       <w:r>
         <w:t xml:space="preserve">IP protection becomes difficult unless the model is severed from the internet, it must retain the entire corpus of knowledge it requires locally, should this be the case, incurring large upfront cost to attain this data, should </w:t>
       </w:r>
@@ -3995,13 +4336,62 @@
         <w:t xml:space="preserve"> </w:t>
       </w:r>
       <w:r>
-        <w:t>Artefact drafting and rapid prototyping will see acceleration in orders of magnitude, but this methodology may improve review effort, if the complexity of output increases, if output is not properly evaluated, or tested. The traditional FEL approaches of attributability can be easily maintained, therefore a standard matrix can be produced. An identifiable hazard here, is the reuse of LLMs as implementors, and reviewers, therefore models (with contexts and individual prompts) themselves must be treated as independent actors, subject to the same</w:t>
-      </w:r>
-      <w:r>
-        <w:t xml:space="preserve"> stipulations around independence proof. The experiment shall prohibit such usage in accordance</w:t>
-      </w:r>
-      <w:r>
-        <w:t xml:space="preserve"> to this fact.</w:t>
+        <w:t xml:space="preserve">Artefact drafting and rapid prototyping </w:t>
+      </w:r>
+      <w:r>
+        <w:t>may</w:t>
+      </w:r>
+      <w:r>
+        <w:t xml:space="preserve"> see acceleration</w:t>
+      </w:r>
+      <w:r>
+        <w:t>,</w:t>
+      </w:r>
+      <w:r>
+        <w:t xml:space="preserve"> whilst</w:t>
+      </w:r>
+      <w:r>
+        <w:t xml:space="preserve"> indirectly increasing</w:t>
+      </w:r>
+      <w:r>
+        <w:t xml:space="preserve"> review effort, if the complexity of output increases, </w:t>
+      </w:r>
+      <w:r>
+        <w:t xml:space="preserve">and </w:t>
+      </w:r>
+      <w:r>
+        <w:t xml:space="preserve">if output is not properly evaluated, or tested. </w:t>
+      </w:r>
+    </w:p>
+    <w:p>
+      <w:pPr>
+        <w:jc w:val="both"/>
+      </w:pPr>
+    </w:p>
+    <w:p>
+      <w:pPr>
+        <w:jc w:val="both"/>
+      </w:pPr>
+      <w:r>
+        <w:t>The traditional FEL approaches of attributability can be easily maintained, therefore a standard matrix can be produced. An identifiable hazard here, is the reuse of LLMs as implementors, and reviewers</w:t>
+      </w:r>
+      <w:r>
+        <w:t>. M</w:t>
+      </w:r>
+      <w:r>
+        <w:t xml:space="preserve">odels </w:t>
+      </w:r>
+      <w:r>
+        <w:t>cannot be differentiated as independent actors and are therefore</w:t>
+      </w:r>
+      <w:r>
+        <w:t xml:space="preserve">, subject to the </w:t>
+      </w:r>
+      <w:r>
+        <w:t>defined</w:t>
+      </w:r>
+      <w:r>
+        <w:t xml:space="preserve"> stipulations around independence proof.</w:t>
       </w:r>
     </w:p>
     <w:p>
@@ -4056,17 +4446,20 @@
       <w:pPr>
         <w:jc w:val="both"/>
       </w:pPr>
+    </w:p>
+    <w:p>
+      <w:pPr>
+        <w:jc w:val="both"/>
+      </w:pPr>
       <w:r>
         <w:t>Quality measures will include establishment of the removal of severity weighted defects, violations of plans and standards, requirement ambiguity, traceability precision and the extent of tool integration</w:t>
       </w:r>
       <w:r>
         <w:t>.</w:t>
       </w:r>
-    </w:p>
-    <w:p>
-      <w:pPr>
-        <w:jc w:val="both"/>
-      </w:pPr>
+      <w:r>
+        <w:t xml:space="preserve"> </w:t>
+      </w:r>
       <w:r>
         <w:t xml:space="preserve">The repeatability or determinism of results shall be established according to a repeat execution of a selection of </w:t>
       </w:r>
@@ -4081,7 +4474,13 @@
       <w:pPr>
         <w:jc w:val="both"/>
       </w:pPr>
-      <w:r>
+    </w:p>
+    <w:p>
+      <w:pPr>
+        <w:jc w:val="both"/>
+      </w:pPr>
+      <w:r>
+        <w:lastRenderedPageBreak/>
         <w:t>The performance of the RAG capability shall be established separately, to ensure a bottleneck in context awareness is not introduced. The same RAG capability shall be integrated into the agentic orchestration capability, such that no associated tool quality bias is introduced.</w:t>
       </w:r>
     </w:p>
@@ -4095,6 +4494,16 @@
     </w:p>
     <w:p>
       <w:pPr>
+        <w:jc w:val="both"/>
+      </w:pPr>
+    </w:p>
+    <w:p>
+      <w:pPr>
+        <w:jc w:val="both"/>
+      </w:pPr>
+    </w:p>
+    <w:p>
+      <w:pPr>
         <w:rPr>
           <w:b/>
           <w:bCs/>
@@ -4105,7 +4514,6 @@
           <w:b/>
           <w:bCs/>
         </w:rPr>
-        <w:lastRenderedPageBreak/>
         <w:t>S</w:t>
       </w:r>
       <w:r>
@@ -4134,7 +4542,10 @@
         <w:t xml:space="preserve"> can be made without analysis of artefacts against stated requirements. According to the utilisation of human review, steering and accountability, existing review and verification measures are expected to mitigate any potential defect introduced by such enablement. Should this claim not be quantifiably substantiated, or should bottlenecks in this process not be identified, the Agentic FEL </w:t>
       </w:r>
       <w:r>
-        <w:t>can not be justified.</w:t>
+        <w:t>cannot</w:t>
+      </w:r>
+      <w:r>
+        <w:t xml:space="preserve"> be justified.</w:t>
       </w:r>
     </w:p>
     <w:p>
@@ -4147,6 +4558,16 @@
           <w:szCs w:val="28"/>
         </w:rPr>
       </w:pPr>
+      <w:r>
+        <w:rPr>
+          <w:rFonts w:eastAsiaTheme="majorEastAsia" w:cstheme="majorBidi"/>
+          <w:b/>
+          <w:color w:val="442B58"/>
+          <w:sz w:val="28"/>
+          <w:szCs w:val="28"/>
+        </w:rPr>
+        <w:br w:type="page"/>
+      </w:r>
     </w:p>
     <w:p>
       <w:pPr>
@@ -4165,6 +4586,7 @@
           <w:sz w:val="24"/>
           <w:szCs w:val="24"/>
         </w:rPr>
+        <w:lastRenderedPageBreak/>
         <w:t>Methodology Review 2: Agentic Team Based FEL</w:t>
       </w:r>
     </w:p>
@@ -4531,130 +4953,7 @@
         <mc:AlternateContent>
           <mc:Choice Requires="wps">
             <w:drawing>
-              <wp:anchor distT="0" distB="0" distL="114300" distR="114300" simplePos="0" relativeHeight="251787264" behindDoc="0" locked="0" layoutInCell="1" allowOverlap="1" wp14:anchorId="3E34CE4A" wp14:editId="0D72A4F0">
-                <wp:simplePos x="0" y="0"/>
-                <wp:positionH relativeFrom="column">
-                  <wp:posOffset>4203065</wp:posOffset>
-                </wp:positionH>
-                <wp:positionV relativeFrom="paragraph">
-                  <wp:posOffset>2748915</wp:posOffset>
-                </wp:positionV>
-                <wp:extent cx="1800225" cy="1038225"/>
-                <wp:effectExtent l="0" t="0" r="28575" b="28575"/>
-                <wp:wrapNone/>
-                <wp:docPr id="1470811628" name="Text Box 32"/>
-                <wp:cNvGraphicFramePr/>
-                <a:graphic xmlns:a="http://schemas.openxmlformats.org/drawingml/2006/main">
-                  <a:graphicData uri="http://schemas.microsoft.com/office/word/2010/wordprocessingShape">
-                    <wps:wsp>
-                      <wps:cNvSpPr txBox="1"/>
-                      <wps:spPr>
-                        <a:xfrm>
-                          <a:off x="0" y="0"/>
-                          <a:ext cx="1800225" cy="1038225"/>
-                        </a:xfrm>
-                        <a:prstGeom prst="rect">
-                          <a:avLst/>
-                        </a:prstGeom>
-                        <a:solidFill>
-                          <a:schemeClr val="lt1"/>
-                        </a:solidFill>
-                        <a:ln w="6350">
-                          <a:solidFill>
-                            <a:prstClr val="black"/>
-                          </a:solidFill>
-                        </a:ln>
-                      </wps:spPr>
-                      <wps:txbx>
-                        <w:txbxContent>
-                          <w:p>
-                            <w:pPr>
-                              <w:rPr>
-                                <w:b/>
-                                <w:bCs/>
-                              </w:rPr>
-                            </w:pPr>
-                            <w:r>
-                              <w:rPr>
-                                <w:b/>
-                                <w:bCs/>
-                              </w:rPr>
-                              <w:t>Review</w:t>
-                            </w:r>
-                          </w:p>
-                          <w:p>
-                            <w:r>
-                              <w:t xml:space="preserve">Formal reviews are </w:t>
-                            </w:r>
-                            <w:r>
-                              <w:t>performed by the agentic team.</w:t>
-                            </w:r>
-                          </w:p>
-                          <w:p/>
-                        </w:txbxContent>
-                      </wps:txbx>
-                      <wps:bodyPr rot="0" spcFirstLastPara="0" vertOverflow="overflow" horzOverflow="overflow" vert="horz" wrap="square" lIns="91440" tIns="45720" rIns="91440" bIns="45720" numCol="1" spcCol="0" rtlCol="0" fromWordArt="0" anchor="t" anchorCtr="0" forceAA="0" compatLnSpc="1">
-                        <a:prstTxWarp prst="textNoShape">
-                          <a:avLst/>
-                        </a:prstTxWarp>
-                        <a:noAutofit/>
-                      </wps:bodyPr>
-                    </wps:wsp>
-                  </a:graphicData>
-                </a:graphic>
-                <wp14:sizeRelH relativeFrom="margin">
-                  <wp14:pctWidth>0</wp14:pctWidth>
-                </wp14:sizeRelH>
-                <wp14:sizeRelV relativeFrom="margin">
-                  <wp14:pctHeight>0</wp14:pctHeight>
-                </wp14:sizeRelV>
-              </wp:anchor>
-            </w:drawing>
-          </mc:Choice>
-          <mc:Fallback>
-            <w:pict>
-              <v:shape w14:anchorId="3E34CE4A" id="_x0000_s1033" type="#_x0000_t202" style="position:absolute;margin-left:330.95pt;margin-top:216.45pt;width:141.75pt;height:81.75pt;z-index:251787264;visibility:visible;mso-wrap-style:square;mso-width-percent:0;mso-height-percent:0;mso-wrap-distance-left:9pt;mso-wrap-distance-top:0;mso-wrap-distance-right:9pt;mso-wrap-distance-bottom:0;mso-position-horizontal:absolute;mso-position-horizontal-relative:text;mso-position-vertical:absolute;mso-position-vertical-relative:text;mso-width-percent:0;mso-height-percent:0;mso-width-relative:margin;mso-height-relative:margin;v-text-anchor:top" o:gfxdata="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" fillcolor="white [3201]" strokeweight=".5pt">
-                <v:textbox>
-                  <w:txbxContent>
-                    <w:p>
-                      <w:pPr>
-                        <w:rPr>
-                          <w:b/>
-                          <w:bCs/>
-                        </w:rPr>
-                      </w:pPr>
-                      <w:r>
-                        <w:rPr>
-                          <w:b/>
-                          <w:bCs/>
-                        </w:rPr>
-                        <w:t>Review</w:t>
-                      </w:r>
-                    </w:p>
-                    <w:p>
-                      <w:r>
-                        <w:t xml:space="preserve">Formal reviews are </w:t>
-                      </w:r>
-                      <w:r>
-                        <w:t>performed by the agentic team.</w:t>
-                      </w:r>
-                    </w:p>
-                    <w:p/>
-                  </w:txbxContent>
-                </v:textbox>
-              </v:shape>
-            </w:pict>
-          </mc:Fallback>
-        </mc:AlternateContent>
-      </w:r>
-      <w:r>
-        <w:rPr>
-          <w:noProof/>
-        </w:rPr>
-        <mc:AlternateContent>
-          <mc:Choice Requires="wps">
-            <w:drawing>
-              <wp:anchor distT="0" distB="0" distL="114300" distR="114300" simplePos="0" relativeHeight="251871232" behindDoc="0" locked="0" layoutInCell="1" allowOverlap="1" wp14:anchorId="31DBF1D8" wp14:editId="0AC5D564">
+              <wp:anchor distT="0" distB="0" distL="114300" distR="114300" simplePos="0" relativeHeight="251871232" behindDoc="0" locked="0" layoutInCell="1" allowOverlap="1" wp14:anchorId="31DBF1D8" wp14:editId="3B729750">
                 <wp:simplePos x="0" y="0"/>
                 <wp:positionH relativeFrom="column">
                   <wp:posOffset>33655</wp:posOffset>
@@ -4737,7 +5036,7 @@
           </mc:Choice>
           <mc:Fallback>
             <w:pict>
-              <v:shape w14:anchorId="31DBF1D8" id="_x0000_s1034" type="#_x0000_t202" style="position:absolute;margin-left:2.65pt;margin-top:355.3pt;width:236.05pt;height:.05pt;z-index:251871232;visibility:visible;mso-wrap-style:square;mso-wrap-distance-left:9pt;mso-wrap-distance-top:0;mso-wrap-distance-right:9pt;mso-wrap-distance-bottom:0;mso-position-horizontal:absolute;mso-position-horizontal-relative:text;mso-position-vertical:absolute;mso-position-vertical-relative:text;v-text-anchor:top" o:gfxdata="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" stroked="f">
+              <v:shape w14:anchorId="31DBF1D8" id="_x0000_s1033" type="#_x0000_t202" style="position:absolute;margin-left:2.65pt;margin-top:355.3pt;width:236.05pt;height:.05pt;z-index:251871232;visibility:visible;mso-wrap-style:square;mso-wrap-distance-left:9pt;mso-wrap-distance-top:0;mso-wrap-distance-right:9pt;mso-wrap-distance-bottom:0;mso-position-horizontal:absolute;mso-position-horizontal-relative:text;mso-position-vertical:absolute;mso-position-vertical-relative:text;v-text-anchor:top" o:gfxdata="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" stroked="f">
                 <v:textbox style="mso-fit-shape-to-text:t" inset="0,0,0,0">
                   <w:txbxContent>
                     <w:p>
@@ -4785,6 +5084,7 @@
         <w:rPr>
           <w:b/>
           <w:bCs/>
+          <w:noProof/>
         </w:rPr>
         <w:drawing>
           <wp:anchor distT="0" distB="0" distL="114300" distR="114300" simplePos="0" relativeHeight="251864064" behindDoc="0" locked="0" layoutInCell="1" allowOverlap="1" wp14:anchorId="10923BA5" wp14:editId="022E36CD">
@@ -5012,6 +5312,121 @@
     <w:p/>
     <w:p/>
     <w:p>
+      <w:r>
+        <w:rPr>
+          <w:noProof/>
+        </w:rPr>
+        <mc:AlternateContent>
+          <mc:Choice Requires="wps">
+            <w:drawing>
+              <wp:anchor distT="0" distB="0" distL="114300" distR="114300" simplePos="0" relativeHeight="251787264" behindDoc="0" locked="0" layoutInCell="1" allowOverlap="1" wp14:anchorId="3E34CE4A" wp14:editId="43BDDCBF">
+                <wp:simplePos x="0" y="0"/>
+                <wp:positionH relativeFrom="column">
+                  <wp:posOffset>4201736</wp:posOffset>
+                </wp:positionH>
+                <wp:positionV relativeFrom="paragraph">
+                  <wp:posOffset>118553</wp:posOffset>
+                </wp:positionV>
+                <wp:extent cx="1800225" cy="1158949"/>
+                <wp:effectExtent l="0" t="0" r="28575" b="22225"/>
+                <wp:wrapNone/>
+                <wp:docPr id="1470811628" name="Text Box 32"/>
+                <wp:cNvGraphicFramePr/>
+                <a:graphic xmlns:a="http://schemas.openxmlformats.org/drawingml/2006/main">
+                  <a:graphicData uri="http://schemas.microsoft.com/office/word/2010/wordprocessingShape">
+                    <wps:wsp>
+                      <wps:cNvSpPr txBox="1"/>
+                      <wps:spPr>
+                        <a:xfrm>
+                          <a:off x="0" y="0"/>
+                          <a:ext cx="1800225" cy="1158949"/>
+                        </a:xfrm>
+                        <a:prstGeom prst="rect">
+                          <a:avLst/>
+                        </a:prstGeom>
+                        <a:solidFill>
+                          <a:schemeClr val="lt1"/>
+                        </a:solidFill>
+                        <a:ln w="6350">
+                          <a:solidFill>
+                            <a:prstClr val="black"/>
+                          </a:solidFill>
+                        </a:ln>
+                      </wps:spPr>
+                      <wps:txbx>
+                        <w:txbxContent>
+                          <w:p>
+                            <w:pPr>
+                              <w:rPr>
+                                <w:b/>
+                                <w:bCs/>
+                              </w:rPr>
+                            </w:pPr>
+                            <w:r>
+                              <w:rPr>
+                                <w:b/>
+                                <w:bCs/>
+                              </w:rPr>
+                              <w:t>Review</w:t>
+                            </w:r>
+                          </w:p>
+                          <w:p>
+                            <w:r>
+                              <w:t>Agentic screening prepares review evidence, formal acceptance provided by independent SQEP.</w:t>
+                            </w:r>
+                          </w:p>
+                        </w:txbxContent>
+                      </wps:txbx>
+                      <wps:bodyPr rot="0" spcFirstLastPara="0" vertOverflow="overflow" horzOverflow="overflow" vert="horz" wrap="square" lIns="91440" tIns="45720" rIns="91440" bIns="45720" numCol="1" spcCol="0" rtlCol="0" fromWordArt="0" anchor="t" anchorCtr="0" forceAA="0" compatLnSpc="1">
+                        <a:prstTxWarp prst="textNoShape">
+                          <a:avLst/>
+                        </a:prstTxWarp>
+                        <a:noAutofit/>
+                      </wps:bodyPr>
+                    </wps:wsp>
+                  </a:graphicData>
+                </a:graphic>
+                <wp14:sizeRelH relativeFrom="margin">
+                  <wp14:pctWidth>0</wp14:pctWidth>
+                </wp14:sizeRelH>
+                <wp14:sizeRelV relativeFrom="margin">
+                  <wp14:pctHeight>0</wp14:pctHeight>
+                </wp14:sizeRelV>
+              </wp:anchor>
+            </w:drawing>
+          </mc:Choice>
+          <mc:Fallback>
+            <w:pict>
+              <v:shape w14:anchorId="3E34CE4A" id="_x0000_s1034" type="#_x0000_t202" style="position:absolute;margin-left:330.85pt;margin-top:9.35pt;width:141.75pt;height:91.25pt;z-index:251787264;visibility:visible;mso-wrap-style:square;mso-width-percent:0;mso-height-percent:0;mso-wrap-distance-left:9pt;mso-wrap-distance-top:0;mso-wrap-distance-right:9pt;mso-wrap-distance-bottom:0;mso-position-horizontal:absolute;mso-position-horizontal-relative:text;mso-position-vertical:absolute;mso-position-vertical-relative:text;mso-width-percent:0;mso-height-percent:0;mso-width-relative:margin;mso-height-relative:margin;v-text-anchor:top" o:gfxdata="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" fillcolor="white [3201]" strokeweight=".5pt">
+                <v:textbox>
+                  <w:txbxContent>
+                    <w:p>
+                      <w:pPr>
+                        <w:rPr>
+                          <w:b/>
+                          <w:bCs/>
+                        </w:rPr>
+                      </w:pPr>
+                      <w:r>
+                        <w:rPr>
+                          <w:b/>
+                          <w:bCs/>
+                        </w:rPr>
+                        <w:t>Review</w:t>
+                      </w:r>
+                    </w:p>
+                    <w:p>
+                      <w:r>
+                        <w:t>Agentic screening prepares review evidence, formal acceptance provided by independent SQEP.</w:t>
+                      </w:r>
+                    </w:p>
+                  </w:txbxContent>
+                </v:textbox>
+              </v:shape>
+            </w:pict>
+          </mc:Fallback>
+        </mc:AlternateContent>
+      </w:r>
       <w:r>
         <w:rPr>
           <w:noProof/>
@@ -5197,7 +5612,6 @@
     <w:p/>
     <w:p/>
     <w:p/>
-    <w:p/>
     <w:p>
       <w:pPr>
         <w:rPr>
@@ -5213,44 +5627,11 @@
           <w:bCs/>
         </w:rPr>
       </w:pPr>
-    </w:p>
-    <w:p>
-      <w:pPr>
+      <w:r>
         <w:rPr>
           <w:b/>
           <w:bCs/>
         </w:rPr>
-      </w:pPr>
-    </w:p>
-    <w:p>
-      <w:pPr>
-        <w:rPr>
-          <w:b/>
-          <w:bCs/>
-        </w:rPr>
-      </w:pPr>
-    </w:p>
-    <w:p>
-      <w:pPr>
-        <w:rPr>
-          <w:b/>
-          <w:bCs/>
-        </w:rPr>
-      </w:pPr>
-    </w:p>
-    <w:p>
-      <w:pPr>
-        <w:rPr>
-          <w:b/>
-          <w:bCs/>
-        </w:rPr>
-      </w:pPr>
-      <w:r>
-        <w:rPr>
-          <w:b/>
-          <w:bCs/>
-        </w:rPr>
-        <w:lastRenderedPageBreak/>
         <w:t>Assumptions and Prerequisites</w:t>
       </w:r>
     </w:p>
@@ -5262,7 +5643,13 @@
         <w:t xml:space="preserve">Safe parallelisation of tasks is a desired outcome of the traditional FEL, but a variety of factors mean the associated benefits are not </w:t>
       </w:r>
       <w:r>
-        <w:t xml:space="preserve">exploited in practise. Here, immediately after a requirements baseline is issued, parallel completion of model implementation, informal tests, simulation verification, and traceability analysis can be commenced. Gated confirmation stages, where human in the loop steering can be utilised if required, serve as incremental controllers for the acceptance of an artefact. Should the requirements of the task not be met according to an independent verifying agent, or human, incremental development shall </w:t>
+        <w:t>exploited in practi</w:t>
+      </w:r>
+      <w:r>
+        <w:t>c</w:t>
+      </w:r>
+      <w:r>
+        <w:t xml:space="preserve">e. Here, immediately after a requirements baseline is issued, parallel completion of model implementation, informal tests, simulation verification, and traceability analysis can be commenced. Gated confirmation stages, where human in the loop steering can be utilised if required, serve as incremental controllers for the acceptance of an artefact. Should the requirements of the task not be met according to an independent verifying agent, or human, incremental development shall </w:t>
       </w:r>
       <w:r>
         <w:t>recommence.</w:t>
@@ -5312,6 +5699,7 @@
         <w:jc w:val="both"/>
       </w:pPr>
       <w:r>
+        <w:lastRenderedPageBreak/>
         <w:t>The burden of assurance associated with this approach is high, therefore the quality of the plans and standards documentation must be absolute.</w:t>
       </w:r>
       <w:r>
@@ -5360,7 +5748,13 @@
         <w:t>model-based</w:t>
       </w:r>
       <w:r>
-        <w:t xml:space="preserve"> verification before agentic implantation. The correctness of the source of truth in this mode is paramount.</w:t>
+        <w:t xml:space="preserve"> verification before agentic </w:t>
+      </w:r>
+      <w:r>
+        <w:t>implementation</w:t>
+      </w:r>
+      <w:r>
+        <w:t>. The correctness of the source of truth in this mode is paramount.</w:t>
       </w:r>
     </w:p>
     <w:p>
@@ -5446,23 +5840,20 @@
         <w:t>baselining of an incorrect assumption.</w:t>
       </w:r>
       <w:r>
+        <w:t xml:space="preserve"> Human review gates shall be utilised at the delivery of each stage of requirement decomposition, to establish the presence of defects, at those stages.</w:t>
+      </w:r>
+    </w:p>
+    <w:p>
+      <w:pPr>
+        <w:jc w:val="both"/>
+      </w:pPr>
+      <w:r>
+        <w:t>Integration of the agentic capability, with all associated toolsets must be achieved, including SCADE itself, Git, Microsoft Office, the operating system and web browsing. External libraries and toolset rich, configurable agentic orchestration frameworks shall be considered for this purpose.</w:t>
+      </w:r>
+      <w:r>
         <w:t xml:space="preserve"> </w:t>
       </w:r>
       <w:r>
-        <w:t>Human review gates shall be utilised at the delivery of each stage of requirement decomposition, to establish the presence of defects, at those stages.</w:t>
-      </w:r>
-    </w:p>
-    <w:p>
-      <w:pPr>
-        <w:jc w:val="both"/>
-      </w:pPr>
-      <w:r>
-        <w:t>Integration of the agentic capability, with all associated toolsets must be achieved, including SCADE itself, Git, Microsoft Office, the operating system and web browsing. External libraries and toolset rich, configurable agentic orchestration frameworks shall be considered for this purpose.</w:t>
-      </w:r>
-      <w:r>
-        <w:t xml:space="preserve"> </w:t>
-      </w:r>
-      <w:r>
         <w:t xml:space="preserve">Automatic measures for the detection of unauthorised baseline modification, untasked delivery, or non SPR/SCA linked change shall be implemented to prevent illegal change. </w:t>
       </w:r>
       <w:r>
@@ -5472,25 +5863,11 @@
         <w:t xml:space="preserve"> until a generalised, or specialised </w:t>
       </w:r>
       <w:r>
-        <w:t>(as desired</w:t>
-      </w:r>
-      <w:r>
-        <w:t>, per the basis of the task</w:t>
-      </w:r>
-      <w:r>
-        <w:t>)</w:t>
-      </w:r>
-      <w:r>
-        <w:t xml:space="preserve"> </w:t>
+        <w:t xml:space="preserve">(as desired, per the basis of the task) </w:t>
       </w:r>
       <w:r>
         <w:t>set of instructions is reached.</w:t>
       </w:r>
-    </w:p>
-    <w:p>
-      <w:pPr>
-        <w:jc w:val="both"/>
-      </w:pPr>
     </w:p>
     <w:p/>
     <w:p/>
@@ -5506,63 +5883,67 @@
           <w:b/>
           <w:bCs/>
         </w:rPr>
+        <w:t>Metrics and Acceptance Criteria</w:t>
+      </w:r>
+    </w:p>
+    <w:p>
+      <w:pPr>
+        <w:jc w:val="both"/>
+      </w:pPr>
+      <w:r>
+        <w:t>Specialisation allows for the measurement of model specific task performance, according to role, associated metrics therefore must be designed to establish per task quality. The orchestration model, responsible for marshalling agent deployment and gauging task success, must permit interruption according to lifecycle review gates, where the review agent shall establish this quality</w:t>
+      </w:r>
+      <w:r>
+        <w:t>. The verifying agent may therefore reject or return an artefact before the human gate is reached, however cannot provide acceptance or approval,</w:t>
+      </w:r>
+      <w:r>
+        <w:t xml:space="preserve"> lifecycle artefact acceptance remains the responsibility of independent SQEP.</w:t>
+      </w:r>
+    </w:p>
+    <w:p>
+      <w:pPr>
+        <w:rPr>
+          <w:b/>
+          <w:bCs/>
+        </w:rPr>
+      </w:pPr>
+    </w:p>
+    <w:p>
+      <w:pPr>
+        <w:jc w:val="both"/>
+      </w:pPr>
+      <w:r>
+        <w:t>Measurable characteristics such as authoring time, search time, tool waiting time, review time, generated tokens, prompting cycles and manual debug time shall be automatically logged against each artefact.</w:t>
+      </w:r>
+      <w:r>
+        <w:t xml:space="preserve"> </w:t>
+      </w:r>
+      <w:r>
+        <w:t>Quality measures will include establishment of the removal of severity weighted defects, violations of plans and standards, requirement ambiguity, traceability precision and the extent of agentic tool integration capability.</w:t>
+      </w:r>
+      <w:r>
+        <w:t xml:space="preserve"> </w:t>
+      </w:r>
+      <w:r>
+        <w:t>The repeatability or determinism of results shall be established according to an automatic, repeat execution of a selection of tasks, with the potential for the project to be recreated and compared for the quantification of difference.</w:t>
+      </w:r>
+      <w:r>
+        <w:t xml:space="preserve"> </w:t>
+      </w:r>
+    </w:p>
+    <w:p>
+      <w:pPr>
+        <w:rPr>
+          <w:b/>
+          <w:bCs/>
+        </w:rPr>
+      </w:pPr>
+      <w:r>
+        <w:rPr>
+          <w:b/>
+          <w:bCs/>
+        </w:rPr>
         <w:lastRenderedPageBreak/>
-        <w:t>Metrics and Acceptance Criteria</w:t>
-      </w:r>
-    </w:p>
-    <w:p>
-      <w:pPr>
-        <w:jc w:val="both"/>
-      </w:pPr>
-      <w:r>
-        <w:t xml:space="preserve">Specialisation allows for the measurement of model specific task performance, according to role, associated metrics therefore must be designed to establish per task quality. The orchestration model, responsible for marshalling agent deployment and gauging task success, must permit interruption according to lifecycle review gates, where the review agent shall establish this quality, before accepting, replacing a traditional software review. </w:t>
-      </w:r>
-    </w:p>
-    <w:p>
-      <w:pPr>
-        <w:rPr>
-          <w:b/>
-          <w:bCs/>
-        </w:rPr>
-      </w:pPr>
-    </w:p>
-    <w:p>
-      <w:pPr>
-        <w:jc w:val="both"/>
-      </w:pPr>
-      <w:r>
-        <w:t>Measurable characteristics such as authoring time, search time, tool waiting time, review time, generated tokens, prompting cycles and manual debug time shall be automatically logged against each artefact.</w:t>
-      </w:r>
-      <w:r>
-        <w:t xml:space="preserve"> </w:t>
-      </w:r>
-      <w:r>
-        <w:t>Quality measures will include establishment of the removal of severity weighted defects, violations of plans and standards, requirement ambiguity, traceability precision and the extent of agentic tool integration capability.</w:t>
-      </w:r>
-      <w:r>
-        <w:t xml:space="preserve"> </w:t>
-      </w:r>
-      <w:r>
-        <w:t>The repeatability or determinism of results shall be established according to an automatic, repeat execution of a selection of tasks, with the potential for the project to be recreated and compared for the quantification of difference.</w:t>
-      </w:r>
-      <w:r>
-        <w:t xml:space="preserve"> </w:t>
-      </w:r>
-    </w:p>
-    <w:p/>
-    <w:p/>
-    <w:p>
-      <w:pPr>
-        <w:rPr>
-          <w:b/>
-          <w:bCs/>
-        </w:rPr>
-      </w:pPr>
-      <w:r>
-        <w:rPr>
-          <w:b/>
-          <w:bCs/>
-        </w:rPr>
         <w:t>Summary</w:t>
       </w:r>
       <w:r>
@@ -5688,13 +6069,16 @@
         <w:t xml:space="preserve"> system </w:t>
       </w:r>
       <w:r>
-        <w:t>and its associated artefacts target a</w:t>
-      </w:r>
-      <w:r>
-        <w:t xml:space="preserve"> DAL B standard, </w:t>
-      </w:r>
-      <w:r>
-        <w:t>with its code and documentation</w:t>
+        <w:t xml:space="preserve">and its associated artefacts </w:t>
+      </w:r>
+      <w:r>
+        <w:t>represent compliance with DAL B objectives</w:t>
+      </w:r>
+      <w:r>
+        <w:t xml:space="preserve">, </w:t>
+      </w:r>
+      <w:r>
+        <w:t>with code and documentation</w:t>
       </w:r>
       <w:r>
         <w:t xml:space="preserve"> stubbed where applicable to permit development in the timeframe allowed. </w:t>
@@ -5716,7 +6100,13 @@
         <w:t>because</w:t>
       </w:r>
       <w:r>
-        <w:t xml:space="preserve"> no domain dependencies exist, all requirements are defined up front and that stubbing of content will be permitted.</w:t>
+        <w:t xml:space="preserve"> </w:t>
+      </w:r>
+      <w:r>
+        <w:t>external dependencies are deliberately bounded or emulated</w:t>
+      </w:r>
+      <w:r>
+        <w:t>, all requirements are defined up front and that stubbing of content will be permitted.</w:t>
       </w:r>
       <w:r>
         <w:t xml:space="preserve"> The introduced delays here are reflective of experience, with comparable SCADE projects, review timeframes, process design timeframes and other</w:t>
@@ -5735,70 +6125,28 @@
         <w:jc w:val="both"/>
       </w:pPr>
       <w:r>
-        <w:drawing>
-          <wp:anchor distT="0" distB="0" distL="114300" distR="114300" simplePos="0" relativeHeight="251872256" behindDoc="0" locked="0" layoutInCell="1" allowOverlap="1" wp14:anchorId="6E212694" wp14:editId="5E1BBD32">
-            <wp:simplePos x="0" y="0"/>
-            <wp:positionH relativeFrom="margin">
-              <wp:posOffset>-1270</wp:posOffset>
-            </wp:positionH>
-            <wp:positionV relativeFrom="paragraph">
-              <wp:posOffset>1161415</wp:posOffset>
-            </wp:positionV>
-            <wp:extent cx="6473190" cy="4678045"/>
-            <wp:effectExtent l="0" t="0" r="3810" b="8255"/>
-            <wp:wrapSquare wrapText="bothSides"/>
-            <wp:docPr id="1682101380" name="Picture 1"/>
-            <wp:cNvGraphicFramePr>
-              <a:graphicFrameLocks xmlns:a="http://schemas.openxmlformats.org/drawingml/2006/main" noChangeAspect="1"/>
-            </wp:cNvGraphicFramePr>
-            <a:graphic xmlns:a="http://schemas.openxmlformats.org/drawingml/2006/main">
-              <a:graphicData uri="http://schemas.openxmlformats.org/drawingml/2006/picture">
-                <pic:pic xmlns:pic="http://schemas.openxmlformats.org/drawingml/2006/picture">
-                  <pic:nvPicPr>
-                    <pic:cNvPr id="1682101380" name=""/>
-                    <pic:cNvPicPr/>
-                  </pic:nvPicPr>
-                  <pic:blipFill>
-                    <a:blip r:embed="rId19">
-                      <a:extLst>
-                        <a:ext uri="{28A0092B-C50C-407E-A947-70E740481C1C}">
-                          <a14:useLocalDpi xmlns:a14="http://schemas.microsoft.com/office/drawing/2010/main" val="0"/>
-                        </a:ext>
-                      </a:extLst>
-                    </a:blip>
-                    <a:stretch>
-                      <a:fillRect/>
-                    </a:stretch>
-                  </pic:blipFill>
-                  <pic:spPr>
-                    <a:xfrm>
-                      <a:off x="0" y="0"/>
-                      <a:ext cx="6473190" cy="4678045"/>
-                    </a:xfrm>
-                    <a:prstGeom prst="rect">
-                      <a:avLst/>
-                    </a:prstGeom>
-                  </pic:spPr>
-                </pic:pic>
-              </a:graphicData>
-            </a:graphic>
-            <wp14:sizeRelH relativeFrom="page">
-              <wp14:pctWidth>0</wp14:pctWidth>
-            </wp14:sizeRelH>
-            <wp14:sizeRelV relativeFrom="page">
-              <wp14:pctHeight>0</wp14:pctHeight>
-            </wp14:sizeRelV>
-          </wp:anchor>
-        </w:drawing>
-      </w:r>
-      <w:r>
         <w:t>Traditional estimating techniques</w:t>
       </w:r>
       <w:r>
-        <w:t>, and the explained factors above were</w:t>
-      </w:r>
-      <w:r>
-        <w:t xml:space="preserve"> employed to design a schedule for the completion of this benchmarked system, the LLM Enabled FEL and the Agentic FEL</w:t>
+        <w:t xml:space="preserve"> and experience </w:t>
+      </w:r>
+      <w:r>
+        <w:t>were</w:t>
+      </w:r>
+      <w:r>
+        <w:t xml:space="preserve"> employed to design a schedule for the </w:t>
+      </w:r>
+      <w:r>
+        <w:t>enaction of the traditional FEL</w:t>
+      </w:r>
+      <w:r>
+        <w:t>, with literature based schedule hypothes</w:t>
+      </w:r>
+      <w:r>
+        <w:t>e</w:t>
+      </w:r>
+      <w:r>
+        <w:t>s formed for the additional FELs</w:t>
       </w:r>
       <w:r>
         <w:t xml:space="preserve">, included in Table </w:t>
@@ -5810,20 +6158,260 @@
         <w:t xml:space="preserve"> below.</w:t>
       </w:r>
       <w:r>
-        <w:t xml:space="preserve"> Delays associated with review periods, learning new processes, and rework cycles are only mitigated in part, </w:t>
-      </w:r>
-      <w:r>
-        <w:t>by either solution, as independent review acceptance must follow</w:t>
-      </w:r>
-      <w:r>
-        <w:t xml:space="preserve">. Later stages involving hardware integration </w:t>
-      </w:r>
-      <w:r>
-        <w:t>are only partly accelerated by agentic or LLM enabled approaches, therefore see the least reduction in acceleration.</w:t>
-      </w:r>
-      <w:r>
         <w:t xml:space="preserve"> </w:t>
       </w:r>
+      <w:r>
+        <w:t>Pang et al.</w:t>
+      </w:r>
+      <w:r>
+        <w:t xml:space="preserve"> [9]</w:t>
+      </w:r>
+      <w:r>
+        <w:t xml:space="preserve"> identified a 55.8% reduced completion time, but for a non comparative project scope, Cui et al</w:t>
+      </w:r>
+      <w:r>
+        <w:t>. [TBD]</w:t>
+      </w:r>
+      <w:r>
+        <w:t>, identified a 26.08% increase across comparable workspaces, but it must be recognised that acceleration of output does not indicate faster acceptance or review</w:t>
+      </w:r>
+      <w:r>
+        <w:t>, as identified by Perry et al [11].</w:t>
+      </w:r>
+      <w:r>
+        <w:t xml:space="preserve"> Should planned benefit be realised without considerable integration/accuracy/performance challenges, the ‘Steady Progression’ timings apply, ‘Validated Use’ considers time allocated for rework cycles, given </w:t>
+      </w:r>
+      <w:r>
+        <w:t>literature reflected</w:t>
+      </w:r>
+      <w:r>
+        <w:t xml:space="preserve"> partial acceleration of artefact implementation/reviewing</w:t>
+      </w:r>
+      <w:r>
+        <w:t xml:space="preserve"> [9,10]</w:t>
+      </w:r>
+      <w:r>
+        <w:t>.</w:t>
+      </w:r>
+    </w:p>
+    <w:p>
+      <w:pPr>
+        <w:jc w:val="both"/>
+      </w:pPr>
+    </w:p>
+    <w:tbl>
+      <w:tblPr>
+        <w:tblStyle w:val="TableGrid"/>
+        <w:tblW w:w="0" w:type="auto"/>
+        <w:tblLook w:val="04A0" w:firstRow="1" w:lastRow="0" w:firstColumn="1" w:lastColumn="0" w:noHBand="0" w:noVBand="1"/>
+      </w:tblPr>
+      <w:tblGrid>
+        <w:gridCol w:w="3396"/>
+        <w:gridCol w:w="3396"/>
+        <w:gridCol w:w="3396"/>
+      </w:tblGrid>
+      <w:tr>
+        <w:tc>
+          <w:tcPr>
+            <w:tcW w:w="3396" w:type="dxa"/>
+            <w:shd w:val="clear" w:color="auto" w:fill="44546A" w:themeFill="text2"/>
+          </w:tcPr>
+          <w:p>
+            <w:pPr>
+              <w:jc w:val="both"/>
+              <w:rPr>
+                <w:b/>
+                <w:bCs/>
+                <w:color w:val="FFFFFF" w:themeColor="background1"/>
+              </w:rPr>
+            </w:pPr>
+            <w:r>
+              <w:rPr>
+                <w:b/>
+                <w:bCs/>
+                <w:color w:val="FFFFFF" w:themeColor="background1"/>
+              </w:rPr>
+              <w:t>Approach</w:t>
+            </w:r>
+          </w:p>
+        </w:tc>
+        <w:tc>
+          <w:tcPr>
+            <w:tcW w:w="3396" w:type="dxa"/>
+            <w:shd w:val="clear" w:color="auto" w:fill="44546A" w:themeFill="text2"/>
+          </w:tcPr>
+          <w:p>
+            <w:pPr>
+              <w:jc w:val="both"/>
+              <w:rPr>
+                <w:b/>
+                <w:bCs/>
+                <w:color w:val="FFFFFF" w:themeColor="background1"/>
+              </w:rPr>
+            </w:pPr>
+            <w:r>
+              <w:rPr>
+                <w:b/>
+                <w:bCs/>
+                <w:color w:val="FFFFFF" w:themeColor="background1"/>
+              </w:rPr>
+              <w:t>Steady Progression</w:t>
+            </w:r>
+          </w:p>
+        </w:tc>
+        <w:tc>
+          <w:tcPr>
+            <w:tcW w:w="3396" w:type="dxa"/>
+            <w:shd w:val="clear" w:color="auto" w:fill="44546A" w:themeFill="text2"/>
+          </w:tcPr>
+          <w:p>
+            <w:pPr>
+              <w:jc w:val="both"/>
+              <w:rPr>
+                <w:b/>
+                <w:bCs/>
+                <w:color w:val="FFFFFF" w:themeColor="background1"/>
+              </w:rPr>
+            </w:pPr>
+            <w:r>
+              <w:rPr>
+                <w:b/>
+                <w:bCs/>
+                <w:color w:val="FFFFFF" w:themeColor="background1"/>
+              </w:rPr>
+              <w:t>Validated Use (Incl rework)</w:t>
+            </w:r>
+          </w:p>
+        </w:tc>
+      </w:tr>
+      <w:tr>
+        <w:tc>
+          <w:tcPr>
+            <w:tcW w:w="3396" w:type="dxa"/>
+          </w:tcPr>
+          <w:p>
+            <w:pPr>
+              <w:jc w:val="both"/>
+            </w:pPr>
+            <w:r>
+              <w:t>Traditional FEL</w:t>
+            </w:r>
+          </w:p>
+        </w:tc>
+        <w:tc>
+          <w:tcPr>
+            <w:tcW w:w="3396" w:type="dxa"/>
+          </w:tcPr>
+          <w:p>
+            <w:pPr>
+              <w:jc w:val="both"/>
+            </w:pPr>
+            <w:r>
+              <w:t>42 weeks</w:t>
+            </w:r>
+          </w:p>
+        </w:tc>
+        <w:tc>
+          <w:tcPr>
+            <w:tcW w:w="3396" w:type="dxa"/>
+          </w:tcPr>
+          <w:p>
+            <w:pPr>
+              <w:jc w:val="both"/>
+            </w:pPr>
+            <w:r>
+              <w:t>42 weeks</w:t>
+            </w:r>
+          </w:p>
+        </w:tc>
+      </w:tr>
+      <w:tr>
+        <w:tc>
+          <w:tcPr>
+            <w:tcW w:w="3396" w:type="dxa"/>
+          </w:tcPr>
+          <w:p>
+            <w:pPr>
+              <w:jc w:val="both"/>
+            </w:pPr>
+            <w:r>
+              <w:t>LLM Enabled FEL</w:t>
+            </w:r>
+          </w:p>
+        </w:tc>
+        <w:tc>
+          <w:tcPr>
+            <w:tcW w:w="3396" w:type="dxa"/>
+          </w:tcPr>
+          <w:p>
+            <w:pPr>
+              <w:jc w:val="both"/>
+            </w:pPr>
+            <w:r>
+              <w:t>35 weeks</w:t>
+            </w:r>
+          </w:p>
+        </w:tc>
+        <w:tc>
+          <w:tcPr>
+            <w:tcW w:w="3396" w:type="dxa"/>
+          </w:tcPr>
+          <w:p>
+            <w:pPr>
+              <w:jc w:val="both"/>
+            </w:pPr>
+            <w:r>
+              <w:t>41 weeks</w:t>
+            </w:r>
+          </w:p>
+        </w:tc>
+      </w:tr>
+      <w:tr>
+        <w:tc>
+          <w:tcPr>
+            <w:tcW w:w="3396" w:type="dxa"/>
+          </w:tcPr>
+          <w:p>
+            <w:pPr>
+              <w:jc w:val="both"/>
+            </w:pPr>
+            <w:r>
+              <w:t>Agentic FEL</w:t>
+            </w:r>
+          </w:p>
+        </w:tc>
+        <w:tc>
+          <w:tcPr>
+            <w:tcW w:w="3396" w:type="dxa"/>
+          </w:tcPr>
+          <w:p>
+            <w:pPr>
+              <w:jc w:val="both"/>
+            </w:pPr>
+            <w:r>
+              <w:t>30 weeks</w:t>
+            </w:r>
+          </w:p>
+        </w:tc>
+        <w:tc>
+          <w:tcPr>
+            <w:tcW w:w="3396" w:type="dxa"/>
+          </w:tcPr>
+          <w:p>
+            <w:pPr>
+              <w:jc w:val="both"/>
+            </w:pPr>
+            <w:r>
+              <w:t>40 weeks</w:t>
+            </w:r>
+          </w:p>
+        </w:tc>
+      </w:tr>
+    </w:tbl>
+    <w:p>
+      <w:pPr>
+        <w:jc w:val="both"/>
+      </w:pPr>
     </w:p>
     <w:p>
       <w:pPr>
@@ -5885,19 +6473,98 @@
           <w:sz w:val="24"/>
           <w:szCs w:val="24"/>
         </w:rPr>
+        <w:t>Experiment Design</w:t>
+      </w:r>
+    </w:p>
+    <w:p>
+      <w:pPr>
+        <w:jc w:val="both"/>
+      </w:pPr>
+      <w:r>
+        <w:t xml:space="preserve">An independently reviewable package of changes, produced and submitted for review by PR, </w:t>
+      </w:r>
+      <w:r>
+        <w:t>form</w:t>
+      </w:r>
+      <w:r>
+        <w:t xml:space="preserve"> the unit of analysis</w:t>
+      </w:r>
+      <w:r>
+        <w:t xml:space="preserve"> in this experiment. Packages, defined in terms of their comparative functional complexity shall be allocated for completion across the lifecycles. The allocation and order o</w:t>
+      </w:r>
+      <w:r>
+        <w:t>f</w:t>
+      </w:r>
+      <w:r>
+        <w:t xml:space="preserve"> execution shall be randomised to reduce any learning effect with reviewers remaining uninformed as to the origination of the artefact.</w:t>
+      </w:r>
+    </w:p>
+    <w:p>
+      <w:pPr>
+        <w:jc w:val="both"/>
+      </w:pPr>
+    </w:p>
+    <w:p>
+      <w:pPr>
+        <w:jc w:val="both"/>
+      </w:pPr>
+      <w:r>
+        <w:t>The applied system of t</w:t>
+      </w:r>
+      <w:r>
+        <w:t>ime logging should distinguish active engineering, context search, prompt construction, deterministic tool execution, model latency, review, rework and waiting.</w:t>
+      </w:r>
+      <w:r>
+        <w:t xml:space="preserve"> </w:t>
+      </w:r>
+      <w:r>
+        <w:t>Quality is assessed against the approved requirements and standards, using functional correctness, robustness, model and coding standard compliance, verification adequacy, trace precision and recall, completeness of lifecycle data,</w:t>
+      </w:r>
+      <w:r>
+        <w:t xml:space="preserve"> and</w:t>
+      </w:r>
+      <w:r>
+        <w:t xml:space="preserve"> unintended functionality</w:t>
+      </w:r>
+      <w:r>
+        <w:t xml:space="preserve">. </w:t>
+      </w:r>
+    </w:p>
+    <w:p>
+      <w:pPr>
+        <w:jc w:val="both"/>
+      </w:pPr>
+      <w:r>
+        <w:t xml:space="preserve">The experiment shall utilise a </w:t>
+      </w:r>
+      <w:r>
+        <w:t>non-inferiority</w:t>
+      </w:r>
+      <w:r>
+        <w:t xml:space="preserve"> approach, with </w:t>
+      </w:r>
+      <w:r>
+        <w:t>margins defined for each measurable quality metric before the examination of results</w:t>
+      </w:r>
+      <w:r>
+        <w:t>, but as a minimum no seeded catastrophic or major defects must remain in the baseline.</w:t>
+      </w:r>
+    </w:p>
+    <w:p>
+      <w:pPr>
+        <w:jc w:val="both"/>
+      </w:pPr>
+    </w:p>
+    <w:p>
+      <w:pPr>
+        <w:jc w:val="both"/>
+      </w:pPr>
+      <w:r>
         <w:lastRenderedPageBreak/>
-        <w:t>Experiment Design</w:t>
-      </w:r>
-    </w:p>
-    <w:p>
-      <w:pPr>
-        <w:jc w:val="both"/>
-      </w:pPr>
-      <w:r>
         <w:t xml:space="preserve">Table </w:t>
       </w:r>
       <w:r>
-        <w:t>4</w:t>
+        <w:t>3</w:t>
       </w:r>
       <w:r>
         <w:t xml:space="preserve"> illustrates the planned analyses to be</w:t>
@@ -5906,31 +6573,7 @@
         <w:t xml:space="preserve"> undertaken against each methodology, and the control actions performed to produce a baseline for comparison.</w:t>
       </w:r>
       <w:r>
-        <w:t xml:space="preserve"> The</w:t>
-      </w:r>
-      <w:r>
-        <w:t xml:space="preserve"> manually produced</w:t>
-      </w:r>
-      <w:r>
-        <w:t xml:space="preserve"> C2 system will intentionally contain seeded defects, introduced at the requirement level and based upon real world examples which shall be designed to produce failure modes, in the resulting operation of the system.</w:t>
-      </w:r>
-      <w:r>
-        <w:t xml:space="preserve"> The results of the ‘Failure Analysis’ and ‘Security’ analyses will form part of the argument around the applicability of both methodologies, in a safety critical</w:t>
-      </w:r>
-      <w:r>
-        <w:t>, classified</w:t>
-      </w:r>
-      <w:r>
         <w:t xml:space="preserve"> </w:t>
-      </w:r>
-      <w:r>
-        <w:t>environment</w:t>
-      </w:r>
-      <w:r>
-        <w:t xml:space="preserve">. The ‘Timing Benchmark’ shall establish if real cost savings can be made from the application of the approaches and the </w:t>
-      </w:r>
-      <w:r>
-        <w:t>‘Human Factors’ assessment shall evaluate the design philosophy for the display panels, to identify usability considerations.</w:t>
       </w:r>
     </w:p>
     <w:p/>
@@ -5941,6 +6584,9 @@
         <w:jc w:val="center"/>
       </w:pPr>
       <w:r>
+        <w:rPr>
+          <w:noProof/>
+        </w:rPr>
         <w:drawing>
           <wp:anchor distT="0" distB="0" distL="114300" distR="114300" simplePos="0" relativeHeight="251873280" behindDoc="0" locked="0" layoutInCell="1" allowOverlap="1" wp14:anchorId="0BC18004" wp14:editId="18AE75BE">
             <wp:simplePos x="0" y="0"/>
@@ -5965,7 +6611,7 @@
                     <pic:cNvPicPr/>
                   </pic:nvPicPr>
                   <pic:blipFill>
-                    <a:blip r:embed="rId20">
+                    <a:blip r:embed="rId19">
                       <a:extLst>
                         <a:ext uri="{28A0092B-C50C-407E-A947-70E740481C1C}">
                           <a14:useLocalDpi xmlns:a14="http://schemas.microsoft.com/office/drawing/2010/main" val="0"/>
@@ -6028,6 +6674,13 @@
     <w:p>
       <w:pPr>
         <w:rPr>
+          <w:b/>
+        </w:rPr>
+      </w:pPr>
+    </w:p>
+    <w:p>
+      <w:pPr>
+        <w:rPr>
           <w:rFonts w:eastAsiaTheme="majorEastAsia" w:cstheme="majorBidi"/>
           <w:b/>
           <w:bCs/>
@@ -6038,153 +6691,89 @@
         <w:rPr>
           <w:b/>
         </w:rPr>
-        <w:br w:type="page"/>
-      </w:r>
-    </w:p>
-    <w:p>
-      <w:pPr>
-        <w:pStyle w:val="Heading4"/>
-        <w:rPr>
-          <w:b/>
-          <w:bCs w:val="0"/>
-          <w:sz w:val="24"/>
-          <w:szCs w:val="24"/>
-        </w:rPr>
-      </w:pPr>
-      <w:r>
-        <w:rPr>
-          <w:b/>
-          <w:sz w:val="24"/>
-          <w:szCs w:val="24"/>
-        </w:rPr>
+        <w:t>Future Development</w:t>
+      </w:r>
+      <w:r>
+        <w:rPr>
+          <w:b/>
+        </w:rPr>
+        <w:t xml:space="preserve"> and Assessment</w:t>
+      </w:r>
+    </w:p>
+    <w:p>
+      <w:pPr>
+        <w:jc w:val="both"/>
+      </w:pPr>
+      <w:r>
+        <w:t>DO-178C/DO-331 remains the primary acceptance basis for the delivery of any plans and standards documentation, with any other artefact reviewed against the plans and standards themselves.</w:t>
+      </w:r>
+    </w:p>
+    <w:p>
+      <w:pPr>
+        <w:jc w:val="both"/>
+      </w:pPr>
+    </w:p>
+    <w:p>
+      <w:pPr>
+        <w:jc w:val="both"/>
+      </w:pPr>
+      <w:r>
+        <w:t xml:space="preserve">It is recognised this investigation is limited by its use of a synthetic and partially stubbed benchmark, additionally the experience of the originator, learning/ordering effects and the quality of the project information corpus may </w:t>
+      </w:r>
+      <w:r>
+        <w:t>affect</w:t>
+      </w:r>
+      <w:r>
+        <w:t xml:space="preserve"> results.</w:t>
+      </w:r>
+    </w:p>
+    <w:p>
+      <w:pPr>
+        <w:jc w:val="both"/>
+      </w:pPr>
+    </w:p>
+    <w:p>
+      <w:pPr>
+        <w:jc w:val="both"/>
+      </w:pPr>
+      <w:r>
+        <w:t>This investigation targets a DAL B level of assurance, therefore limited generalisable findings can be assumed for any other DAL. The benchmark cannot demonstrate compliance or assurance without engagement with authorities, therefore its purpose remains limited to the quantification and analysis of lifecycle and process performance.</w:t>
+      </w:r>
+    </w:p>
+    <w:p/>
+    <w:p>
+      <w:pPr>
+        <w:jc w:val="both"/>
+      </w:pPr>
+      <w:r>
+        <w:t>According to the potential benefit, both methodologies will be evaluated through the performance of the stated experiment. The production of an empirical method for the establishment of holistic performance, once complete, will provide the necessary evidence to substantiate process transformation in this area.</w:t>
+      </w:r>
+      <w:r>
+        <w:t xml:space="preserve"> Despite this adoption, engagement with the certification bodies, the </w:t>
+      </w:r>
+      <w:r>
         <w:lastRenderedPageBreak/>
-        <w:t>Establishing Performance</w:t>
-      </w:r>
-    </w:p>
-    <w:p>
-      <w:pPr>
-        <w:jc w:val="both"/>
-      </w:pPr>
-      <w:r>
-        <w:t>The applied system of t</w:t>
-      </w:r>
-      <w:r>
-        <w:t>ime logging should distinguish active engineering, context search, prompt construction, deterministic tool execution, model latency, review, rework and waiting.</w:t>
-      </w:r>
-    </w:p>
-    <w:p>
-      <w:pPr>
-        <w:jc w:val="both"/>
-      </w:pPr>
-    </w:p>
-    <w:p>
-      <w:pPr>
-        <w:jc w:val="both"/>
-      </w:pPr>
-      <w:r>
-        <w:t>Quality is assessed against the approved requirements and standards, using functional correctness, robustness, model and coding standard compliance, verification adequacy, trace precision and recall, completeness of lifecycle data,</w:t>
-      </w:r>
-      <w:r>
-        <w:t xml:space="preserve"> and</w:t>
-      </w:r>
-      <w:r>
-        <w:t xml:space="preserve"> unintended functionality</w:t>
-      </w:r>
-      <w:r>
-        <w:t>.</w:t>
-      </w:r>
-      <w:r>
-        <w:t xml:space="preserve"> </w:t>
-      </w:r>
-    </w:p>
-    <w:p>
-      <w:pPr>
-        <w:jc w:val="both"/>
-      </w:pPr>
-    </w:p>
-    <w:p>
-      <w:pPr>
-        <w:jc w:val="both"/>
-      </w:pPr>
-      <w:r>
-        <w:t>DO-178C/DO-331 remain</w:t>
-      </w:r>
-      <w:r>
-        <w:t>s</w:t>
-      </w:r>
-      <w:r>
-        <w:t xml:space="preserve"> the primary acceptance basis for the delivery of any plans and standards documentation, with any other artefact review</w:t>
-      </w:r>
-      <w:r>
-        <w:t>ed</w:t>
-      </w:r>
-      <w:r>
-        <w:t xml:space="preserve"> against the plans and standards themselves.</w:t>
-      </w:r>
-    </w:p>
-    <w:p>
-      <w:pPr>
-        <w:jc w:val="both"/>
-      </w:pPr>
-    </w:p>
-    <w:p>
-      <w:pPr>
-        <w:jc w:val="both"/>
-      </w:pPr>
-    </w:p>
-    <w:p>
-      <w:pPr>
-        <w:pStyle w:val="Heading4"/>
-        <w:rPr>
-          <w:b/>
-          <w:bCs w:val="0"/>
-          <w:sz w:val="24"/>
-          <w:szCs w:val="24"/>
-        </w:rPr>
-      </w:pPr>
-      <w:r>
-        <w:rPr>
-          <w:b/>
-          <w:sz w:val="24"/>
-          <w:szCs w:val="24"/>
-        </w:rPr>
-        <w:t>Future Development</w:t>
-      </w:r>
-    </w:p>
-    <w:p>
-      <w:pPr>
-        <w:jc w:val="both"/>
-      </w:pPr>
-      <w:r>
-        <w:t xml:space="preserve">Subject to the findings of the stated experiment, the least impactful change, LLM enablement, remains the most defensible position, for short term modification of the FEL </w:t>
-      </w:r>
-      <w:r>
-        <w:t>via</w:t>
-      </w:r>
-      <w:r>
-        <w:t xml:space="preserve"> utilisation of existing governance structures, agreed processes and evidence collection methods.</w:t>
-      </w:r>
-    </w:p>
-    <w:p>
-      <w:pPr>
-        <w:jc w:val="both"/>
-      </w:pPr>
-    </w:p>
-    <w:p>
-      <w:pPr>
-        <w:jc w:val="both"/>
-      </w:pPr>
-      <w:r>
-        <w:t>According to the potential benefit, both methodologies will be evaluated through the performance of the stated experiment. The production of an empirical method for the establishment of holistic performance, once complete, will provide the necessary evidence to substantiate process transformation in this area.</w:t>
-      </w:r>
-      <w:r>
-        <w:t xml:space="preserve"> Despite this adoption, engagement with the certification bodies, the identification of standards to cover usage of AI tooling, and proof of general applicability remain as issues.</w:t>
+        <w:t>identification of standards to cover usage of AI tooling, and proof of general applicability remain as issues.</w:t>
       </w:r>
     </w:p>
     <w:p/>
     <w:p>
-      <w:r>
-        <w:t xml:space="preserve">Following this investigation, aspects of either process proving to not negatively impact any quality, timeliness and compliance based metric, should be taken forward for introduction into the current FEL. </w:t>
+      <w:pPr>
+        <w:jc w:val="both"/>
+      </w:pPr>
+      <w:r>
+        <w:t>Subject to the findings of the stated experiment, the least impactful change, LLM enablement, remains the most defensible position, for short term modification of the FEL via utilisation of existing governance structures, agreed processes and evidence collection methods.</w:t>
+      </w:r>
+    </w:p>
+    <w:p>
+      <w:pPr>
+        <w:jc w:val="both"/>
+      </w:pPr>
+      <w:r>
+        <w:t>Agentic orchestration constitutes a risky and experimental approach to DAL B+ safety critical process transformation, ill evidenced by the literature</w:t>
+      </w:r>
+      <w:r>
+        <w:t>, whose benefit relies upon dependency ridden integration challenges, extensive orchestration and security performance.</w:t>
       </w:r>
     </w:p>
     <w:p/>
@@ -6222,8 +6811,37 @@
         <w:spacing w:before="26"/>
       </w:pPr>
       <w:r>
-        <w:t>RTCA D0-178C [1]</w:t>
-      </w:r>
+        <w:t xml:space="preserve">RTCA (2011a) </w:t>
+      </w:r>
+      <w:r>
+        <w:rPr>
+          <w:i/>
+          <w:iCs/>
+        </w:rPr>
+        <w:t>DO-178C: Software Considerations in Airborne Systems and Equipment Certification</w:t>
+      </w:r>
+      <w:r>
+        <w:t xml:space="preserve">. Washington, DC: RTCA, Inc. Available at: </w:t>
+      </w:r>
+      <w:hyperlink r:id="rId20" w:tgtFrame="_new" w:history="1">
+        <w:r>
+          <w:rPr>
+            <w:rStyle w:val="Hyperlink"/>
+          </w:rPr>
+          <w:t>RTCA software standards</w:t>
+        </w:r>
+      </w:hyperlink>
+    </w:p>
+    <w:p>
+      <w:pPr>
+        <w:pStyle w:val="ListParagraph"/>
+        <w:numPr>
+          <w:ilvl w:val="0"/>
+          <w:numId w:val="0"/>
+        </w:numPr>
+        <w:spacing w:before="26"/>
+        <w:ind w:left="1080"/>
+      </w:pPr>
     </w:p>
     <w:p>
       <w:pPr>
@@ -6235,8 +6853,28 @@
         <w:spacing w:before="26"/>
       </w:pPr>
       <w:r>
-        <w:t>Defence Standard 00-055 Part 1 [2]</w:t>
-      </w:r>
+        <w:t xml:space="preserve">Ministry of Defence (2021) </w:t>
+      </w:r>
+      <w:r>
+        <w:rPr>
+          <w:i/>
+          <w:iCs/>
+        </w:rPr>
+        <w:t>Defence Standard 00-055 Part 1, Issue 5: Requirements for Safety of Programmable Elements (PE) in Defence Systems—Part 1: Requirements and Guidance</w:t>
+      </w:r>
+      <w:r>
+        <w:t>. Glasgow: UK Defence Standardization.</w:t>
+      </w:r>
+    </w:p>
+    <w:p>
+      <w:pPr>
+        <w:pStyle w:val="ListParagraph"/>
+        <w:numPr>
+          <w:ilvl w:val="0"/>
+          <w:numId w:val="0"/>
+        </w:numPr>
+        <w:ind w:left="714"/>
+      </w:pPr>
     </w:p>
     <w:p>
       <w:pPr>
@@ -6248,8 +6886,39 @@
         <w:spacing w:before="26"/>
       </w:pPr>
       <w:r>
-        <w:t>FAA Advisory Circular 20-115D [3]</w:t>
-      </w:r>
+        <w:t>F</w:t>
+      </w:r>
+      <w:r>
+        <w:t xml:space="preserve">ederal Aviation Administration (2017) </w:t>
+      </w:r>
+      <w:r>
+        <w:rPr>
+          <w:i/>
+          <w:iCs/>
+        </w:rPr>
+        <w:t>AC 20-115D: Airborne Software Development Assurance Using EUROCAE ED-12() and RTCA DO-178()</w:t>
+      </w:r>
+      <w:r>
+        <w:t xml:space="preserve">. Washington, DC: FAA. Available at: </w:t>
+      </w:r>
+      <w:hyperlink r:id="rId21" w:tgtFrame="_new" w:history="1">
+        <w:r>
+          <w:rPr>
+            <w:rStyle w:val="Hyperlink"/>
+          </w:rPr>
+          <w:t>FAA AC 20-115D</w:t>
+        </w:r>
+      </w:hyperlink>
+    </w:p>
+    <w:p>
+      <w:pPr>
+        <w:pStyle w:val="ListParagraph"/>
+        <w:numPr>
+          <w:ilvl w:val="0"/>
+          <w:numId w:val="0"/>
+        </w:numPr>
+        <w:ind w:left="714"/>
+      </w:pPr>
     </w:p>
     <w:p>
       <w:pPr>
@@ -6261,8 +6930,26 @@
         <w:spacing w:before="26"/>
       </w:pPr>
       <w:r>
-        <w:t>Ansys, 2026a</w:t>
-      </w:r>
+        <w:t xml:space="preserve">Ansys (2025a) ‘Efficient Development of Safe Avionics Software with DO-178C Objectives Using SCADE Suite’, 9 April. Available at: </w:t>
+      </w:r>
+      <w:hyperlink r:id="rId22" w:tgtFrame="_new" w:history="1">
+        <w:r>
+          <w:rPr>
+            <w:rStyle w:val="Hyperlink"/>
+          </w:rPr>
+          <w:t>Ansys Knowledge</w:t>
+        </w:r>
+      </w:hyperlink>
+    </w:p>
+    <w:p>
+      <w:pPr>
+        <w:pStyle w:val="ListParagraph"/>
+        <w:numPr>
+          <w:ilvl w:val="0"/>
+          <w:numId w:val="0"/>
+        </w:numPr>
+        <w:ind w:left="714"/>
+      </w:pPr>
     </w:p>
     <w:p>
       <w:pPr>
@@ -6274,8 +6961,26 @@
         <w:spacing w:before="26"/>
       </w:pPr>
       <w:r>
-        <w:t>Ansys, 2026b</w:t>
-      </w:r>
+        <w:t xml:space="preserve">Ansys (2025b) ‘Efficient Verification of Safe Avionics Software with DO-178C Objectives Using SCADE Suite’, 19 May. Available at: </w:t>
+      </w:r>
+      <w:hyperlink r:id="rId23" w:tgtFrame="_new" w:history="1">
+        <w:r>
+          <w:rPr>
+            <w:rStyle w:val="Hyperlink"/>
+          </w:rPr>
+          <w:t>Ansys Knowledge</w:t>
+        </w:r>
+      </w:hyperlink>
+    </w:p>
+    <w:p>
+      <w:pPr>
+        <w:pStyle w:val="ListParagraph"/>
+        <w:numPr>
+          <w:ilvl w:val="0"/>
+          <w:numId w:val="0"/>
+        </w:numPr>
+        <w:ind w:left="714"/>
+      </w:pPr>
     </w:p>
     <w:p>
       <w:pPr>
@@ -6287,8 +6992,38 @@
         <w:spacing w:before="26"/>
       </w:pPr>
       <w:r>
-        <w:t>Lewis et al., 2020</w:t>
-      </w:r>
+        <w:t xml:space="preserve">Lewis, P. et al. (2020) ‘Retrieval-Augmented Generation for Knowledge-Intensive NLP Tasks’, </w:t>
+      </w:r>
+      <w:r>
+        <w:rPr>
+          <w:rStyle w:val="Emphasis"/>
+        </w:rPr>
+        <w:t>Advances in Neural Information Processing Systems</w:t>
+      </w:r>
+      <w:r>
+        <w:t xml:space="preserve">, 33, pp. 9459–9474. Available at: </w:t>
+      </w:r>
+      <w:hyperlink r:id="rId24" w:tgtFrame="_new" w:history="1">
+        <w:r>
+          <w:rPr>
+            <w:rStyle w:val="Hyperlink"/>
+          </w:rPr>
+          <w:t>arXiv:2005.11401</w:t>
+        </w:r>
+      </w:hyperlink>
+      <w:r>
+        <w:t xml:space="preserve">. </w:t>
+      </w:r>
+    </w:p>
+    <w:p>
+      <w:pPr>
+        <w:pStyle w:val="ListParagraph"/>
+        <w:numPr>
+          <w:ilvl w:val="0"/>
+          <w:numId w:val="0"/>
+        </w:numPr>
+        <w:ind w:left="714"/>
+      </w:pPr>
     </w:p>
     <w:p>
       <w:pPr>
@@ -6300,8 +7035,39 @@
         <w:spacing w:before="26"/>
       </w:pPr>
       <w:r>
-        <w:t>EASA AI Concept Paper Issue 3</w:t>
-      </w:r>
+        <w:t xml:space="preserve">European Union Aviation Safety Agency (2026) </w:t>
+      </w:r>
+      <w:r>
+        <w:rPr>
+          <w:rStyle w:val="Emphasis"/>
+        </w:rPr>
+        <w:t>EASA Artificial Intelligence Concept Paper—Proposed Issue 3</w:t>
+      </w:r>
+      <w:r>
+        <w:t xml:space="preserve">. Cologne: EASA. Available at: </w:t>
+      </w:r>
+      <w:hyperlink r:id="rId25" w:tgtFrame="_new" w:history="1">
+        <w:r>
+          <w:rPr>
+            <w:rStyle w:val="Hyperlink"/>
+          </w:rPr>
+          <w:t>EASA Concept Paper</w:t>
+        </w:r>
+      </w:hyperlink>
+      <w:r>
+        <w:t xml:space="preserve">. </w:t>
+      </w:r>
+    </w:p>
+    <w:p>
+      <w:pPr>
+        <w:pStyle w:val="ListParagraph"/>
+        <w:numPr>
+          <w:ilvl w:val="0"/>
+          <w:numId w:val="0"/>
+        </w:numPr>
+        <w:spacing w:before="26"/>
+        <w:ind w:left="1080"/>
+      </w:pPr>
     </w:p>
     <w:p>
       <w:pPr>
@@ -6313,8 +7079,38 @@
         <w:spacing w:before="26"/>
       </w:pPr>
       <w:r>
-        <w:t>Parasuraman and Manzey, 2010</w:t>
-      </w:r>
+        <w:t xml:space="preserve">Parasuraman, R. and Manzey, D.H. (2010) ‘Complacency and Bias in Human Use of Automation: An Attentional Integration’, </w:t>
+      </w:r>
+      <w:r>
+        <w:rPr>
+          <w:rStyle w:val="Emphasis"/>
+        </w:rPr>
+        <w:t>Human Factors</w:t>
+      </w:r>
+      <w:r>
+        <w:t xml:space="preserve">, 52(3), pp. 381–410. </w:t>
+      </w:r>
+      <w:hyperlink r:id="rId26" w:tgtFrame="_new" w:history="1">
+        <w:r>
+          <w:rPr>
+            <w:rStyle w:val="Hyperlink"/>
+          </w:rPr>
+          <w:t>doi:10.1177/0018720810376055</w:t>
+        </w:r>
+      </w:hyperlink>
+      <w:r>
+        <w:t xml:space="preserve">. </w:t>
+      </w:r>
+    </w:p>
+    <w:p>
+      <w:pPr>
+        <w:pStyle w:val="ListParagraph"/>
+        <w:numPr>
+          <w:ilvl w:val="0"/>
+          <w:numId w:val="0"/>
+        </w:numPr>
+        <w:ind w:left="714"/>
+      </w:pPr>
     </w:p>
     <w:p>
       <w:pPr>
@@ -6326,8 +7122,29 @@
         <w:spacing w:before="26"/>
       </w:pPr>
       <w:r>
-        <w:t>(Peng et al., 2023)</w:t>
-      </w:r>
+        <w:t xml:space="preserve">Peng, S., Kalliamvakou, E., Cihon, P. and Demirer, M. (2023) ‘The Impact of AI on Developer Productivity: Evidence from GitHub Copilot’, arXiv:2302.06590. Available at: </w:t>
+      </w:r>
+      <w:hyperlink r:id="rId27" w:tgtFrame="_new" w:history="1">
+        <w:r>
+          <w:rPr>
+            <w:rStyle w:val="Hyperlink"/>
+          </w:rPr>
+          <w:t>arXiv</w:t>
+        </w:r>
+      </w:hyperlink>
+      <w:r>
+        <w:t xml:space="preserve">. </w:t>
+      </w:r>
+    </w:p>
+    <w:p>
+      <w:pPr>
+        <w:pStyle w:val="ListParagraph"/>
+        <w:numPr>
+          <w:ilvl w:val="0"/>
+          <w:numId w:val="0"/>
+        </w:numPr>
+        <w:ind w:left="714"/>
+      </w:pPr>
     </w:p>
     <w:p>
       <w:pPr>
@@ -6339,8 +7156,29 @@
         <w:spacing w:before="26"/>
       </w:pPr>
       <w:r>
-        <w:t>(Becker et al., 2025)</w:t>
-      </w:r>
+        <w:t xml:space="preserve">Becker, J., Rush, N., Barnes, E. and Rein, D. (2025) ‘Measuring the Impact of Early-2025 AI on Experienced Open-Source Developer Productivity’, arXiv:2507.09089. Available at: </w:t>
+      </w:r>
+      <w:hyperlink r:id="rId28" w:tgtFrame="_new" w:history="1">
+        <w:r>
+          <w:rPr>
+            <w:rStyle w:val="Hyperlink"/>
+          </w:rPr>
+          <w:t>METR study</w:t>
+        </w:r>
+      </w:hyperlink>
+      <w:r>
+        <w:t xml:space="preserve">. </w:t>
+      </w:r>
+    </w:p>
+    <w:p>
+      <w:pPr>
+        <w:pStyle w:val="ListParagraph"/>
+        <w:numPr>
+          <w:ilvl w:val="0"/>
+          <w:numId w:val="0"/>
+        </w:numPr>
+        <w:ind w:left="714"/>
+      </w:pPr>
     </w:p>
     <w:p>
       <w:pPr>
@@ -6352,14 +7190,38 @@
         <w:spacing w:before="26"/>
       </w:pPr>
       <w:r>
-        <w:t>P</w:t>
-      </w:r>
-      <w:r>
-        <w:t>erry et al. (2023</w:t>
-      </w:r>
-      <w:r>
-        <w:t>)</w:t>
-      </w:r>
+        <w:t xml:space="preserve">Perry, N., Srivastava, M., Kumar, D. and Boneh, D. (2023) ‘Do Users Write More Insecure Code with AI Assistants?’, </w:t>
+      </w:r>
+      <w:r>
+        <w:rPr>
+          <w:rStyle w:val="Emphasis"/>
+        </w:rPr>
+        <w:t>Proceedings of the 2023 ACM SIGSAC Conference on Computer and Communications Security</w:t>
+      </w:r>
+      <w:r>
+        <w:t xml:space="preserve">. </w:t>
+      </w:r>
+      <w:hyperlink r:id="rId29" w:tgtFrame="_new" w:history="1">
+        <w:r>
+          <w:rPr>
+            <w:rStyle w:val="Hyperlink"/>
+          </w:rPr>
+          <w:t>doi:10.1145/3576915.3623157</w:t>
+        </w:r>
+      </w:hyperlink>
+      <w:r>
+        <w:t xml:space="preserve">. </w:t>
+      </w:r>
+    </w:p>
+    <w:p>
+      <w:pPr>
+        <w:pStyle w:val="ListParagraph"/>
+        <w:numPr>
+          <w:ilvl w:val="0"/>
+          <w:numId w:val="0"/>
+        </w:numPr>
+        <w:ind w:left="714"/>
+      </w:pPr>
     </w:p>
     <w:p>
       <w:pPr>
@@ -6371,8 +7233,38 @@
         <w:spacing w:before="26"/>
       </w:pPr>
       <w:r>
-        <w:t>(Graydon and Lehman, 2025)</w:t>
-      </w:r>
+        <w:t xml:space="preserve">Graydon, M.S. and Lehman, S.M. (2025) </w:t>
+      </w:r>
+      <w:r>
+        <w:rPr>
+          <w:rStyle w:val="Emphasis"/>
+        </w:rPr>
+        <w:t>Examining Proposed Uses of LLMs to Produce or Assess Assurance Arguments</w:t>
+      </w:r>
+      <w:r>
+        <w:t xml:space="preserve">. NASA/TM-20250001849. Hampton, VA: NASA. Available at: </w:t>
+      </w:r>
+      <w:hyperlink r:id="rId30" w:tgtFrame="_new" w:history="1">
+        <w:r>
+          <w:rPr>
+            <w:rStyle w:val="Hyperlink"/>
+          </w:rPr>
+          <w:t>NASA Technical Reports Server</w:t>
+        </w:r>
+      </w:hyperlink>
+      <w:r>
+        <w:t xml:space="preserve">. </w:t>
+      </w:r>
+    </w:p>
+    <w:p>
+      <w:pPr>
+        <w:pStyle w:val="ListParagraph"/>
+        <w:numPr>
+          <w:ilvl w:val="0"/>
+          <w:numId w:val="0"/>
+        </w:numPr>
+        <w:ind w:left="714"/>
+      </w:pPr>
     </w:p>
     <w:p>
       <w:pPr>
@@ -6383,14 +7275,46 @@
         </w:numPr>
         <w:spacing w:before="26"/>
       </w:pPr>
-      <w:hyperlink r:id="rId21" w:history="1">
+      <w:r>
+        <w:t xml:space="preserve">Jimenez, C.E., Yang, J., Wettig, A., Yao, S., Pei, K., Press, O. and Narasimhan, K. (2024) ‘SWE-bench: Can Language Models Resolve Real-World GitHub Issues?’, </w:t>
+      </w:r>
+      <w:r>
+        <w:rPr>
+          <w:rStyle w:val="Emphasis"/>
+        </w:rPr>
+        <w:lastRenderedPageBreak/>
+        <w:t>Proceedings of the Twelfth International Conference on Learning Representations</w:t>
+      </w:r>
+      <w:r>
+        <w:t xml:space="preserve">. Available at: </w:t>
+      </w:r>
+      <w:hyperlink r:id="rId31" w:tgtFrame="_new" w:history="1">
         <w:r>
           <w:rPr>
             <w:rStyle w:val="Hyperlink"/>
           </w:rPr>
-          <w:t>https://www.swebench.com/</w:t>
+          <w:t>arXiv:2310.06770</w:t>
         </w:r>
       </w:hyperlink>
+      <w:r>
+        <w:t>.</w:t>
+      </w:r>
+      <w:r>
+        <w:t>NIST's Generative AI Profile</w:t>
+      </w:r>
+      <w:r>
+        <w:t xml:space="preserve"> 2024</w:t>
+      </w:r>
+    </w:p>
+    <w:p>
+      <w:pPr>
+        <w:pStyle w:val="ListParagraph"/>
+        <w:numPr>
+          <w:ilvl w:val="0"/>
+          <w:numId w:val="0"/>
+        </w:numPr>
+        <w:ind w:left="714"/>
+      </w:pPr>
     </w:p>
     <w:p>
       <w:pPr>
@@ -6402,11 +7326,39 @@
         <w:spacing w:before="26"/>
       </w:pPr>
       <w:r>
-        <w:t>NIST's Generative AI Profile</w:t>
-      </w:r>
-      <w:r>
-        <w:t xml:space="preserve"> 2024</w:t>
-      </w:r>
+        <w:t xml:space="preserve">National Institute of Standards and Technology (2024a) </w:t>
+      </w:r>
+      <w:r>
+        <w:rPr>
+          <w:i/>
+          <w:iCs/>
+        </w:rPr>
+        <w:t>Artificial Intelligence Risk Management Framework: Generative Artificial Intelligence Profile</w:t>
+      </w:r>
+      <w:r>
+        <w:t xml:space="preserve">. NIST AI 600-1. Gaithersburg, MD: NIST. Available at: </w:t>
+      </w:r>
+      <w:hyperlink r:id="rId32" w:tgtFrame="_new" w:history="1">
+        <w:r>
+          <w:rPr>
+            <w:rStyle w:val="Hyperlink"/>
+          </w:rPr>
+          <w:t>NIST AI 600-1</w:t>
+        </w:r>
+      </w:hyperlink>
+      <w:r>
+        <w:t xml:space="preserve">. </w:t>
+      </w:r>
+    </w:p>
+    <w:p>
+      <w:pPr>
+        <w:pStyle w:val="ListParagraph"/>
+        <w:numPr>
+          <w:ilvl w:val="0"/>
+          <w:numId w:val="0"/>
+        </w:numPr>
+        <w:ind w:left="714"/>
+      </w:pPr>
     </w:p>
     <w:p>
       <w:pPr>
@@ -6418,14 +7370,39 @@
         <w:spacing w:before="26"/>
       </w:pPr>
       <w:r>
-        <w:t>SP 800-218A</w:t>
-      </w:r>
-      <w:r>
-        <w:t xml:space="preserve"> </w:t>
-      </w:r>
-      <w:r>
-        <w:t>https://csrc.nist.gov/pubs/sp/800/218/a/ipd</w:t>
-      </w:r>
+        <w:t xml:space="preserve">National Institute of Standards and Technology (2024b) </w:t>
+      </w:r>
+      <w:r>
+        <w:rPr>
+          <w:i/>
+          <w:iCs/>
+        </w:rPr>
+        <w:t>Secure Software Development Practices for Generative AI and Dual-Use Foundation Models: An SSDF Community Profile</w:t>
+      </w:r>
+      <w:r>
+        <w:t xml:space="preserve">. NIST SP 800-218A. Gaithersburg, MD: NIST. </w:t>
+      </w:r>
+      <w:hyperlink r:id="rId33" w:tgtFrame="_new" w:history="1">
+        <w:r>
+          <w:rPr>
+            <w:rStyle w:val="Hyperlink"/>
+          </w:rPr>
+          <w:t>doi:10.6028/NIST.SP.800-218A</w:t>
+        </w:r>
+      </w:hyperlink>
+      <w:r>
+        <w:t xml:space="preserve">. </w:t>
+      </w:r>
+    </w:p>
+    <w:p>
+      <w:pPr>
+        <w:pStyle w:val="ListParagraph"/>
+        <w:numPr>
+          <w:ilvl w:val="0"/>
+          <w:numId w:val="0"/>
+        </w:numPr>
+        <w:ind w:left="714"/>
+      </w:pPr>
     </w:p>
     <w:p>
       <w:pPr>
@@ -6437,8 +7414,39 @@
         <w:spacing w:before="26"/>
       </w:pPr>
       <w:r>
-        <w:t>UK MAA's Regulatory Notice 2025/04</w:t>
-      </w:r>
+        <w:t xml:space="preserve">Military Aviation Authority (2025) </w:t>
+      </w:r>
+      <w:r>
+        <w:rPr>
+          <w:i/>
+          <w:iCs/>
+        </w:rPr>
+        <w:t>MAA/RN/2025/04: Use of Artificial Intelligence within Systems and Equipment Subject to MRP Design Assurance Processes</w:t>
+      </w:r>
+      <w:r>
+        <w:t xml:space="preserve">. Bristol: Ministry of Defence. Available at: </w:t>
+      </w:r>
+      <w:hyperlink r:id="rId34" w:tgtFrame="_new" w:history="1">
+        <w:r>
+          <w:rPr>
+            <w:rStyle w:val="Hyperlink"/>
+          </w:rPr>
+          <w:t>MAA Regulatory Notices</w:t>
+        </w:r>
+      </w:hyperlink>
+      <w:r>
+        <w:t xml:space="preserve">. </w:t>
+      </w:r>
+    </w:p>
+    <w:p>
+      <w:pPr>
+        <w:pStyle w:val="ListParagraph"/>
+        <w:numPr>
+          <w:ilvl w:val="0"/>
+          <w:numId w:val="0"/>
+        </w:numPr>
+        <w:ind w:left="714"/>
+      </w:pPr>
     </w:p>
     <w:p>
       <w:pPr>
@@ -6450,32 +7458,37 @@
         <w:spacing w:before="26"/>
       </w:pPr>
       <w:r>
-        <w:t>MOD JSP 936</w:t>
-      </w:r>
-    </w:p>
-    <w:p>
-      <w:pPr>
-        <w:pStyle w:val="ListParagraph"/>
-        <w:numPr>
-          <w:ilvl w:val="0"/>
-          <w:numId w:val="10"/>
-        </w:numPr>
-        <w:spacing w:before="26"/>
-      </w:pPr>
-      <w:r>
-        <w:t>Parasuraman and Manzey (2010)</w:t>
-      </w:r>
-    </w:p>
-    <w:p>
-      <w:pPr>
-        <w:spacing w:before="26"/>
-        <w:ind w:left="720" w:hanging="720"/>
-      </w:pPr>
+        <w:t>M</w:t>
+      </w:r>
+      <w:r>
+        <w:t xml:space="preserve">inistry of Defence (2024) </w:t>
+      </w:r>
+      <w:r>
+        <w:rPr>
+          <w:i/>
+          <w:iCs/>
+        </w:rPr>
+        <w:t>JSP 936: Dependable Artificial Intelligence in Defence—Part 1: Directive</w:t>
+      </w:r>
+      <w:r>
+        <w:t xml:space="preserve">. London: Ministry of Defence. Available at: </w:t>
+      </w:r>
+      <w:hyperlink r:id="rId35" w:tgtFrame="_new" w:history="1">
+        <w:r>
+          <w:rPr>
+            <w:rStyle w:val="Hyperlink"/>
+          </w:rPr>
+          <w:t>JSP 936</w:t>
+        </w:r>
+      </w:hyperlink>
+      <w:r>
+        <w:t>.</w:t>
+      </w:r>
     </w:p>
     <w:sectPr>
-      <w:footerReference w:type="even" r:id="rId22"/>
-      <w:footerReference w:type="default" r:id="rId23"/>
-      <w:footerReference w:type="first" r:id="rId24"/>
+      <w:footerReference w:type="even" r:id="rId36"/>
+      <w:footerReference w:type="default" r:id="rId37"/>
+      <w:footerReference w:type="first" r:id="rId38"/>
       <w:pgSz w:w="11900" w:h="16840"/>
       <w:pgMar w:top="851" w:right="851" w:bottom="851" w:left="851" w:header="850" w:footer="709" w:gutter="0"/>
       <w:cols w:space="708"/>
@@ -7553,6 +8566,95 @@
     </w:lvl>
   </w:abstractNum>
   <w:abstractNum w:abstractNumId="8" w15:restartNumberingAfterBreak="0">
+    <w:nsid w:val="682058C1"/>
+    <w:multiLevelType w:val="hybridMultilevel"/>
+    <w:tmpl w:val="0EAC2B48"/>
+    <w:lvl w:ilvl="0" w:tplc="FFFFFFFF">
+      <w:start w:val="1"/>
+      <w:numFmt w:val="decimal"/>
+      <w:lvlText w:val="%1."/>
+      <w:lvlJc w:val="left"/>
+      <w:pPr>
+        <w:ind w:left="1080" w:hanging="720"/>
+      </w:pPr>
+      <w:rPr>
+        <w:rFonts w:hint="default"/>
+      </w:rPr>
+    </w:lvl>
+    <w:lvl w:ilvl="1" w:tplc="FFFFFFFF" w:tentative="1">
+      <w:start w:val="1"/>
+      <w:numFmt w:val="lowerLetter"/>
+      <w:lvlText w:val="%2."/>
+      <w:lvlJc w:val="left"/>
+      <w:pPr>
+        <w:ind w:left="1440" w:hanging="360"/>
+      </w:pPr>
+    </w:lvl>
+    <w:lvl w:ilvl="2" w:tplc="FFFFFFFF" w:tentative="1">
+      <w:start w:val="1"/>
+      <w:numFmt w:val="lowerRoman"/>
+      <w:lvlText w:val="%3."/>
+      <w:lvlJc w:val="right"/>
+      <w:pPr>
+        <w:ind w:left="2160" w:hanging="180"/>
+      </w:pPr>
+    </w:lvl>
+    <w:lvl w:ilvl="3" w:tplc="FFFFFFFF" w:tentative="1">
+      <w:start w:val="1"/>
+      <w:numFmt w:val="decimal"/>
+      <w:lvlText w:val="%4."/>
+      <w:lvlJc w:val="left"/>
+      <w:pPr>
+        <w:ind w:left="2880" w:hanging="360"/>
+      </w:pPr>
+    </w:lvl>
+    <w:lvl w:ilvl="4" w:tplc="FFFFFFFF" w:tentative="1">
+      <w:start w:val="1"/>
+      <w:numFmt w:val="lowerLetter"/>
+      <w:lvlText w:val="%5."/>
+      <w:lvlJc w:val="left"/>
+      <w:pPr>
+        <w:ind w:left="3600" w:hanging="360"/>
+      </w:pPr>
+    </w:lvl>
+    <w:lvl w:ilvl="5" w:tplc="FFFFFFFF" w:tentative="1">
+      <w:start w:val="1"/>
+      <w:numFmt w:val="lowerRoman"/>
+      <w:lvlText w:val="%6."/>
+      <w:lvlJc w:val="right"/>
+      <w:pPr>
+        <w:ind w:left="4320" w:hanging="180"/>
+      </w:pPr>
+    </w:lvl>
+    <w:lvl w:ilvl="6" w:tplc="FFFFFFFF" w:tentative="1">
+      <w:start w:val="1"/>
+      <w:numFmt w:val="decimal"/>
+      <w:lvlText w:val="%7."/>
+      <w:lvlJc w:val="left"/>
+      <w:pPr>
+        <w:ind w:left="5040" w:hanging="360"/>
+      </w:pPr>
+    </w:lvl>
+    <w:lvl w:ilvl="7" w:tplc="FFFFFFFF" w:tentative="1">
+      <w:start w:val="1"/>
+      <w:numFmt w:val="lowerLetter"/>
+      <w:lvlText w:val="%8."/>
+      <w:lvlJc w:val="left"/>
+      <w:pPr>
+        <w:ind w:left="5760" w:hanging="360"/>
+      </w:pPr>
+    </w:lvl>
+    <w:lvl w:ilvl="8" w:tplc="FFFFFFFF" w:tentative="1">
+      <w:start w:val="1"/>
+      <w:numFmt w:val="lowerRoman"/>
+      <w:lvlText w:val="%9."/>
+      <w:lvlJc w:val="right"/>
+      <w:pPr>
+        <w:ind w:left="6480" w:hanging="180"/>
+      </w:pPr>
+    </w:lvl>
+  </w:abstractNum>
+  <w:abstractNum w:abstractNumId="9" w15:restartNumberingAfterBreak="0">
     <w:nsid w:val="754A7879"/>
     <w:multiLevelType w:val="hybridMultilevel"/>
     <w:tmpl w:val="F64C6922"/>
@@ -7638,7 +8740,7 @@
       </w:pPr>
     </w:lvl>
   </w:abstractNum>
-  <w:abstractNum w:abstractNumId="9" w15:restartNumberingAfterBreak="0">
+  <w:abstractNum w:abstractNumId="10" w15:restartNumberingAfterBreak="0">
     <w:nsid w:val="7D1312FA"/>
     <w:multiLevelType w:val="hybridMultilevel"/>
     <w:tmpl w:val="69F8C5D6"/>
@@ -7760,10 +8862,10 @@
     <w:abstractNumId w:val="1"/>
   </w:num>
   <w:num w:numId="4" w16cid:durableId="887648544">
-    <w:abstractNumId w:val="9"/>
+    <w:abstractNumId w:val="10"/>
   </w:num>
   <w:num w:numId="5" w16cid:durableId="11539470">
-    <w:abstractNumId w:val="8"/>
+    <w:abstractNumId w:val="9"/>
   </w:num>
   <w:num w:numId="6" w16cid:durableId="1605268316">
     <w:abstractNumId w:val="4"/>
@@ -7779,6 +8881,9 @@
   </w:num>
   <w:num w:numId="10" w16cid:durableId="1830754854">
     <w:abstractNumId w:val="3"/>
+  </w:num>
+  <w:num w:numId="11" w16cid:durableId="492452840">
+    <w:abstractNumId w:val="8"/>
   </w:num>
 </w:numbering>
 </file>
@@ -8333,7 +9438,6 @@
   <w:style w:type="character" w:default="1" w:styleId="DefaultParagraphFont">
     <w:name w:val="Default Paragraph Font"/>
     <w:uiPriority w:val="1"/>
-    <w:semiHidden/>
     <w:unhideWhenUsed/>
   </w:style>
   <w:style w:type="table" w:default="1" w:styleId="TableNormal">
@@ -9309,81 +10413,6 @@
 </file>
 
 <file path=customXml/item2.xml><?xml version="1.0" encoding="utf-8"?>
-<?mso-contentType ?>
-<FormTemplates xmlns="http://schemas.microsoft.com/sharepoint/v3/contenttype/forms">
-  <Display>DocumentLibraryForm</Display>
-  <Edit>DocumentLibraryForm</Edit>
-  <New>DocumentLibraryForm</New>
-</FormTemplates>
-</file>
-
-<file path=customXml/item3.xml><?xml version="1.0" encoding="utf-8"?>
-<?mso-contentType ?>
-<spe:Receivers xmlns:spe="http://schemas.microsoft.com/sharepoint/events">
-  <Receiver>
-    <Name>Document ID Generator</Name>
-    <Synchronization>Synchronous</Synchronization>
-    <Type>10001</Type>
-    <SequenceNumber>1000</SequenceNumber>
-    <Url/>
-    <Assembly>Microsoft.Office.DocumentManagement, Version=16.0.0.0, Culture=neutral, PublicKeyToken=71e9bce111e9429c</Assembly>
-    <Class>Microsoft.Office.DocumentManagement.Internal.DocIdHandler</Class>
-    <Data/>
-    <Filter/>
-  </Receiver>
-  <Receiver>
-    <Name>Document ID Generator</Name>
-    <Synchronization>Synchronous</Synchronization>
-    <Type>10002</Type>
-    <SequenceNumber>1001</SequenceNumber>
-    <Url/>
-    <Assembly>Microsoft.Office.DocumentManagement, Version=16.0.0.0, Culture=neutral, PublicKeyToken=71e9bce111e9429c</Assembly>
-    <Class>Microsoft.Office.DocumentManagement.Internal.DocIdHandler</Class>
-    <Data/>
-    <Filter/>
-  </Receiver>
-  <Receiver>
-    <Name>Document ID Generator</Name>
-    <Synchronization>Synchronous</Synchronization>
-    <Type>10004</Type>
-    <SequenceNumber>1002</SequenceNumber>
-    <Url/>
-    <Assembly>Microsoft.Office.DocumentManagement, Version=16.0.0.0, Culture=neutral, PublicKeyToken=71e9bce111e9429c</Assembly>
-    <Class>Microsoft.Office.DocumentManagement.Internal.DocIdHandler</Class>
-    <Data/>
-    <Filter/>
-  </Receiver>
-  <Receiver>
-    <Name>Document ID Generator</Name>
-    <Synchronization>Synchronous</Synchronization>
-    <Type>10006</Type>
-    <SequenceNumber>1003</SequenceNumber>
-    <Url/>
-    <Assembly>Microsoft.Office.DocumentManagement, Version=16.0.0.0, Culture=neutral, PublicKeyToken=71e9bce111e9429c</Assembly>
-    <Class>Microsoft.Office.DocumentManagement.Internal.DocIdHandler</Class>
-    <Data/>
-    <Filter/>
-  </Receiver>
-</spe:Receivers>
-</file>
-
-<file path=customXml/item4.xml><?xml version="1.0" encoding="utf-8"?>
-<p:properties xmlns:p="http://schemas.microsoft.com/office/2006/metadata/properties" xmlns:xsi="http://www.w3.org/2001/XMLSchema-instance" xmlns:pc="http://schemas.microsoft.com/office/infopath/2007/PartnerControls">
-  <documentManagement>
-    <TaxCatchAll xmlns="d5759068-2af1-405f-8952-bba64d53795f" xsi:nil="true"/>
-    <lcf76f155ced4ddcb4097134ff3c332f xmlns="fc6929cc-5503-4d88-ab04-1ba5755a3b48">
-      <Terms xmlns="http://schemas.microsoft.com/office/infopath/2007/PartnerControls"/>
-    </lcf76f155ced4ddcb4097134ff3c332f>
-    <_dlc_DocId xmlns="d5759068-2af1-405f-8952-bba64d53795f">TQRXN6XH56H4-652439573-2884814</_dlc_DocId>
-    <_dlc_DocIdUrl xmlns="d5759068-2af1-405f-8952-bba64d53795f">
-      <Url>https://cranfield.sharepoint.com/sites/PGVibData/_layouts/15/DocIdRedir.aspx?ID=TQRXN6XH56H4-652439573-2884814</Url>
-      <Description>TQRXN6XH56H4-652439573-2884814</Description>
-    </_dlc_DocIdUrl>
-  </documentManagement>
-</p:properties>
-</file>
-
-<file path=customXml/item5.xml><?xml version="1.0" encoding="utf-8"?>
 <ct:contentTypeSchema xmlns:ct="http://schemas.microsoft.com/office/2006/metadata/contentType" xmlns:ma="http://schemas.microsoft.com/office/2006/metadata/properties/metaAttributes" ct:_="" ma:_="" ma:contentTypeName="Document" ma:contentTypeID="0x010100EC8CC33C3763BF4EA730E2D192C2DDB9" ma:contentTypeVersion="18" ma:contentTypeDescription="Create a new document." ma:contentTypeScope="" ma:versionID="1d13a82d8fbf311ad2d5c7ffcaf8a280">
   <xsd:schema xmlns:xsd="http://www.w3.org/2001/XMLSchema" xmlns:xs="http://www.w3.org/2001/XMLSchema" xmlns:p="http://schemas.microsoft.com/office/2006/metadata/properties" xmlns:ns2="d5759068-2af1-405f-8952-bba64d53795f" xmlns:ns3="fc6929cc-5503-4d88-ab04-1ba5755a3b48" targetNamespace="http://schemas.microsoft.com/office/2006/metadata/properties" ma:root="true" ma:fieldsID="9beb809c4fb16bb24a029ea3bd9fcc9e" ns2:_="" ns3:_="">
     <xsd:import namespace="d5759068-2af1-405f-8952-bba64d53795f"/>
@@ -9663,6 +10692,81 @@
 </ct:contentTypeSchema>
 </file>
 
+<file path=customXml/item3.xml><?xml version="1.0" encoding="utf-8"?>
+<p:properties xmlns:p="http://schemas.microsoft.com/office/2006/metadata/properties" xmlns:xsi="http://www.w3.org/2001/XMLSchema-instance" xmlns:pc="http://schemas.microsoft.com/office/infopath/2007/PartnerControls">
+  <documentManagement>
+    <TaxCatchAll xmlns="d5759068-2af1-405f-8952-bba64d53795f" xsi:nil="true"/>
+    <lcf76f155ced4ddcb4097134ff3c332f xmlns="fc6929cc-5503-4d88-ab04-1ba5755a3b48">
+      <Terms xmlns="http://schemas.microsoft.com/office/infopath/2007/PartnerControls"/>
+    </lcf76f155ced4ddcb4097134ff3c332f>
+    <_dlc_DocId xmlns="d5759068-2af1-405f-8952-bba64d53795f">TQRXN6XH56H4-652439573-2884814</_dlc_DocId>
+    <_dlc_DocIdUrl xmlns="d5759068-2af1-405f-8952-bba64d53795f">
+      <Url>https://cranfield.sharepoint.com/sites/PGVibData/_layouts/15/DocIdRedir.aspx?ID=TQRXN6XH56H4-652439573-2884814</Url>
+      <Description>TQRXN6XH56H4-652439573-2884814</Description>
+    </_dlc_DocIdUrl>
+  </documentManagement>
+</p:properties>
+</file>
+
+<file path=customXml/item4.xml><?xml version="1.0" encoding="utf-8"?>
+<?mso-contentType ?>
+<spe:Receivers xmlns:spe="http://schemas.microsoft.com/sharepoint/events">
+  <Receiver>
+    <Name>Document ID Generator</Name>
+    <Synchronization>Synchronous</Synchronization>
+    <Type>10001</Type>
+    <SequenceNumber>1000</SequenceNumber>
+    <Url/>
+    <Assembly>Microsoft.Office.DocumentManagement, Version=16.0.0.0, Culture=neutral, PublicKeyToken=71e9bce111e9429c</Assembly>
+    <Class>Microsoft.Office.DocumentManagement.Internal.DocIdHandler</Class>
+    <Data/>
+    <Filter/>
+  </Receiver>
+  <Receiver>
+    <Name>Document ID Generator</Name>
+    <Synchronization>Synchronous</Synchronization>
+    <Type>10002</Type>
+    <SequenceNumber>1001</SequenceNumber>
+    <Url/>
+    <Assembly>Microsoft.Office.DocumentManagement, Version=16.0.0.0, Culture=neutral, PublicKeyToken=71e9bce111e9429c</Assembly>
+    <Class>Microsoft.Office.DocumentManagement.Internal.DocIdHandler</Class>
+    <Data/>
+    <Filter/>
+  </Receiver>
+  <Receiver>
+    <Name>Document ID Generator</Name>
+    <Synchronization>Synchronous</Synchronization>
+    <Type>10004</Type>
+    <SequenceNumber>1002</SequenceNumber>
+    <Url/>
+    <Assembly>Microsoft.Office.DocumentManagement, Version=16.0.0.0, Culture=neutral, PublicKeyToken=71e9bce111e9429c</Assembly>
+    <Class>Microsoft.Office.DocumentManagement.Internal.DocIdHandler</Class>
+    <Data/>
+    <Filter/>
+  </Receiver>
+  <Receiver>
+    <Name>Document ID Generator</Name>
+    <Synchronization>Synchronous</Synchronization>
+    <Type>10006</Type>
+    <SequenceNumber>1003</SequenceNumber>
+    <Url/>
+    <Assembly>Microsoft.Office.DocumentManagement, Version=16.0.0.0, Culture=neutral, PublicKeyToken=71e9bce111e9429c</Assembly>
+    <Class>Microsoft.Office.DocumentManagement.Internal.DocIdHandler</Class>
+    <Data/>
+    <Filter/>
+  </Receiver>
+</spe:Receivers>
+</file>
+
+<file path=customXml/item5.xml><?xml version="1.0" encoding="utf-8"?>
+<?mso-contentType ?>
+<FormTemplates xmlns="http://schemas.microsoft.com/sharepoint/v3/contenttype/forms">
+  <Display>DocumentLibraryForm</Display>
+  <Edit>DocumentLibraryForm</Edit>
+  <New>DocumentLibraryForm</New>
+</FormTemplates>
+</file>
+
 <file path=customXml/itemProps1.xml><?xml version="1.0" encoding="utf-8"?>
 <ds:datastoreItem xmlns:ds="http://schemas.openxmlformats.org/officeDocument/2006/customXml" ds:itemID="{B37BF8BA-60FB-44B9-BFEB-4B8F946969EA}">
   <ds:schemaRefs>
@@ -9672,33 +10776,6 @@
 </file>
 
 <file path=customXml/itemProps2.xml><?xml version="1.0" encoding="utf-8"?>
-<ds:datastoreItem xmlns:ds="http://schemas.openxmlformats.org/officeDocument/2006/customXml" ds:itemID="{1CA9BEE3-0228-47D5-9957-749897919E7C}">
-  <ds:schemaRefs>
-    <ds:schemaRef ds:uri="http://schemas.microsoft.com/sharepoint/v3/contenttype/forms"/>
-  </ds:schemaRefs>
-</ds:datastoreItem>
-</file>
-
-<file path=customXml/itemProps3.xml><?xml version="1.0" encoding="utf-8"?>
-<ds:datastoreItem xmlns:ds="http://schemas.openxmlformats.org/officeDocument/2006/customXml" ds:itemID="{9BF3BFED-8332-44D7-87FA-AF83EF4A9234}">
-  <ds:schemaRefs>
-    <ds:schemaRef ds:uri="http://schemas.microsoft.com/sharepoint/events"/>
-  </ds:schemaRefs>
-</ds:datastoreItem>
-</file>
-
-<file path=customXml/itemProps4.xml><?xml version="1.0" encoding="utf-8"?>
-<ds:datastoreItem xmlns:ds="http://schemas.openxmlformats.org/officeDocument/2006/customXml" ds:itemID="{FE6286F3-FFA3-49D9-B011-02550189FDEB}">
-  <ds:schemaRefs>
-    <ds:schemaRef ds:uri="http://schemas.microsoft.com/office/2006/metadata/properties"/>
-    <ds:schemaRef ds:uri="http://schemas.microsoft.com/office/infopath/2007/PartnerControls"/>
-    <ds:schemaRef ds:uri="d5759068-2af1-405f-8952-bba64d53795f"/>
-    <ds:schemaRef ds:uri="fc6929cc-5503-4d88-ab04-1ba5755a3b48"/>
-  </ds:schemaRefs>
-</ds:datastoreItem>
-</file>
-
-<file path=customXml/itemProps5.xml><?xml version="1.0" encoding="utf-8"?>
 <ds:datastoreItem xmlns:ds="http://schemas.openxmlformats.org/officeDocument/2006/customXml" ds:itemID="{D5F812A0-A3A2-4EE0-A6ED-E9877F3154D7}">
   <ds:schemaRefs>
     <ds:schemaRef ds:uri="http://schemas.microsoft.com/office/2006/metadata/contentType"/>
@@ -9715,4 +10792,31 @@
     <ds:schemaRef ds:uri="http://schemas.microsoft.com/internal/obd"/>
   </ds:schemaRefs>
 </ds:datastoreItem>
+</file>
+
+<file path=customXml/itemProps3.xml><?xml version="1.0" encoding="utf-8"?>
+<ds:datastoreItem xmlns:ds="http://schemas.openxmlformats.org/officeDocument/2006/customXml" ds:itemID="{FE6286F3-FFA3-49D9-B011-02550189FDEB}">
+  <ds:schemaRefs>
+    <ds:schemaRef ds:uri="http://schemas.microsoft.com/office/2006/metadata/properties"/>
+    <ds:schemaRef ds:uri="http://schemas.microsoft.com/office/infopath/2007/PartnerControls"/>
+    <ds:schemaRef ds:uri="d5759068-2af1-405f-8952-bba64d53795f"/>
+    <ds:schemaRef ds:uri="fc6929cc-5503-4d88-ab04-1ba5755a3b48"/>
+  </ds:schemaRefs>
+</ds:datastoreItem>
+</file>
+
+<file path=customXml/itemProps4.xml><?xml version="1.0" encoding="utf-8"?>
+<ds:datastoreItem xmlns:ds="http://schemas.openxmlformats.org/officeDocument/2006/customXml" ds:itemID="{9BF3BFED-8332-44D7-87FA-AF83EF4A9234}">
+  <ds:schemaRefs>
+    <ds:schemaRef ds:uri="http://schemas.microsoft.com/sharepoint/events"/>
+  </ds:schemaRefs>
+</ds:datastoreItem>
+</file>
+
+<file path=customXml/itemProps5.xml><?xml version="1.0" encoding="utf-8"?>
+<ds:datastoreItem xmlns:ds="http://schemas.openxmlformats.org/officeDocument/2006/customXml" ds:itemID="{1CA9BEE3-0228-47D5-9957-749897919E7C}">
+  <ds:schemaRefs>
+    <ds:schemaRef ds:uri="http://schemas.microsoft.com/sharepoint/v3/contenttype/forms"/>
+  </ds:schemaRefs>
+</ds:datastoreItem>
 </file>
</xml_diff>

<commit_message>
Major document rework, expanding references
</commit_message>
<xml_diff>
--- a/Submission/s479832 - AutomatingSafetyCriticalEngineering.docx
+++ b/Submission/s479832 - AutomatingSafetyCriticalEngineering.docx
@@ -714,13 +714,31 @@
         <w:t xml:space="preserve"> [1]</w:t>
       </w:r>
       <w:r>
-        <w:t xml:space="preserve"> against lifecycle artefacts, and supplementary standards (330, 331, 332..) are met. </w:t>
+        <w:t xml:space="preserve"> against lifecycle artefacts, and supplementary standards (330, 33</w:t>
+      </w:r>
+      <w:r>
+        <w:t>1</w:t>
+      </w:r>
+      <w:r>
+        <w:t>) [2, 3]</w:t>
+      </w:r>
+      <w:r>
+        <w:t xml:space="preserve"> </w:t>
+      </w:r>
+      <w:r>
+        <w:t xml:space="preserve">are met. </w:t>
       </w:r>
       <w:r>
         <w:t>The aforementioned objectives are scaled in effort, by the Design Assurance Level (DAL), where the level of evidence is required where software failure may lead to a catastrophic condition. Defence Standard 00-055 Part 1</w:t>
       </w:r>
       <w:r>
-        <w:t xml:space="preserve"> [2]</w:t>
+        <w:t xml:space="preserve"> [</w:t>
+      </w:r>
+      <w:r>
+        <w:t>4</w:t>
+      </w:r>
+      <w:r>
+        <w:t>]</w:t>
       </w:r>
       <w:r>
         <w:t xml:space="preserve"> defines </w:t>
@@ -738,7 +756,13 @@
         <w:t xml:space="preserve"> as an acceptable means of demonstrating compliance for the mitigation of such conditions. Further the FAA Advisory Circular 20-115D</w:t>
       </w:r>
       <w:r>
-        <w:t xml:space="preserve"> [3]</w:t>
+        <w:t xml:space="preserve"> [</w:t>
+      </w:r>
+      <w:r>
+        <w:t>5</w:t>
+      </w:r>
+      <w:r>
+        <w:t>]</w:t>
       </w:r>
       <w:r>
         <w:t xml:space="preserve"> substantiates </w:t>
@@ -982,7 +1006,22 @@
         <w:jc w:val="both"/>
       </w:pPr>
       <w:r>
-        <w:t>The necessary bi-directional traceability, requires a cohesive requirement decomposition, supported by through life trace management support, offered in toolsets such as SCADE. This lifecycle, when employed using an MBSE approach, is already optimised from an assurance perspective, as bounded credit for DO-331 can be claimed, via the vendor supplied KCG qualified code generation capability. This credit does not remove the burden of proof around requirement quality, model implementation correctness, or the satisfaction of objective based processes [4, 5].</w:t>
+        <w:t>The necessary bi-directional traceability, requires a cohesive requirement decomposition, supported by through life trace management support, offered in toolsets such as SCADE. This lifecycle, when employed using an MBSE approach, is already optimised from an assurance perspective, as bounded credit for DO-331 can be claimed, via the vendor supplied KCG qualified code generation capability. This credit does not remove the burden of proof around requirement quality, model implementation correctness, or the satisfaction of objective based processes [</w:t>
+      </w:r>
+      <w:r>
+        <w:t xml:space="preserve">3, </w:t>
+      </w:r>
+      <w:r>
+        <w:t>6</w:t>
+      </w:r>
+      <w:r>
+        <w:t xml:space="preserve">, </w:t>
+      </w:r>
+      <w:r>
+        <w:t>7</w:t>
+      </w:r>
+      <w:r>
+        <w:t>].</w:t>
       </w:r>
     </w:p>
     <w:p>
@@ -1001,13 +1040,25 @@
         <w:t xml:space="preserve"> process automation is therefore supported by the characteristics of the supportive standard, the work is structured, requirements driven and evidence rich in nature, relying upon deterministic toolsets to maintain a standardised approach to the delivery of artefacts.</w:t>
       </w:r>
       <w:r>
-        <w:t xml:space="preserve"> Large Language Models (LLMs) can ingest natural language, code and prompted context, while Retrieval Augmented Generation (RAG) can instead route responses through the projects corpus of information, rather than relying upon model parameters alone [6]. </w:t>
+        <w:t xml:space="preserve"> Large Language Models (LLMs) can ingest natural language, code and prompted context, while Retrieval Augmented Generation (RAG) can instead route responses through the projects corpus of information, rather than relying upon model parameters alone [</w:t>
+      </w:r>
+      <w:r>
+        <w:t>8</w:t>
+      </w:r>
+      <w:r>
+        <w:t xml:space="preserve">]. </w:t>
       </w:r>
       <w:r>
         <w:t>An extension of these approaches</w:t>
       </w:r>
       <w:r>
-        <w:t xml:space="preserve"> is agentic orchestration, where model instantiations can plan, use toolsets and coordinate highly specialised/constrained agents for the fulfilment of a task. The extent of agentic orchestration enables parallelised planning, development and review of lifecycle activities, with or without human supervision.</w:t>
+        <w:t xml:space="preserve"> is agentic orchestration, where model instantiations can plan, use toolsets and coordinate highly specialised/constrained agents for the fulfilment of a task</w:t>
+      </w:r>
+      <w:r>
+        <w:t xml:space="preserve"> [25]</w:t>
+      </w:r>
+      <w:r>
+        <w:t>. The extent of agentic orchestration enables parallelised planning, development and review of lifecycle activities, with or without human supervision.</w:t>
       </w:r>
     </w:p>
     <w:p>
@@ -1097,20 +1148,32 @@
         <w:jc w:val="both"/>
       </w:pPr>
       <w:r>
-        <w:t>Further, post deployment learning and even conversation context, can upset the determinism of answers and reduce repeatability. Should proper consideration not be given to hosting or security concerns, Intellectual Property (IP) or classified information could be exposed through logging, callbacks, adversarial prompting or poisoned retrieval methods/content.</w:t>
-      </w:r>
-    </w:p>
-    <w:p>
-      <w:pPr>
-        <w:jc w:val="both"/>
-      </w:pPr>
-    </w:p>
-    <w:p>
-      <w:pPr>
-        <w:jc w:val="both"/>
-      </w:pPr>
-      <w:r>
-        <w:t>On premises deployment allows for tighter control and mitigation of data disclosure/residency problems, however they introduce up front cost, maintenance and security commitments. Access to frontier models provides additional capability where tool integration, reasoning and parameter size is concerned, however such usage potentially risks unauthorised disclosure of export controlled, or otherwise classified information.</w:t>
+        <w:t>Further, post deployment learning and even conversation context, can upset the determinism of answers and reduce repeatability. Should proper consideration not be given to hosting or security concerns, Intellectual Property (IP) or classified information could be exposed through logging, callbacks, adversarial prompting or poisoned retrieval methods/content</w:t>
+      </w:r>
+      <w:r>
+        <w:t xml:space="preserve"> [21, 22, 27]</w:t>
+      </w:r>
+      <w:r>
+        <w:t>.</w:t>
+      </w:r>
+    </w:p>
+    <w:p>
+      <w:pPr>
+        <w:jc w:val="both"/>
+      </w:pPr>
+    </w:p>
+    <w:p>
+      <w:pPr>
+        <w:jc w:val="both"/>
+      </w:pPr>
+      <w:r>
+        <w:t>On premises deployment allows for tighter control and mitigation of data disclosure/residency problems, however they introduce up front cost, maintenance and security commitments</w:t>
+      </w:r>
+      <w:r>
+        <w:t xml:space="preserve"> [29]</w:t>
+      </w:r>
+      <w:r>
+        <w:t>. Access to frontier models provides additional capability where tool integration, reasoning and parameter size is concerned, however such usage potentially risks unauthorised disclosure of export controlled, or otherwise classified information.</w:t>
       </w:r>
       <w:r>
         <w:t xml:space="preserve"> It is recognised that any schedule level time savings can only be </w:t>
@@ -1161,10 +1224,31 @@
         <w:t xml:space="preserve"> (Proposed Issue 3)</w:t>
       </w:r>
       <w:r>
-        <w:t xml:space="preserve"> [7], whilst concerned with deployed AI, relies upon concepts such as operational domains/design domains, human factors, governance and safety cases, which is also applicable to the enablement piece. </w:t>
-      </w:r>
-      <w:r>
-        <w:t>EASA and MOD guidance provides useful governance and as such, their recommendations shall be adhered to where applicable, but DO-178C, DO-330 and DO-331 remain as the basis for assurance through Defence Standard 00-055 Part 1[2].</w:t>
+        <w:t xml:space="preserve"> [</w:t>
+      </w:r>
+      <w:r>
+        <w:t xml:space="preserve">24, </w:t>
+      </w:r>
+      <w:r>
+        <w:t>9</w:t>
+      </w:r>
+      <w:r>
+        <w:t xml:space="preserve">], whilst concerned with deployed AI, relies upon concepts such as operational domains/design domains, human factors, governance and safety cases, which is also applicable to the enablement piece. </w:t>
+      </w:r>
+      <w:r>
+        <w:t>EASA and MOD guidance provides useful governance and as such, their recommendations shall be adhered to where applicable, but DO-178C, DO-330 and DO-331 remain as the basis for assurance through Defence Standard 00-055 Part 1</w:t>
+      </w:r>
+      <w:r>
+        <w:t xml:space="preserve"> </w:t>
+      </w:r>
+      <w:r>
+        <w:t>[</w:t>
+      </w:r>
+      <w:r>
+        <w:t>1-5</w:t>
+      </w:r>
+      <w:r>
+        <w:t>].</w:t>
       </w:r>
     </w:p>
     <w:p>
@@ -1207,12 +1291,30 @@
         <w:t xml:space="preserve"> </w:t>
       </w:r>
       <w:r>
-        <w:t>tool qualification may not be required.</w:t>
+        <w:t>tool qualification may not be required</w:t>
+      </w:r>
+      <w:r>
+        <w:t xml:space="preserve"> [1,</w:t>
       </w:r>
       <w:r>
         <w:t xml:space="preserve"> </w:t>
       </w:r>
       <w:r>
+        <w:t>2,</w:t>
+      </w:r>
+      <w:r>
+        <w:t xml:space="preserve"> </w:t>
+      </w:r>
+      <w:r>
+        <w:t>5]</w:t>
+      </w:r>
+      <w:r>
+        <w:t>.</w:t>
+      </w:r>
+      <w:r>
+        <w:t xml:space="preserve"> </w:t>
+      </w:r>
+      <w:r>
         <w:t>The cost and engineering ability required to perform such review</w:t>
       </w:r>
       <w:r>
@@ -1255,7 +1357,19 @@
         <w:t xml:space="preserve"> </w:t>
       </w:r>
       <w:r>
-        <w:t>[4].</w:t>
+        <w:t>[</w:t>
+      </w:r>
+      <w:r>
+        <w:t>3,</w:t>
+      </w:r>
+      <w:r>
+        <w:t xml:space="preserve"> </w:t>
+      </w:r>
+      <w:r>
+        <w:t>6</w:t>
+      </w:r>
+      <w:r>
+        <w:t>].</w:t>
       </w:r>
     </w:p>
     <w:p/>
@@ -1292,7 +1406,13 @@
         <w:t>A bias towards automation can cause a tendency to omit information or contrary evidence, primarily whilst under pressure, workload or when using poorly defined performance metrics</w:t>
       </w:r>
       <w:r>
-        <w:t xml:space="preserve"> [8].</w:t>
+        <w:t xml:space="preserve"> [</w:t>
+      </w:r>
+      <w:r>
+        <w:t>10</w:t>
+      </w:r>
+      <w:r>
+        <w:t>].</w:t>
       </w:r>
     </w:p>
     <w:p>
@@ -1421,7 +1541,16 @@
         <w:t xml:space="preserve"> defined processes, requiring the correct documentation, review and testing of software, across a structured lifecycle. The standards next releas</w:t>
       </w:r>
       <w:r>
-        <w:t>es D0178B and D0178C, shifted to promote compliance to objectives (themselves split according to Design Assurance Levels (DAL), through the collection and demonstration of evidence, defined in plans and standards, which are defined to meet D0178Cs objectives.</w:t>
+        <w:t>es D0178B and D0178C, shifted to promote compliance to objectives (themselves split according to Design Assurance Levels (DAL), through the collection and demonstration of evidence, defined in plans and standards, which are defined to meet D0178Cs objectives</w:t>
+      </w:r>
+      <w:r>
+        <w:t xml:space="preserve"> </w:t>
+      </w:r>
+      <w:r>
+        <w:t>[1, 5]</w:t>
+      </w:r>
+      <w:r>
+        <w:t>.</w:t>
       </w:r>
     </w:p>
     <w:p/>
@@ -1511,11 +1640,19 @@
       <w:pPr>
         <w:jc w:val="both"/>
       </w:pPr>
+    </w:p>
+    <w:p>
+      <w:pPr>
+        <w:jc w:val="both"/>
+      </w:pPr>
       <w:r>
         <w:t>As a result, high integrity software, would see the greatest cost savings, from complete automation, yet incurs the highest potential penalty, as a consequence of failure in the loss of human life.</w:t>
       </w:r>
       <w:r>
-        <w:t xml:space="preserve"> For this reason, the integration of AI/ML into the domain of safety critical software engineering, is rife with concern and scepticism. As it currently stands, no established means of compliance, for deployed AI/ML has been agreed by the military certification authorities. Ongoing work maintains a position of caution, advising against Level 3 (fully autonomous/human out of the loop) operation.</w:t>
+        <w:t xml:space="preserve"> For this reason, the integration of AI/ML into the domain of safety critical software engineering, is rife with concern and scepticism. As it currently stands, no established means of compliance, for deployed AI/ML has been agreed by the military certification authorities. Ongoing work maintains a position of caution, advising against Level 3 (fully autonomous/human out of the loop) operation</w:t>
+      </w:r>
+      <w:r>
+        <w:t xml:space="preserve"> [9, 23]</w:t>
       </w:r>
     </w:p>
     <w:p>
@@ -1577,7 +1714,13 @@
         <w:t>observed</w:t>
       </w:r>
       <w:r>
-        <w:t xml:space="preserve"> as fact [6]. For any LLM exploitation in a safety critical context, an increased level of logging</w:t>
+        <w:t xml:space="preserve"> as fact [</w:t>
+      </w:r>
+      <w:r>
+        <w:t>8</w:t>
+      </w:r>
+      <w:r>
+        <w:t>]. For any LLM exploitation in a safety critical context, an increased level of logging</w:t>
       </w:r>
       <w:r>
         <w:t xml:space="preserve"> should be performed. T</w:t>
@@ -1610,7 +1753,13 @@
         <w:t xml:space="preserve"> group</w:t>
       </w:r>
       <w:r>
-        <w:t xml:space="preserve"> [9]. Despite this, a randomised study querying </w:t>
+        <w:t xml:space="preserve"> [</w:t>
+      </w:r>
+      <w:r>
+        <w:t>11</w:t>
+      </w:r>
+      <w:r>
+        <w:t xml:space="preserve">]. Despite this, a randomised study querying </w:t>
       </w:r>
       <w:r>
         <w:t>open-source</w:t>
@@ -1622,7 +1771,13 @@
         <w:t>contradicting expected</w:t>
       </w:r>
       <w:r>
-        <w:t xml:space="preserve"> increases in productivity, which were higher [10]. These results indicate that AI excels at greenfield programming tasks, whereas additional reasoning and context is required to parse and measurably improve a highly optimised code base, which is an expected outcome. </w:t>
+        <w:t xml:space="preserve"> increases in productivity, which were higher [1</w:t>
+      </w:r>
+      <w:r>
+        <w:t>2</w:t>
+      </w:r>
+      <w:r>
+        <w:t xml:space="preserve">]. These results indicate that AI excels at greenfield programming tasks, whereas additional reasoning and context is required to parse and measurably improve a highly optimised code base, which is an expected outcome. </w:t>
       </w:r>
       <w:r>
         <w:t>Indeed,</w:t>
@@ -1648,7 +1803,13 @@
         <w:jc w:val="both"/>
       </w:pPr>
       <w:r>
-        <w:t>Quality focused studies on LLM enabled development, purport wider potential dangers. Perry et al [11]</w:t>
+        <w:t>Quality focused studies on LLM enabled development, purport wider potential dangers. Perry et al [1</w:t>
+      </w:r>
+      <w:r>
+        <w:t>3</w:t>
+      </w:r>
+      <w:r>
+        <w:t>]</w:t>
       </w:r>
       <w:r>
         <w:t xml:space="preserve"> found participants in a study produced less secure solutions for a given task, whilst exhibiting more confidence in the security and correctness of their implementation. Reasoning ability in models, is not enough to infer the additional context or instruction, where poor prompting or key details are omitted, in a safety critical context. Model knowledge of planning and standards documentation and all pertinent requirements is not enough to confirm usage, orchestration or ‘master-prompting’ must be used to ensure the context window contains the complete extent of information pertinent to any task. NASA</w:t>
@@ -1657,7 +1818,19 @@
         <w:t>’</w:t>
       </w:r>
       <w:r>
-        <w:t>s review of LLM usage in assurance case argument composition indicated available studies do not demonstrate general efficacy in the production of complete safety arguments, in comparison with human produced examples, with time and cost savings being compromised by rework cycles [12].</w:t>
+        <w:t>s review of LLM usage in assurance case argument composition indicated available studies do not demonstrate general efficacy in the production of complete safety arguments, in comparison with human produced examples, with time and cost savings being compromised by rework cycles [</w:t>
+      </w:r>
+      <w:r>
+        <w:t xml:space="preserve">13, </w:t>
+      </w:r>
+      <w:r>
+        <w:t>1</w:t>
+      </w:r>
+      <w:r>
+        <w:t>4</w:t>
+      </w:r>
+      <w:r>
+        <w:t>].</w:t>
       </w:r>
     </w:p>
     <w:p>
@@ -1750,13 +1923,22 @@
         <w:t xml:space="preserve"> study</w:t>
       </w:r>
       <w:r>
-        <w:t xml:space="preserve"> [13]</w:t>
+        <w:t xml:space="preserve"> [1</w:t>
+      </w:r>
+      <w:r>
+        <w:t>5</w:t>
+      </w:r>
+      <w:r>
+        <w:t>]</w:t>
       </w:r>
       <w:r>
         <w:t xml:space="preserve"> found the best agentic model only resolved 1.96% of 2294 issues, in contrast localisation-repair-validation approaches have achieved a 32% completion rate, against the</w:t>
       </w:r>
       <w:r>
-        <w:t xml:space="preserve"> comparable ‘SWE-bench Lite’ benchmark.</w:t>
+        <w:t xml:space="preserve"> comparable ‘SWE-bench Lite’ benchmark</w:t>
+      </w:r>
+      <w:r>
+        <w:t xml:space="preserve"> [16].</w:t>
       </w:r>
       <w:r>
         <w:t xml:space="preserve"> </w:t>
@@ -1822,7 +2004,19 @@
         <w:jc w:val="both"/>
       </w:pPr>
       <w:r>
-        <w:t>It is evident that the tools necessary to permit agentic interaction within a local machine, exist and are freely available. Orchestration frameworks such as MetaGPT and ChatDev organise model instances into roles, for the coordination and parallelisation of tasks, resembling a deployed software engineering team. It is this similarity, which has in part prompted an investigation into the optimal structure of an agentic software team</w:t>
+        <w:t>It is evident that the tools necessary to permit agentic interaction within a local machine, exist and are freely available. Orchestration frameworks such as MetaGPT</w:t>
+      </w:r>
+      <w:r>
+        <w:t xml:space="preserve"> [17]</w:t>
+      </w:r>
+      <w:r>
+        <w:t xml:space="preserve"> and ChatDev</w:t>
+      </w:r>
+      <w:r>
+        <w:t xml:space="preserve"> [18]</w:t>
+      </w:r>
+      <w:r>
+        <w:t xml:space="preserve"> organise model instances into roles, for the coordination and parallelisation of tasks, resembling a deployed software engineering team. It is this similarity, which has in part prompted an investigation into the optimal structure of an agentic software team</w:t>
       </w:r>
       <w:r>
         <w:t xml:space="preserve">. </w:t>
@@ -1914,6 +2108,9 @@
         <w:t>s</w:t>
       </w:r>
       <w:r>
+        <w:t xml:space="preserve"> [19]</w:t>
+      </w:r>
+      <w:r>
         <w:t xml:space="preserve">, </w:t>
       </w:r>
       <w:r>
@@ -1926,10 +2123,13 @@
         <w:t xml:space="preserve"> or sandbox</w:t>
       </w:r>
       <w:r>
-        <w:t>. This allocated aligns with the expected initiation of agentic action, as the fulfilment of a prior action, would trigger agentic execution of the next sequentially blocked item, such a virtual machine would then be created, to permit the execution of the task in a safe environment. NIST defines data governance restrictions which shall be followed in any further deployment of this framework [1</w:t>
-      </w:r>
-      <w:r>
-        <w:t>4</w:t>
+        <w:t xml:space="preserve"> [21, 22, 27]</w:t>
+      </w:r>
+      <w:r>
+        <w:t>. This allocated aligns with the expected initiation of agentic action, as the fulfilment of a prior action, would trigger agentic execution of the next sequentially blocked item, such a virtual machine would then be created, to permit the execution of the task in a safe environment. NIST defines data governance restrictions which shall be followed in any further deployment of this framework [</w:t>
+      </w:r>
+      <w:r>
+        <w:t>21</w:t>
       </w:r>
       <w:r>
         <w:t>].</w:t>
@@ -1962,10 +2162,10 @@
         <w:t xml:space="preserve">development practices to generative AI and model-dependent systems </w:t>
       </w:r>
       <w:r>
-        <w:t>[1</w:t>
-      </w:r>
-      <w:r>
-        <w:t>5</w:t>
+        <w:t>[</w:t>
+      </w:r>
+      <w:r>
+        <w:t>22</w:t>
       </w:r>
       <w:r>
         <w:t>].</w:t>
@@ -2046,7 +2246,13 @@
         <w:t xml:space="preserve">The proposed </w:t>
       </w:r>
       <w:r>
-        <w:t>EASA’s AI Concept Paper [7]</w:t>
+        <w:t>EASA’s AI Concept Paper [</w:t>
+      </w:r>
+      <w:r>
+        <w:t>9</w:t>
+      </w:r>
+      <w:r>
+        <w:t>]</w:t>
       </w:r>
       <w:r>
         <w:t xml:space="preserve"> defines an approach to software assurance based upon the satisfactory consideration of concepts such as operational and design domains, learning assurance, explainability, risk mitigation and human factors.</w:t>
@@ -2070,7 +2276,19 @@
         <w:t xml:space="preserve"> similar considerations, including defined operational domains, learning related assessments and architectural mitigation of risk</w:t>
       </w:r>
       <w:r>
-        <w:t xml:space="preserve"> (deterministic bounding/failsafe operation) [16]. The MOD published JSP-936, requires departmental and defence contractor adherence to governance around attributability, through life risk management and dependability assessments. All 3 of these publications support the utilisation of AI, but recognise the need for additional verification across varying characteristics of operation. The provision of such verification evidence requires modification to the traditional FEL, such that these activities can be costed and accounted for during scheduling. </w:t>
+        <w:t xml:space="preserve"> (deterministic bounding/failsafe operation) [</w:t>
+      </w:r>
+      <w:r>
+        <w:t>23</w:t>
+      </w:r>
+      <w:r>
+        <w:t>]. The MOD published JSP-936</w:t>
+      </w:r>
+      <w:r>
+        <w:t xml:space="preserve"> [24]</w:t>
+      </w:r>
+      <w:r>
+        <w:t xml:space="preserve">, requires departmental and defence contractor adherence to governance around attributability, through life risk management and dependability assessments. All 3 of these publications support the utilisation of AI, but recognise the need for additional verification across varying characteristics of operation. The provision of such verification evidence requires modification to the traditional FEL, such that these activities can be costed and accounted for during scheduling. </w:t>
       </w:r>
     </w:p>
     <w:p>
@@ -2093,7 +2311,13 @@
         <w:t xml:space="preserve"> </w:t>
       </w:r>
       <w:r>
-        <w:t>which safety critical software development already achieves through satisfaction of Def Stan 00-055 [2], and by extension DO-178C</w:t>
+        <w:t>which safety critical software development already achieves through satisfaction of Def Stan 00-055 [</w:t>
+      </w:r>
+      <w:r>
+        <w:t>4</w:t>
+      </w:r>
+      <w:r>
+        <w:t>], and by extension DO-178C</w:t>
       </w:r>
       <w:r>
         <w:t xml:space="preserve"> [1]</w:t>
@@ -2123,7 +2347,13 @@
         <w:t xml:space="preserve">Parasuraman and Manzey </w:t>
       </w:r>
       <w:r>
-        <w:t>[8]</w:t>
+        <w:t>[</w:t>
+      </w:r>
+      <w:r>
+        <w:t>10</w:t>
+      </w:r>
+      <w:r>
+        <w:t>]</w:t>
       </w:r>
       <w:r>
         <w:t xml:space="preserve"> distinguish commission errors, where an incorrect automation recommendation is followed, from omission errors, where contradictory information is not sought.</w:t>
@@ -2233,7 +2463,13 @@
         <w:t xml:space="preserve">, is a complete deployment and benchmarking of DO-178C compliant, MBSE integrated, LLM enabled processes, which are themselves extensible to use in an agentic </w:t>
       </w:r>
       <w:r>
-        <w:t>orchestration.</w:t>
+        <w:t>orchestration</w:t>
+      </w:r>
+      <w:r>
+        <w:t xml:space="preserve"> [14-18]</w:t>
+      </w:r>
+      <w:r>
+        <w:t>.</w:t>
       </w:r>
       <w:r>
         <w:t xml:space="preserve"> The suggested approach separates the requirement for physical certification credit, from the engineering effort required to achieve the desired outcomes, therefore a reduced software implementation benchmark must be considered.</w:t>
@@ -6161,10 +6397,22 @@
         <w:t xml:space="preserve"> </w:t>
       </w:r>
       <w:r>
-        <w:t>Pang et al.</w:t>
-      </w:r>
-      <w:r>
-        <w:t xml:space="preserve"> [9]</w:t>
+        <w:t>P</w:t>
+      </w:r>
+      <w:r>
+        <w:t>e</w:t>
+      </w:r>
+      <w:r>
+        <w:t>ng et al.</w:t>
+      </w:r>
+      <w:r>
+        <w:t xml:space="preserve"> [</w:t>
+      </w:r>
+      <w:r>
+        <w:t>11</w:t>
+      </w:r>
+      <w:r>
+        <w:t>]</w:t>
       </w:r>
       <w:r>
         <w:t xml:space="preserve"> identified a 55.8% reduced completion time, but for a non comparative project scope, Cui et al</w:t>
@@ -6176,7 +6424,13 @@
         <w:t>, identified a 26.08% increase across comparable workspaces, but it must be recognised that acceleration of output does not indicate faster acceptance or review</w:t>
       </w:r>
       <w:r>
-        <w:t>, as identified by Perry et al [11].</w:t>
+        <w:t>, as identified by Perry et al [1</w:t>
+      </w:r>
+      <w:r>
+        <w:t>3</w:t>
+      </w:r>
+      <w:r>
+        <w:t>].</w:t>
       </w:r>
       <w:r>
         <w:t xml:space="preserve"> Should planned benefit be realised without considerable integration/accuracy/performance challenges, the ‘Steady Progression’ timings apply, ‘Validated Use’ considers time allocated for rework cycles, given </w:t>
@@ -6188,7 +6442,19 @@
         <w:t xml:space="preserve"> partial acceleration of artefact implementation/reviewing</w:t>
       </w:r>
       <w:r>
-        <w:t xml:space="preserve"> [9,10]</w:t>
+        <w:t xml:space="preserve"> [</w:t>
+      </w:r>
+      <w:r>
+        <w:t>11</w:t>
+      </w:r>
+      <w:r>
+        <w:t>,1</w:t>
+      </w:r>
+      <w:r>
+        <w:t>2</w:t>
+      </w:r>
+      <w:r>
+        <w:t>]</w:t>
       </w:r>
       <w:r>
         <w:t>.</w:t>
@@ -6410,11 +6676,6 @@
     </w:tbl>
     <w:p>
       <w:pPr>
-        <w:jc w:val="both"/>
-      </w:pPr>
-    </w:p>
-    <w:p>
-      <w:pPr>
         <w:pStyle w:val="Caption"/>
         <w:spacing w:after="0"/>
         <w:jc w:val="center"/>
@@ -6853,6 +7114,96 @@
         <w:spacing w:before="26"/>
       </w:pPr>
       <w:r>
+        <w:t xml:space="preserve">RTCA (2011b) </w:t>
+      </w:r>
+      <w:r>
+        <w:rPr>
+          <w:i/>
+          <w:iCs/>
+        </w:rPr>
+        <w:t>DO-330: Software Tool Qualification Considerations</w:t>
+      </w:r>
+      <w:r>
+        <w:t xml:space="preserve">. Washington, DC: RTCA, Inc. Available at: </w:t>
+      </w:r>
+      <w:hyperlink r:id="rId21" w:tgtFrame="_new" w:history="1">
+        <w:r>
+          <w:rPr>
+            <w:rStyle w:val="Hyperlink"/>
+          </w:rPr>
+          <w:t>RTCA DO-330</w:t>
+        </w:r>
+      </w:hyperlink>
+      <w:r>
+        <w:t>.</w:t>
+      </w:r>
+    </w:p>
+    <w:p>
+      <w:pPr>
+        <w:pStyle w:val="ListParagraph"/>
+        <w:numPr>
+          <w:ilvl w:val="0"/>
+          <w:numId w:val="0"/>
+        </w:numPr>
+        <w:spacing w:before="26"/>
+        <w:ind w:left="1080"/>
+      </w:pPr>
+    </w:p>
+    <w:p>
+      <w:pPr>
+        <w:pStyle w:val="ListParagraph"/>
+        <w:numPr>
+          <w:ilvl w:val="0"/>
+          <w:numId w:val="10"/>
+        </w:numPr>
+        <w:spacing w:before="26"/>
+      </w:pPr>
+      <w:r>
+        <w:t xml:space="preserve">RTCA (2011c) </w:t>
+      </w:r>
+      <w:r>
+        <w:rPr>
+          <w:i/>
+          <w:iCs/>
+        </w:rPr>
+        <w:t>DO-331: Model-Based Development and Verification Supplement to DO-178C and DO-278A</w:t>
+      </w:r>
+      <w:r>
+        <w:t xml:space="preserve">. Washington, DC: RTCA, Inc. See: </w:t>
+      </w:r>
+      <w:hyperlink r:id="rId22" w:tgtFrame="_new" w:history="1">
+        <w:r>
+          <w:rPr>
+            <w:rStyle w:val="Hyperlink"/>
+          </w:rPr>
+          <w:t>FAA recognition of DO-331</w:t>
+        </w:r>
+      </w:hyperlink>
+      <w:r>
+        <w:t>.</w:t>
+      </w:r>
+    </w:p>
+    <w:p>
+      <w:pPr>
+        <w:pStyle w:val="ListParagraph"/>
+        <w:numPr>
+          <w:ilvl w:val="0"/>
+          <w:numId w:val="0"/>
+        </w:numPr>
+        <w:spacing w:before="26"/>
+        <w:ind w:left="1080"/>
+      </w:pPr>
+    </w:p>
+    <w:p>
+      <w:pPr>
+        <w:pStyle w:val="ListParagraph"/>
+        <w:numPr>
+          <w:ilvl w:val="0"/>
+          <w:numId w:val="10"/>
+        </w:numPr>
+        <w:spacing w:before="26"/>
+      </w:pPr>
+      <w:r>
         <w:t xml:space="preserve">Ministry of Defence (2021) </w:t>
       </w:r>
       <w:r>
@@ -6901,7 +7252,7 @@
       <w:r>
         <w:t xml:space="preserve">. Washington, DC: FAA. Available at: </w:t>
       </w:r>
-      <w:hyperlink r:id="rId21" w:tgtFrame="_new" w:history="1">
+      <w:hyperlink r:id="rId23" w:tgtFrame="_new" w:history="1">
         <w:r>
           <w:rPr>
             <w:rStyle w:val="Hyperlink"/>
@@ -6932,7 +7283,7 @@
       <w:r>
         <w:t xml:space="preserve">Ansys (2025a) ‘Efficient Development of Safe Avionics Software with DO-178C Objectives Using SCADE Suite’, 9 April. Available at: </w:t>
       </w:r>
-      <w:hyperlink r:id="rId22" w:tgtFrame="_new" w:history="1">
+      <w:hyperlink r:id="rId24" w:tgtFrame="_new" w:history="1">
         <w:r>
           <w:rPr>
             <w:rStyle w:val="Hyperlink"/>
@@ -6963,7 +7314,7 @@
       <w:r>
         <w:t xml:space="preserve">Ansys (2025b) ‘Efficient Verification of Safe Avionics Software with DO-178C Objectives Using SCADE Suite’, 19 May. Available at: </w:t>
       </w:r>
-      <w:hyperlink r:id="rId23" w:tgtFrame="_new" w:history="1">
+      <w:hyperlink r:id="rId25" w:tgtFrame="_new" w:history="1">
         <w:r>
           <w:rPr>
             <w:rStyle w:val="Hyperlink"/>
@@ -7003,7 +7354,7 @@
       <w:r>
         <w:t xml:space="preserve">, 33, pp. 9459–9474. Available at: </w:t>
       </w:r>
-      <w:hyperlink r:id="rId24" w:tgtFrame="_new" w:history="1">
+      <w:hyperlink r:id="rId26" w:tgtFrame="_new" w:history="1">
         <w:r>
           <w:rPr>
             <w:rStyle w:val="Hyperlink"/>
@@ -7046,7 +7397,7 @@
       <w:r>
         <w:t xml:space="preserve">. Cologne: EASA. Available at: </w:t>
       </w:r>
-      <w:hyperlink r:id="rId25" w:tgtFrame="_new" w:history="1">
+      <w:hyperlink r:id="rId27" w:tgtFrame="_new" w:history="1">
         <w:r>
           <w:rPr>
             <w:rStyle w:val="Hyperlink"/>
@@ -7090,7 +7441,7 @@
       <w:r>
         <w:t xml:space="preserve">, 52(3), pp. 381–410. </w:t>
       </w:r>
-      <w:hyperlink r:id="rId26" w:tgtFrame="_new" w:history="1">
+      <w:hyperlink r:id="rId28" w:tgtFrame="_new" w:history="1">
         <w:r>
           <w:rPr>
             <w:rStyle w:val="Hyperlink"/>
@@ -7124,7 +7475,7 @@
       <w:r>
         <w:t xml:space="preserve">Peng, S., Kalliamvakou, E., Cihon, P. and Demirer, M. (2023) ‘The Impact of AI on Developer Productivity: Evidence from GitHub Copilot’, arXiv:2302.06590. Available at: </w:t>
       </w:r>
-      <w:hyperlink r:id="rId27" w:tgtFrame="_new" w:history="1">
+      <w:hyperlink r:id="rId29" w:tgtFrame="_new" w:history="1">
         <w:r>
           <w:rPr>
             <w:rStyle w:val="Hyperlink"/>
@@ -7158,7 +7509,7 @@
       <w:r>
         <w:t xml:space="preserve">Becker, J., Rush, N., Barnes, E. and Rein, D. (2025) ‘Measuring the Impact of Early-2025 AI on Experienced Open-Source Developer Productivity’, arXiv:2507.09089. Available at: </w:t>
       </w:r>
-      <w:hyperlink r:id="rId28" w:tgtFrame="_new" w:history="1">
+      <w:hyperlink r:id="rId30" w:tgtFrame="_new" w:history="1">
         <w:r>
           <w:rPr>
             <w:rStyle w:val="Hyperlink"/>
@@ -7201,7 +7552,7 @@
       <w:r>
         <w:t xml:space="preserve">. </w:t>
       </w:r>
-      <w:hyperlink r:id="rId29" w:tgtFrame="_new" w:history="1">
+      <w:hyperlink r:id="rId31" w:tgtFrame="_new" w:history="1">
         <w:r>
           <w:rPr>
             <w:rStyle w:val="Hyperlink"/>
@@ -7233,6 +7584,7 @@
         <w:spacing w:before="26"/>
       </w:pPr>
       <w:r>
+        <w:lastRenderedPageBreak/>
         <w:t xml:space="preserve">Graydon, M.S. and Lehman, S.M. (2025) </w:t>
       </w:r>
       <w:r>
@@ -7244,7 +7596,7 @@
       <w:r>
         <w:t xml:space="preserve">. NASA/TM-20250001849. Hampton, VA: NASA. Available at: </w:t>
       </w:r>
-      <w:hyperlink r:id="rId30" w:tgtFrame="_new" w:history="1">
+      <w:hyperlink r:id="rId32" w:tgtFrame="_new" w:history="1">
         <w:r>
           <w:rPr>
             <w:rStyle w:val="Hyperlink"/>
@@ -7282,13 +7634,12 @@
         <w:rPr>
           <w:rStyle w:val="Emphasis"/>
         </w:rPr>
-        <w:lastRenderedPageBreak/>
         <w:t>Proceedings of the Twelfth International Conference on Learning Representations</w:t>
       </w:r>
       <w:r>
         <w:t xml:space="preserve">. Available at: </w:t>
       </w:r>
-      <w:hyperlink r:id="rId31" w:tgtFrame="_new" w:history="1">
+      <w:hyperlink r:id="rId33" w:tgtFrame="_new" w:history="1">
         <w:r>
           <w:rPr>
             <w:rStyle w:val="Hyperlink"/>
@@ -7326,19 +7677,221 @@
         <w:spacing w:before="26"/>
       </w:pPr>
       <w:r>
-        <w:t xml:space="preserve">National Institute of Standards and Technology (2024a) </w:t>
+        <w:t xml:space="preserve">Xia, C.S., Deng, Y., Dunn, S. and Zhang, L. (2025) ‘Agentless: Demystifying LLM-based Software Engineering Agents’, </w:t>
       </w:r>
       <w:r>
         <w:rPr>
           <w:i/>
           <w:iCs/>
         </w:rPr>
+        <w:t>Proceedings of the 33rd ACM SIGSOFT International Symposium on the Foundations of Software Engineering</w:t>
+      </w:r>
+      <w:r>
+        <w:t xml:space="preserve">. Available at: </w:t>
+      </w:r>
+      <w:hyperlink r:id="rId34" w:tgtFrame="_new" w:history="1">
+        <w:r>
+          <w:rPr>
+            <w:rStyle w:val="Hyperlink"/>
+          </w:rPr>
+          <w:t>arXiv:2407.01489</w:t>
+        </w:r>
+      </w:hyperlink>
+      <w:r>
+        <w:t>.</w:t>
+      </w:r>
+    </w:p>
+    <w:p>
+      <w:pPr>
+        <w:pStyle w:val="ListParagraph"/>
+        <w:numPr>
+          <w:ilvl w:val="0"/>
+          <w:numId w:val="0"/>
+        </w:numPr>
+        <w:ind w:left="714"/>
+      </w:pPr>
+    </w:p>
+    <w:p>
+      <w:pPr>
+        <w:pStyle w:val="ListParagraph"/>
+        <w:numPr>
+          <w:ilvl w:val="0"/>
+          <w:numId w:val="10"/>
+        </w:numPr>
+        <w:spacing w:before="26"/>
+      </w:pPr>
+      <w:r>
+        <w:t xml:space="preserve">Hong, S. et al. (2024) ‘MetaGPT: Meta Programming for a Multi-Agent Collaborative Framework’, </w:t>
+      </w:r>
+      <w:r>
+        <w:rPr>
+          <w:i/>
+          <w:iCs/>
+        </w:rPr>
+        <w:t>Proceedings of the Twelfth International Conference on Learning Representations</w:t>
+      </w:r>
+      <w:r>
+        <w:t xml:space="preserve">. Available at: </w:t>
+      </w:r>
+      <w:hyperlink r:id="rId35" w:tgtFrame="_new" w:history="1">
+        <w:r>
+          <w:rPr>
+            <w:rStyle w:val="Hyperlink"/>
+          </w:rPr>
+          <w:t>arXiv:2308.00352</w:t>
+        </w:r>
+      </w:hyperlink>
+      <w:r>
+        <w:t>.</w:t>
+      </w:r>
+    </w:p>
+    <w:p>
+      <w:pPr>
+        <w:pStyle w:val="ListParagraph"/>
+        <w:numPr>
+          <w:ilvl w:val="0"/>
+          <w:numId w:val="0"/>
+        </w:numPr>
+        <w:spacing w:before="26"/>
+        <w:ind w:left="1080"/>
+      </w:pPr>
+    </w:p>
+    <w:p>
+      <w:pPr>
+        <w:pStyle w:val="ListParagraph"/>
+        <w:numPr>
+          <w:ilvl w:val="0"/>
+          <w:numId w:val="10"/>
+        </w:numPr>
+        <w:spacing w:before="26"/>
+      </w:pPr>
+      <w:r>
+        <w:t xml:space="preserve">Qian, C. et al. (2024) ‘ChatDev: Communicative Agents for Software Development’, </w:t>
+      </w:r>
+      <w:r>
+        <w:rPr>
+          <w:i/>
+          <w:iCs/>
+        </w:rPr>
+        <w:t>Proceedings of the 62nd Annual Meeting of the Association for Computational Linguistics</w:t>
+      </w:r>
+      <w:r>
+        <w:t xml:space="preserve">, 1, pp. 15174–15186. Available at: </w:t>
+      </w:r>
+      <w:hyperlink r:id="rId36" w:tgtFrame="_new" w:history="1">
+        <w:r>
+          <w:rPr>
+            <w:rStyle w:val="Hyperlink"/>
+          </w:rPr>
+          <w:t>arXiv:2307.07924</w:t>
+        </w:r>
+      </w:hyperlink>
+      <w:r>
+        <w:t>.</w:t>
+      </w:r>
+    </w:p>
+    <w:p>
+      <w:pPr>
+        <w:pStyle w:val="ListParagraph"/>
+        <w:numPr>
+          <w:ilvl w:val="0"/>
+          <w:numId w:val="0"/>
+        </w:numPr>
+        <w:spacing w:before="26"/>
+        <w:ind w:left="1080"/>
+      </w:pPr>
+    </w:p>
+    <w:p>
+      <w:pPr>
+        <w:pStyle w:val="ListParagraph"/>
+        <w:numPr>
+          <w:ilvl w:val="0"/>
+          <w:numId w:val="10"/>
+        </w:numPr>
+        <w:spacing w:before="26"/>
+      </w:pPr>
+      <w:r>
+        <w:t xml:space="preserve">Ansys (2024) ‘Using the SCADE Python APIs from Your Favorite IDE’, 3 January. Available at: </w:t>
+      </w:r>
+      <w:hyperlink r:id="rId37" w:tgtFrame="_new" w:history="1">
+        <w:r>
+          <w:rPr>
+            <w:rStyle w:val="Hyperlink"/>
+          </w:rPr>
+          <w:t>Ansys Knowledge</w:t>
+        </w:r>
+      </w:hyperlink>
+      <w:r>
+        <w:t>.</w:t>
+      </w:r>
+    </w:p>
+    <w:p>
+      <w:pPr>
+        <w:pStyle w:val="ListParagraph"/>
+        <w:numPr>
+          <w:ilvl w:val="0"/>
+          <w:numId w:val="0"/>
+        </w:numPr>
+        <w:spacing w:before="26"/>
+        <w:ind w:left="1080"/>
+      </w:pPr>
+    </w:p>
+    <w:p>
+      <w:pPr>
+        <w:pStyle w:val="ListParagraph"/>
+        <w:numPr>
+          <w:ilvl w:val="0"/>
+          <w:numId w:val="10"/>
+        </w:numPr>
+        <w:spacing w:before="26"/>
+      </w:pPr>
+      <w:r>
+        <w:t xml:space="preserve">Cui, K.Z., Demirer, M., Jaffe, S., Musolff, L., Peng, S. and Salz, T. (2026) ‘The Effects of Generative AI on High-Skilled Work: Evidence from Three Field Experiments with Software Developers’, </w:t>
+      </w:r>
+      <w:r>
+        <w:rPr>
+          <w:i/>
+          <w:iCs/>
+        </w:rPr>
+        <w:t>Management Science</w:t>
+      </w:r>
+      <w:r>
+        <w:t>, advance online publication. doi:10.1287/mnsc.2025.00535.</w:t>
+      </w:r>
+    </w:p>
+    <w:p>
+      <w:pPr>
+        <w:pStyle w:val="ListParagraph"/>
+        <w:numPr>
+          <w:ilvl w:val="0"/>
+          <w:numId w:val="0"/>
+        </w:numPr>
+        <w:ind w:left="714"/>
+      </w:pPr>
+    </w:p>
+    <w:p>
+      <w:pPr>
+        <w:pStyle w:val="ListParagraph"/>
+        <w:numPr>
+          <w:ilvl w:val="0"/>
+          <w:numId w:val="10"/>
+        </w:numPr>
+        <w:spacing w:before="26"/>
+      </w:pPr>
+      <w:r>
+        <w:t xml:space="preserve">National Institute of Standards and Technology (2024a) </w:t>
+      </w:r>
+      <w:r>
+        <w:rPr>
+          <w:i/>
+          <w:iCs/>
+        </w:rPr>
         <w:t>Artificial Intelligence Risk Management Framework: Generative Artificial Intelligence Profile</w:t>
       </w:r>
       <w:r>
         <w:t xml:space="preserve">. NIST AI 600-1. Gaithersburg, MD: NIST. Available at: </w:t>
       </w:r>
-      <w:hyperlink r:id="rId32" w:tgtFrame="_new" w:history="1">
+      <w:hyperlink r:id="rId38" w:tgtFrame="_new" w:history="1">
         <w:r>
           <w:rPr>
             <w:rStyle w:val="Hyperlink"/>
@@ -7382,7 +7935,7 @@
       <w:r>
         <w:t xml:space="preserve">. NIST SP 800-218A. Gaithersburg, MD: NIST. </w:t>
       </w:r>
-      <w:hyperlink r:id="rId33" w:tgtFrame="_new" w:history="1">
+      <w:hyperlink r:id="rId39" w:tgtFrame="_new" w:history="1">
         <w:r>
           <w:rPr>
             <w:rStyle w:val="Hyperlink"/>
@@ -7426,7 +7979,7 @@
       <w:r>
         <w:t xml:space="preserve">. Bristol: Ministry of Defence. Available at: </w:t>
       </w:r>
-      <w:hyperlink r:id="rId34" w:tgtFrame="_new" w:history="1">
+      <w:hyperlink r:id="rId40" w:tgtFrame="_new" w:history="1">
         <w:r>
           <w:rPr>
             <w:rStyle w:val="Hyperlink"/>
@@ -7473,7 +8026,7 @@
       <w:r>
         <w:t xml:space="preserve">. London: Ministry of Defence. Available at: </w:t>
       </w:r>
-      <w:hyperlink r:id="rId35" w:tgtFrame="_new" w:history="1">
+      <w:hyperlink r:id="rId41" w:tgtFrame="_new" w:history="1">
         <w:r>
           <w:rPr>
             <w:rStyle w:val="Hyperlink"/>
@@ -7485,10 +8038,245 @@
         <w:t>.</w:t>
       </w:r>
     </w:p>
+    <w:p>
+      <w:pPr>
+        <w:pStyle w:val="ListParagraph"/>
+        <w:numPr>
+          <w:ilvl w:val="0"/>
+          <w:numId w:val="0"/>
+        </w:numPr>
+        <w:ind w:left="714"/>
+      </w:pPr>
+    </w:p>
+    <w:p>
+      <w:pPr>
+        <w:pStyle w:val="ListParagraph"/>
+        <w:numPr>
+          <w:ilvl w:val="0"/>
+          <w:numId w:val="10"/>
+        </w:numPr>
+        <w:spacing w:before="26"/>
+      </w:pPr>
+      <w:r>
+        <w:t xml:space="preserve">Yao, S., Zhao, J., Yu, D., Du, N., Shafran, I., Narasimhan, K.R. and Cao, Y. (2023) ‘ReAct: Synergizing Reasoning and Acting in Language Models’, </w:t>
+      </w:r>
+      <w:r>
+        <w:rPr>
+          <w:i/>
+          <w:iCs/>
+        </w:rPr>
+        <w:t>Proceedings of the Eleventh International Conference on Learning Representations</w:t>
+      </w:r>
+      <w:r>
+        <w:t xml:space="preserve">. Available at: </w:t>
+      </w:r>
+      <w:hyperlink r:id="rId42" w:tgtFrame="_new" w:history="1">
+        <w:r>
+          <w:rPr>
+            <w:rStyle w:val="Hyperlink"/>
+          </w:rPr>
+          <w:t>arXiv:2210.03629</w:t>
+        </w:r>
+      </w:hyperlink>
+      <w:r>
+        <w:t>.</w:t>
+      </w:r>
+    </w:p>
+    <w:p>
+      <w:pPr>
+        <w:pStyle w:val="ListParagraph"/>
+        <w:numPr>
+          <w:ilvl w:val="0"/>
+          <w:numId w:val="0"/>
+        </w:numPr>
+        <w:ind w:left="714"/>
+      </w:pPr>
+    </w:p>
+    <w:p>
+      <w:pPr>
+        <w:pStyle w:val="ListParagraph"/>
+        <w:numPr>
+          <w:ilvl w:val="0"/>
+          <w:numId w:val="0"/>
+        </w:numPr>
+        <w:spacing w:before="26"/>
+        <w:ind w:left="1080"/>
+      </w:pPr>
+    </w:p>
+    <w:p>
+      <w:pPr>
+        <w:pStyle w:val="ListParagraph"/>
+        <w:numPr>
+          <w:ilvl w:val="0"/>
+          <w:numId w:val="10"/>
+        </w:numPr>
+        <w:spacing w:before="26"/>
+      </w:pPr>
+      <w:r>
+        <w:lastRenderedPageBreak/>
+        <w:t xml:space="preserve">Shinn, N., Cassano, F., Berman, E., Gopinath, A., Narasimhan, K.R. and Yao, S. (2023) ‘Reflexion: Language Agents with Verbal Reinforcement Learning’, </w:t>
+      </w:r>
+      <w:r>
+        <w:rPr>
+          <w:i/>
+          <w:iCs/>
+        </w:rPr>
+        <w:t>Advances in Neural Information Processing Systems</w:t>
+      </w:r>
+      <w:r>
+        <w:t xml:space="preserve">, 36. Available at: </w:t>
+      </w:r>
+      <w:hyperlink r:id="rId43" w:tgtFrame="_new" w:history="1">
+        <w:r>
+          <w:rPr>
+            <w:rStyle w:val="Hyperlink"/>
+          </w:rPr>
+          <w:t>arXiv:2303.11366</w:t>
+        </w:r>
+      </w:hyperlink>
+      <w:r>
+        <w:t>.</w:t>
+      </w:r>
+    </w:p>
+    <w:p>
+      <w:pPr>
+        <w:pStyle w:val="ListParagraph"/>
+        <w:numPr>
+          <w:ilvl w:val="0"/>
+          <w:numId w:val="0"/>
+        </w:numPr>
+        <w:spacing w:before="26"/>
+        <w:ind w:left="1080"/>
+      </w:pPr>
+    </w:p>
+    <w:p>
+      <w:pPr>
+        <w:pStyle w:val="ListParagraph"/>
+        <w:numPr>
+          <w:ilvl w:val="0"/>
+          <w:numId w:val="10"/>
+        </w:numPr>
+        <w:spacing w:before="26"/>
+      </w:pPr>
+      <w:r>
+        <w:t xml:space="preserve">Zou, W., Geng, R., Wang, B. and Jia, J. (2025) ‘PoisonedRAG: Knowledge Corruption Attacks to Retrieval-Augmented Generation of Large Language Models’, </w:t>
+      </w:r>
+      <w:r>
+        <w:rPr>
+          <w:i/>
+          <w:iCs/>
+        </w:rPr>
+        <w:t>Proceedings of the 34th USENIX Security Symposium</w:t>
+      </w:r>
+      <w:r>
+        <w:t xml:space="preserve">, pp. 3827–3844. Available at: </w:t>
+      </w:r>
+      <w:hyperlink r:id="rId44" w:tgtFrame="_new" w:history="1">
+        <w:r>
+          <w:rPr>
+            <w:rStyle w:val="Hyperlink"/>
+          </w:rPr>
+          <w:t>USENIX Security 2025</w:t>
+        </w:r>
+      </w:hyperlink>
+      <w:r>
+        <w:t>.</w:t>
+      </w:r>
+    </w:p>
+    <w:p>
+      <w:pPr>
+        <w:pStyle w:val="ListParagraph"/>
+        <w:numPr>
+          <w:ilvl w:val="0"/>
+          <w:numId w:val="0"/>
+        </w:numPr>
+        <w:spacing w:before="26"/>
+        <w:ind w:left="1080"/>
+      </w:pPr>
+    </w:p>
+    <w:p>
+      <w:pPr>
+        <w:pStyle w:val="ListParagraph"/>
+        <w:numPr>
+          <w:ilvl w:val="0"/>
+          <w:numId w:val="10"/>
+        </w:numPr>
+        <w:spacing w:before="26"/>
+      </w:pPr>
+      <w:r>
+        <w:t xml:space="preserve">Lakens, D. (2017) ‘Equivalence Tests: A Practical Primer for t Tests, Correlations, and Meta-Analyses’, </w:t>
+      </w:r>
+      <w:r>
+        <w:rPr>
+          <w:i/>
+          <w:iCs/>
+        </w:rPr>
+        <w:t>Social Psychological and Personality Science</w:t>
+      </w:r>
+      <w:r>
+        <w:t xml:space="preserve">, 8(4), pp. 355–362. </w:t>
+      </w:r>
+      <w:hyperlink r:id="rId45" w:tgtFrame="_new" w:history="1">
+        <w:r>
+          <w:rPr>
+            <w:rStyle w:val="Hyperlink"/>
+          </w:rPr>
+          <w:t>doi:10.1177/1948550617697177</w:t>
+        </w:r>
+      </w:hyperlink>
+      <w:r>
+        <w:t>.</w:t>
+      </w:r>
+    </w:p>
+    <w:p>
+      <w:pPr>
+        <w:pStyle w:val="ListParagraph"/>
+        <w:numPr>
+          <w:ilvl w:val="0"/>
+          <w:numId w:val="0"/>
+        </w:numPr>
+        <w:spacing w:before="26"/>
+        <w:ind w:left="1080"/>
+      </w:pPr>
+    </w:p>
+    <w:p>
+      <w:pPr>
+        <w:pStyle w:val="ListParagraph"/>
+        <w:numPr>
+          <w:ilvl w:val="0"/>
+          <w:numId w:val="10"/>
+        </w:numPr>
+        <w:spacing w:before="26"/>
+      </w:pPr>
+      <w:r>
+        <w:t xml:space="preserve">Dettmers, T., Lewis, M., Belkada, Y. and Zettlemoyer, L. (2022) ‘LLM.int8(): 8-bit Matrix Multiplication for Transformers at Scale’, </w:t>
+      </w:r>
+      <w:r>
+        <w:rPr>
+          <w:i/>
+          <w:iCs/>
+        </w:rPr>
+        <w:t>Advances in Neural Information Processing Systems</w:t>
+      </w:r>
+      <w:r>
+        <w:t xml:space="preserve">, 35. Available at: </w:t>
+      </w:r>
+      <w:hyperlink r:id="rId46" w:tgtFrame="_new" w:history="1">
+        <w:r>
+          <w:rPr>
+            <w:rStyle w:val="Hyperlink"/>
+          </w:rPr>
+          <w:t>arXiv:2208.07339</w:t>
+        </w:r>
+      </w:hyperlink>
+      <w:r>
+        <w:t>.</w:t>
+      </w:r>
+    </w:p>
     <w:sectPr>
-      <w:footerReference w:type="even" r:id="rId36"/>
-      <w:footerReference w:type="default" r:id="rId37"/>
-      <w:footerReference w:type="first" r:id="rId38"/>
+      <w:footerReference w:type="even" r:id="rId47"/>
+      <w:footerReference w:type="default" r:id="rId48"/>
+      <w:footerReference w:type="first" r:id="rId49"/>
       <w:pgSz w:w="11900" w:h="16840"/>
       <w:pgMar w:top="851" w:right="851" w:bottom="851" w:left="851" w:header="850" w:footer="709" w:gutter="0"/>
       <w:cols w:space="708"/>

</xml_diff>